<commit_message>
*UPDATED* Overall structure of the notebook and added Data Preprocessing section to the report
</commit_message>
<xml_diff>
--- a/Text_Mining_Report.docx
+++ b/Text_Mining_Report.docx
@@ -13,19 +13,11 @@
           <w:color w:val="5C666C"/>
         </w:rPr>
       </w:pPr>
-      <w:proofErr w:type="gramStart"/>
       <w:r>
         <w:rPr>
           <w:color w:val="5C666C"/>
         </w:rPr>
-        <w:t>Master in Data Science and Advanced</w:t>
-      </w:r>
-      <w:proofErr w:type="gramEnd"/>
-      <w:r>
-        <w:rPr>
-          <w:color w:val="5C666C"/>
-        </w:rPr>
-        <w:t xml:space="preserve"> Analytics</w:t>
+        <w:t>Master in Data Science and Advanced Analytics</w:t>
       </w:r>
     </w:p>
     <w:p>
@@ -59,36 +51,8 @@
           <w:color w:val="5C666C"/>
           <w:lang w:val="pt-PT"/>
         </w:rPr>
-        <w:t xml:space="preserve">NOVA </w:t>
-      </w:r>
-      <w:proofErr w:type="spellStart"/>
-      <w:r>
-        <w:rPr>
-          <w:b/>
-          <w:color w:val="5C666C"/>
-          <w:lang w:val="pt-PT"/>
-        </w:rPr>
-        <w:t>Information</w:t>
-      </w:r>
-      <w:proofErr w:type="spellEnd"/>
-      <w:r>
-        <w:rPr>
-          <w:b/>
-          <w:color w:val="5C666C"/>
-          <w:lang w:val="pt-PT"/>
-        </w:rPr>
-        <w:t xml:space="preserve"> Management </w:t>
-      </w:r>
-      <w:proofErr w:type="spellStart"/>
-      <w:r>
-        <w:rPr>
-          <w:b/>
-          <w:color w:val="5C666C"/>
-          <w:lang w:val="pt-PT"/>
-        </w:rPr>
-        <w:t>School</w:t>
-      </w:r>
-      <w:proofErr w:type="spellEnd"/>
+        <w:t>NOVA Information Management School</w:t>
+      </w:r>
     </w:p>
     <w:p>
       <w:pPr>
@@ -427,28 +391,12 @@
           <w:lang w:val="pt-PT"/>
         </w:rPr>
       </w:pPr>
-      <w:proofErr w:type="spellStart"/>
       <w:r>
         <w:rPr>
           <w:lang w:val="pt-PT"/>
         </w:rPr>
-        <w:t>Sapana</w:t>
-      </w:r>
-      <w:proofErr w:type="spellEnd"/>
-      <w:r>
-        <w:rPr>
-          <w:lang w:val="pt-PT"/>
-        </w:rPr>
-        <w:t xml:space="preserve"> </w:t>
-      </w:r>
-      <w:proofErr w:type="spellStart"/>
-      <w:r>
-        <w:rPr>
-          <w:lang w:val="pt-PT"/>
-        </w:rPr>
-        <w:t>Dhami</w:t>
-      </w:r>
-      <w:proofErr w:type="spellEnd"/>
+        <w:t>Sapana Dhami</w:t>
+      </w:r>
       <w:r>
         <w:rPr>
           <w:lang w:val="pt-PT"/>
@@ -1692,17 +1640,17 @@
           <w:rFonts w:ascii="Arial" w:hAnsi="Arial" w:cs="Arial"/>
         </w:rPr>
       </w:pPr>
-      <w:bookmarkStart w:id="0" w:name="_Toc410990268"/>
-      <w:bookmarkStart w:id="1" w:name="_Toc410990280"/>
-      <w:bookmarkStart w:id="2" w:name="_Toc412186393"/>
-      <w:bookmarkStart w:id="3" w:name="_Toc412186498"/>
-      <w:bookmarkStart w:id="4" w:name="_Toc412186523"/>
-      <w:bookmarkStart w:id="5" w:name="_Toc412186594"/>
-      <w:bookmarkStart w:id="6" w:name="_Toc412186624"/>
-      <w:bookmarkStart w:id="7" w:name="_Toc115296802"/>
-      <w:bookmarkStart w:id="8" w:name="_Toc136960268"/>
-      <w:bookmarkStart w:id="9" w:name="_Toc141959331"/>
-      <w:bookmarkStart w:id="10" w:name="_Toc228445044"/>
+      <w:bookmarkStart w:id="0" w:name="_Toc228445044"/>
+      <w:bookmarkStart w:id="1" w:name="_Toc410990268"/>
+      <w:bookmarkStart w:id="2" w:name="_Toc410990280"/>
+      <w:bookmarkStart w:id="3" w:name="_Toc412186393"/>
+      <w:bookmarkStart w:id="4" w:name="_Toc412186498"/>
+      <w:bookmarkStart w:id="5" w:name="_Toc412186523"/>
+      <w:bookmarkStart w:id="6" w:name="_Toc412186594"/>
+      <w:bookmarkStart w:id="7" w:name="_Toc412186624"/>
+      <w:bookmarkStart w:id="8" w:name="_Toc115296802"/>
+      <w:bookmarkStart w:id="9" w:name="_Toc136960268"/>
+      <w:bookmarkStart w:id="10" w:name="_Toc141959331"/>
       <w:r>
         <w:rPr>
           <w:rFonts w:ascii="Arial" w:hAnsi="Arial" w:cs="Arial"/>
@@ -1710,7 +1658,7 @@
         <w:lastRenderedPageBreak/>
         <w:t>Project Overview</w:t>
       </w:r>
-      <w:bookmarkEnd w:id="10"/>
+      <w:bookmarkEnd w:id="0"/>
     </w:p>
     <w:p>
       <w:pPr>
@@ -1735,7 +1683,6 @@
         </w:rPr>
       </w:pPr>
       <w:bookmarkStart w:id="11" w:name="_Toc228445045"/>
-      <w:bookmarkEnd w:id="0"/>
       <w:bookmarkEnd w:id="1"/>
       <w:bookmarkEnd w:id="2"/>
       <w:bookmarkEnd w:id="3"/>
@@ -1745,6 +1692,7 @@
       <w:bookmarkEnd w:id="7"/>
       <w:bookmarkEnd w:id="8"/>
       <w:bookmarkEnd w:id="9"/>
+      <w:bookmarkEnd w:id="10"/>
       <w:r>
         <w:rPr>
           <w:rFonts w:ascii="Arial" w:hAnsi="Arial" w:cs="Arial"/>
@@ -2049,23 +1997,7 @@
           <w:rFonts w:ascii="Arial" w:hAnsi="Arial" w:cs="Arial"/>
           <w:lang w:eastAsia="pt-PT"/>
         </w:rPr>
-        <w:t xml:space="preserve"> as a quick way to explore the top 15 most common words in each sentiment class. This gave us an immediate visual sense of which terms stand out the most in bullish, bearish, and neutral tweets, since more frequent words appear larger and are easier to spot </w:t>
-      </w:r>
-      <w:proofErr w:type="gramStart"/>
-      <w:r>
-        <w:rPr>
-          <w:rFonts w:ascii="Arial" w:hAnsi="Arial" w:cs="Arial"/>
-          <w:lang w:eastAsia="pt-PT"/>
-        </w:rPr>
-        <w:t>at a glance</w:t>
-      </w:r>
-      <w:proofErr w:type="gramEnd"/>
-      <w:r>
-        <w:rPr>
-          <w:rFonts w:ascii="Arial" w:hAnsi="Arial" w:cs="Arial"/>
-          <w:lang w:eastAsia="pt-PT"/>
-        </w:rPr>
-        <w:t>.</w:t>
+        <w:t xml:space="preserve"> as a quick way to explore the top 15 most common words in each sentiment class. This gave us an immediate visual sense of which terms stand out the most in bullish, bearish, and neutral tweets, since more frequent words appear larger and are easier to spot at a glance.</w:t>
       </w:r>
     </w:p>
     <w:p>
@@ -2517,23 +2449,7 @@
           <w:rFonts w:ascii="Arial" w:hAnsi="Arial" w:cs="Arial"/>
           <w:lang w:eastAsia="pt-PT"/>
         </w:rPr>
-        <w:t xml:space="preserve">Now, considering that our dataset consists of tweets, we also </w:t>
-      </w:r>
-      <w:proofErr w:type="gramStart"/>
-      <w:r>
-        <w:rPr>
-          <w:rFonts w:ascii="Arial" w:hAnsi="Arial" w:cs="Arial"/>
-          <w:lang w:eastAsia="pt-PT"/>
-        </w:rPr>
-        <w:t>looked into</w:t>
-      </w:r>
-      <w:proofErr w:type="gramEnd"/>
-      <w:r>
-        <w:rPr>
-          <w:rFonts w:ascii="Arial" w:hAnsi="Arial" w:cs="Arial"/>
-          <w:lang w:eastAsia="pt-PT"/>
-        </w:rPr>
-        <w:t xml:space="preserve"> the use of hashtags, mentions, and cashtags, since these are very common elements in this type of text and often carry useful context about topics or specific stocks being discussed.</w:t>
+        <w:t>Now, considering that our dataset consists of tweets, we also looked into the use of hashtags, mentions, and cashtags, since these are very common elements in this type of text and often carry useful context about topics or specific stocks being discussed.</w:t>
       </w:r>
     </w:p>
     <w:p>
@@ -2583,7 +2499,6 @@
         </w:rPr>
         <w:t>” and “</w:t>
       </w:r>
-      <w:proofErr w:type="spellStart"/>
       <w:r>
         <w:rPr>
           <w:rFonts w:ascii="Arial" w:hAnsi="Arial" w:cs="Arial"/>
@@ -2593,7 +2508,6 @@
         </w:rPr>
         <w:t>wti</w:t>
       </w:r>
-      <w:proofErr w:type="spellEnd"/>
       <w:r>
         <w:rPr>
           <w:rFonts w:ascii="Arial" w:hAnsi="Arial" w:cs="Arial"/>
@@ -2710,23 +2624,7 @@
           <w:rFonts w:ascii="Arial" w:hAnsi="Arial" w:cs="Arial"/>
           <w:lang w:eastAsia="pt-PT"/>
         </w:rPr>
-        <w:t xml:space="preserve">Looking at cashtags (stock </w:t>
-      </w:r>
-      <w:proofErr w:type="gramStart"/>
-      <w:r>
-        <w:rPr>
-          <w:rFonts w:ascii="Arial" w:hAnsi="Arial" w:cs="Arial"/>
-          <w:lang w:eastAsia="pt-PT"/>
-        </w:rPr>
-        <w:t>tickers</w:t>
-      </w:r>
-      <w:proofErr w:type="gramEnd"/>
-      <w:r>
-        <w:rPr>
-          <w:rFonts w:ascii="Arial" w:hAnsi="Arial" w:cs="Arial"/>
-          <w:lang w:eastAsia="pt-PT"/>
-        </w:rPr>
-        <w:t>), clearer distinctions emerge. While some popular tickers like “</w:t>
+        <w:t>Looking at cashtags (stock tickers), clearer distinctions emerge. While some popular tickers like “</w:t>
       </w:r>
       <w:r>
         <w:rPr>
@@ -2890,105 +2788,7 @@
           <w:rFonts w:ascii="Arial" w:hAnsi="Arial" w:cs="Arial"/>
           <w:lang w:eastAsia="pt-PT"/>
         </w:rPr>
-        <w:t xml:space="preserve"> per class </w:t>
-      </w:r>
-      <w:proofErr w:type="gramStart"/>
-      <w:r>
-        <w:rPr>
-          <w:rFonts w:ascii="Arial" w:hAnsi="Arial" w:cs="Arial"/>
-          <w:lang w:eastAsia="pt-PT"/>
-        </w:rPr>
-        <w:t>in order to</w:t>
-      </w:r>
-      <w:proofErr w:type="gramEnd"/>
-      <w:r>
-        <w:rPr>
-          <w:rFonts w:ascii="Arial" w:hAnsi="Arial" w:cs="Arial"/>
-          <w:lang w:eastAsia="pt-PT"/>
-        </w:rPr>
-        <w:t xml:space="preserve"> determine </w:t>
-      </w:r>
-      <w:proofErr w:type="spellStart"/>
-      <w:proofErr w:type="gramStart"/>
-      <w:r>
-        <w:rPr>
-          <w:rFonts w:ascii="Arial" w:hAnsi="Arial" w:cs="Arial"/>
-          <w:lang w:eastAsia="pt-PT"/>
-        </w:rPr>
-        <w:t>wether</w:t>
-      </w:r>
-      <w:proofErr w:type="spellEnd"/>
-      <w:proofErr w:type="gramEnd"/>
-      <w:r>
-        <w:rPr>
-          <w:rFonts w:ascii="Arial" w:hAnsi="Arial" w:cs="Arial"/>
-          <w:lang w:eastAsia="pt-PT"/>
-        </w:rPr>
-        <w:t xml:space="preserve"> any of these would be a good indicator of the class that those tweets were in. Out of the three, the neutral was the one who had the highest average of characters per tweet with 88 characters, even though </w:t>
-      </w:r>
-      <w:proofErr w:type="gramStart"/>
-      <w:r>
-        <w:rPr>
-          <w:rFonts w:ascii="Arial" w:hAnsi="Arial" w:cs="Arial"/>
-          <w:lang w:eastAsia="pt-PT"/>
-        </w:rPr>
-        <w:t>all of</w:t>
-      </w:r>
-      <w:proofErr w:type="gramEnd"/>
-      <w:r>
-        <w:rPr>
-          <w:rFonts w:ascii="Arial" w:hAnsi="Arial" w:cs="Arial"/>
-          <w:lang w:eastAsia="pt-PT"/>
-        </w:rPr>
-        <w:t xml:space="preserve"> the classes had the exact same average number of words at 12 words. Regarding the presence of URL’s neutral was also the class with the highest percentage with 49.8% whereas bearish and </w:t>
-      </w:r>
-      <w:proofErr w:type="spellStart"/>
-      <w:r>
-        <w:rPr>
-          <w:rFonts w:ascii="Arial" w:hAnsi="Arial" w:cs="Arial"/>
-          <w:lang w:eastAsia="pt-PT"/>
-        </w:rPr>
-        <w:t>bulish</w:t>
-      </w:r>
-      <w:proofErr w:type="spellEnd"/>
-      <w:r>
-        <w:rPr>
-          <w:rFonts w:ascii="Arial" w:hAnsi="Arial" w:cs="Arial"/>
-          <w:lang w:eastAsia="pt-PT"/>
-        </w:rPr>
-        <w:t xml:space="preserve"> came with 44.3% and 39.1%, respectively. Regarding the presence of a stock </w:t>
-      </w:r>
-      <w:proofErr w:type="gramStart"/>
-      <w:r>
-        <w:rPr>
-          <w:rFonts w:ascii="Arial" w:hAnsi="Arial" w:cs="Arial"/>
-          <w:lang w:eastAsia="pt-PT"/>
-        </w:rPr>
-        <w:t>ticker</w:t>
-      </w:r>
-      <w:proofErr w:type="gramEnd"/>
-      <w:r>
-        <w:rPr>
-          <w:rFonts w:ascii="Arial" w:hAnsi="Arial" w:cs="Arial"/>
-          <w:lang w:eastAsia="pt-PT"/>
-        </w:rPr>
-        <w:t xml:space="preserve"> the bullish class came first with 24.6%</w:t>
-      </w:r>
-      <w:proofErr w:type="gramStart"/>
-      <w:r>
-        <w:rPr>
-          <w:rFonts w:ascii="Arial" w:hAnsi="Arial" w:cs="Arial"/>
-          <w:lang w:eastAsia="pt-PT"/>
-        </w:rPr>
-        <w:t xml:space="preserve"> which</w:t>
-      </w:r>
-      <w:proofErr w:type="gramEnd"/>
-      <w:r>
-        <w:rPr>
-          <w:rFonts w:ascii="Arial" w:hAnsi="Arial" w:cs="Arial"/>
-          <w:lang w:eastAsia="pt-PT"/>
-        </w:rPr>
-        <w:t xml:space="preserve"> represents almost double the percentage that both bearish and neutral classes got at around 13% as can be seen on Figure 6</w:t>
+        <w:t xml:space="preserve"> per class in order to determine wether any of these would be a good indicator of the class that those tweets were in. Out of the three, the neutral was the one who had the highest average of characters per tweet with 88 characters, even though all of the classes had the exact same average number of words at 12 words. Regarding the presence of URL’s neutral was also the class with the highest percentage with 49.8% whereas bearish and bulish came with 44.3% and 39.1%, respectively. Regarding the presence of a stock ticker the bullish class came first with 24.6% which represents almost double the percentage that both bearish and neutral classes got at around 13% as can be seen on Figure 6</w:t>
       </w:r>
     </w:p>
     <w:p>
@@ -3032,18 +2832,606 @@
     </w:p>
     <w:p>
       <w:pPr>
-        <w:pStyle w:val="Ttulo3"/>
-        <w:spacing w:before="0" w:after="0"/>
-        <w:rPr>
-          <w:rFonts w:ascii="Arial" w:hAnsi="Arial" w:cs="Arial"/>
-        </w:rPr>
-      </w:pPr>
-      <w:bookmarkStart w:id="16" w:name="_Toc228445050"/>
-      <w:r>
-        <w:rPr>
-          <w:rFonts w:ascii="Arial" w:hAnsi="Arial" w:cs="Arial"/>
-        </w:rPr>
-        <w:t>Class Imbalance</w:t>
+        <w:rPr>
+          <w:rFonts w:ascii="Arial" w:hAnsi="Arial" w:cs="Arial"/>
+          <w:lang w:eastAsia="pt-PT"/>
+        </w:rPr>
+      </w:pPr>
+      <w:r>
+        <w:rPr>
+          <w:rFonts w:ascii="Arial" w:hAnsi="Arial" w:cs="Arial"/>
+          <w:lang w:eastAsia="pt-PT"/>
+        </w:rPr>
+        <w:t xml:space="preserve">The preprocessing pipeline was designed based on the insights obtained during the exploratory data analysis (EDA). The analysis revealed that sentiment distinctions in the dataset were often expressed through specific financial terminology, stock tickers, hashtags, </w:t>
+      </w:r>
+      <w:r>
+        <w:rPr>
+          <w:rFonts w:ascii="Arial" w:hAnsi="Arial" w:cs="Arial"/>
+          <w:lang w:eastAsia="pt-PT"/>
+        </w:rPr>
+        <w:lastRenderedPageBreak/>
+        <w:t>directional words, and performance-related vocabulary. Therefore, the main objective of preprocessing was not only to reduce textual noise but also to preserve features that could contribute to sentiment discrimination.</w:t>
+      </w:r>
+    </w:p>
+    <w:p>
+      <w:pPr>
+        <w:rPr>
+          <w:rFonts w:ascii="Arial" w:hAnsi="Arial" w:cs="Arial"/>
+          <w:lang w:eastAsia="pt-PT"/>
+        </w:rPr>
+      </w:pPr>
+      <w:r>
+        <w:rPr>
+          <w:rFonts w:ascii="Arial" w:hAnsi="Arial" w:cs="Arial"/>
+          <w:lang w:eastAsia="pt-PT"/>
+        </w:rPr>
+        <w:t>As a first step, all tweets were converted to lowercase to ensure consistency across the corpus and reduce vocabulary sparsity caused by capitalization differences. Contractions such as “don't”, “can't”, and “it's” were expanded into their full forms before further processing, improving linguistic consistency and allowing negation patterns to be identified more reliably.</w:t>
+      </w:r>
+    </w:p>
+    <w:p>
+      <w:pPr>
+        <w:rPr>
+          <w:rFonts w:ascii="Arial" w:hAnsi="Arial" w:cs="Arial"/>
+          <w:lang w:eastAsia="pt-PT"/>
+        </w:rPr>
+      </w:pPr>
+      <w:r>
+        <w:rPr>
+          <w:rFonts w:ascii="Arial" w:hAnsi="Arial" w:cs="Arial"/>
+          <w:lang w:eastAsia="pt-PT"/>
+        </w:rPr>
+        <w:t xml:space="preserve">The EDA showed that bullish and bearish tweets frequently contained words associated with market movements and company performance, such as </w:t>
+      </w:r>
+      <w:r>
+        <w:rPr>
+          <w:rFonts w:ascii="Arial" w:hAnsi="Arial" w:cs="Arial"/>
+          <w:i/>
+          <w:iCs/>
+          <w:lang w:eastAsia="pt-PT"/>
+        </w:rPr>
+        <w:t>beats</w:t>
+      </w:r>
+      <w:r>
+        <w:rPr>
+          <w:rFonts w:ascii="Arial" w:hAnsi="Arial" w:cs="Arial"/>
+          <w:lang w:eastAsia="pt-PT"/>
+        </w:rPr>
+        <w:t xml:space="preserve">, </w:t>
+      </w:r>
+      <w:r>
+        <w:rPr>
+          <w:rFonts w:ascii="Arial" w:hAnsi="Arial" w:cs="Arial"/>
+          <w:i/>
+          <w:iCs/>
+          <w:lang w:eastAsia="pt-PT"/>
+        </w:rPr>
+        <w:t>raised</w:t>
+      </w:r>
+      <w:r>
+        <w:rPr>
+          <w:rFonts w:ascii="Arial" w:hAnsi="Arial" w:cs="Arial"/>
+          <w:lang w:eastAsia="pt-PT"/>
+        </w:rPr>
+        <w:t xml:space="preserve">, </w:t>
+      </w:r>
+      <w:r>
+        <w:rPr>
+          <w:rFonts w:ascii="Arial" w:hAnsi="Arial" w:cs="Arial"/>
+          <w:i/>
+          <w:iCs/>
+          <w:lang w:eastAsia="pt-PT"/>
+        </w:rPr>
+        <w:t>higher</w:t>
+      </w:r>
+      <w:r>
+        <w:rPr>
+          <w:rFonts w:ascii="Arial" w:hAnsi="Arial" w:cs="Arial"/>
+          <w:lang w:eastAsia="pt-PT"/>
+        </w:rPr>
+        <w:t xml:space="preserve">, </w:t>
+      </w:r>
+      <w:r>
+        <w:rPr>
+          <w:rFonts w:ascii="Arial" w:hAnsi="Arial" w:cs="Arial"/>
+          <w:i/>
+          <w:iCs/>
+          <w:lang w:eastAsia="pt-PT"/>
+        </w:rPr>
+        <w:t>misses</w:t>
+      </w:r>
+      <w:r>
+        <w:rPr>
+          <w:rFonts w:ascii="Arial" w:hAnsi="Arial" w:cs="Arial"/>
+          <w:lang w:eastAsia="pt-PT"/>
+        </w:rPr>
+        <w:t xml:space="preserve">, and </w:t>
+      </w:r>
+      <w:r>
+        <w:rPr>
+          <w:rFonts w:ascii="Arial" w:hAnsi="Arial" w:cs="Arial"/>
+          <w:i/>
+          <w:iCs/>
+          <w:lang w:eastAsia="pt-PT"/>
+        </w:rPr>
+        <w:t>cut</w:t>
+      </w:r>
+      <w:r>
+        <w:rPr>
+          <w:rFonts w:ascii="Arial" w:hAnsi="Arial" w:cs="Arial"/>
+          <w:lang w:eastAsia="pt-PT"/>
+        </w:rPr>
+        <w:t>. For this reason, special attention was given to preserving sentiment-bearing indicators. Directional symbols (e.g., upward and downward arrows), percentage changes, and strong emphasis markers were replaced with dedicated tokens before cleaning so that their sentiment information would not be lost during preprocessing.</w:t>
+      </w:r>
+    </w:p>
+    <w:p>
+      <w:pPr>
+        <w:rPr>
+          <w:rFonts w:ascii="Arial" w:hAnsi="Arial" w:cs="Arial"/>
+          <w:lang w:eastAsia="pt-PT"/>
+        </w:rPr>
+      </w:pPr>
+      <w:r>
+        <w:rPr>
+          <w:rFonts w:ascii="Arial" w:hAnsi="Arial" w:cs="Arial"/>
+          <w:lang w:eastAsia="pt-PT"/>
+        </w:rPr>
+        <w:t>Since the analysis of cashtags demonstrated that stock tickers were more prevalent in bullish tweets (24.6%) than in bearish or neutral tweets (approximately 13%), stock ticker references were explicitly preserved. Known tickers were mapped to standardized tokens (e.g., TICKER_AAPL), while unknown tickers were replaced with a generic STOCK_TICKER token. This allowed the model to retain information about stock-specific discussions while limiting vocabulary growth.</w:t>
+      </w:r>
+    </w:p>
+    <w:p>
+      <w:pPr>
+        <w:rPr>
+          <w:rFonts w:ascii="Arial" w:hAnsi="Arial" w:cs="Arial"/>
+          <w:lang w:eastAsia="pt-PT"/>
+        </w:rPr>
+      </w:pPr>
+      <w:r>
+        <w:rPr>
+          <w:rFonts w:ascii="Arial" w:hAnsi="Arial" w:cs="Arial"/>
+          <w:lang w:eastAsia="pt-PT"/>
+        </w:rPr>
+        <w:t>Numerical information was also handled carefully because financial sentiment is often associated with percentages, price targets, earnings figures, and market performance metrics. Percentage values and monetary amounts were converted into contextual tokens such as NUM_PERCENT and DOLLAR_AMOUNT, while standalone numerical values were removed. This approach preserved the semantic role of financial quantities without introducing unnecessary sparsity.</w:t>
+      </w:r>
+    </w:p>
+    <w:p>
+      <w:pPr>
+        <w:rPr>
+          <w:rFonts w:ascii="Arial" w:hAnsi="Arial" w:cs="Arial"/>
+          <w:lang w:eastAsia="pt-PT"/>
+        </w:rPr>
+      </w:pPr>
+      <w:r>
+        <w:rPr>
+          <w:rFonts w:ascii="Arial" w:hAnsi="Arial" w:cs="Arial"/>
+          <w:lang w:eastAsia="pt-PT"/>
+        </w:rPr>
+        <w:t xml:space="preserve">Noise removal was then performed by eliminating URLs, user mentions, punctuation, and redundant whitespace. Although the EDA showed that neutral tweets contained URLs more frequently (49.8%) than bullish (39.1%) or bearish (44.3%) tweets, URLs themselves rarely carry semantic information relevant to sentiment classification. Therefore, only the URL content was removed while retaining the surrounding textual context. Similarly, hashtag symbols were removed while preserving the associated words, since the hashtag analysis revealed that terms such as </w:t>
+      </w:r>
+      <w:r>
+        <w:rPr>
+          <w:rFonts w:ascii="Arial" w:hAnsi="Arial" w:cs="Arial"/>
+          <w:i/>
+          <w:iCs/>
+          <w:lang w:eastAsia="pt-PT"/>
+        </w:rPr>
+        <w:t>economy</w:t>
+      </w:r>
+      <w:r>
+        <w:rPr>
+          <w:rFonts w:ascii="Arial" w:hAnsi="Arial" w:cs="Arial"/>
+          <w:lang w:eastAsia="pt-PT"/>
+        </w:rPr>
+        <w:t xml:space="preserve">, </w:t>
+      </w:r>
+      <w:r>
+        <w:rPr>
+          <w:rFonts w:ascii="Arial" w:hAnsi="Arial" w:cs="Arial"/>
+          <w:i/>
+          <w:iCs/>
+          <w:lang w:eastAsia="pt-PT"/>
+        </w:rPr>
+        <w:t>stock</w:t>
+      </w:r>
+      <w:r>
+        <w:rPr>
+          <w:rFonts w:ascii="Arial" w:hAnsi="Arial" w:cs="Arial"/>
+          <w:lang w:eastAsia="pt-PT"/>
+        </w:rPr>
+        <w:t xml:space="preserve">, </w:t>
+      </w:r>
+      <w:r>
+        <w:rPr>
+          <w:rFonts w:ascii="Arial" w:hAnsi="Arial" w:cs="Arial"/>
+          <w:i/>
+          <w:iCs/>
+          <w:lang w:eastAsia="pt-PT"/>
+        </w:rPr>
+        <w:t>trading</w:t>
+      </w:r>
+      <w:r>
+        <w:rPr>
+          <w:rFonts w:ascii="Arial" w:hAnsi="Arial" w:cs="Arial"/>
+          <w:lang w:eastAsia="pt-PT"/>
+        </w:rPr>
+        <w:t xml:space="preserve">, and </w:t>
+      </w:r>
+      <w:r>
+        <w:rPr>
+          <w:rFonts w:ascii="Arial" w:hAnsi="Arial" w:cs="Arial"/>
+          <w:i/>
+          <w:iCs/>
+          <w:lang w:eastAsia="pt-PT"/>
+        </w:rPr>
+        <w:t>markets</w:t>
+      </w:r>
+      <w:r>
+        <w:rPr>
+          <w:rFonts w:ascii="Arial" w:hAnsi="Arial" w:cs="Arial"/>
+          <w:lang w:eastAsia="pt-PT"/>
+        </w:rPr>
+        <w:t xml:space="preserve"> often contained meaningful topic information.</w:t>
+      </w:r>
+    </w:p>
+    <w:p>
+      <w:pPr>
+        <w:rPr>
+          <w:rFonts w:ascii="Arial" w:hAnsi="Arial" w:cs="Arial"/>
+          <w:lang w:eastAsia="pt-PT"/>
+        </w:rPr>
+      </w:pPr>
+      <w:r>
+        <w:rPr>
+          <w:rFonts w:ascii="Arial" w:hAnsi="Arial" w:cs="Arial"/>
+          <w:lang w:eastAsia="pt-PT"/>
+        </w:rPr>
+        <w:t xml:space="preserve">After cleaning, tweets were tokenized using NLTK's TweetTokenizer, which is specifically designed to handle social media text. Stopword removal was then applied to eliminate common words with limited discriminative value. However, unlike a standard stopword removal procedure, sentiment-critical financial terms identified during EDA were explicitly preserved. Words such as </w:t>
+      </w:r>
+      <w:r>
+        <w:rPr>
+          <w:rFonts w:ascii="Arial" w:hAnsi="Arial" w:cs="Arial"/>
+          <w:i/>
+          <w:iCs/>
+          <w:lang w:eastAsia="pt-PT"/>
+        </w:rPr>
+        <w:t>buy</w:t>
+      </w:r>
+      <w:r>
+        <w:rPr>
+          <w:rFonts w:ascii="Arial" w:hAnsi="Arial" w:cs="Arial"/>
+          <w:lang w:eastAsia="pt-PT"/>
+        </w:rPr>
+        <w:t xml:space="preserve">, </w:t>
+      </w:r>
+      <w:r>
+        <w:rPr>
+          <w:rFonts w:ascii="Arial" w:hAnsi="Arial" w:cs="Arial"/>
+          <w:i/>
+          <w:iCs/>
+          <w:lang w:eastAsia="pt-PT"/>
+        </w:rPr>
+        <w:t>sell</w:t>
+      </w:r>
+      <w:r>
+        <w:rPr>
+          <w:rFonts w:ascii="Arial" w:hAnsi="Arial" w:cs="Arial"/>
+          <w:lang w:eastAsia="pt-PT"/>
+        </w:rPr>
+        <w:t xml:space="preserve">, </w:t>
+      </w:r>
+      <w:r>
+        <w:rPr>
+          <w:rFonts w:ascii="Arial" w:hAnsi="Arial" w:cs="Arial"/>
+          <w:i/>
+          <w:iCs/>
+          <w:lang w:eastAsia="pt-PT"/>
+        </w:rPr>
+        <w:t>bullish</w:t>
+      </w:r>
+      <w:r>
+        <w:rPr>
+          <w:rFonts w:ascii="Arial" w:hAnsi="Arial" w:cs="Arial"/>
+          <w:lang w:eastAsia="pt-PT"/>
+        </w:rPr>
+        <w:t xml:space="preserve">, </w:t>
+      </w:r>
+      <w:r>
+        <w:rPr>
+          <w:rFonts w:ascii="Arial" w:hAnsi="Arial" w:cs="Arial"/>
+          <w:i/>
+          <w:iCs/>
+          <w:lang w:eastAsia="pt-PT"/>
+        </w:rPr>
+        <w:t>bearish</w:t>
+      </w:r>
+      <w:r>
+        <w:rPr>
+          <w:rFonts w:ascii="Arial" w:hAnsi="Arial" w:cs="Arial"/>
+          <w:lang w:eastAsia="pt-PT"/>
+        </w:rPr>
+        <w:t xml:space="preserve">, </w:t>
+      </w:r>
+      <w:r>
+        <w:rPr>
+          <w:rFonts w:ascii="Arial" w:hAnsi="Arial" w:cs="Arial"/>
+          <w:i/>
+          <w:iCs/>
+          <w:lang w:eastAsia="pt-PT"/>
+        </w:rPr>
+        <w:t>upgrade</w:t>
+      </w:r>
+      <w:r>
+        <w:rPr>
+          <w:rFonts w:ascii="Arial" w:hAnsi="Arial" w:cs="Arial"/>
+          <w:lang w:eastAsia="pt-PT"/>
+        </w:rPr>
+        <w:t xml:space="preserve">, </w:t>
+      </w:r>
+      <w:r>
+        <w:rPr>
+          <w:rFonts w:ascii="Arial" w:hAnsi="Arial" w:cs="Arial"/>
+          <w:i/>
+          <w:iCs/>
+          <w:lang w:eastAsia="pt-PT"/>
+        </w:rPr>
+        <w:t>downgrade</w:t>
+      </w:r>
+      <w:r>
+        <w:rPr>
+          <w:rFonts w:ascii="Arial" w:hAnsi="Arial" w:cs="Arial"/>
+          <w:lang w:eastAsia="pt-PT"/>
+        </w:rPr>
+        <w:t xml:space="preserve">, </w:t>
+      </w:r>
+      <w:r>
+        <w:rPr>
+          <w:rFonts w:ascii="Arial" w:hAnsi="Arial" w:cs="Arial"/>
+          <w:i/>
+          <w:iCs/>
+          <w:lang w:eastAsia="pt-PT"/>
+        </w:rPr>
+        <w:t>rise</w:t>
+      </w:r>
+      <w:r>
+        <w:rPr>
+          <w:rFonts w:ascii="Arial" w:hAnsi="Arial" w:cs="Arial"/>
+          <w:lang w:eastAsia="pt-PT"/>
+        </w:rPr>
+        <w:t xml:space="preserve">, </w:t>
+      </w:r>
+      <w:r>
+        <w:rPr>
+          <w:rFonts w:ascii="Arial" w:hAnsi="Arial" w:cs="Arial"/>
+          <w:i/>
+          <w:iCs/>
+          <w:lang w:eastAsia="pt-PT"/>
+        </w:rPr>
+        <w:t>fall</w:t>
+      </w:r>
+      <w:r>
+        <w:rPr>
+          <w:rFonts w:ascii="Arial" w:hAnsi="Arial" w:cs="Arial"/>
+          <w:lang w:eastAsia="pt-PT"/>
+        </w:rPr>
+        <w:t xml:space="preserve">, </w:t>
+      </w:r>
+      <w:r>
+        <w:rPr>
+          <w:rFonts w:ascii="Arial" w:hAnsi="Arial" w:cs="Arial"/>
+          <w:i/>
+          <w:iCs/>
+          <w:lang w:eastAsia="pt-PT"/>
+        </w:rPr>
+        <w:t>higher</w:t>
+      </w:r>
+      <w:r>
+        <w:rPr>
+          <w:rFonts w:ascii="Arial" w:hAnsi="Arial" w:cs="Arial"/>
+          <w:lang w:eastAsia="pt-PT"/>
+        </w:rPr>
+        <w:t xml:space="preserve">, and </w:t>
+      </w:r>
+      <w:r>
+        <w:rPr>
+          <w:rFonts w:ascii="Arial" w:hAnsi="Arial" w:cs="Arial"/>
+          <w:i/>
+          <w:iCs/>
+          <w:lang w:eastAsia="pt-PT"/>
+        </w:rPr>
+        <w:t>lower</w:t>
+      </w:r>
+      <w:r>
+        <w:rPr>
+          <w:rFonts w:ascii="Arial" w:hAnsi="Arial" w:cs="Arial"/>
+          <w:lang w:eastAsia="pt-PT"/>
+        </w:rPr>
+        <w:t xml:space="preserve"> were retained regardless of their frequency because they provide strong signals for sentiment classification.</w:t>
+      </w:r>
+    </w:p>
+    <w:p>
+      <w:pPr>
+        <w:rPr>
+          <w:rFonts w:ascii="Arial" w:hAnsi="Arial" w:cs="Arial"/>
+          <w:lang w:eastAsia="pt-PT"/>
+        </w:rPr>
+      </w:pPr>
+      <w:r>
+        <w:rPr>
+          <w:rFonts w:ascii="Arial" w:hAnsi="Arial" w:cs="Arial"/>
+          <w:lang w:eastAsia="pt-PT"/>
+        </w:rPr>
+        <w:t xml:space="preserve">To further improve sentiment representation, a negation-handling step was introduced. Words immediately following negation terms such as </w:t>
+      </w:r>
+      <w:r>
+        <w:rPr>
+          <w:rFonts w:ascii="Arial" w:hAnsi="Arial" w:cs="Arial"/>
+          <w:i/>
+          <w:iCs/>
+          <w:lang w:eastAsia="pt-PT"/>
+        </w:rPr>
+        <w:t>not</w:t>
+      </w:r>
+      <w:r>
+        <w:rPr>
+          <w:rFonts w:ascii="Arial" w:hAnsi="Arial" w:cs="Arial"/>
+          <w:lang w:eastAsia="pt-PT"/>
+        </w:rPr>
+        <w:t xml:space="preserve">, </w:t>
+      </w:r>
+      <w:r>
+        <w:rPr>
+          <w:rFonts w:ascii="Arial" w:hAnsi="Arial" w:cs="Arial"/>
+          <w:i/>
+          <w:iCs/>
+          <w:lang w:eastAsia="pt-PT"/>
+        </w:rPr>
+        <w:t>never</w:t>
+      </w:r>
+      <w:r>
+        <w:rPr>
+          <w:rFonts w:ascii="Arial" w:hAnsi="Arial" w:cs="Arial"/>
+          <w:lang w:eastAsia="pt-PT"/>
+        </w:rPr>
+        <w:t xml:space="preserve">, and </w:t>
+      </w:r>
+      <w:r>
+        <w:rPr>
+          <w:rFonts w:ascii="Arial" w:hAnsi="Arial" w:cs="Arial"/>
+          <w:i/>
+          <w:iCs/>
+          <w:lang w:eastAsia="pt-PT"/>
+        </w:rPr>
+        <w:t>no</w:t>
+      </w:r>
+      <w:r>
+        <w:rPr>
+          <w:rFonts w:ascii="Arial" w:hAnsi="Arial" w:cs="Arial"/>
+          <w:lang w:eastAsia="pt-PT"/>
+        </w:rPr>
+        <w:t xml:space="preserve"> were prefixed with NOT_, </w:t>
+      </w:r>
+      <w:r>
+        <w:rPr>
+          <w:rFonts w:ascii="Arial" w:hAnsi="Arial" w:cs="Arial"/>
+          <w:lang w:eastAsia="pt-PT"/>
+        </w:rPr>
+        <w:lastRenderedPageBreak/>
+        <w:t xml:space="preserve">allowing the model to distinguish between expressions with opposite meanings, such as </w:t>
+      </w:r>
+      <w:r>
+        <w:rPr>
+          <w:rFonts w:ascii="Arial" w:hAnsi="Arial" w:cs="Arial"/>
+          <w:i/>
+          <w:iCs/>
+          <w:lang w:eastAsia="pt-PT"/>
+        </w:rPr>
+        <w:t>profitable</w:t>
+      </w:r>
+      <w:r>
+        <w:rPr>
+          <w:rFonts w:ascii="Arial" w:hAnsi="Arial" w:cs="Arial"/>
+          <w:lang w:eastAsia="pt-PT"/>
+        </w:rPr>
+        <w:t xml:space="preserve"> and </w:t>
+      </w:r>
+      <w:r>
+        <w:rPr>
+          <w:rFonts w:ascii="Arial" w:hAnsi="Arial" w:cs="Arial"/>
+          <w:i/>
+          <w:iCs/>
+          <w:lang w:eastAsia="pt-PT"/>
+        </w:rPr>
+        <w:t>not profitable</w:t>
+      </w:r>
+      <w:r>
+        <w:rPr>
+          <w:rFonts w:ascii="Arial" w:hAnsi="Arial" w:cs="Arial"/>
+          <w:lang w:eastAsia="pt-PT"/>
+        </w:rPr>
+        <w:t>.</w:t>
+      </w:r>
+    </w:p>
+    <w:p>
+      <w:pPr>
+        <w:rPr>
+          <w:rFonts w:ascii="Arial" w:hAnsi="Arial" w:cs="Arial"/>
+          <w:lang w:eastAsia="pt-PT"/>
+        </w:rPr>
+      </w:pPr>
+      <w:r>
+        <w:rPr>
+          <w:rFonts w:ascii="Arial" w:hAnsi="Arial" w:cs="Arial"/>
+          <w:lang w:eastAsia="pt-PT"/>
+        </w:rPr>
+        <w:t xml:space="preserve">Finally, lemmatization was applied to reduce words to their base forms while preserving their semantic meaning. This helped reduce vocabulary size and group together related word variants (e.g., </w:t>
+      </w:r>
+      <w:r>
+        <w:rPr>
+          <w:rFonts w:ascii="Arial" w:hAnsi="Arial" w:cs="Arial"/>
+          <w:i/>
+          <w:iCs/>
+          <w:lang w:eastAsia="pt-PT"/>
+        </w:rPr>
+        <w:t>raises</w:t>
+      </w:r>
+      <w:r>
+        <w:rPr>
+          <w:rFonts w:ascii="Arial" w:hAnsi="Arial" w:cs="Arial"/>
+          <w:lang w:eastAsia="pt-PT"/>
+        </w:rPr>
+        <w:t xml:space="preserve">, </w:t>
+      </w:r>
+      <w:r>
+        <w:rPr>
+          <w:rFonts w:ascii="Arial" w:hAnsi="Arial" w:cs="Arial"/>
+          <w:i/>
+          <w:iCs/>
+          <w:lang w:eastAsia="pt-PT"/>
+        </w:rPr>
+        <w:t>raised</w:t>
+      </w:r>
+      <w:r>
+        <w:rPr>
+          <w:rFonts w:ascii="Arial" w:hAnsi="Arial" w:cs="Arial"/>
+          <w:lang w:eastAsia="pt-PT"/>
+        </w:rPr>
+        <w:t xml:space="preserve">, and </w:t>
+      </w:r>
+      <w:r>
+        <w:rPr>
+          <w:rFonts w:ascii="Arial" w:hAnsi="Arial" w:cs="Arial"/>
+          <w:i/>
+          <w:iCs/>
+          <w:lang w:eastAsia="pt-PT"/>
+        </w:rPr>
+        <w:t>raising</w:t>
+      </w:r>
+      <w:r>
+        <w:rPr>
+          <w:rFonts w:ascii="Arial" w:hAnsi="Arial" w:cs="Arial"/>
+          <w:lang w:eastAsia="pt-PT"/>
+        </w:rPr>
+        <w:t>). An optional stemming stage was also available, although lemmatization was preferred because it is less aggressive and better suited to maintaining the interpretability of financial language.</w:t>
+      </w:r>
+    </w:p>
+    <w:p>
+      <w:pPr>
+        <w:pStyle w:val="Ttulo1"/>
+        <w:rPr>
+          <w:rFonts w:ascii="Arial" w:hAnsi="Arial" w:cs="Arial"/>
+        </w:rPr>
+      </w:pPr>
+      <w:bookmarkStart w:id="16" w:name="_Toc228445051"/>
+      <w:r>
+        <w:rPr>
+          <w:rFonts w:ascii="Arial" w:hAnsi="Arial" w:cs="Arial"/>
+        </w:rPr>
+        <w:t>Evaluation</w:t>
+      </w:r>
+      <w:r>
+        <w:rPr>
+          <w:rFonts w:ascii="Arial" w:hAnsi="Arial" w:cs="Arial"/>
+        </w:rPr>
+        <w:t xml:space="preserve"> Methodology</w:t>
       </w:r>
       <w:bookmarkEnd w:id="16"/>
     </w:p>
@@ -3062,21 +3450,12 @@
           <w:rFonts w:ascii="Arial" w:hAnsi="Arial" w:cs="Arial"/>
         </w:rPr>
       </w:pPr>
-      <w:bookmarkStart w:id="17" w:name="_Toc228445051"/>
-      <w:proofErr w:type="gramStart"/>
-      <w:r>
-        <w:rPr>
-          <w:rFonts w:ascii="Arial" w:hAnsi="Arial" w:cs="Arial"/>
-        </w:rPr>
-        <w:lastRenderedPageBreak/>
-        <w:t>Evaluation</w:t>
-      </w:r>
-      <w:proofErr w:type="gramEnd"/>
-      <w:r>
-        <w:rPr>
-          <w:rFonts w:ascii="Arial" w:hAnsi="Arial" w:cs="Arial"/>
-        </w:rPr>
-        <w:t xml:space="preserve"> Methodology</w:t>
+      <w:bookmarkStart w:id="17" w:name="_Toc228445052"/>
+      <w:r>
+        <w:rPr>
+          <w:rFonts w:ascii="Arial" w:hAnsi="Arial" w:cs="Arial"/>
+        </w:rPr>
+        <w:t>Model Development &amp; Iterative Improvements</w:t>
       </w:r>
       <w:bookmarkEnd w:id="17"/>
     </w:p>
@@ -3087,6 +3466,13 @@
           <w:lang w:eastAsia="pt-PT"/>
         </w:rPr>
       </w:pPr>
+      <w:r>
+        <w:rPr>
+          <w:rFonts w:ascii="Arial" w:hAnsi="Arial" w:cs="Arial"/>
+          <w:lang w:eastAsia="pt-PT"/>
+        </w:rPr>
+        <w:t xml:space="preserve"> </w:t>
+      </w:r>
     </w:p>
     <w:p>
       <w:pPr>
@@ -3095,12 +3481,27 @@
           <w:rFonts w:ascii="Arial" w:hAnsi="Arial" w:cs="Arial"/>
         </w:rPr>
       </w:pPr>
-      <w:bookmarkStart w:id="18" w:name="_Toc228445052"/>
-      <w:r>
-        <w:rPr>
-          <w:rFonts w:ascii="Arial" w:hAnsi="Arial" w:cs="Arial"/>
-        </w:rPr>
-        <w:t>Model Development &amp; Iterative Improvements</w:t>
+      <w:bookmarkStart w:id="18" w:name="_Toc228445053"/>
+      <w:r>
+        <w:rPr>
+          <w:rFonts w:ascii="Arial" w:hAnsi="Arial" w:cs="Arial"/>
+        </w:rPr>
+        <w:t xml:space="preserve">Results </w:t>
+      </w:r>
+      <w:bookmarkStart w:id="19" w:name="_Toc410990277"/>
+      <w:bookmarkStart w:id="20" w:name="_Toc410990289"/>
+      <w:bookmarkStart w:id="21" w:name="_Toc412186402"/>
+      <w:bookmarkStart w:id="22" w:name="_Toc412186507"/>
+      <w:bookmarkStart w:id="23" w:name="_Toc412186532"/>
+      <w:bookmarkStart w:id="24" w:name="_Toc412186603"/>
+      <w:bookmarkStart w:id="25" w:name="_Toc412186633"/>
+      <w:bookmarkStart w:id="26" w:name="_Toc115296810"/>
+      <w:bookmarkStart w:id="27" w:name="_Toc141959339"/>
+      <w:r>
+        <w:rPr>
+          <w:rFonts w:ascii="Arial" w:hAnsi="Arial" w:cs="Arial"/>
+        </w:rPr>
+        <w:t>And Critical Analysis</w:t>
       </w:r>
       <w:bookmarkEnd w:id="18"/>
     </w:p>
@@ -3111,13 +3512,6 @@
           <w:lang w:eastAsia="pt-PT"/>
         </w:rPr>
       </w:pPr>
-      <w:r>
-        <w:rPr>
-          <w:rFonts w:ascii="Arial" w:hAnsi="Arial" w:cs="Arial"/>
-          <w:lang w:eastAsia="pt-PT"/>
-        </w:rPr>
-        <w:t xml:space="preserve"> </w:t>
-      </w:r>
     </w:p>
     <w:p>
       <w:pPr>
@@ -3126,194 +3520,156 @@
           <w:rFonts w:ascii="Arial" w:hAnsi="Arial" w:cs="Arial"/>
         </w:rPr>
       </w:pPr>
-      <w:bookmarkStart w:id="19" w:name="_Toc228445053"/>
-      <w:r>
-        <w:rPr>
-          <w:rFonts w:ascii="Arial" w:hAnsi="Arial" w:cs="Arial"/>
-        </w:rPr>
-        <w:t xml:space="preserve">Results </w:t>
-      </w:r>
-      <w:bookmarkStart w:id="20" w:name="_Toc410990277"/>
-      <w:bookmarkStart w:id="21" w:name="_Toc410990289"/>
-      <w:bookmarkStart w:id="22" w:name="_Toc412186402"/>
-      <w:bookmarkStart w:id="23" w:name="_Toc412186507"/>
-      <w:bookmarkStart w:id="24" w:name="_Toc412186532"/>
-      <w:bookmarkStart w:id="25" w:name="_Toc412186603"/>
-      <w:bookmarkStart w:id="26" w:name="_Toc412186633"/>
-      <w:bookmarkStart w:id="27" w:name="_Toc115296810"/>
-      <w:bookmarkStart w:id="28" w:name="_Toc141959339"/>
-      <w:r>
-        <w:rPr>
-          <w:rFonts w:ascii="Arial" w:hAnsi="Arial" w:cs="Arial"/>
-        </w:rPr>
-        <w:t>And Critical Analysis</w:t>
-      </w:r>
-      <w:bookmarkEnd w:id="19"/>
-    </w:p>
-    <w:p>
-      <w:pPr>
-        <w:rPr>
-          <w:rFonts w:ascii="Arial" w:hAnsi="Arial" w:cs="Arial"/>
-          <w:lang w:eastAsia="pt-PT"/>
-        </w:rPr>
-      </w:pPr>
-    </w:p>
-    <w:p>
-      <w:pPr>
-        <w:pStyle w:val="Ttulo1"/>
-        <w:rPr>
-          <w:rFonts w:ascii="Arial" w:hAnsi="Arial" w:cs="Arial"/>
-        </w:rPr>
-      </w:pPr>
-      <w:bookmarkStart w:id="29" w:name="_Toc228445054"/>
+      <w:bookmarkStart w:id="28" w:name="_Toc228445054"/>
       <w:r>
         <w:rPr>
           <w:rFonts w:ascii="Arial" w:hAnsi="Arial" w:cs="Arial"/>
         </w:rPr>
         <w:t>Conclusion</w:t>
       </w:r>
-      <w:bookmarkEnd w:id="29"/>
-    </w:p>
-    <w:p>
-      <w:pPr>
-        <w:rPr>
-          <w:lang w:eastAsia="pt-PT"/>
-        </w:rPr>
-      </w:pPr>
-    </w:p>
-    <w:p>
-      <w:pPr>
-        <w:rPr>
-          <w:lang w:eastAsia="pt-PT"/>
-        </w:rPr>
-      </w:pPr>
-    </w:p>
-    <w:p>
-      <w:pPr>
-        <w:rPr>
-          <w:lang w:eastAsia="pt-PT"/>
-        </w:rPr>
-      </w:pPr>
-    </w:p>
-    <w:p>
-      <w:pPr>
-        <w:rPr>
-          <w:lang w:eastAsia="pt-PT"/>
-        </w:rPr>
-      </w:pPr>
-    </w:p>
-    <w:p>
-      <w:pPr>
-        <w:rPr>
-          <w:lang w:eastAsia="pt-PT"/>
-        </w:rPr>
-      </w:pPr>
-    </w:p>
-    <w:p>
-      <w:pPr>
-        <w:rPr>
-          <w:lang w:eastAsia="pt-PT"/>
-        </w:rPr>
-      </w:pPr>
-    </w:p>
-    <w:p>
-      <w:pPr>
-        <w:rPr>
-          <w:lang w:eastAsia="pt-PT"/>
-        </w:rPr>
-      </w:pPr>
-    </w:p>
-    <w:p>
-      <w:pPr>
-        <w:rPr>
-          <w:lang w:eastAsia="pt-PT"/>
-        </w:rPr>
-      </w:pPr>
-    </w:p>
-    <w:p>
-      <w:pPr>
-        <w:rPr>
-          <w:lang w:eastAsia="pt-PT"/>
-        </w:rPr>
-      </w:pPr>
-    </w:p>
-    <w:p>
-      <w:pPr>
-        <w:rPr>
-          <w:lang w:eastAsia="pt-PT"/>
-        </w:rPr>
-      </w:pPr>
-    </w:p>
-    <w:p>
-      <w:pPr>
-        <w:rPr>
-          <w:lang w:eastAsia="pt-PT"/>
-        </w:rPr>
-      </w:pPr>
-    </w:p>
-    <w:p>
-      <w:pPr>
-        <w:rPr>
-          <w:lang w:eastAsia="pt-PT"/>
-        </w:rPr>
-      </w:pPr>
-    </w:p>
-    <w:p>
-      <w:pPr>
-        <w:rPr>
-          <w:lang w:eastAsia="pt-PT"/>
-        </w:rPr>
-      </w:pPr>
-    </w:p>
-    <w:p>
-      <w:pPr>
-        <w:rPr>
-          <w:lang w:eastAsia="pt-PT"/>
-        </w:rPr>
-      </w:pPr>
-    </w:p>
-    <w:p>
-      <w:pPr>
-        <w:rPr>
-          <w:lang w:eastAsia="pt-PT"/>
-        </w:rPr>
-      </w:pPr>
-    </w:p>
-    <w:p>
-      <w:pPr>
-        <w:rPr>
-          <w:lang w:eastAsia="pt-PT"/>
-        </w:rPr>
-      </w:pPr>
-    </w:p>
-    <w:p>
-      <w:pPr>
-        <w:rPr>
-          <w:lang w:eastAsia="pt-PT"/>
-        </w:rPr>
-      </w:pPr>
-    </w:p>
-    <w:p>
-      <w:pPr>
-        <w:rPr>
-          <w:lang w:eastAsia="pt-PT"/>
-        </w:rPr>
-      </w:pPr>
-    </w:p>
-    <w:p>
-      <w:pPr>
-        <w:rPr>
-          <w:lang w:eastAsia="pt-PT"/>
-        </w:rPr>
-      </w:pPr>
-    </w:p>
-    <w:p>
-      <w:pPr>
-        <w:rPr>
-          <w:lang w:eastAsia="pt-PT"/>
-        </w:rPr>
-      </w:pPr>
-    </w:p>
+      <w:bookmarkEnd w:id="28"/>
+    </w:p>
+    <w:p>
+      <w:pPr>
+        <w:rPr>
+          <w:lang w:eastAsia="pt-PT"/>
+        </w:rPr>
+      </w:pPr>
+    </w:p>
+    <w:p>
+      <w:pPr>
+        <w:rPr>
+          <w:lang w:eastAsia="pt-PT"/>
+        </w:rPr>
+      </w:pPr>
+    </w:p>
+    <w:p>
+      <w:pPr>
+        <w:rPr>
+          <w:lang w:eastAsia="pt-PT"/>
+        </w:rPr>
+      </w:pPr>
+    </w:p>
+    <w:p>
+      <w:pPr>
+        <w:rPr>
+          <w:lang w:eastAsia="pt-PT"/>
+        </w:rPr>
+      </w:pPr>
+    </w:p>
+    <w:p>
+      <w:pPr>
+        <w:rPr>
+          <w:lang w:eastAsia="pt-PT"/>
+        </w:rPr>
+      </w:pPr>
+    </w:p>
+    <w:p>
+      <w:pPr>
+        <w:rPr>
+          <w:lang w:eastAsia="pt-PT"/>
+        </w:rPr>
+      </w:pPr>
+    </w:p>
+    <w:p>
+      <w:pPr>
+        <w:rPr>
+          <w:lang w:eastAsia="pt-PT"/>
+        </w:rPr>
+      </w:pPr>
+    </w:p>
+    <w:p>
+      <w:pPr>
+        <w:rPr>
+          <w:lang w:eastAsia="pt-PT"/>
+        </w:rPr>
+      </w:pPr>
+    </w:p>
+    <w:p>
+      <w:pPr>
+        <w:rPr>
+          <w:lang w:eastAsia="pt-PT"/>
+        </w:rPr>
+      </w:pPr>
+    </w:p>
+    <w:p>
+      <w:pPr>
+        <w:rPr>
+          <w:lang w:eastAsia="pt-PT"/>
+        </w:rPr>
+      </w:pPr>
+    </w:p>
+    <w:p>
+      <w:pPr>
+        <w:rPr>
+          <w:lang w:eastAsia="pt-PT"/>
+        </w:rPr>
+      </w:pPr>
+    </w:p>
+    <w:p>
+      <w:pPr>
+        <w:rPr>
+          <w:lang w:eastAsia="pt-PT"/>
+        </w:rPr>
+      </w:pPr>
+    </w:p>
+    <w:p>
+      <w:pPr>
+        <w:rPr>
+          <w:lang w:eastAsia="pt-PT"/>
+        </w:rPr>
+      </w:pPr>
+    </w:p>
+    <w:p>
+      <w:pPr>
+        <w:rPr>
+          <w:lang w:eastAsia="pt-PT"/>
+        </w:rPr>
+      </w:pPr>
+    </w:p>
+    <w:p>
+      <w:pPr>
+        <w:rPr>
+          <w:lang w:eastAsia="pt-PT"/>
+        </w:rPr>
+      </w:pPr>
+    </w:p>
+    <w:p>
+      <w:pPr>
+        <w:rPr>
+          <w:lang w:eastAsia="pt-PT"/>
+        </w:rPr>
+      </w:pPr>
+    </w:p>
+    <w:p>
+      <w:pPr>
+        <w:rPr>
+          <w:lang w:eastAsia="pt-PT"/>
+        </w:rPr>
+      </w:pPr>
+    </w:p>
+    <w:p>
+      <w:pPr>
+        <w:rPr>
+          <w:lang w:eastAsia="pt-PT"/>
+        </w:rPr>
+      </w:pPr>
+    </w:p>
+    <w:p>
+      <w:pPr>
+        <w:rPr>
+          <w:lang w:eastAsia="pt-PT"/>
+        </w:rPr>
+      </w:pPr>
+    </w:p>
+    <w:p>
+      <w:pPr>
+        <w:rPr>
+          <w:lang w:eastAsia="pt-PT"/>
+        </w:rPr>
+      </w:pPr>
+    </w:p>
+    <w:bookmarkEnd w:id="19"/>
     <w:bookmarkEnd w:id="20"/>
     <w:bookmarkEnd w:id="21"/>
     <w:bookmarkEnd w:id="22"/>
@@ -3322,7 +3678,6 @@
     <w:bookmarkEnd w:id="25"/>
     <w:bookmarkEnd w:id="26"/>
     <w:bookmarkEnd w:id="27"/>
-    <w:bookmarkEnd w:id="28"/>
     <w:p>
       <w:pPr>
         <w:spacing w:after="0" w:line="240" w:lineRule="auto"/>
@@ -3339,32 +3694,32 @@
           <w:rFonts w:ascii="Arial" w:hAnsi="Arial" w:cs="Arial"/>
         </w:rPr>
       </w:pPr>
-      <w:bookmarkStart w:id="30" w:name="_Toc410990278"/>
-      <w:bookmarkStart w:id="31" w:name="_Toc410990290"/>
-      <w:bookmarkStart w:id="32" w:name="_Toc412186403"/>
-      <w:bookmarkStart w:id="33" w:name="_Toc412186508"/>
-      <w:bookmarkStart w:id="34" w:name="_Toc412186533"/>
-      <w:bookmarkStart w:id="35" w:name="_Toc412186604"/>
-      <w:bookmarkStart w:id="36" w:name="_Toc412186634"/>
-      <w:bookmarkStart w:id="37" w:name="_Toc115296811"/>
-      <w:bookmarkStart w:id="38" w:name="_Toc141959340"/>
-      <w:bookmarkStart w:id="39" w:name="_Toc228445055"/>
-      <w:r>
-        <w:rPr>
-          <w:rFonts w:ascii="Arial" w:hAnsi="Arial" w:cs="Arial"/>
-        </w:rPr>
-        <w:lastRenderedPageBreak/>
+      <w:bookmarkStart w:id="29" w:name="_Toc410990278"/>
+      <w:bookmarkStart w:id="30" w:name="_Toc410990290"/>
+      <w:bookmarkStart w:id="31" w:name="_Toc412186403"/>
+      <w:bookmarkStart w:id="32" w:name="_Toc412186508"/>
+      <w:bookmarkStart w:id="33" w:name="_Toc412186533"/>
+      <w:bookmarkStart w:id="34" w:name="_Toc412186604"/>
+      <w:bookmarkStart w:id="35" w:name="_Toc412186634"/>
+      <w:bookmarkStart w:id="36" w:name="_Toc115296811"/>
+      <w:bookmarkStart w:id="37" w:name="_Toc141959340"/>
+      <w:bookmarkStart w:id="38" w:name="_Toc228445055"/>
+      <w:r>
+        <w:rPr>
+          <w:rFonts w:ascii="Arial" w:hAnsi="Arial" w:cs="Arial"/>
+        </w:rPr>
         <w:t>Appendix</w:t>
       </w:r>
-      <w:bookmarkStart w:id="40" w:name="_Toc410990279"/>
-      <w:bookmarkStart w:id="41" w:name="_Toc410990291"/>
-      <w:bookmarkStart w:id="42" w:name="_Toc412186404"/>
-      <w:bookmarkStart w:id="43" w:name="_Toc412186509"/>
-      <w:bookmarkStart w:id="44" w:name="_Toc412186534"/>
-      <w:bookmarkStart w:id="45" w:name="_Toc412186605"/>
-      <w:bookmarkStart w:id="46" w:name="_Toc412186635"/>
-      <w:bookmarkStart w:id="47" w:name="_Toc115296812"/>
-      <w:bookmarkStart w:id="48" w:name="_Toc141959341"/>
+      <w:bookmarkStart w:id="39" w:name="_Toc410990279"/>
+      <w:bookmarkStart w:id="40" w:name="_Toc410990291"/>
+      <w:bookmarkStart w:id="41" w:name="_Toc412186404"/>
+      <w:bookmarkStart w:id="42" w:name="_Toc412186509"/>
+      <w:bookmarkStart w:id="43" w:name="_Toc412186534"/>
+      <w:bookmarkStart w:id="44" w:name="_Toc412186605"/>
+      <w:bookmarkStart w:id="45" w:name="_Toc412186635"/>
+      <w:bookmarkStart w:id="46" w:name="_Toc115296812"/>
+      <w:bookmarkStart w:id="47" w:name="_Toc141959341"/>
+      <w:bookmarkEnd w:id="29"/>
       <w:bookmarkEnd w:id="30"/>
       <w:bookmarkEnd w:id="31"/>
       <w:bookmarkEnd w:id="32"/>
@@ -3374,22 +3729,21 @@
       <w:bookmarkEnd w:id="36"/>
       <w:bookmarkEnd w:id="37"/>
       <w:bookmarkEnd w:id="38"/>
-      <w:bookmarkEnd w:id="39"/>
-    </w:p>
-    <w:p>
-      <w:pPr>
-        <w:rPr>
-          <w:lang w:eastAsia="pt-PT"/>
-        </w:rPr>
-      </w:pPr>
-    </w:p>
-    <w:p>
-      <w:pPr>
-        <w:rPr>
-          <w:lang w:eastAsia="pt-PT"/>
-        </w:rPr>
-      </w:pPr>
-      <w:bookmarkStart w:id="49" w:name="Figure1"/>
+    </w:p>
+    <w:p>
+      <w:pPr>
+        <w:rPr>
+          <w:lang w:eastAsia="pt-PT"/>
+        </w:rPr>
+      </w:pPr>
+    </w:p>
+    <w:p>
+      <w:pPr>
+        <w:rPr>
+          <w:lang w:eastAsia="pt-PT"/>
+        </w:rPr>
+      </w:pPr>
+      <w:bookmarkStart w:id="48" w:name="Figure1"/>
       <w:r>
         <w:rPr>
           <w:noProof/>
@@ -3445,7 +3799,7 @@
           </wp:anchor>
         </w:drawing>
       </w:r>
-      <w:bookmarkEnd w:id="49"/>
+      <w:bookmarkEnd w:id="48"/>
     </w:p>
     <w:p>
       <w:pPr>
@@ -3572,7 +3926,7 @@
           <w:lang w:eastAsia="pt-PT"/>
         </w:rPr>
       </w:pPr>
-      <w:bookmarkStart w:id="50" w:name="Figure2"/>
+      <w:bookmarkStart w:id="49" w:name="Figure2"/>
       <w:r>
         <w:rPr>
           <w:rFonts w:ascii="Arial" w:hAnsi="Arial" w:cs="Arial"/>
@@ -3633,7 +3987,7 @@
           </wp:anchor>
         </w:drawing>
       </w:r>
-      <w:bookmarkEnd w:id="50"/>
+      <w:bookmarkEnd w:id="49"/>
     </w:p>
     <w:p>
       <w:pPr>
@@ -3725,7 +4079,7 @@
           <w:lang w:eastAsia="pt-PT"/>
         </w:rPr>
       </w:pPr>
-      <w:bookmarkStart w:id="51" w:name="Figure3"/>
+      <w:bookmarkStart w:id="50" w:name="Figure3"/>
       <w:r>
         <w:rPr>
           <w:rFonts w:ascii="Arial" w:hAnsi="Arial" w:cs="Arial"/>
@@ -3786,7 +4140,7 @@
           </wp:anchor>
         </w:drawing>
       </w:r>
-      <w:bookmarkEnd w:id="51"/>
+      <w:bookmarkEnd w:id="50"/>
       <w:r>
         <w:rPr>
           <w:rFonts w:ascii="Arial" w:hAnsi="Arial" w:cs="Arial"/>
@@ -3896,7 +4250,7 @@
           <w:lang w:eastAsia="pt-PT"/>
         </w:rPr>
       </w:pPr>
-      <w:bookmarkStart w:id="52" w:name="Figure4"/>
+      <w:bookmarkStart w:id="51" w:name="Figure4"/>
       <w:r>
         <w:rPr>
           <w:rFonts w:ascii="Arial" w:hAnsi="Arial" w:cs="Arial"/>
@@ -3908,7 +4262,7 @@
           <w:lang w:eastAsia="pt-PT"/>
         </w:rPr>
         <w:drawing>
-          <wp:anchor distT="0" distB="0" distL="114300" distR="114300" simplePos="0" relativeHeight="251660288" behindDoc="1" locked="0" layoutInCell="1" allowOverlap="1" wp14:anchorId="6BE2B909" wp14:editId="78C1E000">
+          <wp:anchor distT="0" distB="0" distL="114300" distR="114300" simplePos="0" relativeHeight="251660288" behindDoc="1" locked="0" layoutInCell="1" allowOverlap="1" wp14:anchorId="6BE2B909" wp14:editId="09D6A0D9">
             <wp:simplePos x="0" y="0"/>
             <wp:positionH relativeFrom="margin">
               <wp:align>center</wp:align>
@@ -3963,7 +4317,7 @@
           </wp:anchor>
         </w:drawing>
       </w:r>
-      <w:bookmarkEnd w:id="52"/>
+      <w:bookmarkEnd w:id="51"/>
       <w:r>
         <w:rPr>
           <w:rFonts w:ascii="Arial" w:hAnsi="Arial" w:cs="Arial"/>
@@ -4112,7 +4466,7 @@
           <w:lang w:eastAsia="pt-PT"/>
         </w:rPr>
       </w:pPr>
-      <w:bookmarkStart w:id="53" w:name="Figure5"/>
+      <w:bookmarkStart w:id="52" w:name="Figure5"/>
       <w:r>
         <w:rPr>
           <w:rFonts w:ascii="Arial" w:hAnsi="Arial" w:cs="Arial"/>
@@ -4123,7 +4477,6 @@
           <w:szCs w:val="20"/>
           <w:lang w:eastAsia="pt-PT"/>
         </w:rPr>
-        <w:lastRenderedPageBreak/>
         <w:drawing>
           <wp:inline distT="0" distB="0" distL="0" distR="0" wp14:anchorId="4E9E3D37" wp14:editId="73D1DC4A">
             <wp:extent cx="5759450" cy="3164840"/>
@@ -4160,7 +4513,7 @@
           </wp:inline>
         </w:drawing>
       </w:r>
-      <w:bookmarkEnd w:id="53"/>
+      <w:bookmarkEnd w:id="52"/>
     </w:p>
     <w:p>
       <w:pPr>
@@ -4198,7 +4551,7 @@
           <w:lang w:eastAsia="pt-PT"/>
         </w:rPr>
       </w:pPr>
-      <w:bookmarkStart w:id="54" w:name="Figure6"/>
+      <w:bookmarkStart w:id="53" w:name="Figure6"/>
       <w:r>
         <w:rPr>
           <w:rFonts w:ascii="Arial" w:hAnsi="Arial" w:cs="Arial"/>
@@ -4259,7 +4612,7 @@
           </wp:anchor>
         </w:drawing>
       </w:r>
-      <w:bookmarkEnd w:id="54"/>
+      <w:bookmarkEnd w:id="53"/>
     </w:p>
     <w:p>
       <w:pPr>
@@ -4386,10 +4739,12 @@
           <w:szCs w:val="20"/>
           <w:lang w:eastAsia="pt-PT"/>
         </w:rPr>
-        <w:t xml:space="preserve">Figure 6: Class statistics regarding average number of characters, words and presence of URL and </w:t>
-      </w:r>
-      <w:proofErr w:type="spellStart"/>
-      <w:r>
+        <w:t>Figure 6: Class statistics regarding average number of characters, words and presence of URL and cashtag</w:t>
+      </w:r>
+    </w:p>
+    <w:p>
+      <w:pPr>
+        <w:jc w:val="center"/>
         <w:rPr>
           <w:rFonts w:ascii="Arial" w:hAnsi="Arial" w:cs="Arial"/>
           <w:i/>
@@ -4398,21 +4753,6 @@
           <w:szCs w:val="20"/>
           <w:lang w:eastAsia="pt-PT"/>
         </w:rPr>
-        <w:t>cashtag</w:t>
-      </w:r>
-      <w:proofErr w:type="spellEnd"/>
-    </w:p>
-    <w:p>
-      <w:pPr>
-        <w:jc w:val="center"/>
-        <w:rPr>
-          <w:rFonts w:ascii="Arial" w:hAnsi="Arial" w:cs="Arial"/>
-          <w:i/>
-          <w:iCs/>
-          <w:sz w:val="20"/>
-          <w:szCs w:val="20"/>
-          <w:lang w:eastAsia="pt-PT"/>
-        </w:rPr>
       </w:pPr>
     </w:p>
     <w:p>
@@ -4422,15 +4762,17 @@
           <w:rFonts w:ascii="Arial" w:hAnsi="Arial" w:cs="Arial"/>
         </w:rPr>
       </w:pPr>
-      <w:bookmarkStart w:id="55" w:name="_Annexes"/>
-      <w:bookmarkStart w:id="56" w:name="_Toc228445056"/>
-      <w:bookmarkEnd w:id="55"/>
-      <w:r>
-        <w:rPr>
-          <w:rFonts w:ascii="Arial" w:hAnsi="Arial" w:cs="Arial"/>
-        </w:rPr>
+      <w:bookmarkStart w:id="54" w:name="_Annexes"/>
+      <w:bookmarkStart w:id="55" w:name="_Toc228445056"/>
+      <w:bookmarkEnd w:id="54"/>
+      <w:r>
+        <w:rPr>
+          <w:rFonts w:ascii="Arial" w:hAnsi="Arial" w:cs="Arial"/>
+        </w:rPr>
+        <w:lastRenderedPageBreak/>
         <w:t>Annexes</w:t>
       </w:r>
+      <w:bookmarkEnd w:id="39"/>
       <w:bookmarkEnd w:id="40"/>
       <w:bookmarkEnd w:id="41"/>
       <w:bookmarkEnd w:id="42"/>
@@ -4439,8 +4781,7 @@
       <w:bookmarkEnd w:id="45"/>
       <w:bookmarkEnd w:id="46"/>
       <w:bookmarkEnd w:id="47"/>
-      <w:bookmarkEnd w:id="48"/>
-      <w:bookmarkEnd w:id="56"/>
+      <w:bookmarkEnd w:id="55"/>
       <w:r>
         <w:rPr>
           <w:rFonts w:ascii="Arial" w:hAnsi="Arial" w:cs="Arial"/>
@@ -6366,7 +6707,6 @@
   <w:style w:type="character" w:default="1" w:styleId="Tipodeletrapredefinidodopargrafo">
     <w:name w:val="Default Paragraph Font"/>
     <w:uiPriority w:val="1"/>
-    <w:semiHidden/>
     <w:unhideWhenUsed/>
   </w:style>
   <w:style w:type="table" w:default="1" w:styleId="Tabelanormal">
@@ -7332,9 +7672,12 @@
 </file>
 
 <file path=customXml/item2.xml><?xml version="1.0" encoding="utf-8"?>
-<p:properties xmlns:p="http://schemas.microsoft.com/office/2006/metadata/properties" xmlns:xsi="http://www.w3.org/2001/XMLSchema-instance" xmlns:pc="http://schemas.microsoft.com/office/infopath/2007/PartnerControls">
-  <documentManagement/>
-</p:properties>
+<?mso-contentType ?>
+<FormTemplates xmlns="http://schemas.microsoft.com/sharepoint/v3/contenttype/forms">
+  <Display>DocumentLibraryForm</Display>
+  <Edit>DocumentLibraryForm</Edit>
+  <New>DocumentLibraryForm</New>
+</FormTemplates>
 </file>
 
 <file path=customXml/item3.xml><?xml version="1.0" encoding="utf-8"?>
@@ -7482,12 +7825,9 @@
 </file>
 
 <file path=customXml/item4.xml><?xml version="1.0" encoding="utf-8"?>
-<?mso-contentType ?>
-<FormTemplates xmlns="http://schemas.microsoft.com/sharepoint/v3/contenttype/forms">
-  <Display>DocumentLibraryForm</Display>
-  <Edit>DocumentLibraryForm</Edit>
-  <New>DocumentLibraryForm</New>
-</FormTemplates>
+<p:properties xmlns:p="http://schemas.microsoft.com/office/2006/metadata/properties" xmlns:xsi="http://www.w3.org/2001/XMLSchema-instance" xmlns:pc="http://schemas.microsoft.com/office/infopath/2007/PartnerControls">
+  <documentManagement/>
+</p:properties>
 </file>
 
 <file path=customXml/itemProps1.xml><?xml version="1.0" encoding="utf-8"?>
@@ -7499,10 +7839,9 @@
 </file>
 
 <file path=customXml/itemProps2.xml><?xml version="1.0" encoding="utf-8"?>
-<ds:datastoreItem xmlns:ds="http://schemas.openxmlformats.org/officeDocument/2006/customXml" ds:itemID="{FA1E1BA7-7F9D-4F2A-A01A-7DD974292B82}">
+<ds:datastoreItem xmlns:ds="http://schemas.openxmlformats.org/officeDocument/2006/customXml" ds:itemID="{59B26DD8-52A3-42CA-81B0-F4B8F09A41AF}">
   <ds:schemaRefs>
-    <ds:schemaRef ds:uri="http://schemas.microsoft.com/office/2006/metadata/properties"/>
-    <ds:schemaRef ds:uri="http://schemas.microsoft.com/office/infopath/2007/PartnerControls"/>
+    <ds:schemaRef ds:uri="http://schemas.microsoft.com/sharepoint/v3/contenttype/forms"/>
   </ds:schemaRefs>
 </ds:datastoreItem>
 </file>
@@ -7526,9 +7865,10 @@
 </file>
 
 <file path=customXml/itemProps4.xml><?xml version="1.0" encoding="utf-8"?>
-<ds:datastoreItem xmlns:ds="http://schemas.openxmlformats.org/officeDocument/2006/customXml" ds:itemID="{59B26DD8-52A3-42CA-81B0-F4B8F09A41AF}">
+<ds:datastoreItem xmlns:ds="http://schemas.openxmlformats.org/officeDocument/2006/customXml" ds:itemID="{FA1E1BA7-7F9D-4F2A-A01A-7DD974292B82}">
   <ds:schemaRefs>
-    <ds:schemaRef ds:uri="http://schemas.microsoft.com/sharepoint/v3/contenttype/forms"/>
+    <ds:schemaRef ds:uri="http://schemas.microsoft.com/office/2006/metadata/properties"/>
+    <ds:schemaRef ds:uri="http://schemas.microsoft.com/office/infopath/2007/PartnerControls"/>
   </ds:schemaRefs>
 </ds:datastoreItem>
 </file>
</xml_diff>

<commit_message>
*UPDATED* both notebook and report, transformer models are getting suspiciously low f1 scores in final evaluation
</commit_message>
<xml_diff>
--- a/Text_Mining_Report.docx
+++ b/Text_Mining_Report.docx
@@ -13,11 +13,19 @@
           <w:color w:val="5C666C"/>
         </w:rPr>
       </w:pPr>
+      <w:proofErr w:type="gramStart"/>
       <w:r>
         <w:rPr>
           <w:color w:val="5C666C"/>
         </w:rPr>
-        <w:t>Master in Data Science and Advanced Analytics</w:t>
+        <w:t>Master in Data Science and Advanced</w:t>
+      </w:r>
+      <w:proofErr w:type="gramEnd"/>
+      <w:r>
+        <w:rPr>
+          <w:color w:val="5C666C"/>
+        </w:rPr>
+        <w:t xml:space="preserve"> Analytics</w:t>
       </w:r>
     </w:p>
     <w:p>
@@ -51,8 +59,36 @@
           <w:color w:val="5C666C"/>
           <w:lang w:val="pt-PT"/>
         </w:rPr>
-        <w:t>NOVA Information Management School</w:t>
-      </w:r>
+        <w:t xml:space="preserve">NOVA </w:t>
+      </w:r>
+      <w:proofErr w:type="spellStart"/>
+      <w:r>
+        <w:rPr>
+          <w:b/>
+          <w:color w:val="5C666C"/>
+          <w:lang w:val="pt-PT"/>
+        </w:rPr>
+        <w:t>Information</w:t>
+      </w:r>
+      <w:proofErr w:type="spellEnd"/>
+      <w:r>
+        <w:rPr>
+          <w:b/>
+          <w:color w:val="5C666C"/>
+          <w:lang w:val="pt-PT"/>
+        </w:rPr>
+        <w:t xml:space="preserve"> Management </w:t>
+      </w:r>
+      <w:proofErr w:type="spellStart"/>
+      <w:r>
+        <w:rPr>
+          <w:b/>
+          <w:color w:val="5C666C"/>
+          <w:lang w:val="pt-PT"/>
+        </w:rPr>
+        <w:t>School</w:t>
+      </w:r>
+      <w:proofErr w:type="spellEnd"/>
     </w:p>
     <w:p>
       <w:pPr>
@@ -391,16 +427,32 @@
           <w:lang w:val="pt-PT"/>
         </w:rPr>
       </w:pPr>
+      <w:proofErr w:type="spellStart"/>
       <w:r>
         <w:rPr>
           <w:lang w:val="pt-PT"/>
         </w:rPr>
-        <w:t>Sapana Dhami</w:t>
-      </w:r>
+        <w:t>Sapana</w:t>
+      </w:r>
+      <w:proofErr w:type="spellEnd"/>
       <w:r>
         <w:rPr>
           <w:lang w:val="pt-PT"/>
         </w:rPr>
+        <w:t xml:space="preserve"> </w:t>
+      </w:r>
+      <w:proofErr w:type="spellStart"/>
+      <w:r>
+        <w:rPr>
+          <w:lang w:val="pt-PT"/>
+        </w:rPr>
+        <w:t>Dhami</w:t>
+      </w:r>
+      <w:proofErr w:type="spellEnd"/>
+      <w:r>
+        <w:rPr>
+          <w:lang w:val="pt-PT"/>
+        </w:rPr>
         <w:t xml:space="preserve">, </w:t>
       </w:r>
       <w:r>
@@ -420,6 +472,34 @@
           <w:lang w:val="pt-PT"/>
         </w:rPr>
         <w:t>3</w:t>
+      </w:r>
+    </w:p>
+    <w:p>
+      <w:pPr>
+        <w:jc w:val="center"/>
+        <w:rPr>
+          <w:lang w:val="pt-PT"/>
+        </w:rPr>
+      </w:pPr>
+      <w:r>
+        <w:rPr>
+          <w:lang w:val="pt-PT"/>
+        </w:rPr>
+        <w:t xml:space="preserve">Maria Luiza </w:t>
+      </w:r>
+      <w:proofErr w:type="spellStart"/>
+      <w:r>
+        <w:rPr>
+          <w:lang w:val="pt-PT"/>
+        </w:rPr>
+        <w:t>Salum</w:t>
+      </w:r>
+      <w:proofErr w:type="spellEnd"/>
+      <w:r>
+        <w:rPr>
+          <w:lang w:val="pt-PT"/>
+        </w:rPr>
+        <w:t xml:space="preserve"> Alves Corrêa, 20221902</w:t>
       </w:r>
     </w:p>
     <w:p>
@@ -556,7 +636,7 @@
           <w:r>
             <w:fldChar w:fldCharType="separate"/>
           </w:r>
-          <w:hyperlink w:anchor="_Toc228445044" w:history="1">
+          <w:hyperlink w:anchor="_Toc231138626" w:history="1">
             <w:r>
               <w:rPr>
                 <w:rStyle w:val="Hiperligao"/>
@@ -598,7 +678,7 @@
               <w:rPr>
                 <w:webHidden/>
               </w:rPr>
-              <w:instrText xml:space="preserve"> PAGEREF _Toc228445044 \h </w:instrText>
+              <w:instrText xml:space="preserve"> PAGEREF _Toc231138626 \h </w:instrText>
             </w:r>
             <w:r>
               <w:rPr>
@@ -637,7 +717,7 @@
               <w14:ligatures w14:val="standardContextual"/>
             </w:rPr>
           </w:pPr>
-          <w:hyperlink w:anchor="_Toc228445045" w:history="1">
+          <w:hyperlink w:anchor="_Toc231138627" w:history="1">
             <w:r>
               <w:rPr>
                 <w:rStyle w:val="Hiperligao"/>
@@ -679,7 +759,7 @@
               <w:rPr>
                 <w:webHidden/>
               </w:rPr>
-              <w:instrText xml:space="preserve"> PAGEREF _Toc228445045 \h </w:instrText>
+              <w:instrText xml:space="preserve"> PAGEREF _Toc231138627 \h </w:instrText>
             </w:r>
             <w:r>
               <w:rPr>
@@ -718,7 +798,7 @@
               <w14:ligatures w14:val="standardContextual"/>
             </w:rPr>
           </w:pPr>
-          <w:hyperlink w:anchor="_Toc228445046" w:history="1">
+          <w:hyperlink w:anchor="_Toc231138628" w:history="1">
             <w:r>
               <w:rPr>
                 <w:rStyle w:val="Hiperligao"/>
@@ -760,7 +840,7 @@
               <w:rPr>
                 <w:webHidden/>
               </w:rPr>
-              <w:instrText xml:space="preserve"> PAGEREF _Toc228445046 \h </w:instrText>
+              <w:instrText xml:space="preserve"> PAGEREF _Toc231138628 \h </w:instrText>
             </w:r>
             <w:r>
               <w:rPr>
@@ -799,7 +879,7 @@
               <w14:ligatures w14:val="standardContextual"/>
             </w:rPr>
           </w:pPr>
-          <w:hyperlink w:anchor="_Toc228445047" w:history="1">
+          <w:hyperlink w:anchor="_Toc231138629" w:history="1">
             <w:r>
               <w:rPr>
                 <w:rStyle w:val="Hiperligao"/>
@@ -841,7 +921,7 @@
               <w:rPr>
                 <w:webHidden/>
               </w:rPr>
-              <w:instrText xml:space="preserve"> PAGEREF _Toc228445047 \h </w:instrText>
+              <w:instrText xml:space="preserve"> PAGEREF _Toc231138629 \h </w:instrText>
             </w:r>
             <w:r>
               <w:rPr>
@@ -880,7 +960,7 @@
               <w14:ligatures w14:val="standardContextual"/>
             </w:rPr>
           </w:pPr>
-          <w:hyperlink w:anchor="_Toc228445048" w:history="1">
+          <w:hyperlink w:anchor="_Toc231138630" w:history="1">
             <w:r>
               <w:rPr>
                 <w:rStyle w:val="Hiperligao"/>
@@ -922,7 +1002,7 @@
               <w:rPr>
                 <w:webHidden/>
               </w:rPr>
-              <w:instrText xml:space="preserve"> PAGEREF _Toc228445048 \h </w:instrText>
+              <w:instrText xml:space="preserve"> PAGEREF _Toc231138630 \h </w:instrText>
             </w:r>
             <w:r>
               <w:rPr>
@@ -940,6 +1020,249 @@
                 <w:webHidden/>
               </w:rPr>
               <w:t>1</w:t>
+            </w:r>
+            <w:r>
+              <w:rPr>
+                <w:webHidden/>
+              </w:rPr>
+              <w:fldChar w:fldCharType="end"/>
+            </w:r>
+          </w:hyperlink>
+        </w:p>
+        <w:p>
+          <w:pPr>
+            <w:pStyle w:val="ndice1"/>
+            <w:rPr>
+              <w:rFonts w:asciiTheme="minorHAnsi" w:eastAsiaTheme="minorEastAsia" w:hAnsiTheme="minorHAnsi" w:cstheme="minorBidi"/>
+              <w:kern w:val="2"/>
+              <w:sz w:val="24"/>
+              <w:szCs w:val="24"/>
+              <w:lang w:val="pt-PT"/>
+              <w14:ligatures w14:val="standardContextual"/>
+            </w:rPr>
+          </w:pPr>
+          <w:hyperlink w:anchor="_Toc231138631" w:history="1">
+            <w:r>
+              <w:rPr>
+                <w:rStyle w:val="Hiperligao"/>
+                <w:rFonts w:ascii="Arial" w:hAnsi="Arial" w:cs="Arial"/>
+              </w:rPr>
+              <w:t>3.</w:t>
+            </w:r>
+            <w:r>
+              <w:rPr>
+                <w:rFonts w:asciiTheme="minorHAnsi" w:eastAsiaTheme="minorEastAsia" w:hAnsiTheme="minorHAnsi" w:cstheme="minorBidi"/>
+                <w:kern w:val="2"/>
+                <w:sz w:val="24"/>
+                <w:szCs w:val="24"/>
+                <w:lang w:val="pt-PT"/>
+                <w14:ligatures w14:val="standardContextual"/>
+              </w:rPr>
+              <w:tab/>
+            </w:r>
+            <w:r>
+              <w:rPr>
+                <w:rStyle w:val="Hiperligao"/>
+                <w:rFonts w:ascii="Arial" w:hAnsi="Arial" w:cs="Arial"/>
+              </w:rPr>
+              <w:t>Data Preprocessing</w:t>
+            </w:r>
+            <w:r>
+              <w:rPr>
+                <w:webHidden/>
+              </w:rPr>
+              <w:tab/>
+            </w:r>
+            <w:r>
+              <w:rPr>
+                <w:webHidden/>
+              </w:rPr>
+              <w:fldChar w:fldCharType="begin"/>
+            </w:r>
+            <w:r>
+              <w:rPr>
+                <w:webHidden/>
+              </w:rPr>
+              <w:instrText xml:space="preserve"> PAGEREF _Toc231138631 \h </w:instrText>
+            </w:r>
+            <w:r>
+              <w:rPr>
+                <w:webHidden/>
+              </w:rPr>
+            </w:r>
+            <w:r>
+              <w:rPr>
+                <w:webHidden/>
+              </w:rPr>
+              <w:fldChar w:fldCharType="separate"/>
+            </w:r>
+            <w:r>
+              <w:rPr>
+                <w:webHidden/>
+              </w:rPr>
+              <w:t>2</w:t>
+            </w:r>
+            <w:r>
+              <w:rPr>
+                <w:webHidden/>
+              </w:rPr>
+              <w:fldChar w:fldCharType="end"/>
+            </w:r>
+          </w:hyperlink>
+        </w:p>
+        <w:p>
+          <w:pPr>
+            <w:pStyle w:val="ndice1"/>
+            <w:rPr>
+              <w:rFonts w:asciiTheme="minorHAnsi" w:eastAsiaTheme="minorEastAsia" w:hAnsiTheme="minorHAnsi" w:cstheme="minorBidi"/>
+              <w:kern w:val="2"/>
+              <w:sz w:val="24"/>
+              <w:szCs w:val="24"/>
+              <w:lang w:val="pt-PT"/>
+              <w14:ligatures w14:val="standardContextual"/>
+            </w:rPr>
+          </w:pPr>
+          <w:hyperlink w:anchor="_Toc231138632" w:history="1">
+            <w:r>
+              <w:rPr>
+                <w:rStyle w:val="Hiperligao"/>
+                <w:rFonts w:ascii="Arial" w:hAnsi="Arial" w:cs="Arial"/>
+              </w:rPr>
+              <w:t>4.</w:t>
+            </w:r>
+            <w:r>
+              <w:rPr>
+                <w:rFonts w:asciiTheme="minorHAnsi" w:eastAsiaTheme="minorEastAsia" w:hAnsiTheme="minorHAnsi" w:cstheme="minorBidi"/>
+                <w:kern w:val="2"/>
+                <w:sz w:val="24"/>
+                <w:szCs w:val="24"/>
+                <w:lang w:val="pt-PT"/>
+                <w14:ligatures w14:val="standardContextual"/>
+              </w:rPr>
+              <w:tab/>
+            </w:r>
+            <w:r>
+              <w:rPr>
+                <w:rStyle w:val="Hiperligao"/>
+                <w:rFonts w:ascii="Arial" w:hAnsi="Arial" w:cs="Arial"/>
+              </w:rPr>
+              <w:t>Feature Engineering</w:t>
+            </w:r>
+            <w:r>
+              <w:rPr>
+                <w:webHidden/>
+              </w:rPr>
+              <w:tab/>
+            </w:r>
+            <w:r>
+              <w:rPr>
+                <w:webHidden/>
+              </w:rPr>
+              <w:fldChar w:fldCharType="begin"/>
+            </w:r>
+            <w:r>
+              <w:rPr>
+                <w:webHidden/>
+              </w:rPr>
+              <w:instrText xml:space="preserve"> PAGEREF _Toc231138632 \h </w:instrText>
+            </w:r>
+            <w:r>
+              <w:rPr>
+                <w:webHidden/>
+              </w:rPr>
+            </w:r>
+            <w:r>
+              <w:rPr>
+                <w:webHidden/>
+              </w:rPr>
+              <w:fldChar w:fldCharType="separate"/>
+            </w:r>
+            <w:r>
+              <w:rPr>
+                <w:webHidden/>
+              </w:rPr>
+              <w:t>4</w:t>
+            </w:r>
+            <w:r>
+              <w:rPr>
+                <w:webHidden/>
+              </w:rPr>
+              <w:fldChar w:fldCharType="end"/>
+            </w:r>
+          </w:hyperlink>
+        </w:p>
+        <w:p>
+          <w:pPr>
+            <w:pStyle w:val="ndice1"/>
+            <w:rPr>
+              <w:rFonts w:asciiTheme="minorHAnsi" w:eastAsiaTheme="minorEastAsia" w:hAnsiTheme="minorHAnsi" w:cstheme="minorBidi"/>
+              <w:kern w:val="2"/>
+              <w:sz w:val="24"/>
+              <w:szCs w:val="24"/>
+              <w:lang w:val="pt-PT"/>
+              <w14:ligatures w14:val="standardContextual"/>
+            </w:rPr>
+          </w:pPr>
+          <w:hyperlink w:anchor="_Toc231138633" w:history="1">
+            <w:r>
+              <w:rPr>
+                <w:rStyle w:val="Hiperligao"/>
+                <w:rFonts w:ascii="Arial" w:hAnsi="Arial" w:cs="Arial"/>
+              </w:rPr>
+              <w:t>5.</w:t>
+            </w:r>
+            <w:r>
+              <w:rPr>
+                <w:rFonts w:asciiTheme="minorHAnsi" w:eastAsiaTheme="minorEastAsia" w:hAnsiTheme="minorHAnsi" w:cstheme="minorBidi"/>
+                <w:kern w:val="2"/>
+                <w:sz w:val="24"/>
+                <w:szCs w:val="24"/>
+                <w:lang w:val="pt-PT"/>
+                <w14:ligatures w14:val="standardContextual"/>
+              </w:rPr>
+              <w:tab/>
+            </w:r>
+            <w:r>
+              <w:rPr>
+                <w:rStyle w:val="Hiperligao"/>
+                <w:rFonts w:ascii="Arial" w:hAnsi="Arial" w:cs="Arial"/>
+              </w:rPr>
+              <w:t>Classification Models</w:t>
+            </w:r>
+            <w:r>
+              <w:rPr>
+                <w:webHidden/>
+              </w:rPr>
+              <w:tab/>
+            </w:r>
+            <w:r>
+              <w:rPr>
+                <w:webHidden/>
+              </w:rPr>
+              <w:fldChar w:fldCharType="begin"/>
+            </w:r>
+            <w:r>
+              <w:rPr>
+                <w:webHidden/>
+              </w:rPr>
+              <w:instrText xml:space="preserve"> PAGEREF _Toc231138633 \h </w:instrText>
+            </w:r>
+            <w:r>
+              <w:rPr>
+                <w:webHidden/>
+              </w:rPr>
+            </w:r>
+            <w:r>
+              <w:rPr>
+                <w:webHidden/>
+              </w:rPr>
+              <w:fldChar w:fldCharType="separate"/>
+            </w:r>
+            <w:r>
+              <w:rPr>
+                <w:webHidden/>
+              </w:rPr>
+              <w:t>5</w:t>
             </w:r>
             <w:r>
               <w:rPr>
@@ -961,13 +1284,13 @@
               <w14:ligatures w14:val="standardContextual"/>
             </w:rPr>
           </w:pPr>
-          <w:hyperlink w:anchor="_Toc228445049" w:history="1">
+          <w:hyperlink w:anchor="_Toc231138634" w:history="1">
             <w:r>
               <w:rPr>
                 <w:rStyle w:val="Hiperligao"/>
                 <w:rFonts w:ascii="Arial" w:hAnsi="Arial" w:cs="Arial"/>
               </w:rPr>
-              <w:t>2.3.</w:t>
+              <w:t>5.1.</w:t>
             </w:r>
             <w:r>
               <w:rPr>
@@ -985,7 +1308,7 @@
                 <w:rStyle w:val="Hiperligao"/>
                 <w:rFonts w:ascii="Arial" w:hAnsi="Arial" w:cs="Arial"/>
               </w:rPr>
-              <w:t>Data Preprocessing</w:t>
+              <w:t>Corpus Split and Validation Strategy</w:t>
             </w:r>
             <w:r>
               <w:rPr>
@@ -1003,7 +1326,7 @@
               <w:rPr>
                 <w:webHidden/>
               </w:rPr>
-              <w:instrText xml:space="preserve"> PAGEREF _Toc228445049 \h </w:instrText>
+              <w:instrText xml:space="preserve"> PAGEREF _Toc231138634 \h </w:instrText>
             </w:r>
             <w:r>
               <w:rPr>
@@ -1020,88 +1343,7 @@
               <w:rPr>
                 <w:webHidden/>
               </w:rPr>
-              <w:t>2</w:t>
-            </w:r>
-            <w:r>
-              <w:rPr>
-                <w:webHidden/>
-              </w:rPr>
-              <w:fldChar w:fldCharType="end"/>
-            </w:r>
-          </w:hyperlink>
-        </w:p>
-        <w:p>
-          <w:pPr>
-            <w:pStyle w:val="ndice3"/>
-            <w:rPr>
-              <w:rFonts w:asciiTheme="minorHAnsi" w:eastAsiaTheme="minorEastAsia" w:hAnsiTheme="minorHAnsi" w:cstheme="minorBidi"/>
-              <w:kern w:val="2"/>
-              <w:sz w:val="24"/>
-              <w:szCs w:val="24"/>
-              <w:lang w:val="pt-PT"/>
-              <w14:ligatures w14:val="standardContextual"/>
-            </w:rPr>
-          </w:pPr>
-          <w:hyperlink w:anchor="_Toc228445050" w:history="1">
-            <w:r>
-              <w:rPr>
-                <w:rStyle w:val="Hiperligao"/>
-                <w:rFonts w:ascii="Arial" w:hAnsi="Arial" w:cs="Arial"/>
-              </w:rPr>
-              <w:t>2.3.1.</w:t>
-            </w:r>
-            <w:r>
-              <w:rPr>
-                <w:rFonts w:asciiTheme="minorHAnsi" w:eastAsiaTheme="minorEastAsia" w:hAnsiTheme="minorHAnsi" w:cstheme="minorBidi"/>
-                <w:kern w:val="2"/>
-                <w:sz w:val="24"/>
-                <w:szCs w:val="24"/>
-                <w:lang w:val="pt-PT"/>
-                <w14:ligatures w14:val="standardContextual"/>
-              </w:rPr>
-              <w:tab/>
-            </w:r>
-            <w:r>
-              <w:rPr>
-                <w:rStyle w:val="Hiperligao"/>
-                <w:rFonts w:ascii="Arial" w:hAnsi="Arial" w:cs="Arial"/>
-              </w:rPr>
-              <w:t>Class Imbalance</w:t>
-            </w:r>
-            <w:r>
-              <w:rPr>
-                <w:webHidden/>
-              </w:rPr>
-              <w:tab/>
-            </w:r>
-            <w:r>
-              <w:rPr>
-                <w:webHidden/>
-              </w:rPr>
-              <w:fldChar w:fldCharType="begin"/>
-            </w:r>
-            <w:r>
-              <w:rPr>
-                <w:webHidden/>
-              </w:rPr>
-              <w:instrText xml:space="preserve"> PAGEREF _Toc228445050 \h </w:instrText>
-            </w:r>
-            <w:r>
-              <w:rPr>
-                <w:webHidden/>
-              </w:rPr>
-            </w:r>
-            <w:r>
-              <w:rPr>
-                <w:webHidden/>
-              </w:rPr>
-              <w:fldChar w:fldCharType="separate"/>
-            </w:r>
-            <w:r>
-              <w:rPr>
-                <w:webHidden/>
-              </w:rPr>
-              <w:t>2</w:t>
+              <w:t>5</w:t>
             </w:r>
             <w:r>
               <w:rPr>
@@ -1123,13 +1365,13 @@
               <w14:ligatures w14:val="standardContextual"/>
             </w:rPr>
           </w:pPr>
-          <w:hyperlink w:anchor="_Toc228445051" w:history="1">
+          <w:hyperlink w:anchor="_Toc231138635" w:history="1">
             <w:r>
               <w:rPr>
                 <w:rStyle w:val="Hiperligao"/>
                 <w:rFonts w:ascii="Arial" w:hAnsi="Arial" w:cs="Arial"/>
               </w:rPr>
-              <w:t>3.</w:t>
+              <w:t>6.</w:t>
             </w:r>
             <w:r>
               <w:rPr>
@@ -1147,7 +1389,7 @@
                 <w:rStyle w:val="Hiperligao"/>
                 <w:rFonts w:ascii="Arial" w:hAnsi="Arial" w:cs="Arial"/>
               </w:rPr>
-              <w:t>Evaluation Methodology</w:t>
+              <w:t>Evaluation And Results</w:t>
             </w:r>
             <w:r>
               <w:rPr>
@@ -1165,7 +1407,7 @@
               <w:rPr>
                 <w:webHidden/>
               </w:rPr>
-              <w:instrText xml:space="preserve"> PAGEREF _Toc228445051 \h </w:instrText>
+              <w:instrText xml:space="preserve"> PAGEREF _Toc231138635 \h </w:instrText>
             </w:r>
             <w:r>
               <w:rPr>
@@ -1182,7 +1424,7 @@
               <w:rPr>
                 <w:webHidden/>
               </w:rPr>
-              <w:t>3</w:t>
+              <w:t>6</w:t>
             </w:r>
             <w:r>
               <w:rPr>
@@ -1204,13 +1446,13 @@
               <w14:ligatures w14:val="standardContextual"/>
             </w:rPr>
           </w:pPr>
-          <w:hyperlink w:anchor="_Toc228445052" w:history="1">
+          <w:hyperlink w:anchor="_Toc231138636" w:history="1">
             <w:r>
               <w:rPr>
                 <w:rStyle w:val="Hiperligao"/>
                 <w:rFonts w:ascii="Arial" w:hAnsi="Arial" w:cs="Arial"/>
               </w:rPr>
-              <w:t>4.</w:t>
+              <w:t>7.</w:t>
             </w:r>
             <w:r>
               <w:rPr>
@@ -1228,7 +1470,7 @@
                 <w:rStyle w:val="Hiperligao"/>
                 <w:rFonts w:ascii="Arial" w:hAnsi="Arial" w:cs="Arial"/>
               </w:rPr>
-              <w:t>Model Development &amp; Iterative Improvements</w:t>
+              <w:t>Appendix</w:t>
             </w:r>
             <w:r>
               <w:rPr>
@@ -1246,7 +1488,7 @@
               <w:rPr>
                 <w:webHidden/>
               </w:rPr>
-              <w:instrText xml:space="preserve"> PAGEREF _Toc228445052 \h </w:instrText>
+              <w:instrText xml:space="preserve"> PAGEREF _Toc231138636 \h </w:instrText>
             </w:r>
             <w:r>
               <w:rPr>
@@ -1263,7 +1505,7 @@
               <w:rPr>
                 <w:webHidden/>
               </w:rPr>
-              <w:t>3</w:t>
+              <w:t>7</w:t>
             </w:r>
             <w:r>
               <w:rPr>
@@ -1285,13 +1527,13 @@
               <w14:ligatures w14:val="standardContextual"/>
             </w:rPr>
           </w:pPr>
-          <w:hyperlink w:anchor="_Toc228445053" w:history="1">
+          <w:hyperlink w:anchor="_Toc231138637" w:history="1">
             <w:r>
               <w:rPr>
                 <w:rStyle w:val="Hiperligao"/>
                 <w:rFonts w:ascii="Arial" w:hAnsi="Arial" w:cs="Arial"/>
               </w:rPr>
-              <w:t>5.</w:t>
+              <w:t>8.</w:t>
             </w:r>
             <w:r>
               <w:rPr>
@@ -1309,7 +1551,7 @@
                 <w:rStyle w:val="Hiperligao"/>
                 <w:rFonts w:ascii="Arial" w:hAnsi="Arial" w:cs="Arial"/>
               </w:rPr>
-              <w:t>Results And Critical Analysis</w:t>
+              <w:t>Annexes</w:t>
             </w:r>
             <w:r>
               <w:rPr>
@@ -1327,7 +1569,7 @@
               <w:rPr>
                 <w:webHidden/>
               </w:rPr>
-              <w:instrText xml:space="preserve"> PAGEREF _Toc228445053 \h </w:instrText>
+              <w:instrText xml:space="preserve"> PAGEREF _Toc231138637 \h </w:instrText>
             </w:r>
             <w:r>
               <w:rPr>
@@ -1344,250 +1586,7 @@
               <w:rPr>
                 <w:webHidden/>
               </w:rPr>
-              <w:t>3</w:t>
-            </w:r>
-            <w:r>
-              <w:rPr>
-                <w:webHidden/>
-              </w:rPr>
-              <w:fldChar w:fldCharType="end"/>
-            </w:r>
-          </w:hyperlink>
-        </w:p>
-        <w:p>
-          <w:pPr>
-            <w:pStyle w:val="ndice1"/>
-            <w:rPr>
-              <w:rFonts w:asciiTheme="minorHAnsi" w:eastAsiaTheme="minorEastAsia" w:hAnsiTheme="minorHAnsi" w:cstheme="minorBidi"/>
-              <w:kern w:val="2"/>
-              <w:sz w:val="24"/>
-              <w:szCs w:val="24"/>
-              <w:lang w:val="pt-PT"/>
-              <w14:ligatures w14:val="standardContextual"/>
-            </w:rPr>
-          </w:pPr>
-          <w:hyperlink w:anchor="_Toc228445054" w:history="1">
-            <w:r>
-              <w:rPr>
-                <w:rStyle w:val="Hiperligao"/>
-                <w:rFonts w:ascii="Arial" w:hAnsi="Arial" w:cs="Arial"/>
-              </w:rPr>
-              <w:t>6.</w:t>
-            </w:r>
-            <w:r>
-              <w:rPr>
-                <w:rFonts w:asciiTheme="minorHAnsi" w:eastAsiaTheme="minorEastAsia" w:hAnsiTheme="minorHAnsi" w:cstheme="minorBidi"/>
-                <w:kern w:val="2"/>
-                <w:sz w:val="24"/>
-                <w:szCs w:val="24"/>
-                <w:lang w:val="pt-PT"/>
-                <w14:ligatures w14:val="standardContextual"/>
-              </w:rPr>
-              <w:tab/>
-            </w:r>
-            <w:r>
-              <w:rPr>
-                <w:rStyle w:val="Hiperligao"/>
-                <w:rFonts w:ascii="Arial" w:hAnsi="Arial" w:cs="Arial"/>
-              </w:rPr>
-              <w:t>Conclusion</w:t>
-            </w:r>
-            <w:r>
-              <w:rPr>
-                <w:webHidden/>
-              </w:rPr>
-              <w:tab/>
-            </w:r>
-            <w:r>
-              <w:rPr>
-                <w:webHidden/>
-              </w:rPr>
-              <w:fldChar w:fldCharType="begin"/>
-            </w:r>
-            <w:r>
-              <w:rPr>
-                <w:webHidden/>
-              </w:rPr>
-              <w:instrText xml:space="preserve"> PAGEREF _Toc228445054 \h </w:instrText>
-            </w:r>
-            <w:r>
-              <w:rPr>
-                <w:webHidden/>
-              </w:rPr>
-            </w:r>
-            <w:r>
-              <w:rPr>
-                <w:webHidden/>
-              </w:rPr>
-              <w:fldChar w:fldCharType="separate"/>
-            </w:r>
-            <w:r>
-              <w:rPr>
-                <w:webHidden/>
-              </w:rPr>
-              <w:t>3</w:t>
-            </w:r>
-            <w:r>
-              <w:rPr>
-                <w:webHidden/>
-              </w:rPr>
-              <w:fldChar w:fldCharType="end"/>
-            </w:r>
-          </w:hyperlink>
-        </w:p>
-        <w:p>
-          <w:pPr>
-            <w:pStyle w:val="ndice1"/>
-            <w:rPr>
-              <w:rFonts w:asciiTheme="minorHAnsi" w:eastAsiaTheme="minorEastAsia" w:hAnsiTheme="minorHAnsi" w:cstheme="minorBidi"/>
-              <w:kern w:val="2"/>
-              <w:sz w:val="24"/>
-              <w:szCs w:val="24"/>
-              <w:lang w:val="pt-PT"/>
-              <w14:ligatures w14:val="standardContextual"/>
-            </w:rPr>
-          </w:pPr>
-          <w:hyperlink w:anchor="_Toc228445055" w:history="1">
-            <w:r>
-              <w:rPr>
-                <w:rStyle w:val="Hiperligao"/>
-                <w:rFonts w:ascii="Arial" w:hAnsi="Arial" w:cs="Arial"/>
-              </w:rPr>
-              <w:t>7.</w:t>
-            </w:r>
-            <w:r>
-              <w:rPr>
-                <w:rFonts w:asciiTheme="minorHAnsi" w:eastAsiaTheme="minorEastAsia" w:hAnsiTheme="minorHAnsi" w:cstheme="minorBidi"/>
-                <w:kern w:val="2"/>
-                <w:sz w:val="24"/>
-                <w:szCs w:val="24"/>
-                <w:lang w:val="pt-PT"/>
-                <w14:ligatures w14:val="standardContextual"/>
-              </w:rPr>
-              <w:tab/>
-            </w:r>
-            <w:r>
-              <w:rPr>
-                <w:rStyle w:val="Hiperligao"/>
-                <w:rFonts w:ascii="Arial" w:hAnsi="Arial" w:cs="Arial"/>
-              </w:rPr>
-              <w:t>Appendix</w:t>
-            </w:r>
-            <w:r>
-              <w:rPr>
-                <w:webHidden/>
-              </w:rPr>
-              <w:tab/>
-            </w:r>
-            <w:r>
-              <w:rPr>
-                <w:webHidden/>
-              </w:rPr>
-              <w:fldChar w:fldCharType="begin"/>
-            </w:r>
-            <w:r>
-              <w:rPr>
-                <w:webHidden/>
-              </w:rPr>
-              <w:instrText xml:space="preserve"> PAGEREF _Toc228445055 \h </w:instrText>
-            </w:r>
-            <w:r>
-              <w:rPr>
-                <w:webHidden/>
-              </w:rPr>
-            </w:r>
-            <w:r>
-              <w:rPr>
-                <w:webHidden/>
-              </w:rPr>
-              <w:fldChar w:fldCharType="separate"/>
-            </w:r>
-            <w:r>
-              <w:rPr>
-                <w:webHidden/>
-              </w:rPr>
-              <w:t>4</w:t>
-            </w:r>
-            <w:r>
-              <w:rPr>
-                <w:webHidden/>
-              </w:rPr>
-              <w:fldChar w:fldCharType="end"/>
-            </w:r>
-          </w:hyperlink>
-        </w:p>
-        <w:p>
-          <w:pPr>
-            <w:pStyle w:val="ndice1"/>
-            <w:rPr>
-              <w:rFonts w:asciiTheme="minorHAnsi" w:eastAsiaTheme="minorEastAsia" w:hAnsiTheme="minorHAnsi" w:cstheme="minorBidi"/>
-              <w:kern w:val="2"/>
-              <w:sz w:val="24"/>
-              <w:szCs w:val="24"/>
-              <w:lang w:val="pt-PT"/>
-              <w14:ligatures w14:val="standardContextual"/>
-            </w:rPr>
-          </w:pPr>
-          <w:hyperlink w:anchor="_Toc228445056" w:history="1">
-            <w:r>
-              <w:rPr>
-                <w:rStyle w:val="Hiperligao"/>
-                <w:rFonts w:ascii="Arial" w:hAnsi="Arial" w:cs="Arial"/>
-              </w:rPr>
-              <w:t>8.</w:t>
-            </w:r>
-            <w:r>
-              <w:rPr>
-                <w:rFonts w:asciiTheme="minorHAnsi" w:eastAsiaTheme="minorEastAsia" w:hAnsiTheme="minorHAnsi" w:cstheme="minorBidi"/>
-                <w:kern w:val="2"/>
-                <w:sz w:val="24"/>
-                <w:szCs w:val="24"/>
-                <w:lang w:val="pt-PT"/>
-                <w14:ligatures w14:val="standardContextual"/>
-              </w:rPr>
-              <w:tab/>
-            </w:r>
-            <w:r>
-              <w:rPr>
-                <w:rStyle w:val="Hiperligao"/>
-                <w:rFonts w:ascii="Arial" w:hAnsi="Arial" w:cs="Arial"/>
-              </w:rPr>
-              <w:t>Annexes</w:t>
-            </w:r>
-            <w:r>
-              <w:rPr>
-                <w:webHidden/>
-              </w:rPr>
-              <w:tab/>
-            </w:r>
-            <w:r>
-              <w:rPr>
-                <w:webHidden/>
-              </w:rPr>
-              <w:fldChar w:fldCharType="begin"/>
-            </w:r>
-            <w:r>
-              <w:rPr>
-                <w:webHidden/>
-              </w:rPr>
-              <w:instrText xml:space="preserve"> PAGEREF _Toc228445056 \h </w:instrText>
-            </w:r>
-            <w:r>
-              <w:rPr>
-                <w:webHidden/>
-              </w:rPr>
-            </w:r>
-            <w:r>
-              <w:rPr>
-                <w:webHidden/>
-              </w:rPr>
-              <w:fldChar w:fldCharType="separate"/>
-            </w:r>
-            <w:r>
-              <w:rPr>
-                <w:webHidden/>
-              </w:rPr>
-              <w:t>5</w:t>
+              <w:t>8</w:t>
             </w:r>
             <w:r>
               <w:rPr>
@@ -1640,17 +1639,17 @@
           <w:rFonts w:ascii="Arial" w:hAnsi="Arial" w:cs="Arial"/>
         </w:rPr>
       </w:pPr>
-      <w:bookmarkStart w:id="0" w:name="_Toc228445044"/>
-      <w:bookmarkStart w:id="1" w:name="_Toc410990268"/>
-      <w:bookmarkStart w:id="2" w:name="_Toc410990280"/>
-      <w:bookmarkStart w:id="3" w:name="_Toc412186393"/>
-      <w:bookmarkStart w:id="4" w:name="_Toc412186498"/>
-      <w:bookmarkStart w:id="5" w:name="_Toc412186523"/>
-      <w:bookmarkStart w:id="6" w:name="_Toc412186594"/>
-      <w:bookmarkStart w:id="7" w:name="_Toc412186624"/>
-      <w:bookmarkStart w:id="8" w:name="_Toc115296802"/>
-      <w:bookmarkStart w:id="9" w:name="_Toc136960268"/>
-      <w:bookmarkStart w:id="10" w:name="_Toc141959331"/>
+      <w:bookmarkStart w:id="0" w:name="_Toc410990268"/>
+      <w:bookmarkStart w:id="1" w:name="_Toc410990280"/>
+      <w:bookmarkStart w:id="2" w:name="_Toc412186393"/>
+      <w:bookmarkStart w:id="3" w:name="_Toc412186498"/>
+      <w:bookmarkStart w:id="4" w:name="_Toc412186523"/>
+      <w:bookmarkStart w:id="5" w:name="_Toc412186594"/>
+      <w:bookmarkStart w:id="6" w:name="_Toc412186624"/>
+      <w:bookmarkStart w:id="7" w:name="_Toc115296802"/>
+      <w:bookmarkStart w:id="8" w:name="_Toc136960268"/>
+      <w:bookmarkStart w:id="9" w:name="_Toc141959331"/>
+      <w:bookmarkStart w:id="10" w:name="_Toc231138626"/>
       <w:r>
         <w:rPr>
           <w:rFonts w:ascii="Arial" w:hAnsi="Arial" w:cs="Arial"/>
@@ -1658,31 +1657,32 @@
         <w:lastRenderedPageBreak/>
         <w:t>Project Overview</w:t>
       </w:r>
+      <w:bookmarkEnd w:id="10"/>
+    </w:p>
+    <w:p>
+      <w:pPr>
+        <w:rPr>
+          <w:rFonts w:ascii="Arial" w:hAnsi="Arial" w:cs="Arial"/>
+          <w:lang w:eastAsia="pt-PT"/>
+        </w:rPr>
+      </w:pPr>
+      <w:r>
+        <w:rPr>
+          <w:rFonts w:ascii="Arial" w:hAnsi="Arial" w:cs="Arial"/>
+          <w:lang w:eastAsia="pt-PT"/>
+        </w:rPr>
+        <w:t>The project addresses the problem of predicting market sentiment from tweets, which is a common task in natural language processing (NLP). The goal is to classify tweets into three categories: Bearish (0), Bullish (1), or Neutral (2).</w:t>
+      </w:r>
+    </w:p>
+    <w:p>
+      <w:pPr>
+        <w:pStyle w:val="Ttulo1"/>
+        <w:rPr>
+          <w:rFonts w:ascii="Arial" w:hAnsi="Arial" w:cs="Arial"/>
+        </w:rPr>
+      </w:pPr>
+      <w:bookmarkStart w:id="11" w:name="_Toc231138627"/>
       <w:bookmarkEnd w:id="0"/>
-    </w:p>
-    <w:p>
-      <w:pPr>
-        <w:rPr>
-          <w:rFonts w:ascii="Arial" w:hAnsi="Arial" w:cs="Arial"/>
-          <w:lang w:eastAsia="pt-PT"/>
-        </w:rPr>
-      </w:pPr>
-      <w:r>
-        <w:rPr>
-          <w:rFonts w:ascii="Arial" w:hAnsi="Arial" w:cs="Arial"/>
-          <w:lang w:eastAsia="pt-PT"/>
-        </w:rPr>
-        <w:t>The project addresses the problem of predicting market sentiment from tweets, which is a common task in natural language processing (NLP). The goal is to classify tweets into three categories: Bearish (0), Bullish (1), or Neutral (2).</w:t>
-      </w:r>
-    </w:p>
-    <w:p>
-      <w:pPr>
-        <w:pStyle w:val="Ttulo1"/>
-        <w:rPr>
-          <w:rFonts w:ascii="Arial" w:hAnsi="Arial" w:cs="Arial"/>
-        </w:rPr>
-      </w:pPr>
-      <w:bookmarkStart w:id="11" w:name="_Toc228445045"/>
       <w:bookmarkEnd w:id="1"/>
       <w:bookmarkEnd w:id="2"/>
       <w:bookmarkEnd w:id="3"/>
@@ -1692,7 +1692,6 @@
       <w:bookmarkEnd w:id="7"/>
       <w:bookmarkEnd w:id="8"/>
       <w:bookmarkEnd w:id="9"/>
-      <w:bookmarkEnd w:id="10"/>
       <w:r>
         <w:rPr>
           <w:rFonts w:ascii="Arial" w:hAnsi="Arial" w:cs="Arial"/>
@@ -1715,7 +1714,7 @@
           <w:rFonts w:ascii="Arial" w:hAnsi="Arial" w:cs="Arial"/>
         </w:rPr>
       </w:pPr>
-      <w:bookmarkStart w:id="12" w:name="_Toc228445046"/>
+      <w:bookmarkStart w:id="12" w:name="_Toc231138628"/>
       <w:r>
         <w:rPr>
           <w:rFonts w:ascii="Arial" w:hAnsi="Arial" w:cs="Arial"/>
@@ -1782,7 +1781,7 @@
           <w:rFonts w:ascii="Arial" w:hAnsi="Arial" w:cs="Arial"/>
         </w:rPr>
       </w:pPr>
-      <w:bookmarkStart w:id="13" w:name="_Toc228445047"/>
+      <w:bookmarkStart w:id="13" w:name="_Toc231138629"/>
       <w:r>
         <w:rPr>
           <w:rFonts w:ascii="Arial" w:hAnsi="Arial" w:cs="Arial"/>
@@ -1798,7 +1797,7 @@
           <w:rFonts w:ascii="Arial" w:hAnsi="Arial" w:cs="Arial"/>
         </w:rPr>
       </w:pPr>
-      <w:bookmarkStart w:id="14" w:name="_Toc228445048"/>
+      <w:bookmarkStart w:id="14" w:name="_Toc231138630"/>
       <w:r>
         <w:rPr>
           <w:rFonts w:ascii="Arial" w:hAnsi="Arial" w:cs="Arial"/>
@@ -1997,7 +1996,23 @@
           <w:rFonts w:ascii="Arial" w:hAnsi="Arial" w:cs="Arial"/>
           <w:lang w:eastAsia="pt-PT"/>
         </w:rPr>
-        <w:t xml:space="preserve"> as a quick way to explore the top 15 most common words in each sentiment class. This gave us an immediate visual sense of which terms stand out the most in bullish, bearish, and neutral tweets, since more frequent words appear larger and are easier to spot at a glance.</w:t>
+        <w:t xml:space="preserve"> as a quick way to explore the top 15 most common words in each sentiment class. This gave us an immediate visual sense of which terms stand out the most in bullish, bearish, and neutral tweets, since more frequent words appear larger and are easier to spot </w:t>
+      </w:r>
+      <w:proofErr w:type="gramStart"/>
+      <w:r>
+        <w:rPr>
+          <w:rFonts w:ascii="Arial" w:hAnsi="Arial" w:cs="Arial"/>
+          <w:lang w:eastAsia="pt-PT"/>
+        </w:rPr>
+        <w:t>at a glance</w:t>
+      </w:r>
+      <w:proofErr w:type="gramEnd"/>
+      <w:r>
+        <w:rPr>
+          <w:rFonts w:ascii="Arial" w:hAnsi="Arial" w:cs="Arial"/>
+          <w:lang w:eastAsia="pt-PT"/>
+        </w:rPr>
+        <w:t>.</w:t>
       </w:r>
     </w:p>
     <w:p>
@@ -2449,7 +2464,23 @@
           <w:rFonts w:ascii="Arial" w:hAnsi="Arial" w:cs="Arial"/>
           <w:lang w:eastAsia="pt-PT"/>
         </w:rPr>
-        <w:t>Now, considering that our dataset consists of tweets, we also looked into the use of hashtags, mentions, and cashtags, since these are very common elements in this type of text and often carry useful context about topics or specific stocks being discussed.</w:t>
+        <w:t xml:space="preserve">Now, considering that our dataset consists of tweets, we also </w:t>
+      </w:r>
+      <w:proofErr w:type="gramStart"/>
+      <w:r>
+        <w:rPr>
+          <w:rFonts w:ascii="Arial" w:hAnsi="Arial" w:cs="Arial"/>
+          <w:lang w:eastAsia="pt-PT"/>
+        </w:rPr>
+        <w:t>looked into</w:t>
+      </w:r>
+      <w:proofErr w:type="gramEnd"/>
+      <w:r>
+        <w:rPr>
+          <w:rFonts w:ascii="Arial" w:hAnsi="Arial" w:cs="Arial"/>
+          <w:lang w:eastAsia="pt-PT"/>
+        </w:rPr>
+        <w:t xml:space="preserve"> the use of hashtags, mentions, and cashtags, since these are very common elements in this type of text and often carry useful context about topics or specific stocks being discussed.</w:t>
       </w:r>
     </w:p>
     <w:p>
@@ -2499,6 +2530,7 @@
         </w:rPr>
         <w:t>” and “</w:t>
       </w:r>
+      <w:proofErr w:type="spellStart"/>
       <w:r>
         <w:rPr>
           <w:rFonts w:ascii="Arial" w:hAnsi="Arial" w:cs="Arial"/>
@@ -2508,6 +2540,7 @@
         </w:rPr>
         <w:t>wti</w:t>
       </w:r>
+      <w:proofErr w:type="spellEnd"/>
       <w:r>
         <w:rPr>
           <w:rFonts w:ascii="Arial" w:hAnsi="Arial" w:cs="Arial"/>
@@ -2624,7 +2657,23 @@
           <w:rFonts w:ascii="Arial" w:hAnsi="Arial" w:cs="Arial"/>
           <w:lang w:eastAsia="pt-PT"/>
         </w:rPr>
-        <w:t>Looking at cashtags (stock tickers), clearer distinctions emerge. While some popular tickers like “</w:t>
+        <w:t xml:space="preserve">Looking at cashtags (stock </w:t>
+      </w:r>
+      <w:proofErr w:type="gramStart"/>
+      <w:r>
+        <w:rPr>
+          <w:rFonts w:ascii="Arial" w:hAnsi="Arial" w:cs="Arial"/>
+          <w:lang w:eastAsia="pt-PT"/>
+        </w:rPr>
+        <w:t>tickers</w:t>
+      </w:r>
+      <w:proofErr w:type="gramEnd"/>
+      <w:r>
+        <w:rPr>
+          <w:rFonts w:ascii="Arial" w:hAnsi="Arial" w:cs="Arial"/>
+          <w:lang w:eastAsia="pt-PT"/>
+        </w:rPr>
+        <w:t>), clearer distinctions emerge. While some popular tickers like “</w:t>
       </w:r>
       <w:r>
         <w:rPr>
@@ -2788,630 +2837,1037 @@
           <w:rFonts w:ascii="Arial" w:hAnsi="Arial" w:cs="Arial"/>
           <w:lang w:eastAsia="pt-PT"/>
         </w:rPr>
-        <w:t xml:space="preserve"> per class in order to determine wether any of these would be a good indicator of the class that those tweets were in. Out of the three, the neutral was the one who had the highest average of characters per tweet with 88 characters, even though all of the classes had the exact same average number of words at 12 words. Regarding the presence of URL’s neutral was also the class with the highest percentage with 49.8% whereas bearish and bulish came with 44.3% and 39.1%, respectively. Regarding the presence of a stock ticker the bullish class came first with 24.6% which represents almost double the percentage that both bearish and neutral classes got at around 13% as can be seen on Figure 6</w:t>
-      </w:r>
-    </w:p>
-    <w:p>
-      <w:pPr>
-        <w:rPr>
-          <w:rFonts w:ascii="Arial" w:hAnsi="Arial" w:cs="Arial"/>
-          <w:lang w:eastAsia="pt-PT"/>
-        </w:rPr>
-      </w:pPr>
+        <w:t xml:space="preserve"> per class </w:t>
+      </w:r>
+      <w:proofErr w:type="gramStart"/>
+      <w:r>
+        <w:rPr>
+          <w:rFonts w:ascii="Arial" w:hAnsi="Arial" w:cs="Arial"/>
+          <w:lang w:eastAsia="pt-PT"/>
+        </w:rPr>
+        <w:t>in order to</w:t>
+      </w:r>
+      <w:proofErr w:type="gramEnd"/>
+      <w:r>
+        <w:rPr>
+          <w:rFonts w:ascii="Arial" w:hAnsi="Arial" w:cs="Arial"/>
+          <w:lang w:eastAsia="pt-PT"/>
+        </w:rPr>
+        <w:t xml:space="preserve"> determine </w:t>
+      </w:r>
+      <w:proofErr w:type="spellStart"/>
+      <w:proofErr w:type="gramStart"/>
+      <w:r>
+        <w:rPr>
+          <w:rFonts w:ascii="Arial" w:hAnsi="Arial" w:cs="Arial"/>
+          <w:lang w:eastAsia="pt-PT"/>
+        </w:rPr>
+        <w:t>wether</w:t>
+      </w:r>
+      <w:proofErr w:type="spellEnd"/>
+      <w:proofErr w:type="gramEnd"/>
+      <w:r>
+        <w:rPr>
+          <w:rFonts w:ascii="Arial" w:hAnsi="Arial" w:cs="Arial"/>
+          <w:lang w:eastAsia="pt-PT"/>
+        </w:rPr>
+        <w:t xml:space="preserve"> any of these would be a good indicator of the class that those tweets were in. Out of the three, the neutral was the one who had the highest average of characters per tweet with 88 characters, even though </w:t>
+      </w:r>
+      <w:proofErr w:type="gramStart"/>
+      <w:r>
+        <w:rPr>
+          <w:rFonts w:ascii="Arial" w:hAnsi="Arial" w:cs="Arial"/>
+          <w:lang w:eastAsia="pt-PT"/>
+        </w:rPr>
+        <w:t>all of</w:t>
+      </w:r>
+      <w:proofErr w:type="gramEnd"/>
+      <w:r>
+        <w:rPr>
+          <w:rFonts w:ascii="Arial" w:hAnsi="Arial" w:cs="Arial"/>
+          <w:lang w:eastAsia="pt-PT"/>
+        </w:rPr>
+        <w:t xml:space="preserve"> the classes had the exact same average number of words at 12 words. Regarding the presence of URL’s neutral was also the class with the highest percentage with 49.8% whereas bearish and </w:t>
+      </w:r>
+      <w:proofErr w:type="spellStart"/>
+      <w:r>
+        <w:rPr>
+          <w:rFonts w:ascii="Arial" w:hAnsi="Arial" w:cs="Arial"/>
+          <w:lang w:eastAsia="pt-PT"/>
+        </w:rPr>
+        <w:t>bulish</w:t>
+      </w:r>
+      <w:proofErr w:type="spellEnd"/>
+      <w:r>
+        <w:rPr>
+          <w:rFonts w:ascii="Arial" w:hAnsi="Arial" w:cs="Arial"/>
+          <w:lang w:eastAsia="pt-PT"/>
+        </w:rPr>
+        <w:t xml:space="preserve"> came with 44.3% and 39.1%, respectively. Regarding the presence of a stock </w:t>
+      </w:r>
+      <w:proofErr w:type="gramStart"/>
+      <w:r>
+        <w:rPr>
+          <w:rFonts w:ascii="Arial" w:hAnsi="Arial" w:cs="Arial"/>
+          <w:lang w:eastAsia="pt-PT"/>
+        </w:rPr>
+        <w:t>ticker</w:t>
+      </w:r>
+      <w:proofErr w:type="gramEnd"/>
+      <w:r>
+        <w:rPr>
+          <w:rFonts w:ascii="Arial" w:hAnsi="Arial" w:cs="Arial"/>
+          <w:lang w:eastAsia="pt-PT"/>
+        </w:rPr>
+        <w:t xml:space="preserve"> the bullish class came first with 24.6%</w:t>
+      </w:r>
+      <w:proofErr w:type="gramStart"/>
+      <w:r>
+        <w:rPr>
+          <w:rFonts w:ascii="Arial" w:hAnsi="Arial" w:cs="Arial"/>
+          <w:lang w:eastAsia="pt-PT"/>
+        </w:rPr>
+        <w:t xml:space="preserve"> which</w:t>
+      </w:r>
+      <w:proofErr w:type="gramEnd"/>
+      <w:r>
+        <w:rPr>
+          <w:rFonts w:ascii="Arial" w:hAnsi="Arial" w:cs="Arial"/>
+          <w:lang w:eastAsia="pt-PT"/>
+        </w:rPr>
+        <w:t xml:space="preserve"> represents almost double the percentage that both bearish and neutral classes got at around 13% as can be seen on Figure 6</w:t>
+      </w:r>
+    </w:p>
+    <w:p>
+      <w:pPr>
+        <w:rPr>
+          <w:rFonts w:ascii="Arial" w:hAnsi="Arial" w:cs="Arial"/>
+          <w:lang w:eastAsia="pt-PT"/>
+        </w:rPr>
+      </w:pPr>
+    </w:p>
+    <w:p>
+      <w:pPr>
+        <w:pStyle w:val="Ttulo1"/>
+        <w:rPr>
+          <w:rFonts w:ascii="Arial" w:hAnsi="Arial" w:cs="Arial"/>
+        </w:rPr>
+      </w:pPr>
+      <w:bookmarkStart w:id="15" w:name="_Toc231138631"/>
+      <w:r>
+        <w:rPr>
+          <w:rFonts w:ascii="Arial" w:hAnsi="Arial" w:cs="Arial"/>
+        </w:rPr>
+        <w:t xml:space="preserve">Data </w:t>
+      </w:r>
+      <w:r>
+        <w:rPr>
+          <w:rFonts w:ascii="Arial" w:hAnsi="Arial" w:cs="Arial"/>
+        </w:rPr>
+        <w:t>Preprocessing</w:t>
+      </w:r>
+      <w:bookmarkEnd w:id="15"/>
+    </w:p>
+    <w:p>
+      <w:pPr>
+        <w:rPr>
+          <w:rFonts w:ascii="Arial" w:hAnsi="Arial" w:cs="Arial"/>
+          <w:lang w:eastAsia="pt-PT"/>
+        </w:rPr>
+      </w:pPr>
+      <w:r>
+        <w:rPr>
+          <w:rFonts w:ascii="Arial" w:hAnsi="Arial" w:cs="Arial"/>
+          <w:lang w:eastAsia="pt-PT"/>
+        </w:rPr>
+        <w:t xml:space="preserve">The preprocessing pipeline was designed based on the insights obtained during the exploratory data analysis (EDA). The analysis revealed that sentiment distinctions in the dataset were often expressed through specific financial terminology, stock tickers, hashtags, directional words, and performance-related vocabulary. Therefore, the main objective of </w:t>
+      </w:r>
+      <w:r>
+        <w:rPr>
+          <w:rFonts w:ascii="Arial" w:hAnsi="Arial" w:cs="Arial"/>
+          <w:lang w:eastAsia="pt-PT"/>
+        </w:rPr>
+        <w:lastRenderedPageBreak/>
+        <w:t>preprocessing was not only to reduce textual noise but also to preserve features that could contribute to sentiment discrimination.</w:t>
+      </w:r>
+    </w:p>
+    <w:p>
+      <w:pPr>
+        <w:rPr>
+          <w:rFonts w:ascii="Arial" w:hAnsi="Arial" w:cs="Arial"/>
+          <w:lang w:eastAsia="pt-PT"/>
+        </w:rPr>
+      </w:pPr>
+      <w:r>
+        <w:rPr>
+          <w:rFonts w:ascii="Arial" w:hAnsi="Arial" w:cs="Arial"/>
+          <w:lang w:eastAsia="pt-PT"/>
+        </w:rPr>
+        <w:t>As a first step, all tweets were converted to lowercase to ensure consistency across the corpus and reduce vocabulary sparsity caused by capitalization differences. Contractions such as “don't”, “can't”, and “it's” were expanded into their full forms before further processing, improving linguistic consistency and allowing negation patterns to be identified more reliably.</w:t>
+      </w:r>
+    </w:p>
+    <w:p>
+      <w:pPr>
+        <w:rPr>
+          <w:rFonts w:ascii="Arial" w:hAnsi="Arial" w:cs="Arial"/>
+          <w:lang w:eastAsia="pt-PT"/>
+        </w:rPr>
+      </w:pPr>
+      <w:r>
+        <w:rPr>
+          <w:rFonts w:ascii="Arial" w:hAnsi="Arial" w:cs="Arial"/>
+          <w:lang w:eastAsia="pt-PT"/>
+        </w:rPr>
+        <w:t xml:space="preserve">The EDA showed that bullish and bearish tweets frequently </w:t>
+      </w:r>
+      <w:proofErr w:type="gramStart"/>
+      <w:r>
+        <w:rPr>
+          <w:rFonts w:ascii="Arial" w:hAnsi="Arial" w:cs="Arial"/>
+          <w:lang w:eastAsia="pt-PT"/>
+        </w:rPr>
+        <w:t>contained</w:t>
+      </w:r>
+      <w:proofErr w:type="gramEnd"/>
+      <w:r>
+        <w:rPr>
+          <w:rFonts w:ascii="Arial" w:hAnsi="Arial" w:cs="Arial"/>
+          <w:lang w:eastAsia="pt-PT"/>
+        </w:rPr>
+        <w:t xml:space="preserve"> words associated with market movements and company performance, such as </w:t>
+      </w:r>
+      <w:r>
+        <w:rPr>
+          <w:rFonts w:ascii="Arial" w:hAnsi="Arial" w:cs="Arial"/>
+          <w:i/>
+          <w:iCs/>
+          <w:lang w:eastAsia="pt-PT"/>
+        </w:rPr>
+        <w:t>beats</w:t>
+      </w:r>
+      <w:r>
+        <w:rPr>
+          <w:rFonts w:ascii="Arial" w:hAnsi="Arial" w:cs="Arial"/>
+          <w:lang w:eastAsia="pt-PT"/>
+        </w:rPr>
+        <w:t xml:space="preserve">, </w:t>
+      </w:r>
+      <w:r>
+        <w:rPr>
+          <w:rFonts w:ascii="Arial" w:hAnsi="Arial" w:cs="Arial"/>
+          <w:i/>
+          <w:iCs/>
+          <w:lang w:eastAsia="pt-PT"/>
+        </w:rPr>
+        <w:t>raised</w:t>
+      </w:r>
+      <w:r>
+        <w:rPr>
+          <w:rFonts w:ascii="Arial" w:hAnsi="Arial" w:cs="Arial"/>
+          <w:lang w:eastAsia="pt-PT"/>
+        </w:rPr>
+        <w:t xml:space="preserve">, </w:t>
+      </w:r>
+      <w:r>
+        <w:rPr>
+          <w:rFonts w:ascii="Arial" w:hAnsi="Arial" w:cs="Arial"/>
+          <w:i/>
+          <w:iCs/>
+          <w:lang w:eastAsia="pt-PT"/>
+        </w:rPr>
+        <w:t>higher</w:t>
+      </w:r>
+      <w:r>
+        <w:rPr>
+          <w:rFonts w:ascii="Arial" w:hAnsi="Arial" w:cs="Arial"/>
+          <w:lang w:eastAsia="pt-PT"/>
+        </w:rPr>
+        <w:t xml:space="preserve">, </w:t>
+      </w:r>
+      <w:r>
+        <w:rPr>
+          <w:rFonts w:ascii="Arial" w:hAnsi="Arial" w:cs="Arial"/>
+          <w:i/>
+          <w:iCs/>
+          <w:lang w:eastAsia="pt-PT"/>
+        </w:rPr>
+        <w:t>misses</w:t>
+      </w:r>
+      <w:r>
+        <w:rPr>
+          <w:rFonts w:ascii="Arial" w:hAnsi="Arial" w:cs="Arial"/>
+          <w:lang w:eastAsia="pt-PT"/>
+        </w:rPr>
+        <w:t xml:space="preserve">, and </w:t>
+      </w:r>
+      <w:r>
+        <w:rPr>
+          <w:rFonts w:ascii="Arial" w:hAnsi="Arial" w:cs="Arial"/>
+          <w:i/>
+          <w:iCs/>
+          <w:lang w:eastAsia="pt-PT"/>
+        </w:rPr>
+        <w:t>cut</w:t>
+      </w:r>
+      <w:r>
+        <w:rPr>
+          <w:rFonts w:ascii="Arial" w:hAnsi="Arial" w:cs="Arial"/>
+          <w:lang w:eastAsia="pt-PT"/>
+        </w:rPr>
+        <w:t>. For this reason, special attention was given to preserving sentiment-bearing indicators. Directional symbols (e.g., upward and downward arrows), percentage changes, and strong emphasis markers were replaced with dedicated tokens before cleaning so that their sentiment information would not be lost during preprocessing.</w:t>
+      </w:r>
+    </w:p>
+    <w:p>
+      <w:pPr>
+        <w:rPr>
+          <w:rFonts w:ascii="Arial" w:hAnsi="Arial" w:cs="Arial"/>
+          <w:lang w:eastAsia="pt-PT"/>
+        </w:rPr>
+      </w:pPr>
+      <w:r>
+        <w:rPr>
+          <w:rFonts w:ascii="Arial" w:hAnsi="Arial" w:cs="Arial"/>
+          <w:lang w:eastAsia="pt-PT"/>
+        </w:rPr>
+        <w:t xml:space="preserve">Since the analysis of </w:t>
+      </w:r>
+      <w:proofErr w:type="spellStart"/>
+      <w:r>
+        <w:rPr>
+          <w:rFonts w:ascii="Arial" w:hAnsi="Arial" w:cs="Arial"/>
+          <w:lang w:eastAsia="pt-PT"/>
+        </w:rPr>
+        <w:t>cashtags</w:t>
+      </w:r>
+      <w:proofErr w:type="spellEnd"/>
+      <w:r>
+        <w:rPr>
+          <w:rFonts w:ascii="Arial" w:hAnsi="Arial" w:cs="Arial"/>
+          <w:lang w:eastAsia="pt-PT"/>
+        </w:rPr>
+        <w:t xml:space="preserve"> demonstrated that stock tickers were more prevalent in bullish tweets (24.6%) than in bearish or neutral tweets (approximately 13%), stock ticker references were explicitly preserved. Known tickers were mapped to standardized tokens (e.g., TICKER_AAPL), while unknown tickers were replaced with a generic STOCK_TICKER token. This allowed the model to retain information about stock-specific discussions while limiting vocabulary growth.</w:t>
+      </w:r>
+    </w:p>
+    <w:p>
+      <w:pPr>
+        <w:rPr>
+          <w:rFonts w:ascii="Arial" w:hAnsi="Arial" w:cs="Arial"/>
+          <w:lang w:eastAsia="pt-PT"/>
+        </w:rPr>
+      </w:pPr>
+      <w:r>
+        <w:rPr>
+          <w:rFonts w:ascii="Arial" w:hAnsi="Arial" w:cs="Arial"/>
+          <w:lang w:eastAsia="pt-PT"/>
+        </w:rPr>
+        <w:t>Numerical information was also handled carefully because financial sentiment is often associated with percentages, price targets, earnings figures, and market performance metrics. Percentage values and monetary amounts were converted into contextual tokens such as NUM_PERCENT and DOLLAR_AMOUNT, while standalone numerical values were removed. This approach preserved the semantic role of financial quantities without introducing unnecessary sparsity.</w:t>
+      </w:r>
+    </w:p>
+    <w:p>
+      <w:pPr>
+        <w:rPr>
+          <w:rFonts w:ascii="Arial" w:hAnsi="Arial" w:cs="Arial"/>
+          <w:lang w:eastAsia="pt-PT"/>
+        </w:rPr>
+      </w:pPr>
+      <w:r>
+        <w:rPr>
+          <w:rFonts w:ascii="Arial" w:hAnsi="Arial" w:cs="Arial"/>
+          <w:lang w:eastAsia="pt-PT"/>
+        </w:rPr>
+        <w:t xml:space="preserve">Noise removal was then performed by eliminating URLs, user mentions, punctuation, and redundant whitespace. Although the EDA showed that neutral tweets contained URLs more frequently (49.8%) than bullish (39.1%) or bearish (44.3%) tweets, URLs themselves rarely carry semantic information relevant to sentiment classification. Therefore, only the URL content was removed while retaining the surrounding textual context. Similarly, hashtag symbols were removed while preserving the associated words, since the hashtag analysis revealed that terms such as </w:t>
+      </w:r>
+      <w:r>
+        <w:rPr>
+          <w:rFonts w:ascii="Arial" w:hAnsi="Arial" w:cs="Arial"/>
+          <w:i/>
+          <w:iCs/>
+          <w:lang w:eastAsia="pt-PT"/>
+        </w:rPr>
+        <w:t>economy</w:t>
+      </w:r>
+      <w:r>
+        <w:rPr>
+          <w:rFonts w:ascii="Arial" w:hAnsi="Arial" w:cs="Arial"/>
+          <w:lang w:eastAsia="pt-PT"/>
+        </w:rPr>
+        <w:t xml:space="preserve">, </w:t>
+      </w:r>
+      <w:r>
+        <w:rPr>
+          <w:rFonts w:ascii="Arial" w:hAnsi="Arial" w:cs="Arial"/>
+          <w:i/>
+          <w:iCs/>
+          <w:lang w:eastAsia="pt-PT"/>
+        </w:rPr>
+        <w:t>stock</w:t>
+      </w:r>
+      <w:r>
+        <w:rPr>
+          <w:rFonts w:ascii="Arial" w:hAnsi="Arial" w:cs="Arial"/>
+          <w:lang w:eastAsia="pt-PT"/>
+        </w:rPr>
+        <w:t xml:space="preserve">, </w:t>
+      </w:r>
+      <w:r>
+        <w:rPr>
+          <w:rFonts w:ascii="Arial" w:hAnsi="Arial" w:cs="Arial"/>
+          <w:i/>
+          <w:iCs/>
+          <w:lang w:eastAsia="pt-PT"/>
+        </w:rPr>
+        <w:t>trading</w:t>
+      </w:r>
+      <w:r>
+        <w:rPr>
+          <w:rFonts w:ascii="Arial" w:hAnsi="Arial" w:cs="Arial"/>
+          <w:lang w:eastAsia="pt-PT"/>
+        </w:rPr>
+        <w:t xml:space="preserve">, and </w:t>
+      </w:r>
+      <w:r>
+        <w:rPr>
+          <w:rFonts w:ascii="Arial" w:hAnsi="Arial" w:cs="Arial"/>
+          <w:i/>
+          <w:iCs/>
+          <w:lang w:eastAsia="pt-PT"/>
+        </w:rPr>
+        <w:t>markets</w:t>
+      </w:r>
+      <w:r>
+        <w:rPr>
+          <w:rFonts w:ascii="Arial" w:hAnsi="Arial" w:cs="Arial"/>
+          <w:lang w:eastAsia="pt-PT"/>
+        </w:rPr>
+        <w:t xml:space="preserve"> often contained meaningful topic information.</w:t>
+      </w:r>
+    </w:p>
+    <w:p>
+      <w:pPr>
+        <w:rPr>
+          <w:rFonts w:ascii="Arial" w:hAnsi="Arial" w:cs="Arial"/>
+          <w:lang w:eastAsia="pt-PT"/>
+        </w:rPr>
+      </w:pPr>
+      <w:r>
+        <w:rPr>
+          <w:rFonts w:ascii="Arial" w:hAnsi="Arial" w:cs="Arial"/>
+          <w:lang w:eastAsia="pt-PT"/>
+        </w:rPr>
+        <w:t xml:space="preserve">After cleaning, tweets were tokenized using NLTK's </w:t>
+      </w:r>
+      <w:proofErr w:type="spellStart"/>
+      <w:r>
+        <w:rPr>
+          <w:rFonts w:ascii="Arial" w:hAnsi="Arial" w:cs="Arial"/>
+          <w:lang w:eastAsia="pt-PT"/>
+        </w:rPr>
+        <w:t>TweetTokenizer</w:t>
+      </w:r>
+      <w:proofErr w:type="spellEnd"/>
+      <w:r>
+        <w:rPr>
+          <w:rFonts w:ascii="Arial" w:hAnsi="Arial" w:cs="Arial"/>
+          <w:lang w:eastAsia="pt-PT"/>
+        </w:rPr>
+        <w:t xml:space="preserve">, which is specifically designed to handle social media text. </w:t>
+      </w:r>
+      <w:proofErr w:type="spellStart"/>
+      <w:r>
+        <w:rPr>
+          <w:rFonts w:ascii="Arial" w:hAnsi="Arial" w:cs="Arial"/>
+          <w:lang w:eastAsia="pt-PT"/>
+        </w:rPr>
+        <w:t>Stopword</w:t>
+      </w:r>
+      <w:proofErr w:type="spellEnd"/>
+      <w:r>
+        <w:rPr>
+          <w:rFonts w:ascii="Arial" w:hAnsi="Arial" w:cs="Arial"/>
+          <w:lang w:eastAsia="pt-PT"/>
+        </w:rPr>
+        <w:t xml:space="preserve"> removal was then applied to eliminate common words with limited discriminative value. However, unlike a standard </w:t>
+      </w:r>
+      <w:proofErr w:type="spellStart"/>
+      <w:r>
+        <w:rPr>
+          <w:rFonts w:ascii="Arial" w:hAnsi="Arial" w:cs="Arial"/>
+          <w:lang w:eastAsia="pt-PT"/>
+        </w:rPr>
+        <w:t>stopword</w:t>
+      </w:r>
+      <w:proofErr w:type="spellEnd"/>
+      <w:r>
+        <w:rPr>
+          <w:rFonts w:ascii="Arial" w:hAnsi="Arial" w:cs="Arial"/>
+          <w:lang w:eastAsia="pt-PT"/>
+        </w:rPr>
+        <w:t xml:space="preserve"> removal procedure, sentiment-critical financial terms identified during EDA were explicitly preserved. Words such as </w:t>
+      </w:r>
+      <w:r>
+        <w:rPr>
+          <w:rFonts w:ascii="Arial" w:hAnsi="Arial" w:cs="Arial"/>
+          <w:i/>
+          <w:iCs/>
+          <w:lang w:eastAsia="pt-PT"/>
+        </w:rPr>
+        <w:t>buy</w:t>
+      </w:r>
+      <w:r>
+        <w:rPr>
+          <w:rFonts w:ascii="Arial" w:hAnsi="Arial" w:cs="Arial"/>
+          <w:lang w:eastAsia="pt-PT"/>
+        </w:rPr>
+        <w:t xml:space="preserve">, </w:t>
+      </w:r>
+      <w:r>
+        <w:rPr>
+          <w:rFonts w:ascii="Arial" w:hAnsi="Arial" w:cs="Arial"/>
+          <w:i/>
+          <w:iCs/>
+          <w:lang w:eastAsia="pt-PT"/>
+        </w:rPr>
+        <w:t>sell</w:t>
+      </w:r>
+      <w:r>
+        <w:rPr>
+          <w:rFonts w:ascii="Arial" w:hAnsi="Arial" w:cs="Arial"/>
+          <w:lang w:eastAsia="pt-PT"/>
+        </w:rPr>
+        <w:t xml:space="preserve">, </w:t>
+      </w:r>
+      <w:r>
+        <w:rPr>
+          <w:rFonts w:ascii="Arial" w:hAnsi="Arial" w:cs="Arial"/>
+          <w:i/>
+          <w:iCs/>
+          <w:lang w:eastAsia="pt-PT"/>
+        </w:rPr>
+        <w:t>bullish</w:t>
+      </w:r>
+      <w:r>
+        <w:rPr>
+          <w:rFonts w:ascii="Arial" w:hAnsi="Arial" w:cs="Arial"/>
+          <w:lang w:eastAsia="pt-PT"/>
+        </w:rPr>
+        <w:t xml:space="preserve">, </w:t>
+      </w:r>
+      <w:r>
+        <w:rPr>
+          <w:rFonts w:ascii="Arial" w:hAnsi="Arial" w:cs="Arial"/>
+          <w:i/>
+          <w:iCs/>
+          <w:lang w:eastAsia="pt-PT"/>
+        </w:rPr>
+        <w:t>bearish</w:t>
+      </w:r>
+      <w:r>
+        <w:rPr>
+          <w:rFonts w:ascii="Arial" w:hAnsi="Arial" w:cs="Arial"/>
+          <w:lang w:eastAsia="pt-PT"/>
+        </w:rPr>
+        <w:t xml:space="preserve">, </w:t>
+      </w:r>
+      <w:r>
+        <w:rPr>
+          <w:rFonts w:ascii="Arial" w:hAnsi="Arial" w:cs="Arial"/>
+          <w:i/>
+          <w:iCs/>
+          <w:lang w:eastAsia="pt-PT"/>
+        </w:rPr>
+        <w:t>upgrade</w:t>
+      </w:r>
+      <w:r>
+        <w:rPr>
+          <w:rFonts w:ascii="Arial" w:hAnsi="Arial" w:cs="Arial"/>
+          <w:lang w:eastAsia="pt-PT"/>
+        </w:rPr>
+        <w:t xml:space="preserve">, </w:t>
+      </w:r>
+      <w:r>
+        <w:rPr>
+          <w:rFonts w:ascii="Arial" w:hAnsi="Arial" w:cs="Arial"/>
+          <w:i/>
+          <w:iCs/>
+          <w:lang w:eastAsia="pt-PT"/>
+        </w:rPr>
+        <w:t>downgrade</w:t>
+      </w:r>
+      <w:r>
+        <w:rPr>
+          <w:rFonts w:ascii="Arial" w:hAnsi="Arial" w:cs="Arial"/>
+          <w:lang w:eastAsia="pt-PT"/>
+        </w:rPr>
+        <w:t xml:space="preserve">, </w:t>
+      </w:r>
+      <w:r>
+        <w:rPr>
+          <w:rFonts w:ascii="Arial" w:hAnsi="Arial" w:cs="Arial"/>
+          <w:i/>
+          <w:iCs/>
+          <w:lang w:eastAsia="pt-PT"/>
+        </w:rPr>
+        <w:t>rise</w:t>
+      </w:r>
+      <w:r>
+        <w:rPr>
+          <w:rFonts w:ascii="Arial" w:hAnsi="Arial" w:cs="Arial"/>
+          <w:lang w:eastAsia="pt-PT"/>
+        </w:rPr>
+        <w:t xml:space="preserve">, </w:t>
+      </w:r>
+      <w:r>
+        <w:rPr>
+          <w:rFonts w:ascii="Arial" w:hAnsi="Arial" w:cs="Arial"/>
+          <w:i/>
+          <w:iCs/>
+          <w:lang w:eastAsia="pt-PT"/>
+        </w:rPr>
+        <w:t>fall</w:t>
+      </w:r>
+      <w:r>
+        <w:rPr>
+          <w:rFonts w:ascii="Arial" w:hAnsi="Arial" w:cs="Arial"/>
+          <w:lang w:eastAsia="pt-PT"/>
+        </w:rPr>
+        <w:t xml:space="preserve">, </w:t>
+      </w:r>
+      <w:r>
+        <w:rPr>
+          <w:rFonts w:ascii="Arial" w:hAnsi="Arial" w:cs="Arial"/>
+          <w:i/>
+          <w:iCs/>
+          <w:lang w:eastAsia="pt-PT"/>
+        </w:rPr>
+        <w:t>higher</w:t>
+      </w:r>
+      <w:r>
+        <w:rPr>
+          <w:rFonts w:ascii="Arial" w:hAnsi="Arial" w:cs="Arial"/>
+          <w:lang w:eastAsia="pt-PT"/>
+        </w:rPr>
+        <w:t xml:space="preserve">, and </w:t>
+      </w:r>
+      <w:r>
+        <w:rPr>
+          <w:rFonts w:ascii="Arial" w:hAnsi="Arial" w:cs="Arial"/>
+          <w:i/>
+          <w:iCs/>
+          <w:lang w:eastAsia="pt-PT"/>
+        </w:rPr>
+        <w:t>lower</w:t>
+      </w:r>
+      <w:r>
+        <w:rPr>
+          <w:rFonts w:ascii="Arial" w:hAnsi="Arial" w:cs="Arial"/>
+          <w:lang w:eastAsia="pt-PT"/>
+        </w:rPr>
+        <w:t xml:space="preserve"> were retained regardless of their frequency because they provide strong signals for sentiment classification.</w:t>
+      </w:r>
+    </w:p>
+    <w:p>
+      <w:pPr>
+        <w:rPr>
+          <w:rFonts w:ascii="Arial" w:hAnsi="Arial" w:cs="Arial"/>
+          <w:lang w:eastAsia="pt-PT"/>
+        </w:rPr>
+      </w:pPr>
+      <w:r>
+        <w:rPr>
+          <w:rFonts w:ascii="Arial" w:hAnsi="Arial" w:cs="Arial"/>
+          <w:lang w:eastAsia="pt-PT"/>
+        </w:rPr>
+        <w:t xml:space="preserve">To further improve sentiment representation, a negation-handling step was introduced. Words immediately following negation terms such as </w:t>
+      </w:r>
+      <w:r>
+        <w:rPr>
+          <w:rFonts w:ascii="Arial" w:hAnsi="Arial" w:cs="Arial"/>
+          <w:i/>
+          <w:iCs/>
+          <w:lang w:eastAsia="pt-PT"/>
+        </w:rPr>
+        <w:t>not</w:t>
+      </w:r>
+      <w:r>
+        <w:rPr>
+          <w:rFonts w:ascii="Arial" w:hAnsi="Arial" w:cs="Arial"/>
+          <w:lang w:eastAsia="pt-PT"/>
+        </w:rPr>
+        <w:t xml:space="preserve">, </w:t>
+      </w:r>
+      <w:r>
+        <w:rPr>
+          <w:rFonts w:ascii="Arial" w:hAnsi="Arial" w:cs="Arial"/>
+          <w:i/>
+          <w:iCs/>
+          <w:lang w:eastAsia="pt-PT"/>
+        </w:rPr>
+        <w:t>never</w:t>
+      </w:r>
+      <w:r>
+        <w:rPr>
+          <w:rFonts w:ascii="Arial" w:hAnsi="Arial" w:cs="Arial"/>
+          <w:lang w:eastAsia="pt-PT"/>
+        </w:rPr>
+        <w:t xml:space="preserve">, and </w:t>
+      </w:r>
+      <w:r>
+        <w:rPr>
+          <w:rFonts w:ascii="Arial" w:hAnsi="Arial" w:cs="Arial"/>
+          <w:i/>
+          <w:iCs/>
+          <w:lang w:eastAsia="pt-PT"/>
+        </w:rPr>
+        <w:t>no</w:t>
+      </w:r>
+      <w:r>
+        <w:rPr>
+          <w:rFonts w:ascii="Arial" w:hAnsi="Arial" w:cs="Arial"/>
+          <w:lang w:eastAsia="pt-PT"/>
+        </w:rPr>
+        <w:t xml:space="preserve"> were prefixed with NOT_, allowing the model to distinguish between expressions with opposite meanings, such as </w:t>
+      </w:r>
+      <w:r>
+        <w:rPr>
+          <w:rFonts w:ascii="Arial" w:hAnsi="Arial" w:cs="Arial"/>
+          <w:i/>
+          <w:iCs/>
+          <w:lang w:eastAsia="pt-PT"/>
+        </w:rPr>
+        <w:t>profitable</w:t>
+      </w:r>
+      <w:r>
+        <w:rPr>
+          <w:rFonts w:ascii="Arial" w:hAnsi="Arial" w:cs="Arial"/>
+          <w:lang w:eastAsia="pt-PT"/>
+        </w:rPr>
+        <w:t xml:space="preserve"> and </w:t>
+      </w:r>
+      <w:r>
+        <w:rPr>
+          <w:rFonts w:ascii="Arial" w:hAnsi="Arial" w:cs="Arial"/>
+          <w:i/>
+          <w:iCs/>
+          <w:lang w:eastAsia="pt-PT"/>
+        </w:rPr>
+        <w:t>not profitable</w:t>
+      </w:r>
+      <w:r>
+        <w:rPr>
+          <w:rFonts w:ascii="Arial" w:hAnsi="Arial" w:cs="Arial"/>
+          <w:lang w:eastAsia="pt-PT"/>
+        </w:rPr>
+        <w:t>.</w:t>
+      </w:r>
+    </w:p>
+    <w:p>
+      <w:pPr>
+        <w:rPr>
+          <w:rFonts w:ascii="Arial" w:hAnsi="Arial" w:cs="Arial"/>
+          <w:lang w:eastAsia="pt-PT"/>
+        </w:rPr>
+      </w:pPr>
+      <w:r>
+        <w:rPr>
+          <w:rFonts w:ascii="Arial" w:hAnsi="Arial" w:cs="Arial"/>
+          <w:lang w:eastAsia="pt-PT"/>
+        </w:rPr>
+        <w:lastRenderedPageBreak/>
+        <w:t xml:space="preserve">Finally, lemmatization was applied to reduce words to their base forms while preserving their semantic meaning. This helped reduce vocabulary size and group together related word variants (e.g., </w:t>
+      </w:r>
+      <w:r>
+        <w:rPr>
+          <w:rFonts w:ascii="Arial" w:hAnsi="Arial" w:cs="Arial"/>
+          <w:i/>
+          <w:iCs/>
+          <w:lang w:eastAsia="pt-PT"/>
+        </w:rPr>
+        <w:t>raises</w:t>
+      </w:r>
+      <w:r>
+        <w:rPr>
+          <w:rFonts w:ascii="Arial" w:hAnsi="Arial" w:cs="Arial"/>
+          <w:lang w:eastAsia="pt-PT"/>
+        </w:rPr>
+        <w:t xml:space="preserve">, </w:t>
+      </w:r>
+      <w:r>
+        <w:rPr>
+          <w:rFonts w:ascii="Arial" w:hAnsi="Arial" w:cs="Arial"/>
+          <w:i/>
+          <w:iCs/>
+          <w:lang w:eastAsia="pt-PT"/>
+        </w:rPr>
+        <w:t>raised</w:t>
+      </w:r>
+      <w:r>
+        <w:rPr>
+          <w:rFonts w:ascii="Arial" w:hAnsi="Arial" w:cs="Arial"/>
+          <w:lang w:eastAsia="pt-PT"/>
+        </w:rPr>
+        <w:t xml:space="preserve">, and </w:t>
+      </w:r>
+      <w:r>
+        <w:rPr>
+          <w:rFonts w:ascii="Arial" w:hAnsi="Arial" w:cs="Arial"/>
+          <w:i/>
+          <w:iCs/>
+          <w:lang w:eastAsia="pt-PT"/>
+        </w:rPr>
+        <w:t>raising</w:t>
+      </w:r>
+      <w:r>
+        <w:rPr>
+          <w:rFonts w:ascii="Arial" w:hAnsi="Arial" w:cs="Arial"/>
+          <w:lang w:eastAsia="pt-PT"/>
+        </w:rPr>
+        <w:t>). An optional stemming stage was also available, although lemmatization was preferred because it is less aggressive and better suited to maintaining the interpretability of financial language.</w:t>
+      </w:r>
+    </w:p>
+    <w:p>
+      <w:pPr>
+        <w:rPr>
+          <w:rFonts w:ascii="Arial" w:hAnsi="Arial" w:cs="Arial"/>
+          <w:lang w:eastAsia="pt-PT"/>
+        </w:rPr>
+      </w:pPr>
+    </w:p>
+    <w:p>
+      <w:pPr>
+        <w:pStyle w:val="Ttulo1"/>
+        <w:rPr>
+          <w:rFonts w:ascii="Arial" w:hAnsi="Arial" w:cs="Arial"/>
+        </w:rPr>
+      </w:pPr>
+      <w:bookmarkStart w:id="16" w:name="_Toc231138632"/>
+      <w:r>
+        <w:rPr>
+          <w:rFonts w:ascii="Arial" w:hAnsi="Arial" w:cs="Arial"/>
+        </w:rPr>
+        <w:t>Feature Engineering</w:t>
+      </w:r>
+      <w:bookmarkEnd w:id="16"/>
+    </w:p>
+    <w:p>
+      <w:pPr>
+        <w:rPr>
+          <w:rFonts w:ascii="Arial" w:hAnsi="Arial" w:cs="Arial"/>
+          <w:lang w:eastAsia="pt-PT"/>
+        </w:rPr>
+      </w:pPr>
+      <w:r>
+        <w:rPr>
+          <w:rFonts w:ascii="Arial" w:hAnsi="Arial" w:cs="Arial"/>
+          <w:lang w:eastAsia="pt-PT"/>
+        </w:rPr>
+        <w:t>To convert the preprocessed textual data into a format suitable for machine learning algorithms, multiple feature extraction techniques were explored, including Bag-of-Words (</w:t>
+      </w:r>
+      <w:proofErr w:type="spellStart"/>
+      <w:r>
+        <w:rPr>
+          <w:rFonts w:ascii="Arial" w:hAnsi="Arial" w:cs="Arial"/>
+          <w:lang w:eastAsia="pt-PT"/>
+        </w:rPr>
+        <w:t>BoW</w:t>
+      </w:r>
+      <w:proofErr w:type="spellEnd"/>
+      <w:r>
+        <w:rPr>
+          <w:rFonts w:ascii="Arial" w:hAnsi="Arial" w:cs="Arial"/>
+          <w:lang w:eastAsia="pt-PT"/>
+        </w:rPr>
+        <w:t>)</w:t>
+      </w:r>
+      <w:r>
+        <w:rPr>
+          <w:rFonts w:ascii="Arial" w:hAnsi="Arial" w:cs="Arial"/>
+          <w:lang w:eastAsia="pt-PT"/>
+        </w:rPr>
+        <w:t xml:space="preserve"> alongside </w:t>
+      </w:r>
+      <w:r>
+        <w:rPr>
+          <w:rFonts w:ascii="Arial" w:hAnsi="Arial" w:cs="Arial"/>
+          <w:lang w:eastAsia="pt-PT"/>
+        </w:rPr>
+        <w:t>TF-IDF representations, and Word2Vec embeddings. The goal was to capture both lexical importance and semantic relationships within financial tweets.</w:t>
+      </w:r>
     </w:p>
     <w:p>
       <w:pPr>
         <w:pStyle w:val="Ttulo2"/>
-        <w:spacing w:before="0" w:after="0"/>
-        <w:rPr>
-          <w:rFonts w:ascii="Arial" w:hAnsi="Arial" w:cs="Arial"/>
-        </w:rPr>
-      </w:pPr>
-      <w:bookmarkStart w:id="15" w:name="_Toc228445049"/>
-      <w:r>
-        <w:rPr>
-          <w:rFonts w:ascii="Arial" w:hAnsi="Arial" w:cs="Arial"/>
-        </w:rPr>
-        <w:t xml:space="preserve">Data </w:t>
-      </w:r>
-      <w:r>
-        <w:rPr>
-          <w:rFonts w:ascii="Arial" w:hAnsi="Arial" w:cs="Arial"/>
-        </w:rPr>
-        <w:t>Preprocessing</w:t>
-      </w:r>
-      <w:bookmarkEnd w:id="15"/>
-    </w:p>
-    <w:p>
-      <w:pPr>
-        <w:rPr>
-          <w:rFonts w:ascii="Arial" w:hAnsi="Arial" w:cs="Arial"/>
-          <w:lang w:eastAsia="pt-PT"/>
-        </w:rPr>
-      </w:pPr>
-    </w:p>
-    <w:p>
-      <w:pPr>
-        <w:rPr>
-          <w:rFonts w:ascii="Arial" w:hAnsi="Arial" w:cs="Arial"/>
-          <w:lang w:eastAsia="pt-PT"/>
-        </w:rPr>
-      </w:pPr>
-      <w:r>
-        <w:rPr>
-          <w:rFonts w:ascii="Arial" w:hAnsi="Arial" w:cs="Arial"/>
-          <w:lang w:eastAsia="pt-PT"/>
-        </w:rPr>
-        <w:t xml:space="preserve">The preprocessing pipeline was designed based on the insights obtained during the exploratory data analysis (EDA). The analysis revealed that sentiment distinctions in the dataset were often expressed through specific financial terminology, stock tickers, hashtags, </w:t>
-      </w:r>
+        <w:rPr>
+          <w:rFonts w:ascii="Arial" w:hAnsi="Arial" w:cs="Arial"/>
+        </w:rPr>
+      </w:pPr>
+      <w:r>
+        <w:rPr>
+          <w:rFonts w:ascii="Arial" w:hAnsi="Arial" w:cs="Arial"/>
+        </w:rPr>
+        <w:t>Bag-of-Words and TF-IDF Representation</w:t>
+      </w:r>
+    </w:p>
+    <w:p>
+      <w:pPr>
+        <w:rPr>
+          <w:rFonts w:ascii="Arial" w:hAnsi="Arial" w:cs="Arial"/>
+          <w:lang w:eastAsia="pt-PT"/>
+        </w:rPr>
+      </w:pPr>
+      <w:r>
+        <w:rPr>
+          <w:rFonts w:ascii="Arial" w:hAnsi="Arial" w:cs="Arial"/>
+          <w:lang w:eastAsia="pt-PT"/>
+        </w:rPr>
+        <w:t>The primary baseline representation was based on a Bag-of-Words approach enhanced with TF-IDF weighting. This method converts each tweet into a sparse vector representation, where each dimension corresponds to a word or n-gram in the vocabulary.</w:t>
+      </w:r>
+    </w:p>
+    <w:p>
+      <w:pPr>
+        <w:rPr>
+          <w:rFonts w:ascii="Arial" w:hAnsi="Arial" w:cs="Arial"/>
+          <w:lang w:eastAsia="pt-PT"/>
+        </w:rPr>
+      </w:pPr>
+      <w:r>
+        <w:rPr>
+          <w:rFonts w:ascii="Arial" w:hAnsi="Arial" w:cs="Arial"/>
+          <w:lang w:eastAsia="pt-PT"/>
+        </w:rPr>
+        <w:t xml:space="preserve">To improve performance in the financial domain, several domain-specific </w:t>
+      </w:r>
+      <w:proofErr w:type="spellStart"/>
+      <w:r>
+        <w:rPr>
+          <w:rFonts w:ascii="Arial" w:hAnsi="Arial" w:cs="Arial"/>
+          <w:lang w:eastAsia="pt-PT"/>
+        </w:rPr>
+        <w:t>optimisations</w:t>
+      </w:r>
+      <w:proofErr w:type="spellEnd"/>
+      <w:r>
+        <w:rPr>
+          <w:rFonts w:ascii="Arial" w:hAnsi="Arial" w:cs="Arial"/>
+          <w:lang w:eastAsia="pt-PT"/>
+        </w:rPr>
+        <w:t xml:space="preserve"> were introduced. A maximum feature limit of 10,000 was applied to control vocabulary size and reduce computational complexity. In addition, n-gram extraction was enabled (up to trigrams), allowing the model to capture short phrases such as “price target”, “beats estimates”, and “stock market”, which are often more informative than isolated words.</w:t>
+      </w:r>
+    </w:p>
+    <w:p>
+      <w:pPr>
+        <w:rPr>
+          <w:rFonts w:ascii="Arial" w:hAnsi="Arial" w:cs="Arial"/>
+          <w:lang w:eastAsia="pt-PT"/>
+        </w:rPr>
+      </w:pPr>
+      <w:r>
+        <w:rPr>
+          <w:rFonts w:ascii="Arial" w:hAnsi="Arial" w:cs="Arial"/>
+          <w:lang w:eastAsia="pt-PT"/>
+        </w:rPr>
+        <w:t>Term filtering was also applied using document frequency thresholds. Terms appearing in fewer than two documents were removed to reduce noise, while extremely frequent terms appearing in more than 85% of documents were discarded due to their limited discriminative value. Furthermore, sublinear term frequency scaling was used to reduce the impact of overly frequent words, and L2 normalization was applied to ensure consistent vector magnitudes across samples.</w:t>
+      </w:r>
+    </w:p>
+    <w:p>
+      <w:pPr>
+        <w:rPr>
+          <w:rFonts w:ascii="Arial" w:hAnsi="Arial" w:cs="Arial"/>
+          <w:lang w:eastAsia="pt-PT"/>
+        </w:rPr>
+      </w:pPr>
+      <w:r>
+        <w:rPr>
+          <w:rFonts w:ascii="Arial" w:hAnsi="Arial" w:cs="Arial"/>
+          <w:lang w:eastAsia="pt-PT"/>
+        </w:rPr>
+        <w:t>In addition to the standard TF-IDF representation, feature interpretability was supported by inspecting the highest inverse document frequency (IDF) scores, allowing identification of the most distinctive terms within the corpus.</w:t>
+      </w:r>
+    </w:p>
+    <w:p>
+      <w:pPr>
+        <w:pStyle w:val="Ttulo2"/>
+        <w:rPr>
+          <w:rFonts w:ascii="Arial" w:hAnsi="Arial" w:cs="Arial"/>
+          <w:lang w:val="pt-PT"/>
+        </w:rPr>
+      </w:pPr>
+      <w:r>
+        <w:rPr>
+          <w:rFonts w:ascii="Arial" w:hAnsi="Arial" w:cs="Arial"/>
+          <w:lang w:val="pt-PT"/>
+        </w:rPr>
+        <w:t xml:space="preserve">Word2Vec </w:t>
+      </w:r>
+      <w:proofErr w:type="spellStart"/>
+      <w:r>
+        <w:rPr>
+          <w:rFonts w:ascii="Arial" w:hAnsi="Arial" w:cs="Arial"/>
+          <w:lang w:val="pt-PT"/>
+        </w:rPr>
+        <w:t>Embeddings</w:t>
+      </w:r>
+      <w:proofErr w:type="spellEnd"/>
+    </w:p>
+    <w:p>
+      <w:pPr>
+        <w:rPr>
+          <w:rFonts w:ascii="Arial" w:hAnsi="Arial" w:cs="Arial"/>
+          <w:lang w:eastAsia="pt-PT"/>
+        </w:rPr>
+      </w:pPr>
+      <w:r>
+        <w:rPr>
+          <w:rFonts w:ascii="Arial" w:hAnsi="Arial" w:cs="Arial"/>
+          <w:lang w:eastAsia="pt-PT"/>
+        </w:rPr>
+        <w:t>To capture semantic relationships between words beyond simple frequency-based representations, a Word2Vec embedding model was trained directly on the financial tweet corpus. The skip-gram architecture was selected due to its ability to better represent rare words, which are common in financial text (e.g., stock tickers and company-specific terminology).</w:t>
+      </w:r>
+    </w:p>
+    <w:p>
+      <w:pPr>
+        <w:rPr>
+          <w:rFonts w:ascii="Arial" w:hAnsi="Arial" w:cs="Arial"/>
+          <w:lang w:eastAsia="pt-PT"/>
+        </w:rPr>
+      </w:pPr>
+      <w:r>
+        <w:rPr>
+          <w:rFonts w:ascii="Arial" w:hAnsi="Arial" w:cs="Arial"/>
+          <w:lang w:eastAsia="pt-PT"/>
+        </w:rPr>
+        <w:t>Each word was mapped into a dense vector representation, and document-level embeddings were obtained by aggregating word vectors. Several aggregation strategies were explored, including mean pooling, sum pooling, and weighted aggregation using TF-IDF scores. This allowed the model to represent each tweet as a fixed-length dense vector while preserving semantic information.</w:t>
+      </w:r>
+    </w:p>
+    <w:p>
+      <w:pPr>
+        <w:rPr>
+          <w:rFonts w:ascii="Arial" w:hAnsi="Arial" w:cs="Arial"/>
+          <w:lang w:eastAsia="pt-PT"/>
+        </w:rPr>
+      </w:pPr>
       <w:r>
         <w:rPr>
           <w:rFonts w:ascii="Arial" w:hAnsi="Arial" w:cs="Arial"/>
           <w:lang w:eastAsia="pt-PT"/>
         </w:rPr>
         <w:lastRenderedPageBreak/>
-        <w:t>directional words, and performance-related vocabulary. Therefore, the main objective of preprocessing was not only to reduce textual noise but also to preserve features that could contribute to sentiment discrimination.</w:t>
-      </w:r>
-    </w:p>
-    <w:p>
-      <w:pPr>
-        <w:rPr>
-          <w:rFonts w:ascii="Arial" w:hAnsi="Arial" w:cs="Arial"/>
-          <w:lang w:eastAsia="pt-PT"/>
-        </w:rPr>
-      </w:pPr>
-      <w:r>
-        <w:rPr>
-          <w:rFonts w:ascii="Arial" w:hAnsi="Arial" w:cs="Arial"/>
-          <w:lang w:eastAsia="pt-PT"/>
-        </w:rPr>
-        <w:t>As a first step, all tweets were converted to lowercase to ensure consistency across the corpus and reduce vocabulary sparsity caused by capitalization differences. Contractions such as “don't”, “can't”, and “it's” were expanded into their full forms before further processing, improving linguistic consistency and allowing negation patterns to be identified more reliably.</w:t>
-      </w:r>
-    </w:p>
-    <w:p>
-      <w:pPr>
-        <w:rPr>
-          <w:rFonts w:ascii="Arial" w:hAnsi="Arial" w:cs="Arial"/>
-          <w:lang w:eastAsia="pt-PT"/>
-        </w:rPr>
-      </w:pPr>
-      <w:r>
-        <w:rPr>
-          <w:rFonts w:ascii="Arial" w:hAnsi="Arial" w:cs="Arial"/>
-          <w:lang w:eastAsia="pt-PT"/>
-        </w:rPr>
-        <w:t xml:space="preserve">The EDA showed that bullish and bearish tweets frequently contained words associated with market movements and company performance, such as </w:t>
-      </w:r>
-      <w:r>
-        <w:rPr>
-          <w:rFonts w:ascii="Arial" w:hAnsi="Arial" w:cs="Arial"/>
-          <w:i/>
-          <w:iCs/>
-          <w:lang w:eastAsia="pt-PT"/>
-        </w:rPr>
-        <w:t>beats</w:t>
-      </w:r>
-      <w:r>
-        <w:rPr>
-          <w:rFonts w:ascii="Arial" w:hAnsi="Arial" w:cs="Arial"/>
-          <w:lang w:eastAsia="pt-PT"/>
-        </w:rPr>
-        <w:t xml:space="preserve">, </w:t>
-      </w:r>
-      <w:r>
-        <w:rPr>
-          <w:rFonts w:ascii="Arial" w:hAnsi="Arial" w:cs="Arial"/>
-          <w:i/>
-          <w:iCs/>
-          <w:lang w:eastAsia="pt-PT"/>
-        </w:rPr>
-        <w:t>raised</w:t>
-      </w:r>
-      <w:r>
-        <w:rPr>
-          <w:rFonts w:ascii="Arial" w:hAnsi="Arial" w:cs="Arial"/>
-          <w:lang w:eastAsia="pt-PT"/>
-        </w:rPr>
-        <w:t xml:space="preserve">, </w:t>
-      </w:r>
-      <w:r>
-        <w:rPr>
-          <w:rFonts w:ascii="Arial" w:hAnsi="Arial" w:cs="Arial"/>
-          <w:i/>
-          <w:iCs/>
-          <w:lang w:eastAsia="pt-PT"/>
-        </w:rPr>
-        <w:t>higher</w:t>
-      </w:r>
-      <w:r>
-        <w:rPr>
-          <w:rFonts w:ascii="Arial" w:hAnsi="Arial" w:cs="Arial"/>
-          <w:lang w:eastAsia="pt-PT"/>
-        </w:rPr>
-        <w:t xml:space="preserve">, </w:t>
-      </w:r>
-      <w:r>
-        <w:rPr>
-          <w:rFonts w:ascii="Arial" w:hAnsi="Arial" w:cs="Arial"/>
-          <w:i/>
-          <w:iCs/>
-          <w:lang w:eastAsia="pt-PT"/>
-        </w:rPr>
-        <w:t>misses</w:t>
-      </w:r>
-      <w:r>
-        <w:rPr>
-          <w:rFonts w:ascii="Arial" w:hAnsi="Arial" w:cs="Arial"/>
-          <w:lang w:eastAsia="pt-PT"/>
-        </w:rPr>
-        <w:t xml:space="preserve">, and </w:t>
-      </w:r>
-      <w:r>
-        <w:rPr>
-          <w:rFonts w:ascii="Arial" w:hAnsi="Arial" w:cs="Arial"/>
-          <w:i/>
-          <w:iCs/>
-          <w:lang w:eastAsia="pt-PT"/>
-        </w:rPr>
-        <w:t>cut</w:t>
-      </w:r>
-      <w:r>
-        <w:rPr>
-          <w:rFonts w:ascii="Arial" w:hAnsi="Arial" w:cs="Arial"/>
-          <w:lang w:eastAsia="pt-PT"/>
-        </w:rPr>
-        <w:t>. For this reason, special attention was given to preserving sentiment-bearing indicators. Directional symbols (e.g., upward and downward arrows), percentage changes, and strong emphasis markers were replaced with dedicated tokens before cleaning so that their sentiment information would not be lost during preprocessing.</w:t>
-      </w:r>
-    </w:p>
-    <w:p>
-      <w:pPr>
-        <w:rPr>
-          <w:rFonts w:ascii="Arial" w:hAnsi="Arial" w:cs="Arial"/>
-          <w:lang w:eastAsia="pt-PT"/>
-        </w:rPr>
-      </w:pPr>
-      <w:r>
-        <w:rPr>
-          <w:rFonts w:ascii="Arial" w:hAnsi="Arial" w:cs="Arial"/>
-          <w:lang w:eastAsia="pt-PT"/>
-        </w:rPr>
-        <w:t>Since the analysis of cashtags demonstrated that stock tickers were more prevalent in bullish tweets (24.6%) than in bearish or neutral tweets (approximately 13%), stock ticker references were explicitly preserved. Known tickers were mapped to standardized tokens (e.g., TICKER_AAPL), while unknown tickers were replaced with a generic STOCK_TICKER token. This allowed the model to retain information about stock-specific discussions while limiting vocabulary growth.</w:t>
-      </w:r>
-    </w:p>
-    <w:p>
-      <w:pPr>
-        <w:rPr>
-          <w:rFonts w:ascii="Arial" w:hAnsi="Arial" w:cs="Arial"/>
-          <w:lang w:eastAsia="pt-PT"/>
-        </w:rPr>
-      </w:pPr>
-      <w:r>
-        <w:rPr>
-          <w:rFonts w:ascii="Arial" w:hAnsi="Arial" w:cs="Arial"/>
-          <w:lang w:eastAsia="pt-PT"/>
-        </w:rPr>
-        <w:t>Numerical information was also handled carefully because financial sentiment is often associated with percentages, price targets, earnings figures, and market performance metrics. Percentage values and monetary amounts were converted into contextual tokens such as NUM_PERCENT and DOLLAR_AMOUNT, while standalone numerical values were removed. This approach preserved the semantic role of financial quantities without introducing unnecessary sparsity.</w:t>
-      </w:r>
-    </w:p>
-    <w:p>
-      <w:pPr>
-        <w:rPr>
-          <w:rFonts w:ascii="Arial" w:hAnsi="Arial" w:cs="Arial"/>
-          <w:lang w:eastAsia="pt-PT"/>
-        </w:rPr>
-      </w:pPr>
-      <w:r>
-        <w:rPr>
-          <w:rFonts w:ascii="Arial" w:hAnsi="Arial" w:cs="Arial"/>
-          <w:lang w:eastAsia="pt-PT"/>
-        </w:rPr>
-        <w:t xml:space="preserve">Noise removal was then performed by eliminating URLs, user mentions, punctuation, and redundant whitespace. Although the EDA showed that neutral tweets contained URLs more frequently (49.8%) than bullish (39.1%) or bearish (44.3%) tweets, URLs themselves rarely carry semantic information relevant to sentiment classification. Therefore, only the URL content was removed while retaining the surrounding textual context. Similarly, hashtag symbols were removed while preserving the associated words, since the hashtag analysis revealed that terms such as </w:t>
-      </w:r>
-      <w:r>
-        <w:rPr>
-          <w:rFonts w:ascii="Arial" w:hAnsi="Arial" w:cs="Arial"/>
-          <w:i/>
-          <w:iCs/>
-          <w:lang w:eastAsia="pt-PT"/>
-        </w:rPr>
-        <w:t>economy</w:t>
-      </w:r>
-      <w:r>
-        <w:rPr>
-          <w:rFonts w:ascii="Arial" w:hAnsi="Arial" w:cs="Arial"/>
-          <w:lang w:eastAsia="pt-PT"/>
-        </w:rPr>
-        <w:t xml:space="preserve">, </w:t>
-      </w:r>
-      <w:r>
-        <w:rPr>
-          <w:rFonts w:ascii="Arial" w:hAnsi="Arial" w:cs="Arial"/>
-          <w:i/>
-          <w:iCs/>
-          <w:lang w:eastAsia="pt-PT"/>
-        </w:rPr>
-        <w:t>stock</w:t>
-      </w:r>
-      <w:r>
-        <w:rPr>
-          <w:rFonts w:ascii="Arial" w:hAnsi="Arial" w:cs="Arial"/>
-          <w:lang w:eastAsia="pt-PT"/>
-        </w:rPr>
-        <w:t xml:space="preserve">, </w:t>
-      </w:r>
-      <w:r>
-        <w:rPr>
-          <w:rFonts w:ascii="Arial" w:hAnsi="Arial" w:cs="Arial"/>
-          <w:i/>
-          <w:iCs/>
-          <w:lang w:eastAsia="pt-PT"/>
-        </w:rPr>
-        <w:t>trading</w:t>
-      </w:r>
-      <w:r>
-        <w:rPr>
-          <w:rFonts w:ascii="Arial" w:hAnsi="Arial" w:cs="Arial"/>
-          <w:lang w:eastAsia="pt-PT"/>
-        </w:rPr>
-        <w:t xml:space="preserve">, and </w:t>
-      </w:r>
-      <w:r>
-        <w:rPr>
-          <w:rFonts w:ascii="Arial" w:hAnsi="Arial" w:cs="Arial"/>
-          <w:i/>
-          <w:iCs/>
-          <w:lang w:eastAsia="pt-PT"/>
-        </w:rPr>
-        <w:t>markets</w:t>
-      </w:r>
-      <w:r>
-        <w:rPr>
-          <w:rFonts w:ascii="Arial" w:hAnsi="Arial" w:cs="Arial"/>
-          <w:lang w:eastAsia="pt-PT"/>
-        </w:rPr>
-        <w:t xml:space="preserve"> often contained meaningful topic information.</w:t>
-      </w:r>
-    </w:p>
-    <w:p>
-      <w:pPr>
-        <w:rPr>
-          <w:rFonts w:ascii="Arial" w:hAnsi="Arial" w:cs="Arial"/>
-          <w:lang w:eastAsia="pt-PT"/>
-        </w:rPr>
-      </w:pPr>
-      <w:r>
-        <w:rPr>
-          <w:rFonts w:ascii="Arial" w:hAnsi="Arial" w:cs="Arial"/>
-          <w:lang w:eastAsia="pt-PT"/>
-        </w:rPr>
-        <w:t xml:space="preserve">After cleaning, tweets were tokenized using NLTK's TweetTokenizer, which is specifically designed to handle social media text. Stopword removal was then applied to eliminate common words with limited discriminative value. However, unlike a standard stopword removal procedure, sentiment-critical financial terms identified during EDA were explicitly preserved. Words such as </w:t>
-      </w:r>
-      <w:r>
-        <w:rPr>
-          <w:rFonts w:ascii="Arial" w:hAnsi="Arial" w:cs="Arial"/>
-          <w:i/>
-          <w:iCs/>
-          <w:lang w:eastAsia="pt-PT"/>
-        </w:rPr>
-        <w:t>buy</w:t>
-      </w:r>
-      <w:r>
-        <w:rPr>
-          <w:rFonts w:ascii="Arial" w:hAnsi="Arial" w:cs="Arial"/>
-          <w:lang w:eastAsia="pt-PT"/>
-        </w:rPr>
-        <w:t xml:space="preserve">, </w:t>
-      </w:r>
-      <w:r>
-        <w:rPr>
-          <w:rFonts w:ascii="Arial" w:hAnsi="Arial" w:cs="Arial"/>
-          <w:i/>
-          <w:iCs/>
-          <w:lang w:eastAsia="pt-PT"/>
-        </w:rPr>
-        <w:t>sell</w:t>
-      </w:r>
-      <w:r>
-        <w:rPr>
-          <w:rFonts w:ascii="Arial" w:hAnsi="Arial" w:cs="Arial"/>
-          <w:lang w:eastAsia="pt-PT"/>
-        </w:rPr>
-        <w:t xml:space="preserve">, </w:t>
-      </w:r>
-      <w:r>
-        <w:rPr>
-          <w:rFonts w:ascii="Arial" w:hAnsi="Arial" w:cs="Arial"/>
-          <w:i/>
-          <w:iCs/>
-          <w:lang w:eastAsia="pt-PT"/>
-        </w:rPr>
-        <w:t>bullish</w:t>
-      </w:r>
-      <w:r>
-        <w:rPr>
-          <w:rFonts w:ascii="Arial" w:hAnsi="Arial" w:cs="Arial"/>
-          <w:lang w:eastAsia="pt-PT"/>
-        </w:rPr>
-        <w:t xml:space="preserve">, </w:t>
-      </w:r>
-      <w:r>
-        <w:rPr>
-          <w:rFonts w:ascii="Arial" w:hAnsi="Arial" w:cs="Arial"/>
-          <w:i/>
-          <w:iCs/>
-          <w:lang w:eastAsia="pt-PT"/>
-        </w:rPr>
-        <w:t>bearish</w:t>
-      </w:r>
-      <w:r>
-        <w:rPr>
-          <w:rFonts w:ascii="Arial" w:hAnsi="Arial" w:cs="Arial"/>
-          <w:lang w:eastAsia="pt-PT"/>
-        </w:rPr>
-        <w:t xml:space="preserve">, </w:t>
-      </w:r>
-      <w:r>
-        <w:rPr>
-          <w:rFonts w:ascii="Arial" w:hAnsi="Arial" w:cs="Arial"/>
-          <w:i/>
-          <w:iCs/>
-          <w:lang w:eastAsia="pt-PT"/>
-        </w:rPr>
-        <w:t>upgrade</w:t>
-      </w:r>
-      <w:r>
-        <w:rPr>
-          <w:rFonts w:ascii="Arial" w:hAnsi="Arial" w:cs="Arial"/>
-          <w:lang w:eastAsia="pt-PT"/>
-        </w:rPr>
-        <w:t xml:space="preserve">, </w:t>
-      </w:r>
-      <w:r>
-        <w:rPr>
-          <w:rFonts w:ascii="Arial" w:hAnsi="Arial" w:cs="Arial"/>
-          <w:i/>
-          <w:iCs/>
-          <w:lang w:eastAsia="pt-PT"/>
-        </w:rPr>
-        <w:t>downgrade</w:t>
-      </w:r>
-      <w:r>
-        <w:rPr>
-          <w:rFonts w:ascii="Arial" w:hAnsi="Arial" w:cs="Arial"/>
-          <w:lang w:eastAsia="pt-PT"/>
-        </w:rPr>
-        <w:t xml:space="preserve">, </w:t>
-      </w:r>
-      <w:r>
-        <w:rPr>
-          <w:rFonts w:ascii="Arial" w:hAnsi="Arial" w:cs="Arial"/>
-          <w:i/>
-          <w:iCs/>
-          <w:lang w:eastAsia="pt-PT"/>
-        </w:rPr>
-        <w:t>rise</w:t>
-      </w:r>
-      <w:r>
-        <w:rPr>
-          <w:rFonts w:ascii="Arial" w:hAnsi="Arial" w:cs="Arial"/>
-          <w:lang w:eastAsia="pt-PT"/>
-        </w:rPr>
-        <w:t xml:space="preserve">, </w:t>
-      </w:r>
-      <w:r>
-        <w:rPr>
-          <w:rFonts w:ascii="Arial" w:hAnsi="Arial" w:cs="Arial"/>
-          <w:i/>
-          <w:iCs/>
-          <w:lang w:eastAsia="pt-PT"/>
-        </w:rPr>
-        <w:t>fall</w:t>
-      </w:r>
-      <w:r>
-        <w:rPr>
-          <w:rFonts w:ascii="Arial" w:hAnsi="Arial" w:cs="Arial"/>
-          <w:lang w:eastAsia="pt-PT"/>
-        </w:rPr>
-        <w:t xml:space="preserve">, </w:t>
-      </w:r>
-      <w:r>
-        <w:rPr>
-          <w:rFonts w:ascii="Arial" w:hAnsi="Arial" w:cs="Arial"/>
-          <w:i/>
-          <w:iCs/>
-          <w:lang w:eastAsia="pt-PT"/>
-        </w:rPr>
-        <w:t>higher</w:t>
-      </w:r>
-      <w:r>
-        <w:rPr>
-          <w:rFonts w:ascii="Arial" w:hAnsi="Arial" w:cs="Arial"/>
-          <w:lang w:eastAsia="pt-PT"/>
-        </w:rPr>
-        <w:t xml:space="preserve">, and </w:t>
-      </w:r>
-      <w:r>
-        <w:rPr>
-          <w:rFonts w:ascii="Arial" w:hAnsi="Arial" w:cs="Arial"/>
-          <w:i/>
-          <w:iCs/>
-          <w:lang w:eastAsia="pt-PT"/>
-        </w:rPr>
-        <w:t>lower</w:t>
-      </w:r>
-      <w:r>
-        <w:rPr>
-          <w:rFonts w:ascii="Arial" w:hAnsi="Arial" w:cs="Arial"/>
-          <w:lang w:eastAsia="pt-PT"/>
-        </w:rPr>
-        <w:t xml:space="preserve"> were retained regardless of their frequency because they provide strong signals for sentiment classification.</w:t>
-      </w:r>
-    </w:p>
-    <w:p>
-      <w:pPr>
-        <w:rPr>
-          <w:rFonts w:ascii="Arial" w:hAnsi="Arial" w:cs="Arial"/>
-          <w:lang w:eastAsia="pt-PT"/>
-        </w:rPr>
-      </w:pPr>
-      <w:r>
-        <w:rPr>
-          <w:rFonts w:ascii="Arial" w:hAnsi="Arial" w:cs="Arial"/>
-          <w:lang w:eastAsia="pt-PT"/>
-        </w:rPr>
-        <w:t xml:space="preserve">To further improve sentiment representation, a negation-handling step was introduced. Words immediately following negation terms such as </w:t>
-      </w:r>
-      <w:r>
-        <w:rPr>
-          <w:rFonts w:ascii="Arial" w:hAnsi="Arial" w:cs="Arial"/>
-          <w:i/>
-          <w:iCs/>
-          <w:lang w:eastAsia="pt-PT"/>
-        </w:rPr>
-        <w:t>not</w:t>
-      </w:r>
-      <w:r>
-        <w:rPr>
-          <w:rFonts w:ascii="Arial" w:hAnsi="Arial" w:cs="Arial"/>
-          <w:lang w:eastAsia="pt-PT"/>
-        </w:rPr>
-        <w:t xml:space="preserve">, </w:t>
-      </w:r>
-      <w:r>
-        <w:rPr>
-          <w:rFonts w:ascii="Arial" w:hAnsi="Arial" w:cs="Arial"/>
-          <w:i/>
-          <w:iCs/>
-          <w:lang w:eastAsia="pt-PT"/>
-        </w:rPr>
-        <w:t>never</w:t>
-      </w:r>
-      <w:r>
-        <w:rPr>
-          <w:rFonts w:ascii="Arial" w:hAnsi="Arial" w:cs="Arial"/>
-          <w:lang w:eastAsia="pt-PT"/>
-        </w:rPr>
-        <w:t xml:space="preserve">, and </w:t>
-      </w:r>
-      <w:r>
-        <w:rPr>
-          <w:rFonts w:ascii="Arial" w:hAnsi="Arial" w:cs="Arial"/>
-          <w:i/>
-          <w:iCs/>
-          <w:lang w:eastAsia="pt-PT"/>
-        </w:rPr>
-        <w:t>no</w:t>
-      </w:r>
-      <w:r>
-        <w:rPr>
-          <w:rFonts w:ascii="Arial" w:hAnsi="Arial" w:cs="Arial"/>
-          <w:lang w:eastAsia="pt-PT"/>
-        </w:rPr>
-        <w:t xml:space="preserve"> were prefixed with NOT_, </w:t>
-      </w:r>
-      <w:r>
-        <w:rPr>
-          <w:rFonts w:ascii="Arial" w:hAnsi="Arial" w:cs="Arial"/>
-          <w:lang w:eastAsia="pt-PT"/>
-        </w:rPr>
-        <w:lastRenderedPageBreak/>
-        <w:t xml:space="preserve">allowing the model to distinguish between expressions with opposite meanings, such as </w:t>
-      </w:r>
-      <w:r>
-        <w:rPr>
-          <w:rFonts w:ascii="Arial" w:hAnsi="Arial" w:cs="Arial"/>
-          <w:i/>
-          <w:iCs/>
-          <w:lang w:eastAsia="pt-PT"/>
-        </w:rPr>
-        <w:t>profitable</w:t>
-      </w:r>
-      <w:r>
-        <w:rPr>
-          <w:rFonts w:ascii="Arial" w:hAnsi="Arial" w:cs="Arial"/>
-          <w:lang w:eastAsia="pt-PT"/>
-        </w:rPr>
-        <w:t xml:space="preserve"> and </w:t>
-      </w:r>
-      <w:r>
-        <w:rPr>
-          <w:rFonts w:ascii="Arial" w:hAnsi="Arial" w:cs="Arial"/>
-          <w:i/>
-          <w:iCs/>
-          <w:lang w:eastAsia="pt-PT"/>
-        </w:rPr>
-        <w:t>not profitable</w:t>
-      </w:r>
-      <w:r>
-        <w:rPr>
-          <w:rFonts w:ascii="Arial" w:hAnsi="Arial" w:cs="Arial"/>
-          <w:lang w:eastAsia="pt-PT"/>
-        </w:rPr>
-        <w:t>.</w:t>
-      </w:r>
-    </w:p>
-    <w:p>
-      <w:pPr>
-        <w:rPr>
-          <w:rFonts w:ascii="Arial" w:hAnsi="Arial" w:cs="Arial"/>
-          <w:lang w:eastAsia="pt-PT"/>
-        </w:rPr>
-      </w:pPr>
-      <w:r>
-        <w:rPr>
-          <w:rFonts w:ascii="Arial" w:hAnsi="Arial" w:cs="Arial"/>
-          <w:lang w:eastAsia="pt-PT"/>
-        </w:rPr>
-        <w:t xml:space="preserve">Finally, lemmatization was applied to reduce words to their base forms while preserving their semantic meaning. This helped reduce vocabulary size and group together related word variants (e.g., </w:t>
-      </w:r>
-      <w:r>
-        <w:rPr>
-          <w:rFonts w:ascii="Arial" w:hAnsi="Arial" w:cs="Arial"/>
-          <w:i/>
-          <w:iCs/>
-          <w:lang w:eastAsia="pt-PT"/>
-        </w:rPr>
-        <w:t>raises</w:t>
-      </w:r>
-      <w:r>
-        <w:rPr>
-          <w:rFonts w:ascii="Arial" w:hAnsi="Arial" w:cs="Arial"/>
-          <w:lang w:eastAsia="pt-PT"/>
-        </w:rPr>
-        <w:t xml:space="preserve">, </w:t>
-      </w:r>
-      <w:r>
-        <w:rPr>
-          <w:rFonts w:ascii="Arial" w:hAnsi="Arial" w:cs="Arial"/>
-          <w:i/>
-          <w:iCs/>
-          <w:lang w:eastAsia="pt-PT"/>
-        </w:rPr>
-        <w:t>raised</w:t>
-      </w:r>
-      <w:r>
-        <w:rPr>
-          <w:rFonts w:ascii="Arial" w:hAnsi="Arial" w:cs="Arial"/>
-          <w:lang w:eastAsia="pt-PT"/>
-        </w:rPr>
-        <w:t xml:space="preserve">, and </w:t>
-      </w:r>
-      <w:r>
-        <w:rPr>
-          <w:rFonts w:ascii="Arial" w:hAnsi="Arial" w:cs="Arial"/>
-          <w:i/>
-          <w:iCs/>
-          <w:lang w:eastAsia="pt-PT"/>
-        </w:rPr>
-        <w:t>raising</w:t>
-      </w:r>
-      <w:r>
-        <w:rPr>
-          <w:rFonts w:ascii="Arial" w:hAnsi="Arial" w:cs="Arial"/>
-          <w:lang w:eastAsia="pt-PT"/>
-        </w:rPr>
-        <w:t>). An optional stemming stage was also available, although lemmatization was preferred because it is less aggressive and better suited to maintaining the interpretability of financial language.</w:t>
-      </w:r>
+        <w:t>For TF-IDF weighted aggregation, more important words contributed more strongly to the final document representation, improving the model’s ability to focus on sentiment-relevant terms. Alternative pooling strategies such as concatenation of statistical summaries (mean, max, min, and median) were also considered to enrich the representation.</w:t>
+      </w:r>
+    </w:p>
+    <w:p>
+      <w:pPr>
+        <w:pStyle w:val="Ttulo2"/>
+      </w:pPr>
+      <w:r>
+        <w:t>Transformer Encoders</w:t>
+      </w:r>
+    </w:p>
+    <w:p>
+      <w:pPr>
+        <w:rPr>
+          <w:lang w:eastAsia="pt-PT"/>
+        </w:rPr>
+      </w:pPr>
     </w:p>
     <w:p>
       <w:pPr>
@@ -3420,28 +3876,162 @@
           <w:rFonts w:ascii="Arial" w:hAnsi="Arial" w:cs="Arial"/>
         </w:rPr>
       </w:pPr>
-      <w:bookmarkStart w:id="16" w:name="_Toc228445051"/>
-      <w:r>
-        <w:rPr>
-          <w:rFonts w:ascii="Arial" w:hAnsi="Arial" w:cs="Arial"/>
-        </w:rPr>
-        <w:t>Evaluation</w:t>
-      </w:r>
-      <w:r>
-        <w:rPr>
-          <w:rFonts w:ascii="Arial" w:hAnsi="Arial" w:cs="Arial"/>
-        </w:rPr>
-        <w:t xml:space="preserve"> Methodology</w:t>
-      </w:r>
-      <w:bookmarkEnd w:id="16"/>
-    </w:p>
-    <w:p>
-      <w:pPr>
-        <w:rPr>
-          <w:rFonts w:ascii="Arial" w:hAnsi="Arial" w:cs="Arial"/>
-          <w:lang w:eastAsia="pt-PT"/>
-        </w:rPr>
-      </w:pPr>
+      <w:bookmarkStart w:id="17" w:name="_Toc231138633"/>
+      <w:r>
+        <w:rPr>
+          <w:rFonts w:ascii="Arial" w:hAnsi="Arial" w:cs="Arial"/>
+        </w:rPr>
+        <w:t>Classification Models</w:t>
+      </w:r>
+      <w:bookmarkEnd w:id="17"/>
+    </w:p>
+    <w:p>
+      <w:pPr>
+        <w:pStyle w:val="Ttulo2"/>
+        <w:rPr>
+          <w:rFonts w:ascii="Arial" w:hAnsi="Arial" w:cs="Arial"/>
+        </w:rPr>
+      </w:pPr>
+      <w:bookmarkStart w:id="18" w:name="_Toc231138634"/>
+      <w:r>
+        <w:rPr>
+          <w:rFonts w:ascii="Arial" w:hAnsi="Arial" w:cs="Arial"/>
+        </w:rPr>
+        <w:t>Corpus Split</w:t>
+      </w:r>
+      <w:r>
+        <w:rPr>
+          <w:rFonts w:ascii="Arial" w:hAnsi="Arial" w:cs="Arial"/>
+        </w:rPr>
+        <w:t xml:space="preserve"> and Validation Strategy</w:t>
+      </w:r>
+      <w:bookmarkEnd w:id="18"/>
+    </w:p>
+    <w:p>
+      <w:pPr>
+        <w:rPr>
+          <w:rFonts w:ascii="Arial" w:hAnsi="Arial" w:cs="Arial"/>
+          <w:lang w:eastAsia="pt-PT"/>
+        </w:rPr>
+      </w:pPr>
+      <w:r>
+        <w:rPr>
+          <w:rFonts w:ascii="Arial" w:hAnsi="Arial" w:cs="Arial"/>
+          <w:lang w:eastAsia="pt-PT"/>
+        </w:rPr>
+        <w:t>To ensure that model evaluation remained representative of the original corpus distribution, a stratified cross-validation approach was adopted.</w:t>
+      </w:r>
+    </w:p>
+    <w:p>
+      <w:pPr>
+        <w:rPr>
+          <w:rFonts w:ascii="Arial" w:hAnsi="Arial" w:cs="Arial"/>
+          <w:lang w:eastAsia="pt-PT"/>
+        </w:rPr>
+      </w:pPr>
+      <w:r>
+        <w:rPr>
+          <w:rFonts w:ascii="Arial" w:hAnsi="Arial" w:cs="Arial"/>
+          <w:lang w:eastAsia="pt-PT"/>
+        </w:rPr>
+        <w:t>Instead of performing a single train-test split, the dataset was partitioned using Stratified K-Fold Cross-Validation with (k = 5). In this approach, the corpus is divided into five equally sized folds while preserving the original class proportions within each fold. During each iteration, four folds are used for training, and the remaining fold is used for validation. This process is repeated five times so that every sample is used exactly once for validation and four times for training.</w:t>
+      </w:r>
+    </w:p>
+    <w:p>
+      <w:pPr>
+        <w:rPr>
+          <w:rFonts w:ascii="Arial" w:hAnsi="Arial" w:cs="Arial"/>
+          <w:lang w:eastAsia="pt-PT"/>
+        </w:rPr>
+      </w:pPr>
+      <w:r>
+        <w:rPr>
+          <w:rFonts w:ascii="Arial" w:hAnsi="Arial" w:cs="Arial"/>
+          <w:lang w:eastAsia="pt-PT"/>
+        </w:rPr>
+        <w:t>The use of stratification was particularly important given the imbalance between sentiment classes. Without stratification, some validation folds could contain disproportionately few Bearish or Bullish samples, leading to unreliable performance estimates. By maintaining the original class distribution across all folds, the evaluation better reflects the characteristics of the complete dataset.</w:t>
+      </w:r>
+    </w:p>
+    <w:p>
+      <w:pPr>
+        <w:rPr>
+          <w:rFonts w:ascii="Arial" w:hAnsi="Arial" w:cs="Arial"/>
+          <w:lang w:eastAsia="pt-PT"/>
+        </w:rPr>
+      </w:pPr>
+      <w:r>
+        <w:rPr>
+          <w:rFonts w:ascii="Arial" w:hAnsi="Arial" w:cs="Arial"/>
+          <w:lang w:eastAsia="pt-PT"/>
+        </w:rPr>
+        <w:t xml:space="preserve">To further address class imbalance during training, class weights were computed separately for each fold using the balanced weighting strategy provided by Scikit-learn. This method assigns higher weights to underrepresented classes and lower weights to majority classes, encouraging the classifier to pay greater attention to Bullish and Bearish tweets during learning. The class weights were calculated exclusively from the training portion of each fold to avoid </w:t>
+      </w:r>
+      <w:r>
+        <w:rPr>
+          <w:rFonts w:ascii="Arial" w:hAnsi="Arial" w:cs="Arial"/>
+          <w:lang w:eastAsia="pt-PT"/>
+        </w:rPr>
+        <w:t>data</w:t>
+      </w:r>
+      <w:r>
+        <w:rPr>
+          <w:rFonts w:ascii="Arial" w:hAnsi="Arial" w:cs="Arial"/>
+          <w:lang w:eastAsia="pt-PT"/>
+        </w:rPr>
+        <w:t xml:space="preserve"> leakage.</w:t>
+      </w:r>
+    </w:p>
+    <w:p>
+      <w:pPr>
+        <w:rPr>
+          <w:rFonts w:ascii="Arial" w:hAnsi="Arial" w:cs="Arial"/>
+          <w:lang w:eastAsia="pt-PT"/>
+        </w:rPr>
+      </w:pPr>
+      <w:r>
+        <w:rPr>
+          <w:rFonts w:ascii="Arial" w:hAnsi="Arial" w:cs="Arial"/>
+          <w:lang w:eastAsia="pt-PT"/>
+        </w:rPr>
+        <w:t>For each cross-validation iteration, the preprocessing pipeline and TF-IDF vectorization were fitted only on the training subset and subsequently applied to the corresponding validation subset. This procedure ensures that no information from the validation data influences the feature extraction process, thereby providing an unbiased estimate of model performance.</w:t>
+      </w:r>
+    </w:p>
+    <w:p>
+      <w:pPr>
+        <w:rPr>
+          <w:rFonts w:ascii="Arial" w:hAnsi="Arial" w:cs="Arial"/>
+          <w:lang w:eastAsia="pt-PT"/>
+        </w:rPr>
+      </w:pPr>
+      <w:r>
+        <w:rPr>
+          <w:rFonts w:ascii="Arial" w:hAnsi="Arial" w:cs="Arial"/>
+          <w:lang w:eastAsia="pt-PT"/>
+        </w:rPr>
+        <w:t>Model performance was evaluated on each validation fold using Macro F1-score, Weighted F1-score, and per-class F1-scores. Macro F1-score was particularly important because it assigns equal importance to each sentiment class regardless of its frequency, making it a suitable metric for imbalanced classification problems. The final reported performance corresponds to the average results obtained across all five folds, providing a more robust estimate of the model's generalization ability than a single train-test split.</w:t>
+      </w:r>
+    </w:p>
+    <w:p>
+      <w:pPr>
+        <w:rPr>
+          <w:lang w:eastAsia="pt-PT"/>
+        </w:rPr>
+      </w:pPr>
+    </w:p>
+    <w:p>
+      <w:pPr>
+        <w:rPr>
+          <w:rFonts w:ascii="Arial" w:hAnsi="Arial" w:cs="Arial"/>
+          <w:lang w:eastAsia="pt-PT"/>
+        </w:rPr>
+      </w:pPr>
+      <w:r>
+        <w:rPr>
+          <w:rFonts w:ascii="Arial" w:hAnsi="Arial" w:cs="Arial"/>
+          <w:lang w:eastAsia="pt-PT"/>
+        </w:rPr>
+        <w:t xml:space="preserve"> </w:t>
+      </w:r>
     </w:p>
     <w:p>
       <w:pPr>
@@ -3450,44 +4040,6 @@
           <w:rFonts w:ascii="Arial" w:hAnsi="Arial" w:cs="Arial"/>
         </w:rPr>
       </w:pPr>
-      <w:bookmarkStart w:id="17" w:name="_Toc228445052"/>
-      <w:r>
-        <w:rPr>
-          <w:rFonts w:ascii="Arial" w:hAnsi="Arial" w:cs="Arial"/>
-        </w:rPr>
-        <w:t>Model Development &amp; Iterative Improvements</w:t>
-      </w:r>
-      <w:bookmarkEnd w:id="17"/>
-    </w:p>
-    <w:p>
-      <w:pPr>
-        <w:rPr>
-          <w:rFonts w:ascii="Arial" w:hAnsi="Arial" w:cs="Arial"/>
-          <w:lang w:eastAsia="pt-PT"/>
-        </w:rPr>
-      </w:pPr>
-      <w:r>
-        <w:rPr>
-          <w:rFonts w:ascii="Arial" w:hAnsi="Arial" w:cs="Arial"/>
-          <w:lang w:eastAsia="pt-PT"/>
-        </w:rPr>
-        <w:t xml:space="preserve"> </w:t>
-      </w:r>
-    </w:p>
-    <w:p>
-      <w:pPr>
-        <w:pStyle w:val="Ttulo1"/>
-        <w:rPr>
-          <w:rFonts w:ascii="Arial" w:hAnsi="Arial" w:cs="Arial"/>
-        </w:rPr>
-      </w:pPr>
-      <w:bookmarkStart w:id="18" w:name="_Toc228445053"/>
-      <w:r>
-        <w:rPr>
-          <w:rFonts w:ascii="Arial" w:hAnsi="Arial" w:cs="Arial"/>
-        </w:rPr>
-        <w:t xml:space="preserve">Results </w:t>
-      </w:r>
       <w:bookmarkStart w:id="19" w:name="_Toc410990277"/>
       <w:bookmarkStart w:id="20" w:name="_Toc410990289"/>
       <w:bookmarkStart w:id="21" w:name="_Toc412186402"/>
@@ -3497,35 +4049,21 @@
       <w:bookmarkStart w:id="25" w:name="_Toc412186633"/>
       <w:bookmarkStart w:id="26" w:name="_Toc115296810"/>
       <w:bookmarkStart w:id="27" w:name="_Toc141959339"/>
-      <w:r>
-        <w:rPr>
-          <w:rFonts w:ascii="Arial" w:hAnsi="Arial" w:cs="Arial"/>
-        </w:rPr>
-        <w:t>And Critical Analysis</w:t>
-      </w:r>
-      <w:bookmarkEnd w:id="18"/>
-    </w:p>
-    <w:p>
-      <w:pPr>
-        <w:rPr>
-          <w:rFonts w:ascii="Arial" w:hAnsi="Arial" w:cs="Arial"/>
-          <w:lang w:eastAsia="pt-PT"/>
-        </w:rPr>
-      </w:pPr>
-    </w:p>
-    <w:p>
-      <w:pPr>
-        <w:pStyle w:val="Ttulo1"/>
-        <w:rPr>
-          <w:rFonts w:ascii="Arial" w:hAnsi="Arial" w:cs="Arial"/>
-        </w:rPr>
-      </w:pPr>
-      <w:bookmarkStart w:id="28" w:name="_Toc228445054"/>
-      <w:r>
-        <w:rPr>
-          <w:rFonts w:ascii="Arial" w:hAnsi="Arial" w:cs="Arial"/>
-        </w:rPr>
-        <w:t>Conclusion</w:t>
+      <w:bookmarkStart w:id="28" w:name="_Toc231138635"/>
+      <w:proofErr w:type="gramStart"/>
+      <w:r>
+        <w:rPr>
+          <w:rFonts w:ascii="Arial" w:hAnsi="Arial" w:cs="Arial"/>
+        </w:rPr>
+        <w:lastRenderedPageBreak/>
+        <w:t>Evaluation</w:t>
+      </w:r>
+      <w:proofErr w:type="gramEnd"/>
+      <w:r>
+        <w:rPr>
+          <w:rFonts w:ascii="Arial" w:hAnsi="Arial" w:cs="Arial"/>
+        </w:rPr>
+        <w:t xml:space="preserve"> And Results</w:t>
       </w:r>
       <w:bookmarkEnd w:id="28"/>
     </w:p>
@@ -3703,7 +4241,7 @@
       <w:bookmarkStart w:id="35" w:name="_Toc412186634"/>
       <w:bookmarkStart w:id="36" w:name="_Toc115296811"/>
       <w:bookmarkStart w:id="37" w:name="_Toc141959340"/>
-      <w:bookmarkStart w:id="38" w:name="_Toc228445055"/>
+      <w:bookmarkStart w:id="38" w:name="_Toc231138636"/>
       <w:r>
         <w:rPr>
           <w:rFonts w:ascii="Arial" w:hAnsi="Arial" w:cs="Arial"/>
@@ -4477,6 +5015,7 @@
           <w:szCs w:val="20"/>
           <w:lang w:eastAsia="pt-PT"/>
         </w:rPr>
+        <w:lastRenderedPageBreak/>
         <w:drawing>
           <wp:inline distT="0" distB="0" distL="0" distR="0" wp14:anchorId="4E9E3D37" wp14:editId="73D1DC4A">
             <wp:extent cx="5759450" cy="3164840"/>
@@ -4739,12 +5278,10 @@
           <w:szCs w:val="20"/>
           <w:lang w:eastAsia="pt-PT"/>
         </w:rPr>
-        <w:t>Figure 6: Class statistics regarding average number of characters, words and presence of URL and cashtag</w:t>
-      </w:r>
-    </w:p>
-    <w:p>
-      <w:pPr>
-        <w:jc w:val="center"/>
+        <w:t xml:space="preserve">Figure 6: Class statistics regarding average number of characters, words and presence of URL and </w:t>
+      </w:r>
+      <w:proofErr w:type="spellStart"/>
+      <w:r>
         <w:rPr>
           <w:rFonts w:ascii="Arial" w:hAnsi="Arial" w:cs="Arial"/>
           <w:i/>
@@ -4753,6 +5290,21 @@
           <w:szCs w:val="20"/>
           <w:lang w:eastAsia="pt-PT"/>
         </w:rPr>
+        <w:t>cashtag</w:t>
+      </w:r>
+      <w:proofErr w:type="spellEnd"/>
+    </w:p>
+    <w:p>
+      <w:pPr>
+        <w:jc w:val="center"/>
+        <w:rPr>
+          <w:rFonts w:ascii="Arial" w:hAnsi="Arial" w:cs="Arial"/>
+          <w:i/>
+          <w:iCs/>
+          <w:sz w:val="20"/>
+          <w:szCs w:val="20"/>
+          <w:lang w:eastAsia="pt-PT"/>
+        </w:rPr>
       </w:pPr>
     </w:p>
     <w:p>
@@ -4763,13 +5315,12 @@
         </w:rPr>
       </w:pPr>
       <w:bookmarkStart w:id="54" w:name="_Annexes"/>
-      <w:bookmarkStart w:id="55" w:name="_Toc228445056"/>
+      <w:bookmarkStart w:id="55" w:name="_Toc231138637"/>
       <w:bookmarkEnd w:id="54"/>
       <w:r>
         <w:rPr>
           <w:rFonts w:ascii="Arial" w:hAnsi="Arial" w:cs="Arial"/>
         </w:rPr>
-        <w:lastRenderedPageBreak/>
         <w:t>Annexes</w:t>
       </w:r>
       <w:bookmarkEnd w:id="39"/>
@@ -5893,6 +6444,155 @@
     </w:lvl>
   </w:abstractNum>
   <w:abstractNum w:abstractNumId="8" w15:restartNumberingAfterBreak="0">
+    <w:nsid w:val="66B16689"/>
+    <w:multiLevelType w:val="multilevel"/>
+    <w:tmpl w:val="AD4EFAE0"/>
+    <w:lvl w:ilvl="0">
+      <w:start w:val="1"/>
+      <w:numFmt w:val="bullet"/>
+      <w:lvlText w:val=""/>
+      <w:lvlJc w:val="left"/>
+      <w:pPr>
+        <w:tabs>
+          <w:tab w:val="num" w:pos="720"/>
+        </w:tabs>
+        <w:ind w:left="720" w:hanging="360"/>
+      </w:pPr>
+      <w:rPr>
+        <w:rFonts w:ascii="Symbol" w:hAnsi="Symbol" w:hint="default"/>
+        <w:sz w:val="20"/>
+      </w:rPr>
+    </w:lvl>
+    <w:lvl w:ilvl="1" w:tentative="1">
+      <w:start w:val="1"/>
+      <w:numFmt w:val="bullet"/>
+      <w:lvlText w:val="o"/>
+      <w:lvlJc w:val="left"/>
+      <w:pPr>
+        <w:tabs>
+          <w:tab w:val="num" w:pos="1440"/>
+        </w:tabs>
+        <w:ind w:left="1440" w:hanging="360"/>
+      </w:pPr>
+      <w:rPr>
+        <w:rFonts w:ascii="Courier New" w:hAnsi="Courier New" w:hint="default"/>
+        <w:sz w:val="20"/>
+      </w:rPr>
+    </w:lvl>
+    <w:lvl w:ilvl="2" w:tentative="1">
+      <w:start w:val="1"/>
+      <w:numFmt w:val="bullet"/>
+      <w:lvlText w:val=""/>
+      <w:lvlJc w:val="left"/>
+      <w:pPr>
+        <w:tabs>
+          <w:tab w:val="num" w:pos="2160"/>
+        </w:tabs>
+        <w:ind w:left="2160" w:hanging="360"/>
+      </w:pPr>
+      <w:rPr>
+        <w:rFonts w:ascii="Wingdings" w:hAnsi="Wingdings" w:hint="default"/>
+        <w:sz w:val="20"/>
+      </w:rPr>
+    </w:lvl>
+    <w:lvl w:ilvl="3" w:tentative="1">
+      <w:start w:val="1"/>
+      <w:numFmt w:val="bullet"/>
+      <w:lvlText w:val=""/>
+      <w:lvlJc w:val="left"/>
+      <w:pPr>
+        <w:tabs>
+          <w:tab w:val="num" w:pos="2880"/>
+        </w:tabs>
+        <w:ind w:left="2880" w:hanging="360"/>
+      </w:pPr>
+      <w:rPr>
+        <w:rFonts w:ascii="Wingdings" w:hAnsi="Wingdings" w:hint="default"/>
+        <w:sz w:val="20"/>
+      </w:rPr>
+    </w:lvl>
+    <w:lvl w:ilvl="4" w:tentative="1">
+      <w:start w:val="1"/>
+      <w:numFmt w:val="bullet"/>
+      <w:lvlText w:val=""/>
+      <w:lvlJc w:val="left"/>
+      <w:pPr>
+        <w:tabs>
+          <w:tab w:val="num" w:pos="3600"/>
+        </w:tabs>
+        <w:ind w:left="3600" w:hanging="360"/>
+      </w:pPr>
+      <w:rPr>
+        <w:rFonts w:ascii="Wingdings" w:hAnsi="Wingdings" w:hint="default"/>
+        <w:sz w:val="20"/>
+      </w:rPr>
+    </w:lvl>
+    <w:lvl w:ilvl="5" w:tentative="1">
+      <w:start w:val="1"/>
+      <w:numFmt w:val="bullet"/>
+      <w:lvlText w:val=""/>
+      <w:lvlJc w:val="left"/>
+      <w:pPr>
+        <w:tabs>
+          <w:tab w:val="num" w:pos="4320"/>
+        </w:tabs>
+        <w:ind w:left="4320" w:hanging="360"/>
+      </w:pPr>
+      <w:rPr>
+        <w:rFonts w:ascii="Wingdings" w:hAnsi="Wingdings" w:hint="default"/>
+        <w:sz w:val="20"/>
+      </w:rPr>
+    </w:lvl>
+    <w:lvl w:ilvl="6" w:tentative="1">
+      <w:start w:val="1"/>
+      <w:numFmt w:val="bullet"/>
+      <w:lvlText w:val=""/>
+      <w:lvlJc w:val="left"/>
+      <w:pPr>
+        <w:tabs>
+          <w:tab w:val="num" w:pos="5040"/>
+        </w:tabs>
+        <w:ind w:left="5040" w:hanging="360"/>
+      </w:pPr>
+      <w:rPr>
+        <w:rFonts w:ascii="Wingdings" w:hAnsi="Wingdings" w:hint="default"/>
+        <w:sz w:val="20"/>
+      </w:rPr>
+    </w:lvl>
+    <w:lvl w:ilvl="7" w:tentative="1">
+      <w:start w:val="1"/>
+      <w:numFmt w:val="bullet"/>
+      <w:lvlText w:val=""/>
+      <w:lvlJc w:val="left"/>
+      <w:pPr>
+        <w:tabs>
+          <w:tab w:val="num" w:pos="5760"/>
+        </w:tabs>
+        <w:ind w:left="5760" w:hanging="360"/>
+      </w:pPr>
+      <w:rPr>
+        <w:rFonts w:ascii="Wingdings" w:hAnsi="Wingdings" w:hint="default"/>
+        <w:sz w:val="20"/>
+      </w:rPr>
+    </w:lvl>
+    <w:lvl w:ilvl="8" w:tentative="1">
+      <w:start w:val="1"/>
+      <w:numFmt w:val="bullet"/>
+      <w:lvlText w:val=""/>
+      <w:lvlJc w:val="left"/>
+      <w:pPr>
+        <w:tabs>
+          <w:tab w:val="num" w:pos="6480"/>
+        </w:tabs>
+        <w:ind w:left="6480" w:hanging="360"/>
+      </w:pPr>
+      <w:rPr>
+        <w:rFonts w:ascii="Wingdings" w:hAnsi="Wingdings" w:hint="default"/>
+        <w:sz w:val="20"/>
+      </w:rPr>
+    </w:lvl>
+  </w:abstractNum>
+  <w:abstractNum w:abstractNumId="9" w15:restartNumberingAfterBreak="0">
     <w:nsid w:val="74CF00DC"/>
     <w:multiLevelType w:val="hybridMultilevel"/>
     <w:tmpl w:val="BAD4ED26"/>
@@ -6005,7 +6705,7 @@
       </w:rPr>
     </w:lvl>
   </w:abstractNum>
-  <w:abstractNum w:abstractNumId="9" w15:restartNumberingAfterBreak="0">
+  <w:abstractNum w:abstractNumId="10" w15:restartNumberingAfterBreak="0">
     <w:nsid w:val="759ED340"/>
     <w:multiLevelType w:val="hybridMultilevel"/>
     <w:tmpl w:val="FFFFFFFF"/>
@@ -6149,13 +6849,16 @@
     <w:abstractNumId w:val="0"/>
   </w:num>
   <w:num w:numId="11" w16cid:durableId="244655233">
-    <w:abstractNumId w:val="9"/>
+    <w:abstractNumId w:val="10"/>
   </w:num>
   <w:num w:numId="12" w16cid:durableId="925770493">
-    <w:abstractNumId w:val="8"/>
+    <w:abstractNumId w:val="9"/>
   </w:num>
   <w:num w:numId="13" w16cid:durableId="672299657">
     <w:abstractNumId w:val="2"/>
+  </w:num>
+  <w:num w:numId="14" w16cid:durableId="192882839">
+    <w:abstractNumId w:val="8"/>
   </w:num>
 </w:numbering>
 </file>

</xml_diff>

<commit_message>
*FIXED* transformer models (Bert/DistilBert) classification issues obtaining a mean f1-score of 92% + also updated report with traditional ml models classification subsection
</commit_message>
<xml_diff>
--- a/Text_Mining_Report.docx
+++ b/Text_Mining_Report.docx
@@ -13,19 +13,11 @@
           <w:color w:val="5C666C"/>
         </w:rPr>
       </w:pPr>
-      <w:proofErr w:type="gramStart"/>
       <w:r>
         <w:rPr>
           <w:color w:val="5C666C"/>
         </w:rPr>
-        <w:t>Master in Data Science and Advanced</w:t>
-      </w:r>
-      <w:proofErr w:type="gramEnd"/>
-      <w:r>
-        <w:rPr>
-          <w:color w:val="5C666C"/>
-        </w:rPr>
-        <w:t xml:space="preserve"> Analytics</w:t>
+        <w:t>Master in Data Science and Advanced Analytics</w:t>
       </w:r>
     </w:p>
     <w:p>
@@ -59,36 +51,8 @@
           <w:color w:val="5C666C"/>
           <w:lang w:val="pt-PT"/>
         </w:rPr>
-        <w:t xml:space="preserve">NOVA </w:t>
-      </w:r>
-      <w:proofErr w:type="spellStart"/>
-      <w:r>
-        <w:rPr>
-          <w:b/>
-          <w:color w:val="5C666C"/>
-          <w:lang w:val="pt-PT"/>
-        </w:rPr>
-        <w:t>Information</w:t>
-      </w:r>
-      <w:proofErr w:type="spellEnd"/>
-      <w:r>
-        <w:rPr>
-          <w:b/>
-          <w:color w:val="5C666C"/>
-          <w:lang w:val="pt-PT"/>
-        </w:rPr>
-        <w:t xml:space="preserve"> Management </w:t>
-      </w:r>
-      <w:proofErr w:type="spellStart"/>
-      <w:r>
-        <w:rPr>
-          <w:b/>
-          <w:color w:val="5C666C"/>
-          <w:lang w:val="pt-PT"/>
-        </w:rPr>
-        <w:t>School</w:t>
-      </w:r>
-      <w:proofErr w:type="spellEnd"/>
+        <w:t>NOVA Information Management School</w:t>
+      </w:r>
     </w:p>
     <w:p>
       <w:pPr>
@@ -427,79 +391,49 @@
           <w:lang w:val="pt-PT"/>
         </w:rPr>
       </w:pPr>
-      <w:proofErr w:type="spellStart"/>
       <w:r>
         <w:rPr>
           <w:lang w:val="pt-PT"/>
         </w:rPr>
-        <w:t>Sapana</w:t>
-      </w:r>
-      <w:proofErr w:type="spellEnd"/>
+        <w:t>Sapana Dhami</w:t>
+      </w:r>
       <w:r>
         <w:rPr>
           <w:lang w:val="pt-PT"/>
         </w:rPr>
-        <w:t xml:space="preserve"> </w:t>
-      </w:r>
-      <w:proofErr w:type="spellStart"/>
+        <w:t xml:space="preserve">, </w:t>
+      </w:r>
       <w:r>
         <w:rPr>
           <w:lang w:val="pt-PT"/>
         </w:rPr>
-        <w:t>Dhami</w:t>
-      </w:r>
-      <w:proofErr w:type="spellEnd"/>
+        <w:t>202504</w:t>
+      </w:r>
       <w:r>
         <w:rPr>
           <w:lang w:val="pt-PT"/>
         </w:rPr>
-        <w:t xml:space="preserve">, </w:t>
+        <w:t>0</w:t>
       </w:r>
       <w:r>
         <w:rPr>
           <w:lang w:val="pt-PT"/>
         </w:rPr>
-        <w:t>202504</w:t>
-      </w:r>
-      <w:r>
+        <w:t>3</w:t>
+      </w:r>
+    </w:p>
+    <w:p>
+      <w:pPr>
+        <w:jc w:val="center"/>
         <w:rPr>
           <w:lang w:val="pt-PT"/>
         </w:rPr>
-        <w:t>0</w:t>
-      </w:r>
+      </w:pPr>
       <w:r>
         <w:rPr>
           <w:lang w:val="pt-PT"/>
         </w:rPr>
-        <w:t>3</w:t>
-      </w:r>
-    </w:p>
-    <w:p>
-      <w:pPr>
-        <w:jc w:val="center"/>
-        <w:rPr>
-          <w:lang w:val="pt-PT"/>
-        </w:rPr>
-      </w:pPr>
-      <w:r>
-        <w:rPr>
-          <w:lang w:val="pt-PT"/>
-        </w:rPr>
-        <w:t xml:space="preserve">Maria Luiza </w:t>
-      </w:r>
-      <w:proofErr w:type="spellStart"/>
-      <w:r>
-        <w:rPr>
-          <w:lang w:val="pt-PT"/>
-        </w:rPr>
-        <w:t>Salum</w:t>
-      </w:r>
-      <w:proofErr w:type="spellEnd"/>
-      <w:r>
-        <w:rPr>
-          <w:lang w:val="pt-PT"/>
-        </w:rPr>
-        <w:t xml:space="preserve"> Alves Corrêa, 20221902</w:t>
+        <w:t>Maria Luiza Salum Alves Corrêa, 20221902</w:t>
       </w:r>
     </w:p>
     <w:p>
@@ -636,7 +570,7 @@
           <w:r>
             <w:fldChar w:fldCharType="separate"/>
           </w:r>
-          <w:hyperlink w:anchor="_Toc231138626" w:history="1">
+          <w:hyperlink w:anchor="_Toc231292226" w:history="1">
             <w:r>
               <w:rPr>
                 <w:rStyle w:val="Hiperligao"/>
@@ -678,7 +612,7 @@
               <w:rPr>
                 <w:webHidden/>
               </w:rPr>
-              <w:instrText xml:space="preserve"> PAGEREF _Toc231138626 \h </w:instrText>
+              <w:instrText xml:space="preserve"> PAGEREF _Toc231292226 \h </w:instrText>
             </w:r>
             <w:r>
               <w:rPr>
@@ -717,7 +651,7 @@
               <w14:ligatures w14:val="standardContextual"/>
             </w:rPr>
           </w:pPr>
-          <w:hyperlink w:anchor="_Toc231138627" w:history="1">
+          <w:hyperlink w:anchor="_Toc231292227" w:history="1">
             <w:r>
               <w:rPr>
                 <w:rStyle w:val="Hiperligao"/>
@@ -759,7 +693,7 @@
               <w:rPr>
                 <w:webHidden/>
               </w:rPr>
-              <w:instrText xml:space="preserve"> PAGEREF _Toc231138627 \h </w:instrText>
+              <w:instrText xml:space="preserve"> PAGEREF _Toc231292227 \h </w:instrText>
             </w:r>
             <w:r>
               <w:rPr>
@@ -798,7 +732,7 @@
               <w14:ligatures w14:val="standardContextual"/>
             </w:rPr>
           </w:pPr>
-          <w:hyperlink w:anchor="_Toc231138628" w:history="1">
+          <w:hyperlink w:anchor="_Toc231292228" w:history="1">
             <w:r>
               <w:rPr>
                 <w:rStyle w:val="Hiperligao"/>
@@ -840,7 +774,7 @@
               <w:rPr>
                 <w:webHidden/>
               </w:rPr>
-              <w:instrText xml:space="preserve"> PAGEREF _Toc231138628 \h </w:instrText>
+              <w:instrText xml:space="preserve"> PAGEREF _Toc231292228 \h </w:instrText>
             </w:r>
             <w:r>
               <w:rPr>
@@ -879,7 +813,7 @@
               <w14:ligatures w14:val="standardContextual"/>
             </w:rPr>
           </w:pPr>
-          <w:hyperlink w:anchor="_Toc231138629" w:history="1">
+          <w:hyperlink w:anchor="_Toc231292229" w:history="1">
             <w:r>
               <w:rPr>
                 <w:rStyle w:val="Hiperligao"/>
@@ -921,7 +855,7 @@
               <w:rPr>
                 <w:webHidden/>
               </w:rPr>
-              <w:instrText xml:space="preserve"> PAGEREF _Toc231138629 \h </w:instrText>
+              <w:instrText xml:space="preserve"> PAGEREF _Toc231292229 \h </w:instrText>
             </w:r>
             <w:r>
               <w:rPr>
@@ -960,7 +894,7 @@
               <w14:ligatures w14:val="standardContextual"/>
             </w:rPr>
           </w:pPr>
-          <w:hyperlink w:anchor="_Toc231138630" w:history="1">
+          <w:hyperlink w:anchor="_Toc231292230" w:history="1">
             <w:r>
               <w:rPr>
                 <w:rStyle w:val="Hiperligao"/>
@@ -1002,7 +936,7 @@
               <w:rPr>
                 <w:webHidden/>
               </w:rPr>
-              <w:instrText xml:space="preserve"> PAGEREF _Toc231138630 \h </w:instrText>
+              <w:instrText xml:space="preserve"> PAGEREF _Toc231292230 \h </w:instrText>
             </w:r>
             <w:r>
               <w:rPr>
@@ -1041,7 +975,7 @@
               <w14:ligatures w14:val="standardContextual"/>
             </w:rPr>
           </w:pPr>
-          <w:hyperlink w:anchor="_Toc231138631" w:history="1">
+          <w:hyperlink w:anchor="_Toc231292231" w:history="1">
             <w:r>
               <w:rPr>
                 <w:rStyle w:val="Hiperligao"/>
@@ -1083,7 +1017,7 @@
               <w:rPr>
                 <w:webHidden/>
               </w:rPr>
-              <w:instrText xml:space="preserve"> PAGEREF _Toc231138631 \h </w:instrText>
+              <w:instrText xml:space="preserve"> PAGEREF _Toc231292231 \h </w:instrText>
             </w:r>
             <w:r>
               <w:rPr>
@@ -1122,7 +1056,7 @@
               <w14:ligatures w14:val="standardContextual"/>
             </w:rPr>
           </w:pPr>
-          <w:hyperlink w:anchor="_Toc231138632" w:history="1">
+          <w:hyperlink w:anchor="_Toc231292232" w:history="1">
             <w:r>
               <w:rPr>
                 <w:rStyle w:val="Hiperligao"/>
@@ -1164,7 +1098,7 @@
               <w:rPr>
                 <w:webHidden/>
               </w:rPr>
-              <w:instrText xml:space="preserve"> PAGEREF _Toc231138632 \h </w:instrText>
+              <w:instrText xml:space="preserve"> PAGEREF _Toc231292232 \h </w:instrText>
             </w:r>
             <w:r>
               <w:rPr>
@@ -1182,6 +1116,249 @@
                 <w:webHidden/>
               </w:rPr>
               <w:t>4</w:t>
+            </w:r>
+            <w:r>
+              <w:rPr>
+                <w:webHidden/>
+              </w:rPr>
+              <w:fldChar w:fldCharType="end"/>
+            </w:r>
+          </w:hyperlink>
+        </w:p>
+        <w:p>
+          <w:pPr>
+            <w:pStyle w:val="ndice2"/>
+            <w:rPr>
+              <w:rFonts w:asciiTheme="minorHAnsi" w:eastAsiaTheme="minorEastAsia" w:hAnsiTheme="minorHAnsi" w:cstheme="minorBidi"/>
+              <w:kern w:val="2"/>
+              <w:sz w:val="24"/>
+              <w:szCs w:val="24"/>
+              <w:lang w:val="pt-PT"/>
+              <w14:ligatures w14:val="standardContextual"/>
+            </w:rPr>
+          </w:pPr>
+          <w:hyperlink w:anchor="_Toc231292233" w:history="1">
+            <w:r>
+              <w:rPr>
+                <w:rStyle w:val="Hiperligao"/>
+                <w:rFonts w:ascii="Arial" w:hAnsi="Arial" w:cs="Arial"/>
+              </w:rPr>
+              <w:t>4.1.</w:t>
+            </w:r>
+            <w:r>
+              <w:rPr>
+                <w:rFonts w:asciiTheme="minorHAnsi" w:eastAsiaTheme="minorEastAsia" w:hAnsiTheme="minorHAnsi" w:cstheme="minorBidi"/>
+                <w:kern w:val="2"/>
+                <w:sz w:val="24"/>
+                <w:szCs w:val="24"/>
+                <w:lang w:val="pt-PT"/>
+                <w14:ligatures w14:val="standardContextual"/>
+              </w:rPr>
+              <w:tab/>
+            </w:r>
+            <w:r>
+              <w:rPr>
+                <w:rStyle w:val="Hiperligao"/>
+                <w:rFonts w:ascii="Arial" w:hAnsi="Arial" w:cs="Arial"/>
+              </w:rPr>
+              <w:t>Bag-of-Words and TF-IDF Representation</w:t>
+            </w:r>
+            <w:r>
+              <w:rPr>
+                <w:webHidden/>
+              </w:rPr>
+              <w:tab/>
+            </w:r>
+            <w:r>
+              <w:rPr>
+                <w:webHidden/>
+              </w:rPr>
+              <w:fldChar w:fldCharType="begin"/>
+            </w:r>
+            <w:r>
+              <w:rPr>
+                <w:webHidden/>
+              </w:rPr>
+              <w:instrText xml:space="preserve"> PAGEREF _Toc231292233 \h </w:instrText>
+            </w:r>
+            <w:r>
+              <w:rPr>
+                <w:webHidden/>
+              </w:rPr>
+            </w:r>
+            <w:r>
+              <w:rPr>
+                <w:webHidden/>
+              </w:rPr>
+              <w:fldChar w:fldCharType="separate"/>
+            </w:r>
+            <w:r>
+              <w:rPr>
+                <w:webHidden/>
+              </w:rPr>
+              <w:t>4</w:t>
+            </w:r>
+            <w:r>
+              <w:rPr>
+                <w:webHidden/>
+              </w:rPr>
+              <w:fldChar w:fldCharType="end"/>
+            </w:r>
+          </w:hyperlink>
+        </w:p>
+        <w:p>
+          <w:pPr>
+            <w:pStyle w:val="ndice2"/>
+            <w:rPr>
+              <w:rFonts w:asciiTheme="minorHAnsi" w:eastAsiaTheme="minorEastAsia" w:hAnsiTheme="minorHAnsi" w:cstheme="minorBidi"/>
+              <w:kern w:val="2"/>
+              <w:sz w:val="24"/>
+              <w:szCs w:val="24"/>
+              <w:lang w:val="pt-PT"/>
+              <w14:ligatures w14:val="standardContextual"/>
+            </w:rPr>
+          </w:pPr>
+          <w:hyperlink w:anchor="_Toc231292234" w:history="1">
+            <w:r>
+              <w:rPr>
+                <w:rStyle w:val="Hiperligao"/>
+                <w:rFonts w:ascii="Arial" w:hAnsi="Arial" w:cs="Arial"/>
+                <w:lang w:val="pt-PT"/>
+              </w:rPr>
+              <w:t>4.2.</w:t>
+            </w:r>
+            <w:r>
+              <w:rPr>
+                <w:rFonts w:asciiTheme="minorHAnsi" w:eastAsiaTheme="minorEastAsia" w:hAnsiTheme="minorHAnsi" w:cstheme="minorBidi"/>
+                <w:kern w:val="2"/>
+                <w:sz w:val="24"/>
+                <w:szCs w:val="24"/>
+                <w:lang w:val="pt-PT"/>
+                <w14:ligatures w14:val="standardContextual"/>
+              </w:rPr>
+              <w:tab/>
+            </w:r>
+            <w:r>
+              <w:rPr>
+                <w:rStyle w:val="Hiperligao"/>
+                <w:rFonts w:ascii="Arial" w:hAnsi="Arial" w:cs="Arial"/>
+                <w:lang w:val="pt-PT"/>
+              </w:rPr>
+              <w:t>Word2Vec Embeddings</w:t>
+            </w:r>
+            <w:r>
+              <w:rPr>
+                <w:webHidden/>
+              </w:rPr>
+              <w:tab/>
+            </w:r>
+            <w:r>
+              <w:rPr>
+                <w:webHidden/>
+              </w:rPr>
+              <w:fldChar w:fldCharType="begin"/>
+            </w:r>
+            <w:r>
+              <w:rPr>
+                <w:webHidden/>
+              </w:rPr>
+              <w:instrText xml:space="preserve"> PAGEREF _Toc231292234 \h </w:instrText>
+            </w:r>
+            <w:r>
+              <w:rPr>
+                <w:webHidden/>
+              </w:rPr>
+            </w:r>
+            <w:r>
+              <w:rPr>
+                <w:webHidden/>
+              </w:rPr>
+              <w:fldChar w:fldCharType="separate"/>
+            </w:r>
+            <w:r>
+              <w:rPr>
+                <w:webHidden/>
+              </w:rPr>
+              <w:t>4</w:t>
+            </w:r>
+            <w:r>
+              <w:rPr>
+                <w:webHidden/>
+              </w:rPr>
+              <w:fldChar w:fldCharType="end"/>
+            </w:r>
+          </w:hyperlink>
+        </w:p>
+        <w:p>
+          <w:pPr>
+            <w:pStyle w:val="ndice2"/>
+            <w:rPr>
+              <w:rFonts w:asciiTheme="minorHAnsi" w:eastAsiaTheme="minorEastAsia" w:hAnsiTheme="minorHAnsi" w:cstheme="minorBidi"/>
+              <w:kern w:val="2"/>
+              <w:sz w:val="24"/>
+              <w:szCs w:val="24"/>
+              <w:lang w:val="pt-PT"/>
+              <w14:ligatures w14:val="standardContextual"/>
+            </w:rPr>
+          </w:pPr>
+          <w:hyperlink w:anchor="_Toc231292235" w:history="1">
+            <w:r>
+              <w:rPr>
+                <w:rStyle w:val="Hiperligao"/>
+              </w:rPr>
+              <w:t>4.3.</w:t>
+            </w:r>
+            <w:r>
+              <w:rPr>
+                <w:rFonts w:asciiTheme="minorHAnsi" w:eastAsiaTheme="minorEastAsia" w:hAnsiTheme="minorHAnsi" w:cstheme="minorBidi"/>
+                <w:kern w:val="2"/>
+                <w:sz w:val="24"/>
+                <w:szCs w:val="24"/>
+                <w:lang w:val="pt-PT"/>
+                <w14:ligatures w14:val="standardContextual"/>
+              </w:rPr>
+              <w:tab/>
+            </w:r>
+            <w:r>
+              <w:rPr>
+                <w:rStyle w:val="Hiperligao"/>
+              </w:rPr>
+              <w:t>Transformer Encoders</w:t>
+            </w:r>
+            <w:r>
+              <w:rPr>
+                <w:webHidden/>
+              </w:rPr>
+              <w:tab/>
+            </w:r>
+            <w:r>
+              <w:rPr>
+                <w:webHidden/>
+              </w:rPr>
+              <w:fldChar w:fldCharType="begin"/>
+            </w:r>
+            <w:r>
+              <w:rPr>
+                <w:webHidden/>
+              </w:rPr>
+              <w:instrText xml:space="preserve"> PAGEREF _Toc231292235 \h </w:instrText>
+            </w:r>
+            <w:r>
+              <w:rPr>
+                <w:webHidden/>
+              </w:rPr>
+            </w:r>
+            <w:r>
+              <w:rPr>
+                <w:webHidden/>
+              </w:rPr>
+              <w:fldChar w:fldCharType="separate"/>
+            </w:r>
+            <w:r>
+              <w:rPr>
+                <w:webHidden/>
+              </w:rPr>
+              <w:t>5</w:t>
             </w:r>
             <w:r>
               <w:rPr>
@@ -1203,7 +1380,7 @@
               <w14:ligatures w14:val="standardContextual"/>
             </w:rPr>
           </w:pPr>
-          <w:hyperlink w:anchor="_Toc231138633" w:history="1">
+          <w:hyperlink w:anchor="_Toc231292236" w:history="1">
             <w:r>
               <w:rPr>
                 <w:rStyle w:val="Hiperligao"/>
@@ -1245,7 +1422,7 @@
               <w:rPr>
                 <w:webHidden/>
               </w:rPr>
-              <w:instrText xml:space="preserve"> PAGEREF _Toc231138633 \h </w:instrText>
+              <w:instrText xml:space="preserve"> PAGEREF _Toc231292236 \h </w:instrText>
             </w:r>
             <w:r>
               <w:rPr>
@@ -1284,7 +1461,7 @@
               <w14:ligatures w14:val="standardContextual"/>
             </w:rPr>
           </w:pPr>
-          <w:hyperlink w:anchor="_Toc231138634" w:history="1">
+          <w:hyperlink w:anchor="_Toc231292237" w:history="1">
             <w:r>
               <w:rPr>
                 <w:rStyle w:val="Hiperligao"/>
@@ -1326,7 +1503,7 @@
               <w:rPr>
                 <w:webHidden/>
               </w:rPr>
-              <w:instrText xml:space="preserve"> PAGEREF _Toc231138634 \h </w:instrText>
+              <w:instrText xml:space="preserve"> PAGEREF _Toc231292237 \h </w:instrText>
             </w:r>
             <w:r>
               <w:rPr>
@@ -1365,7 +1542,7 @@
               <w14:ligatures w14:val="standardContextual"/>
             </w:rPr>
           </w:pPr>
-          <w:hyperlink w:anchor="_Toc231138635" w:history="1">
+          <w:hyperlink w:anchor="_Toc231292238" w:history="1">
             <w:r>
               <w:rPr>
                 <w:rStyle w:val="Hiperligao"/>
@@ -1407,7 +1584,7 @@
               <w:rPr>
                 <w:webHidden/>
               </w:rPr>
-              <w:instrText xml:space="preserve"> PAGEREF _Toc231138635 \h </w:instrText>
+              <w:instrText xml:space="preserve"> PAGEREF _Toc231292238 \h </w:instrText>
             </w:r>
             <w:r>
               <w:rPr>
@@ -1446,7 +1623,7 @@
               <w14:ligatures w14:val="standardContextual"/>
             </w:rPr>
           </w:pPr>
-          <w:hyperlink w:anchor="_Toc231138636" w:history="1">
+          <w:hyperlink w:anchor="_Toc231292239" w:history="1">
             <w:r>
               <w:rPr>
                 <w:rStyle w:val="Hiperligao"/>
@@ -1488,7 +1665,7 @@
               <w:rPr>
                 <w:webHidden/>
               </w:rPr>
-              <w:instrText xml:space="preserve"> PAGEREF _Toc231138636 \h </w:instrText>
+              <w:instrText xml:space="preserve"> PAGEREF _Toc231292239 \h </w:instrText>
             </w:r>
             <w:r>
               <w:rPr>
@@ -1505,7 +1682,7 @@
               <w:rPr>
                 <w:webHidden/>
               </w:rPr>
-              <w:t>7</w:t>
+              <w:t>6</w:t>
             </w:r>
             <w:r>
               <w:rPr>
@@ -1527,7 +1704,7 @@
               <w14:ligatures w14:val="standardContextual"/>
             </w:rPr>
           </w:pPr>
-          <w:hyperlink w:anchor="_Toc231138637" w:history="1">
+          <w:hyperlink w:anchor="_Toc231292240" w:history="1">
             <w:r>
               <w:rPr>
                 <w:rStyle w:val="Hiperligao"/>
@@ -1569,7 +1746,7 @@
               <w:rPr>
                 <w:webHidden/>
               </w:rPr>
-              <w:instrText xml:space="preserve"> PAGEREF _Toc231138637 \h </w:instrText>
+              <w:instrText xml:space="preserve"> PAGEREF _Toc231292240 \h </w:instrText>
             </w:r>
             <w:r>
               <w:rPr>
@@ -1649,7 +1826,7 @@
       <w:bookmarkStart w:id="7" w:name="_Toc115296802"/>
       <w:bookmarkStart w:id="8" w:name="_Toc136960268"/>
       <w:bookmarkStart w:id="9" w:name="_Toc141959331"/>
-      <w:bookmarkStart w:id="10" w:name="_Toc231138626"/>
+      <w:bookmarkStart w:id="10" w:name="_Toc231292226"/>
       <w:r>
         <w:rPr>
           <w:rFonts w:ascii="Arial" w:hAnsi="Arial" w:cs="Arial"/>
@@ -1681,7 +1858,7 @@
           <w:rFonts w:ascii="Arial" w:hAnsi="Arial" w:cs="Arial"/>
         </w:rPr>
       </w:pPr>
-      <w:bookmarkStart w:id="11" w:name="_Toc231138627"/>
+      <w:bookmarkStart w:id="11" w:name="_Toc231292227"/>
       <w:bookmarkEnd w:id="0"/>
       <w:bookmarkEnd w:id="1"/>
       <w:bookmarkEnd w:id="2"/>
@@ -1714,7 +1891,7 @@
           <w:rFonts w:ascii="Arial" w:hAnsi="Arial" w:cs="Arial"/>
         </w:rPr>
       </w:pPr>
-      <w:bookmarkStart w:id="12" w:name="_Toc231138628"/>
+      <w:bookmarkStart w:id="12" w:name="_Toc231292228"/>
       <w:r>
         <w:rPr>
           <w:rFonts w:ascii="Arial" w:hAnsi="Arial" w:cs="Arial"/>
@@ -1781,7 +1958,7 @@
           <w:rFonts w:ascii="Arial" w:hAnsi="Arial" w:cs="Arial"/>
         </w:rPr>
       </w:pPr>
-      <w:bookmarkStart w:id="13" w:name="_Toc231138629"/>
+      <w:bookmarkStart w:id="13" w:name="_Toc231292229"/>
       <w:r>
         <w:rPr>
           <w:rFonts w:ascii="Arial" w:hAnsi="Arial" w:cs="Arial"/>
@@ -1797,7 +1974,7 @@
           <w:rFonts w:ascii="Arial" w:hAnsi="Arial" w:cs="Arial"/>
         </w:rPr>
       </w:pPr>
-      <w:bookmarkStart w:id="14" w:name="_Toc231138630"/>
+      <w:bookmarkStart w:id="14" w:name="_Toc231292230"/>
       <w:r>
         <w:rPr>
           <w:rFonts w:ascii="Arial" w:hAnsi="Arial" w:cs="Arial"/>
@@ -1996,23 +2173,7 @@
           <w:rFonts w:ascii="Arial" w:hAnsi="Arial" w:cs="Arial"/>
           <w:lang w:eastAsia="pt-PT"/>
         </w:rPr>
-        <w:t xml:space="preserve"> as a quick way to explore the top 15 most common words in each sentiment class. This gave us an immediate visual sense of which terms stand out the most in bullish, bearish, and neutral tweets, since more frequent words appear larger and are easier to spot </w:t>
-      </w:r>
-      <w:proofErr w:type="gramStart"/>
-      <w:r>
-        <w:rPr>
-          <w:rFonts w:ascii="Arial" w:hAnsi="Arial" w:cs="Arial"/>
-          <w:lang w:eastAsia="pt-PT"/>
-        </w:rPr>
-        <w:t>at a glance</w:t>
-      </w:r>
-      <w:proofErr w:type="gramEnd"/>
-      <w:r>
-        <w:rPr>
-          <w:rFonts w:ascii="Arial" w:hAnsi="Arial" w:cs="Arial"/>
-          <w:lang w:eastAsia="pt-PT"/>
-        </w:rPr>
-        <w:t>.</w:t>
+        <w:t xml:space="preserve"> as a quick way to explore the top 15 most common words in each sentiment class. This gave us an immediate visual sense of which terms stand out the most in bullish, bearish, and neutral tweets, since more frequent words appear larger and are easier to spot at a glance.</w:t>
       </w:r>
     </w:p>
     <w:p>
@@ -2464,23 +2625,7 @@
           <w:rFonts w:ascii="Arial" w:hAnsi="Arial" w:cs="Arial"/>
           <w:lang w:eastAsia="pt-PT"/>
         </w:rPr>
-        <w:t xml:space="preserve">Now, considering that our dataset consists of tweets, we also </w:t>
-      </w:r>
-      <w:proofErr w:type="gramStart"/>
-      <w:r>
-        <w:rPr>
-          <w:rFonts w:ascii="Arial" w:hAnsi="Arial" w:cs="Arial"/>
-          <w:lang w:eastAsia="pt-PT"/>
-        </w:rPr>
-        <w:t>looked into</w:t>
-      </w:r>
-      <w:proofErr w:type="gramEnd"/>
-      <w:r>
-        <w:rPr>
-          <w:rFonts w:ascii="Arial" w:hAnsi="Arial" w:cs="Arial"/>
-          <w:lang w:eastAsia="pt-PT"/>
-        </w:rPr>
-        <w:t xml:space="preserve"> the use of hashtags, mentions, and cashtags, since these are very common elements in this type of text and often carry useful context about topics or specific stocks being discussed.</w:t>
+        <w:t>Now, considering that our dataset consists of tweets, we also looked into the use of hashtags, mentions, and cashtags, since these are very common elements in this type of text and often carry useful context about topics or specific stocks being discussed.</w:t>
       </w:r>
     </w:p>
     <w:p>
@@ -2530,7 +2675,6 @@
         </w:rPr>
         <w:t>” and “</w:t>
       </w:r>
-      <w:proofErr w:type="spellStart"/>
       <w:r>
         <w:rPr>
           <w:rFonts w:ascii="Arial" w:hAnsi="Arial" w:cs="Arial"/>
@@ -2540,7 +2684,6 @@
         </w:rPr>
         <w:t>wti</w:t>
       </w:r>
-      <w:proofErr w:type="spellEnd"/>
       <w:r>
         <w:rPr>
           <w:rFonts w:ascii="Arial" w:hAnsi="Arial" w:cs="Arial"/>
@@ -2657,23 +2800,7 @@
           <w:rFonts w:ascii="Arial" w:hAnsi="Arial" w:cs="Arial"/>
           <w:lang w:eastAsia="pt-PT"/>
         </w:rPr>
-        <w:t xml:space="preserve">Looking at cashtags (stock </w:t>
-      </w:r>
-      <w:proofErr w:type="gramStart"/>
-      <w:r>
-        <w:rPr>
-          <w:rFonts w:ascii="Arial" w:hAnsi="Arial" w:cs="Arial"/>
-          <w:lang w:eastAsia="pt-PT"/>
-        </w:rPr>
-        <w:t>tickers</w:t>
-      </w:r>
-      <w:proofErr w:type="gramEnd"/>
-      <w:r>
-        <w:rPr>
-          <w:rFonts w:ascii="Arial" w:hAnsi="Arial" w:cs="Arial"/>
-          <w:lang w:eastAsia="pt-PT"/>
-        </w:rPr>
-        <w:t>), clearer distinctions emerge. While some popular tickers like “</w:t>
+        <w:t>Looking at cashtags (stock tickers), clearer distinctions emerge. While some popular tickers like “</w:t>
       </w:r>
       <w:r>
         <w:rPr>
@@ -2837,105 +2964,7 @@
           <w:rFonts w:ascii="Arial" w:hAnsi="Arial" w:cs="Arial"/>
           <w:lang w:eastAsia="pt-PT"/>
         </w:rPr>
-        <w:t xml:space="preserve"> per class </w:t>
-      </w:r>
-      <w:proofErr w:type="gramStart"/>
-      <w:r>
-        <w:rPr>
-          <w:rFonts w:ascii="Arial" w:hAnsi="Arial" w:cs="Arial"/>
-          <w:lang w:eastAsia="pt-PT"/>
-        </w:rPr>
-        <w:t>in order to</w:t>
-      </w:r>
-      <w:proofErr w:type="gramEnd"/>
-      <w:r>
-        <w:rPr>
-          <w:rFonts w:ascii="Arial" w:hAnsi="Arial" w:cs="Arial"/>
-          <w:lang w:eastAsia="pt-PT"/>
-        </w:rPr>
-        <w:t xml:space="preserve"> determine </w:t>
-      </w:r>
-      <w:proofErr w:type="spellStart"/>
-      <w:proofErr w:type="gramStart"/>
-      <w:r>
-        <w:rPr>
-          <w:rFonts w:ascii="Arial" w:hAnsi="Arial" w:cs="Arial"/>
-          <w:lang w:eastAsia="pt-PT"/>
-        </w:rPr>
-        <w:t>wether</w:t>
-      </w:r>
-      <w:proofErr w:type="spellEnd"/>
-      <w:proofErr w:type="gramEnd"/>
-      <w:r>
-        <w:rPr>
-          <w:rFonts w:ascii="Arial" w:hAnsi="Arial" w:cs="Arial"/>
-          <w:lang w:eastAsia="pt-PT"/>
-        </w:rPr>
-        <w:t xml:space="preserve"> any of these would be a good indicator of the class that those tweets were in. Out of the three, the neutral was the one who had the highest average of characters per tweet with 88 characters, even though </w:t>
-      </w:r>
-      <w:proofErr w:type="gramStart"/>
-      <w:r>
-        <w:rPr>
-          <w:rFonts w:ascii="Arial" w:hAnsi="Arial" w:cs="Arial"/>
-          <w:lang w:eastAsia="pt-PT"/>
-        </w:rPr>
-        <w:t>all of</w:t>
-      </w:r>
-      <w:proofErr w:type="gramEnd"/>
-      <w:r>
-        <w:rPr>
-          <w:rFonts w:ascii="Arial" w:hAnsi="Arial" w:cs="Arial"/>
-          <w:lang w:eastAsia="pt-PT"/>
-        </w:rPr>
-        <w:t xml:space="preserve"> the classes had the exact same average number of words at 12 words. Regarding the presence of URL’s neutral was also the class with the highest percentage with 49.8% whereas bearish and </w:t>
-      </w:r>
-      <w:proofErr w:type="spellStart"/>
-      <w:r>
-        <w:rPr>
-          <w:rFonts w:ascii="Arial" w:hAnsi="Arial" w:cs="Arial"/>
-          <w:lang w:eastAsia="pt-PT"/>
-        </w:rPr>
-        <w:t>bulish</w:t>
-      </w:r>
-      <w:proofErr w:type="spellEnd"/>
-      <w:r>
-        <w:rPr>
-          <w:rFonts w:ascii="Arial" w:hAnsi="Arial" w:cs="Arial"/>
-          <w:lang w:eastAsia="pt-PT"/>
-        </w:rPr>
-        <w:t xml:space="preserve"> came with 44.3% and 39.1%, respectively. Regarding the presence of a stock </w:t>
-      </w:r>
-      <w:proofErr w:type="gramStart"/>
-      <w:r>
-        <w:rPr>
-          <w:rFonts w:ascii="Arial" w:hAnsi="Arial" w:cs="Arial"/>
-          <w:lang w:eastAsia="pt-PT"/>
-        </w:rPr>
-        <w:t>ticker</w:t>
-      </w:r>
-      <w:proofErr w:type="gramEnd"/>
-      <w:r>
-        <w:rPr>
-          <w:rFonts w:ascii="Arial" w:hAnsi="Arial" w:cs="Arial"/>
-          <w:lang w:eastAsia="pt-PT"/>
-        </w:rPr>
-        <w:t xml:space="preserve"> the bullish class came first with 24.6%</w:t>
-      </w:r>
-      <w:proofErr w:type="gramStart"/>
-      <w:r>
-        <w:rPr>
-          <w:rFonts w:ascii="Arial" w:hAnsi="Arial" w:cs="Arial"/>
-          <w:lang w:eastAsia="pt-PT"/>
-        </w:rPr>
-        <w:t xml:space="preserve"> which</w:t>
-      </w:r>
-      <w:proofErr w:type="gramEnd"/>
-      <w:r>
-        <w:rPr>
-          <w:rFonts w:ascii="Arial" w:hAnsi="Arial" w:cs="Arial"/>
-          <w:lang w:eastAsia="pt-PT"/>
-        </w:rPr>
-        <w:t xml:space="preserve"> represents almost double the percentage that both bearish and neutral classes got at around 13% as can be seen on Figure 6</w:t>
+        <w:t xml:space="preserve"> per class in order to determine wether any of these would be a good indicator of the class that those tweets were in. Out of the three, the neutral was the one who had the highest average of characters per tweet with 88 characters, even though all of the classes had the exact same average number of words at 12 words. Regarding the presence of URL’s neutral was also the class with the highest percentage with 49.8% whereas bearish and bulish came with 44.3% and 39.1%, respectively. Regarding the presence of a stock ticker the bullish class came first with 24.6% which represents almost double the percentage that both bearish and neutral classes got at around 13% as can be seen on Figure 6</w:t>
       </w:r>
     </w:p>
     <w:p>
@@ -2953,7 +2982,7 @@
           <w:rFonts w:ascii="Arial" w:hAnsi="Arial" w:cs="Arial"/>
         </w:rPr>
       </w:pPr>
-      <w:bookmarkStart w:id="15" w:name="_Toc231138631"/>
+      <w:bookmarkStart w:id="15" w:name="_Toc231292231"/>
       <w:r>
         <w:rPr>
           <w:rFonts w:ascii="Arial" w:hAnsi="Arial" w:cs="Arial"/>
@@ -3018,23 +3047,7 @@
           <w:rFonts w:ascii="Arial" w:hAnsi="Arial" w:cs="Arial"/>
           <w:lang w:eastAsia="pt-PT"/>
         </w:rPr>
-        <w:t xml:space="preserve">The EDA showed that bullish and bearish tweets frequently </w:t>
-      </w:r>
-      <w:proofErr w:type="gramStart"/>
-      <w:r>
-        <w:rPr>
-          <w:rFonts w:ascii="Arial" w:hAnsi="Arial" w:cs="Arial"/>
-          <w:lang w:eastAsia="pt-PT"/>
-        </w:rPr>
-        <w:t>contained</w:t>
-      </w:r>
-      <w:proofErr w:type="gramEnd"/>
-      <w:r>
-        <w:rPr>
-          <w:rFonts w:ascii="Arial" w:hAnsi="Arial" w:cs="Arial"/>
-          <w:lang w:eastAsia="pt-PT"/>
-        </w:rPr>
-        <w:t xml:space="preserve"> words associated with market movements and company performance, such as </w:t>
+        <w:t xml:space="preserve">The EDA showed that bullish and bearish tweets frequently contained words associated with market movements and company performance, such as </w:t>
       </w:r>
       <w:r>
         <w:rPr>
@@ -3129,23 +3142,7 @@
           <w:rFonts w:ascii="Arial" w:hAnsi="Arial" w:cs="Arial"/>
           <w:lang w:eastAsia="pt-PT"/>
         </w:rPr>
-        <w:t xml:space="preserve">Since the analysis of </w:t>
-      </w:r>
-      <w:proofErr w:type="spellStart"/>
-      <w:r>
-        <w:rPr>
-          <w:rFonts w:ascii="Arial" w:hAnsi="Arial" w:cs="Arial"/>
-          <w:lang w:eastAsia="pt-PT"/>
-        </w:rPr>
-        <w:t>cashtags</w:t>
-      </w:r>
-      <w:proofErr w:type="spellEnd"/>
-      <w:r>
-        <w:rPr>
-          <w:rFonts w:ascii="Arial" w:hAnsi="Arial" w:cs="Arial"/>
-          <w:lang w:eastAsia="pt-PT"/>
-        </w:rPr>
-        <w:t xml:space="preserve"> demonstrated that stock tickers were more prevalent in bullish tweets (24.6%) than in bearish or neutral tweets (approximately 13%), stock ticker references were explicitly preserved. Known tickers were mapped to standardized tokens (e.g., TICKER_AAPL), while unknown tickers were replaced with a generic STOCK_TICKER token. This allowed the model to retain information about stock-specific discussions while limiting vocabulary growth.</w:t>
+        <w:t>Since the analysis of cashtags demonstrated that stock tickers were more prevalent in bullish tweets (24.6%) than in bearish or neutral tweets (approximately 13%), stock ticker references were explicitly preserved. Known tickers were mapped to standardized tokens (e.g., TICKER_AAPL), while unknown tickers were replaced with a generic STOCK_TICKER token. This allowed the model to retain information about stock-specific discussions while limiting vocabulary growth.</w:t>
       </w:r>
     </w:p>
     <w:p>
@@ -3254,55 +3251,7 @@
           <w:rFonts w:ascii="Arial" w:hAnsi="Arial" w:cs="Arial"/>
           <w:lang w:eastAsia="pt-PT"/>
         </w:rPr>
-        <w:t xml:space="preserve">After cleaning, tweets were tokenized using NLTK's </w:t>
-      </w:r>
-      <w:proofErr w:type="spellStart"/>
-      <w:r>
-        <w:rPr>
-          <w:rFonts w:ascii="Arial" w:hAnsi="Arial" w:cs="Arial"/>
-          <w:lang w:eastAsia="pt-PT"/>
-        </w:rPr>
-        <w:t>TweetTokenizer</w:t>
-      </w:r>
-      <w:proofErr w:type="spellEnd"/>
-      <w:r>
-        <w:rPr>
-          <w:rFonts w:ascii="Arial" w:hAnsi="Arial" w:cs="Arial"/>
-          <w:lang w:eastAsia="pt-PT"/>
-        </w:rPr>
-        <w:t xml:space="preserve">, which is specifically designed to handle social media text. </w:t>
-      </w:r>
-      <w:proofErr w:type="spellStart"/>
-      <w:r>
-        <w:rPr>
-          <w:rFonts w:ascii="Arial" w:hAnsi="Arial" w:cs="Arial"/>
-          <w:lang w:eastAsia="pt-PT"/>
-        </w:rPr>
-        <w:t>Stopword</w:t>
-      </w:r>
-      <w:proofErr w:type="spellEnd"/>
-      <w:r>
-        <w:rPr>
-          <w:rFonts w:ascii="Arial" w:hAnsi="Arial" w:cs="Arial"/>
-          <w:lang w:eastAsia="pt-PT"/>
-        </w:rPr>
-        <w:t xml:space="preserve"> removal was then applied to eliminate common words with limited discriminative value. However, unlike a standard </w:t>
-      </w:r>
-      <w:proofErr w:type="spellStart"/>
-      <w:r>
-        <w:rPr>
-          <w:rFonts w:ascii="Arial" w:hAnsi="Arial" w:cs="Arial"/>
-          <w:lang w:eastAsia="pt-PT"/>
-        </w:rPr>
-        <w:t>stopword</w:t>
-      </w:r>
-      <w:proofErr w:type="spellEnd"/>
-      <w:r>
-        <w:rPr>
-          <w:rFonts w:ascii="Arial" w:hAnsi="Arial" w:cs="Arial"/>
-          <w:lang w:eastAsia="pt-PT"/>
-        </w:rPr>
-        <w:t xml:space="preserve"> removal procedure, sentiment-critical financial terms identified during EDA were explicitly preserved. Words such as </w:t>
+        <w:t xml:space="preserve">After cleaning, tweets were tokenized using NLTK's TweetTokenizer, which is specifically designed to handle social media text. Stopword removal was then applied to eliminate common words with limited discriminative value. However, unlike a standard stopword removal procedure, sentiment-critical financial terms identified during EDA were explicitly preserved. Words such as </w:t>
       </w:r>
       <w:r>
         <w:rPr>
@@ -3639,7 +3588,7 @@
           <w:rFonts w:ascii="Arial" w:hAnsi="Arial" w:cs="Arial"/>
         </w:rPr>
       </w:pPr>
-      <w:bookmarkStart w:id="16" w:name="_Toc231138632"/>
+      <w:bookmarkStart w:id="16" w:name="_Toc231292232"/>
       <w:r>
         <w:rPr>
           <w:rFonts w:ascii="Arial" w:hAnsi="Arial" w:cs="Arial"/>
@@ -3660,23 +3609,7 @@
           <w:rFonts w:ascii="Arial" w:hAnsi="Arial" w:cs="Arial"/>
           <w:lang w:eastAsia="pt-PT"/>
         </w:rPr>
-        <w:t>To convert the preprocessed textual data into a format suitable for machine learning algorithms, multiple feature extraction techniques were explored, including Bag-of-Words (</w:t>
-      </w:r>
-      <w:proofErr w:type="spellStart"/>
-      <w:r>
-        <w:rPr>
-          <w:rFonts w:ascii="Arial" w:hAnsi="Arial" w:cs="Arial"/>
-          <w:lang w:eastAsia="pt-PT"/>
-        </w:rPr>
-        <w:t>BoW</w:t>
-      </w:r>
-      <w:proofErr w:type="spellEnd"/>
-      <w:r>
-        <w:rPr>
-          <w:rFonts w:ascii="Arial" w:hAnsi="Arial" w:cs="Arial"/>
-          <w:lang w:eastAsia="pt-PT"/>
-        </w:rPr>
-        <w:t>)</w:t>
+        <w:t>To convert the preprocessed textual data into a format suitable for machine learning algorithms, multiple feature extraction techniques were explored, including Bag-of-Words (BoW)</w:t>
       </w:r>
       <w:r>
         <w:rPr>
@@ -3700,12 +3633,14 @@
           <w:rFonts w:ascii="Arial" w:hAnsi="Arial" w:cs="Arial"/>
         </w:rPr>
       </w:pPr>
+      <w:bookmarkStart w:id="17" w:name="_Toc231292233"/>
       <w:r>
         <w:rPr>
           <w:rFonts w:ascii="Arial" w:hAnsi="Arial" w:cs="Arial"/>
         </w:rPr>
         <w:t>Bag-of-Words and TF-IDF Representation</w:t>
       </w:r>
+      <w:bookmarkEnd w:id="17"/>
     </w:p>
     <w:p>
       <w:pPr>
@@ -3734,23 +3669,7 @@
           <w:rFonts w:ascii="Arial" w:hAnsi="Arial" w:cs="Arial"/>
           <w:lang w:eastAsia="pt-PT"/>
         </w:rPr>
-        <w:t xml:space="preserve">To improve performance in the financial domain, several domain-specific </w:t>
-      </w:r>
-      <w:proofErr w:type="spellStart"/>
-      <w:r>
-        <w:rPr>
-          <w:rFonts w:ascii="Arial" w:hAnsi="Arial" w:cs="Arial"/>
-          <w:lang w:eastAsia="pt-PT"/>
-        </w:rPr>
-        <w:t>optimisations</w:t>
-      </w:r>
-      <w:proofErr w:type="spellEnd"/>
-      <w:r>
-        <w:rPr>
-          <w:rFonts w:ascii="Arial" w:hAnsi="Arial" w:cs="Arial"/>
-          <w:lang w:eastAsia="pt-PT"/>
-        </w:rPr>
-        <w:t xml:space="preserve"> were introduced. A maximum feature limit of 10,000 was applied to control vocabulary size and reduce computational complexity. In addition, n-gram extraction was enabled (up to trigrams), allowing the model to capture short phrases such as “price target”, “beats estimates”, and “stock market”, which are often more informative than isolated words.</w:t>
+        <w:t>To improve performance in the financial domain, several domain-specific optimisations were introduced. A maximum feature limit of 10,000 was applied to control vocabulary size and reduce computational complexity. In addition, n-gram extraction was enabled (up to trigrams), allowing the model to capture short phrases such as “price target”, “beats estimates”, and “stock market”, which are often more informative than isolated words.</w:t>
       </w:r>
     </w:p>
     <w:p>
@@ -3791,22 +3710,15 @@
           <w:lang w:val="pt-PT"/>
         </w:rPr>
       </w:pPr>
+      <w:bookmarkStart w:id="18" w:name="_Toc231292234"/>
       <w:r>
         <w:rPr>
           <w:rFonts w:ascii="Arial" w:hAnsi="Arial" w:cs="Arial"/>
           <w:lang w:val="pt-PT"/>
         </w:rPr>
-        <w:t xml:space="preserve">Word2Vec </w:t>
-      </w:r>
-      <w:proofErr w:type="spellStart"/>
-      <w:r>
-        <w:rPr>
-          <w:rFonts w:ascii="Arial" w:hAnsi="Arial" w:cs="Arial"/>
-          <w:lang w:val="pt-PT"/>
-        </w:rPr>
-        <w:t>Embeddings</w:t>
-      </w:r>
-      <w:proofErr w:type="spellEnd"/>
+        <w:t>Word2Vec Embeddings</w:t>
+      </w:r>
+      <w:bookmarkEnd w:id="18"/>
     </w:p>
     <w:p>
       <w:pPr>
@@ -3857,10 +3769,18 @@
     <w:p>
       <w:pPr>
         <w:pStyle w:val="Ttulo2"/>
-      </w:pPr>
-      <w:r>
+        <w:rPr>
+          <w:rFonts w:ascii="Arial" w:hAnsi="Arial" w:cs="Arial"/>
+        </w:rPr>
+      </w:pPr>
+      <w:bookmarkStart w:id="19" w:name="_Toc231292235"/>
+      <w:r>
+        <w:rPr>
+          <w:rFonts w:ascii="Arial" w:hAnsi="Arial" w:cs="Arial"/>
+        </w:rPr>
         <w:t>Transformer Encoders</w:t>
       </w:r>
+      <w:bookmarkEnd w:id="19"/>
     </w:p>
     <w:p>
       <w:pPr>
@@ -3876,14 +3796,14 @@
           <w:rFonts w:ascii="Arial" w:hAnsi="Arial" w:cs="Arial"/>
         </w:rPr>
       </w:pPr>
-      <w:bookmarkStart w:id="17" w:name="_Toc231138633"/>
+      <w:bookmarkStart w:id="20" w:name="_Toc231292236"/>
       <w:r>
         <w:rPr>
           <w:rFonts w:ascii="Arial" w:hAnsi="Arial" w:cs="Arial"/>
         </w:rPr>
         <w:t>Classification Models</w:t>
       </w:r>
-      <w:bookmarkEnd w:id="17"/>
+      <w:bookmarkEnd w:id="20"/>
     </w:p>
     <w:p>
       <w:pPr>
@@ -3892,20 +3812,14 @@
           <w:rFonts w:ascii="Arial" w:hAnsi="Arial" w:cs="Arial"/>
         </w:rPr>
       </w:pPr>
-      <w:bookmarkStart w:id="18" w:name="_Toc231138634"/>
-      <w:r>
-        <w:rPr>
-          <w:rFonts w:ascii="Arial" w:hAnsi="Arial" w:cs="Arial"/>
-        </w:rPr>
-        <w:t>Corpus Split</w:t>
-      </w:r>
-      <w:r>
-        <w:rPr>
-          <w:rFonts w:ascii="Arial" w:hAnsi="Arial" w:cs="Arial"/>
-        </w:rPr>
-        <w:t xml:space="preserve"> and Validation Strategy</w:t>
-      </w:r>
-      <w:bookmarkEnd w:id="18"/>
+      <w:bookmarkStart w:id="21" w:name="_Toc231292237"/>
+      <w:r>
+        <w:rPr>
+          <w:rFonts w:ascii="Arial" w:hAnsi="Arial" w:cs="Arial"/>
+        </w:rPr>
+        <w:t>Corpus Split and Validation Strategy</w:t>
+      </w:r>
+      <w:bookmarkEnd w:id="21"/>
     </w:p>
     <w:p>
       <w:pPr>
@@ -4013,10 +3927,258 @@
     </w:p>
     <w:p>
       <w:pPr>
-        <w:rPr>
-          <w:lang w:eastAsia="pt-PT"/>
-        </w:rPr>
-      </w:pPr>
+        <w:pStyle w:val="Ttulo2"/>
+        <w:rPr>
+          <w:rFonts w:ascii="Arial" w:hAnsi="Arial" w:cs="Arial"/>
+        </w:rPr>
+      </w:pPr>
+      <w:r>
+        <w:rPr>
+          <w:rFonts w:ascii="Arial" w:hAnsi="Arial" w:cs="Arial"/>
+        </w:rPr>
+        <w:lastRenderedPageBreak/>
+        <w:t>Traditional ML Models</w:t>
+      </w:r>
+    </w:p>
+    <w:p>
+      <w:pPr>
+        <w:rPr>
+          <w:rFonts w:ascii="Arial" w:hAnsi="Arial" w:cs="Arial"/>
+          <w:lang w:eastAsia="pt-PT"/>
+        </w:rPr>
+      </w:pPr>
+      <w:r>
+        <w:rPr>
+          <w:rFonts w:ascii="Arial" w:hAnsi="Arial" w:cs="Arial"/>
+          <w:lang w:eastAsia="pt-PT"/>
+        </w:rPr>
+        <w:t>To establish a strong baseline for sentiment classification, three traditional machine learning algorithms were evaluated: Logistic Regression, Random Forest, and XGBoost. These models were selected due to their widespread use in text classification tasks and their ability to provide a meaningful comparison against more computationally expensive transformer-based approaches.</w:t>
+      </w:r>
+    </w:p>
+    <w:p>
+      <w:pPr>
+        <w:rPr>
+          <w:rFonts w:ascii="Arial" w:hAnsi="Arial" w:cs="Arial"/>
+          <w:lang w:eastAsia="pt-PT"/>
+        </w:rPr>
+      </w:pPr>
+      <w:r>
+        <w:rPr>
+          <w:rFonts w:ascii="Arial" w:hAnsi="Arial" w:cs="Arial"/>
+          <w:lang w:eastAsia="pt-PT"/>
+        </w:rPr>
+        <w:t>A unified wrapper class, TraditionalMLClassifier, was implemented to manage model creation, hyperparameter optimisation, training, and inference. The wrapper allows different algorithms to be trained through a common interface while maintaining model-specific configurations.</w:t>
+      </w:r>
+    </w:p>
+    <w:p>
+      <w:pPr>
+        <w:pStyle w:val="Ttulo3"/>
+        <w:rPr>
+          <w:lang w:val="pt-PT"/>
+        </w:rPr>
+      </w:pPr>
+      <w:r>
+        <w:rPr>
+          <w:lang w:val="pt-PT"/>
+        </w:rPr>
+        <w:t>Logistic Regression</w:t>
+      </w:r>
+    </w:p>
+    <w:p>
+      <w:pPr>
+        <w:rPr>
+          <w:rFonts w:ascii="Arial" w:hAnsi="Arial" w:cs="Arial"/>
+          <w:lang w:eastAsia="pt-PT"/>
+        </w:rPr>
+      </w:pPr>
+      <w:r>
+        <w:rPr>
+          <w:rFonts w:ascii="Arial" w:hAnsi="Arial" w:cs="Arial"/>
+          <w:lang w:eastAsia="pt-PT"/>
+        </w:rPr>
+        <w:t>Logistic Regression was selected as a linear baseline model due to its effectiveness in high-dimensional text classification problems. The model was configured with a maximum of 1000 training iterations and support for class weighting to compensate for class imbalance within the dataset.</w:t>
+      </w:r>
+    </w:p>
+    <w:p>
+      <w:pPr>
+        <w:rPr>
+          <w:rFonts w:ascii="Arial" w:hAnsi="Arial" w:cs="Arial"/>
+          <w:lang w:eastAsia="pt-PT"/>
+        </w:rPr>
+      </w:pPr>
+      <w:r>
+        <w:rPr>
+          <w:rFonts w:ascii="Arial" w:hAnsi="Arial" w:cs="Arial"/>
+          <w:lang w:eastAsia="pt-PT"/>
+        </w:rPr>
+        <w:t>The hyperparameter search explored different values of the regularisation parameter (C), which controls the trade-off between model complexity and generalisation performance.</w:t>
+      </w:r>
+    </w:p>
+    <w:p>
+      <w:pPr>
+        <w:pStyle w:val="Ttulo3"/>
+        <w:rPr>
+          <w:lang w:val="pt-PT"/>
+        </w:rPr>
+      </w:pPr>
+      <w:r>
+        <w:rPr>
+          <w:lang w:val="pt-PT"/>
+        </w:rPr>
+        <w:t>Random Forest</w:t>
+      </w:r>
+    </w:p>
+    <w:p>
+      <w:pPr>
+        <w:rPr>
+          <w:rFonts w:ascii="Arial" w:hAnsi="Arial" w:cs="Arial"/>
+          <w:lang w:eastAsia="pt-PT"/>
+        </w:rPr>
+      </w:pPr>
+      <w:r>
+        <w:rPr>
+          <w:rFonts w:ascii="Arial" w:hAnsi="Arial" w:cs="Arial"/>
+          <w:lang w:eastAsia="pt-PT"/>
+        </w:rPr>
+        <w:t>Random Forest is an ensemble learning algorithm that combines the predictions of multiple decision trees. By aggregating the outputs of many trees, the model reduces variance and often achieves higher predictive performance than a single decision tree.</w:t>
+      </w:r>
+    </w:p>
+    <w:p>
+      <w:pPr>
+        <w:rPr>
+          <w:rFonts w:ascii="Arial" w:hAnsi="Arial" w:cs="Arial"/>
+          <w:lang w:eastAsia="pt-PT"/>
+        </w:rPr>
+      </w:pPr>
+      <w:r>
+        <w:rPr>
+          <w:rFonts w:ascii="Arial" w:hAnsi="Arial" w:cs="Arial"/>
+          <w:lang w:eastAsia="pt-PT"/>
+        </w:rPr>
+        <w:t>Several hyperparameters were tuned, including the number of trees, maximum tree depth, minimum number of samples required to split a node, and minimum number of samples required at leaf nodes. The balanced_subsample weighting strategy was used to mitigate the effects of class imbalance during training.</w:t>
+      </w:r>
+    </w:p>
+    <w:p>
+      <w:pPr>
+        <w:numPr>
+          <w:ilvl w:val="0"/>
+          <w:numId w:val="1"/>
+        </w:numPr>
+        <w:rPr>
+          <w:rFonts w:ascii="Arial" w:hAnsi="Arial" w:cs="Arial"/>
+          <w:b/>
+          <w:bCs/>
+          <w:lang w:val="pt-PT" w:eastAsia="pt-PT"/>
+        </w:rPr>
+      </w:pPr>
+      <w:r>
+        <w:rPr>
+          <w:rFonts w:ascii="Arial" w:hAnsi="Arial" w:cs="Arial"/>
+          <w:b/>
+          <w:bCs/>
+          <w:lang w:val="pt-PT" w:eastAsia="pt-PT"/>
+        </w:rPr>
+        <w:t>XGBoost</w:t>
+      </w:r>
+    </w:p>
+    <w:p>
+      <w:pPr>
+        <w:rPr>
+          <w:rFonts w:ascii="Arial" w:hAnsi="Arial" w:cs="Arial"/>
+          <w:lang w:eastAsia="pt-PT"/>
+        </w:rPr>
+      </w:pPr>
+      <w:r>
+        <w:rPr>
+          <w:rFonts w:ascii="Arial" w:hAnsi="Arial" w:cs="Arial"/>
+          <w:lang w:eastAsia="pt-PT"/>
+        </w:rPr>
+        <w:t>XGBoost is a gradient boosting framework that constructs an ensemble of decision trees sequentially, with each new tree attempting to correct the errors made by previous trees. Due to its strong performance in structured data problems and its ability to model complex decision boundaries, XGBoost was included as an additional traditional machine learning baseline.</w:t>
+      </w:r>
+    </w:p>
+    <w:p>
+      <w:pPr>
+        <w:rPr>
+          <w:rFonts w:ascii="Arial" w:hAnsi="Arial" w:cs="Arial"/>
+          <w:lang w:eastAsia="pt-PT"/>
+        </w:rPr>
+      </w:pPr>
+      <w:r>
+        <w:rPr>
+          <w:rFonts w:ascii="Arial" w:hAnsi="Arial" w:cs="Arial"/>
+          <w:lang w:eastAsia="pt-PT"/>
+        </w:rPr>
+        <w:t>The tuning process considered different values for the number of estimators, tree depth, and learning rate. Parameters such as subsampling and column sampling ratios were fixed to commonly recommended values in order to reduce the search space while maintaining robust performance.</w:t>
+      </w:r>
+    </w:p>
+    <w:p>
+      <w:pPr>
+        <w:numPr>
+          <w:ilvl w:val="0"/>
+          <w:numId w:val="1"/>
+        </w:numPr>
+        <w:rPr>
+          <w:rFonts w:ascii="Arial" w:hAnsi="Arial" w:cs="Arial"/>
+          <w:b/>
+          <w:bCs/>
+          <w:lang w:val="pt-PT" w:eastAsia="pt-PT"/>
+        </w:rPr>
+      </w:pPr>
+      <w:r>
+        <w:rPr>
+          <w:rFonts w:ascii="Arial" w:hAnsi="Arial" w:cs="Arial"/>
+          <w:b/>
+          <w:bCs/>
+          <w:lang w:val="pt-PT" w:eastAsia="pt-PT"/>
+        </w:rPr>
+        <w:t>Hyperparameter Optimisation</w:t>
+      </w:r>
+    </w:p>
+    <w:p>
+      <w:pPr>
+        <w:rPr>
+          <w:rFonts w:ascii="Arial" w:hAnsi="Arial" w:cs="Arial"/>
+          <w:lang w:eastAsia="pt-PT"/>
+        </w:rPr>
+      </w:pPr>
+      <w:r>
+        <w:rPr>
+          <w:rFonts w:ascii="Arial" w:hAnsi="Arial" w:cs="Arial"/>
+          <w:lang w:eastAsia="pt-PT"/>
+        </w:rPr>
+        <w:t>To ensure fair model comparison and prevent data leakage, hyperparameter tuning was performed before the final evaluation stage. Each model was optimised using Grid Search combined with stratified cross-validation. The optimisation objective was the macro-averaged F1 score, which was selected because it assigns equal importance to all sentiment classes regardless of their frequency.</w:t>
+      </w:r>
+    </w:p>
+    <w:p>
+      <w:pPr>
+        <w:rPr>
+          <w:rFonts w:ascii="Arial" w:hAnsi="Arial" w:cs="Arial"/>
+          <w:lang w:eastAsia="pt-PT"/>
+        </w:rPr>
+      </w:pPr>
+      <w:r>
+        <w:rPr>
+          <w:rFonts w:ascii="Arial" w:hAnsi="Arial" w:cs="Arial"/>
+          <w:lang w:eastAsia="pt-PT"/>
+        </w:rPr>
+        <w:lastRenderedPageBreak/>
+        <w:t>The search spaces were intentionally constrained to reduce computational cost while still allowing meaningful exploration of the most influential hyperparameters.</w:t>
+      </w:r>
+    </w:p>
+    <w:p>
+      <w:pPr>
+        <w:rPr>
+          <w:rFonts w:ascii="Arial" w:hAnsi="Arial" w:cs="Arial"/>
+          <w:lang w:eastAsia="pt-PT"/>
+        </w:rPr>
+      </w:pPr>
+      <w:r>
+        <w:rPr>
+          <w:rFonts w:ascii="Arial" w:hAnsi="Arial" w:cs="Arial"/>
+          <w:lang w:eastAsia="pt-PT"/>
+        </w:rPr>
+        <w:t>After identifying the best hyperparameter configuration, the corresponding model was retained and used for subsequent evaluation. The selected configuration was stored together with the preprocessing and feature extraction pipeline to ensure reproducibility and consistency during later testing stages.</w:t>
+      </w:r>
     </w:p>
     <w:p>
       <w:pPr>
@@ -4040,182 +4202,173 @@
           <w:rFonts w:ascii="Arial" w:hAnsi="Arial" w:cs="Arial"/>
         </w:rPr>
       </w:pPr>
-      <w:bookmarkStart w:id="19" w:name="_Toc410990277"/>
-      <w:bookmarkStart w:id="20" w:name="_Toc410990289"/>
-      <w:bookmarkStart w:id="21" w:name="_Toc412186402"/>
-      <w:bookmarkStart w:id="22" w:name="_Toc412186507"/>
-      <w:bookmarkStart w:id="23" w:name="_Toc412186532"/>
-      <w:bookmarkStart w:id="24" w:name="_Toc412186603"/>
-      <w:bookmarkStart w:id="25" w:name="_Toc412186633"/>
-      <w:bookmarkStart w:id="26" w:name="_Toc115296810"/>
-      <w:bookmarkStart w:id="27" w:name="_Toc141959339"/>
-      <w:bookmarkStart w:id="28" w:name="_Toc231138635"/>
-      <w:proofErr w:type="gramStart"/>
-      <w:r>
-        <w:rPr>
-          <w:rFonts w:ascii="Arial" w:hAnsi="Arial" w:cs="Arial"/>
-        </w:rPr>
-        <w:lastRenderedPageBreak/>
-        <w:t>Evaluation</w:t>
-      </w:r>
-      <w:proofErr w:type="gramEnd"/>
-      <w:r>
-        <w:rPr>
-          <w:rFonts w:ascii="Arial" w:hAnsi="Arial" w:cs="Arial"/>
-        </w:rPr>
-        <w:t xml:space="preserve"> And Results</w:t>
-      </w:r>
-      <w:bookmarkEnd w:id="28"/>
-    </w:p>
-    <w:p>
-      <w:pPr>
-        <w:rPr>
-          <w:lang w:eastAsia="pt-PT"/>
-        </w:rPr>
-      </w:pPr>
-    </w:p>
-    <w:p>
-      <w:pPr>
-        <w:rPr>
-          <w:lang w:eastAsia="pt-PT"/>
-        </w:rPr>
-      </w:pPr>
-    </w:p>
-    <w:p>
-      <w:pPr>
-        <w:rPr>
-          <w:lang w:eastAsia="pt-PT"/>
-        </w:rPr>
-      </w:pPr>
-    </w:p>
-    <w:p>
-      <w:pPr>
-        <w:rPr>
-          <w:lang w:eastAsia="pt-PT"/>
-        </w:rPr>
-      </w:pPr>
-    </w:p>
-    <w:p>
-      <w:pPr>
-        <w:rPr>
-          <w:lang w:eastAsia="pt-PT"/>
-        </w:rPr>
-      </w:pPr>
-    </w:p>
-    <w:p>
-      <w:pPr>
-        <w:rPr>
-          <w:lang w:eastAsia="pt-PT"/>
-        </w:rPr>
-      </w:pPr>
-    </w:p>
-    <w:p>
-      <w:pPr>
-        <w:rPr>
-          <w:lang w:eastAsia="pt-PT"/>
-        </w:rPr>
-      </w:pPr>
-    </w:p>
-    <w:p>
-      <w:pPr>
-        <w:rPr>
-          <w:lang w:eastAsia="pt-PT"/>
-        </w:rPr>
-      </w:pPr>
-    </w:p>
-    <w:p>
-      <w:pPr>
-        <w:rPr>
-          <w:lang w:eastAsia="pt-PT"/>
-        </w:rPr>
-      </w:pPr>
-    </w:p>
-    <w:p>
-      <w:pPr>
-        <w:rPr>
-          <w:lang w:eastAsia="pt-PT"/>
-        </w:rPr>
-      </w:pPr>
-    </w:p>
-    <w:p>
-      <w:pPr>
-        <w:rPr>
-          <w:lang w:eastAsia="pt-PT"/>
-        </w:rPr>
-      </w:pPr>
-    </w:p>
-    <w:p>
-      <w:pPr>
-        <w:rPr>
-          <w:lang w:eastAsia="pt-PT"/>
-        </w:rPr>
-      </w:pPr>
-    </w:p>
-    <w:p>
-      <w:pPr>
-        <w:rPr>
-          <w:lang w:eastAsia="pt-PT"/>
-        </w:rPr>
-      </w:pPr>
-    </w:p>
-    <w:p>
-      <w:pPr>
-        <w:rPr>
-          <w:lang w:eastAsia="pt-PT"/>
-        </w:rPr>
-      </w:pPr>
-    </w:p>
-    <w:p>
-      <w:pPr>
-        <w:rPr>
-          <w:lang w:eastAsia="pt-PT"/>
-        </w:rPr>
-      </w:pPr>
-    </w:p>
-    <w:p>
-      <w:pPr>
-        <w:rPr>
-          <w:lang w:eastAsia="pt-PT"/>
-        </w:rPr>
-      </w:pPr>
-    </w:p>
-    <w:p>
-      <w:pPr>
-        <w:rPr>
-          <w:lang w:eastAsia="pt-PT"/>
-        </w:rPr>
-      </w:pPr>
-    </w:p>
-    <w:p>
-      <w:pPr>
-        <w:rPr>
-          <w:lang w:eastAsia="pt-PT"/>
-        </w:rPr>
-      </w:pPr>
-    </w:p>
-    <w:p>
-      <w:pPr>
-        <w:rPr>
-          <w:lang w:eastAsia="pt-PT"/>
-        </w:rPr>
-      </w:pPr>
-    </w:p>
-    <w:p>
-      <w:pPr>
-        <w:rPr>
-          <w:lang w:eastAsia="pt-PT"/>
-        </w:rPr>
-      </w:pPr>
-    </w:p>
-    <w:bookmarkEnd w:id="19"/>
-    <w:bookmarkEnd w:id="20"/>
-    <w:bookmarkEnd w:id="21"/>
+      <w:bookmarkStart w:id="22" w:name="_Toc410990277"/>
+      <w:bookmarkStart w:id="23" w:name="_Toc410990289"/>
+      <w:bookmarkStart w:id="24" w:name="_Toc412186402"/>
+      <w:bookmarkStart w:id="25" w:name="_Toc412186507"/>
+      <w:bookmarkStart w:id="26" w:name="_Toc412186532"/>
+      <w:bookmarkStart w:id="27" w:name="_Toc412186603"/>
+      <w:bookmarkStart w:id="28" w:name="_Toc412186633"/>
+      <w:bookmarkStart w:id="29" w:name="_Toc115296810"/>
+      <w:bookmarkStart w:id="30" w:name="_Toc141959339"/>
+      <w:bookmarkStart w:id="31" w:name="_Toc231292238"/>
+      <w:r>
+        <w:rPr>
+          <w:rFonts w:ascii="Arial" w:hAnsi="Arial" w:cs="Arial"/>
+        </w:rPr>
+        <w:t>Evaluation And Results</w:t>
+      </w:r>
+      <w:bookmarkEnd w:id="31"/>
+    </w:p>
+    <w:p>
+      <w:pPr>
+        <w:rPr>
+          <w:lang w:eastAsia="pt-PT"/>
+        </w:rPr>
+      </w:pPr>
+    </w:p>
+    <w:p>
+      <w:pPr>
+        <w:rPr>
+          <w:lang w:eastAsia="pt-PT"/>
+        </w:rPr>
+      </w:pPr>
+    </w:p>
+    <w:p>
+      <w:pPr>
+        <w:rPr>
+          <w:lang w:eastAsia="pt-PT"/>
+        </w:rPr>
+      </w:pPr>
+    </w:p>
+    <w:p>
+      <w:pPr>
+        <w:rPr>
+          <w:lang w:eastAsia="pt-PT"/>
+        </w:rPr>
+      </w:pPr>
+    </w:p>
+    <w:p>
+      <w:pPr>
+        <w:rPr>
+          <w:lang w:eastAsia="pt-PT"/>
+        </w:rPr>
+      </w:pPr>
+    </w:p>
+    <w:p>
+      <w:pPr>
+        <w:rPr>
+          <w:lang w:eastAsia="pt-PT"/>
+        </w:rPr>
+      </w:pPr>
+    </w:p>
+    <w:p>
+      <w:pPr>
+        <w:rPr>
+          <w:lang w:eastAsia="pt-PT"/>
+        </w:rPr>
+      </w:pPr>
+    </w:p>
+    <w:p>
+      <w:pPr>
+        <w:rPr>
+          <w:lang w:eastAsia="pt-PT"/>
+        </w:rPr>
+      </w:pPr>
+    </w:p>
+    <w:p>
+      <w:pPr>
+        <w:rPr>
+          <w:lang w:eastAsia="pt-PT"/>
+        </w:rPr>
+      </w:pPr>
+    </w:p>
+    <w:p>
+      <w:pPr>
+        <w:rPr>
+          <w:lang w:eastAsia="pt-PT"/>
+        </w:rPr>
+      </w:pPr>
+    </w:p>
+    <w:p>
+      <w:pPr>
+        <w:rPr>
+          <w:lang w:eastAsia="pt-PT"/>
+        </w:rPr>
+      </w:pPr>
+    </w:p>
+    <w:p>
+      <w:pPr>
+        <w:rPr>
+          <w:lang w:eastAsia="pt-PT"/>
+        </w:rPr>
+      </w:pPr>
+    </w:p>
+    <w:p>
+      <w:pPr>
+        <w:rPr>
+          <w:lang w:eastAsia="pt-PT"/>
+        </w:rPr>
+      </w:pPr>
+    </w:p>
+    <w:p>
+      <w:pPr>
+        <w:rPr>
+          <w:lang w:eastAsia="pt-PT"/>
+        </w:rPr>
+      </w:pPr>
+    </w:p>
+    <w:p>
+      <w:pPr>
+        <w:rPr>
+          <w:lang w:eastAsia="pt-PT"/>
+        </w:rPr>
+      </w:pPr>
+    </w:p>
+    <w:p>
+      <w:pPr>
+        <w:rPr>
+          <w:lang w:eastAsia="pt-PT"/>
+        </w:rPr>
+      </w:pPr>
+    </w:p>
+    <w:p>
+      <w:pPr>
+        <w:rPr>
+          <w:lang w:eastAsia="pt-PT"/>
+        </w:rPr>
+      </w:pPr>
+    </w:p>
+    <w:p>
+      <w:pPr>
+        <w:rPr>
+          <w:lang w:eastAsia="pt-PT"/>
+        </w:rPr>
+      </w:pPr>
+    </w:p>
+    <w:p>
+      <w:pPr>
+        <w:rPr>
+          <w:lang w:eastAsia="pt-PT"/>
+        </w:rPr>
+      </w:pPr>
+    </w:p>
+    <w:p>
+      <w:pPr>
+        <w:rPr>
+          <w:lang w:eastAsia="pt-PT"/>
+        </w:rPr>
+      </w:pPr>
+    </w:p>
     <w:bookmarkEnd w:id="22"/>
     <w:bookmarkEnd w:id="23"/>
     <w:bookmarkEnd w:id="24"/>
     <w:bookmarkEnd w:id="25"/>
     <w:bookmarkEnd w:id="26"/>
     <w:bookmarkEnd w:id="27"/>
+    <w:bookmarkEnd w:id="28"/>
+    <w:bookmarkEnd w:id="29"/>
+    <w:bookmarkEnd w:id="30"/>
     <w:p>
       <w:pPr>
         <w:spacing w:after="0" w:line="240" w:lineRule="auto"/>
@@ -4232,34 +4385,32 @@
           <w:rFonts w:ascii="Arial" w:hAnsi="Arial" w:cs="Arial"/>
         </w:rPr>
       </w:pPr>
-      <w:bookmarkStart w:id="29" w:name="_Toc410990278"/>
-      <w:bookmarkStart w:id="30" w:name="_Toc410990290"/>
-      <w:bookmarkStart w:id="31" w:name="_Toc412186403"/>
-      <w:bookmarkStart w:id="32" w:name="_Toc412186508"/>
-      <w:bookmarkStart w:id="33" w:name="_Toc412186533"/>
-      <w:bookmarkStart w:id="34" w:name="_Toc412186604"/>
-      <w:bookmarkStart w:id="35" w:name="_Toc412186634"/>
-      <w:bookmarkStart w:id="36" w:name="_Toc115296811"/>
-      <w:bookmarkStart w:id="37" w:name="_Toc141959340"/>
-      <w:bookmarkStart w:id="38" w:name="_Toc231138636"/>
-      <w:r>
-        <w:rPr>
-          <w:rFonts w:ascii="Arial" w:hAnsi="Arial" w:cs="Arial"/>
-        </w:rPr>
+      <w:bookmarkStart w:id="32" w:name="_Toc410990278"/>
+      <w:bookmarkStart w:id="33" w:name="_Toc410990290"/>
+      <w:bookmarkStart w:id="34" w:name="_Toc412186403"/>
+      <w:bookmarkStart w:id="35" w:name="_Toc412186508"/>
+      <w:bookmarkStart w:id="36" w:name="_Toc412186533"/>
+      <w:bookmarkStart w:id="37" w:name="_Toc412186604"/>
+      <w:bookmarkStart w:id="38" w:name="_Toc412186634"/>
+      <w:bookmarkStart w:id="39" w:name="_Toc115296811"/>
+      <w:bookmarkStart w:id="40" w:name="_Toc141959340"/>
+      <w:bookmarkStart w:id="41" w:name="_Toc231292239"/>
+      <w:r>
+        <w:rPr>
+          <w:rFonts w:ascii="Arial" w:hAnsi="Arial" w:cs="Arial"/>
+        </w:rPr>
+        <w:lastRenderedPageBreak/>
         <w:t>Appendix</w:t>
       </w:r>
-      <w:bookmarkStart w:id="39" w:name="_Toc410990279"/>
-      <w:bookmarkStart w:id="40" w:name="_Toc410990291"/>
-      <w:bookmarkStart w:id="41" w:name="_Toc412186404"/>
-      <w:bookmarkStart w:id="42" w:name="_Toc412186509"/>
-      <w:bookmarkStart w:id="43" w:name="_Toc412186534"/>
-      <w:bookmarkStart w:id="44" w:name="_Toc412186605"/>
-      <w:bookmarkStart w:id="45" w:name="_Toc412186635"/>
-      <w:bookmarkStart w:id="46" w:name="_Toc115296812"/>
-      <w:bookmarkStart w:id="47" w:name="_Toc141959341"/>
-      <w:bookmarkEnd w:id="29"/>
-      <w:bookmarkEnd w:id="30"/>
-      <w:bookmarkEnd w:id="31"/>
+      <w:bookmarkStart w:id="42" w:name="_Toc410990279"/>
+      <w:bookmarkStart w:id="43" w:name="_Toc410990291"/>
+      <w:bookmarkStart w:id="44" w:name="_Toc412186404"/>
+      <w:bookmarkStart w:id="45" w:name="_Toc412186509"/>
+      <w:bookmarkStart w:id="46" w:name="_Toc412186534"/>
+      <w:bookmarkStart w:id="47" w:name="_Toc412186605"/>
+      <w:bookmarkStart w:id="48" w:name="_Toc412186635"/>
+      <w:bookmarkStart w:id="49" w:name="_Toc115296812"/>
+      <w:bookmarkStart w:id="50" w:name="_Toc141959341"/>
       <w:bookmarkEnd w:id="32"/>
       <w:bookmarkEnd w:id="33"/>
       <w:bookmarkEnd w:id="34"/>
@@ -4267,21 +4418,24 @@
       <w:bookmarkEnd w:id="36"/>
       <w:bookmarkEnd w:id="37"/>
       <w:bookmarkEnd w:id="38"/>
-    </w:p>
-    <w:p>
-      <w:pPr>
-        <w:rPr>
-          <w:lang w:eastAsia="pt-PT"/>
-        </w:rPr>
-      </w:pPr>
-    </w:p>
-    <w:p>
-      <w:pPr>
-        <w:rPr>
-          <w:lang w:eastAsia="pt-PT"/>
-        </w:rPr>
-      </w:pPr>
-      <w:bookmarkStart w:id="48" w:name="Figure1"/>
+      <w:bookmarkEnd w:id="39"/>
+      <w:bookmarkEnd w:id="40"/>
+      <w:bookmarkEnd w:id="41"/>
+    </w:p>
+    <w:p>
+      <w:pPr>
+        <w:rPr>
+          <w:lang w:eastAsia="pt-PT"/>
+        </w:rPr>
+      </w:pPr>
+    </w:p>
+    <w:p>
+      <w:pPr>
+        <w:rPr>
+          <w:lang w:eastAsia="pt-PT"/>
+        </w:rPr>
+      </w:pPr>
+      <w:bookmarkStart w:id="51" w:name="Figure1"/>
       <w:r>
         <w:rPr>
           <w:noProof/>
@@ -4337,7 +4491,7 @@
           </wp:anchor>
         </w:drawing>
       </w:r>
-      <w:bookmarkEnd w:id="48"/>
+      <w:bookmarkEnd w:id="51"/>
     </w:p>
     <w:p>
       <w:pPr>
@@ -4464,7 +4618,7 @@
           <w:lang w:eastAsia="pt-PT"/>
         </w:rPr>
       </w:pPr>
-      <w:bookmarkStart w:id="49" w:name="Figure2"/>
+      <w:bookmarkStart w:id="52" w:name="Figure2"/>
       <w:r>
         <w:rPr>
           <w:rFonts w:ascii="Arial" w:hAnsi="Arial" w:cs="Arial"/>
@@ -4525,7 +4679,7 @@
           </wp:anchor>
         </w:drawing>
       </w:r>
-      <w:bookmarkEnd w:id="49"/>
+      <w:bookmarkEnd w:id="52"/>
     </w:p>
     <w:p>
       <w:pPr>
@@ -4617,7 +4771,7 @@
           <w:lang w:eastAsia="pt-PT"/>
         </w:rPr>
       </w:pPr>
-      <w:bookmarkStart w:id="50" w:name="Figure3"/>
+      <w:bookmarkStart w:id="53" w:name="Figure3"/>
       <w:r>
         <w:rPr>
           <w:rFonts w:ascii="Arial" w:hAnsi="Arial" w:cs="Arial"/>
@@ -4678,7 +4832,7 @@
           </wp:anchor>
         </w:drawing>
       </w:r>
-      <w:bookmarkEnd w:id="50"/>
+      <w:bookmarkEnd w:id="53"/>
       <w:r>
         <w:rPr>
           <w:rFonts w:ascii="Arial" w:hAnsi="Arial" w:cs="Arial"/>
@@ -4788,7 +4942,7 @@
           <w:lang w:eastAsia="pt-PT"/>
         </w:rPr>
       </w:pPr>
-      <w:bookmarkStart w:id="51" w:name="Figure4"/>
+      <w:bookmarkStart w:id="54" w:name="Figure4"/>
       <w:r>
         <w:rPr>
           <w:rFonts w:ascii="Arial" w:hAnsi="Arial" w:cs="Arial"/>
@@ -4800,7 +4954,7 @@
           <w:lang w:eastAsia="pt-PT"/>
         </w:rPr>
         <w:drawing>
-          <wp:anchor distT="0" distB="0" distL="114300" distR="114300" simplePos="0" relativeHeight="251660288" behindDoc="1" locked="0" layoutInCell="1" allowOverlap="1" wp14:anchorId="6BE2B909" wp14:editId="09D6A0D9">
+          <wp:anchor distT="0" distB="0" distL="114300" distR="114300" simplePos="0" relativeHeight="251660288" behindDoc="1" locked="0" layoutInCell="1" allowOverlap="1" wp14:anchorId="6BE2B909" wp14:editId="36F89BFD">
             <wp:simplePos x="0" y="0"/>
             <wp:positionH relativeFrom="margin">
               <wp:align>center</wp:align>
@@ -4855,7 +5009,7 @@
           </wp:anchor>
         </w:drawing>
       </w:r>
-      <w:bookmarkEnd w:id="51"/>
+      <w:bookmarkEnd w:id="54"/>
       <w:r>
         <w:rPr>
           <w:rFonts w:ascii="Arial" w:hAnsi="Arial" w:cs="Arial"/>
@@ -5004,7 +5158,7 @@
           <w:lang w:eastAsia="pt-PT"/>
         </w:rPr>
       </w:pPr>
-      <w:bookmarkStart w:id="52" w:name="Figure5"/>
+      <w:bookmarkStart w:id="55" w:name="Figure5"/>
       <w:r>
         <w:rPr>
           <w:rFonts w:ascii="Arial" w:hAnsi="Arial" w:cs="Arial"/>
@@ -5052,7 +5206,7 @@
           </wp:inline>
         </w:drawing>
       </w:r>
-      <w:bookmarkEnd w:id="52"/>
+      <w:bookmarkEnd w:id="55"/>
     </w:p>
     <w:p>
       <w:pPr>
@@ -5090,7 +5244,7 @@
           <w:lang w:eastAsia="pt-PT"/>
         </w:rPr>
       </w:pPr>
-      <w:bookmarkStart w:id="53" w:name="Figure6"/>
+      <w:bookmarkStart w:id="56" w:name="Figure6"/>
       <w:r>
         <w:rPr>
           <w:rFonts w:ascii="Arial" w:hAnsi="Arial" w:cs="Arial"/>
@@ -5151,7 +5305,7 @@
           </wp:anchor>
         </w:drawing>
       </w:r>
-      <w:bookmarkEnd w:id="53"/>
+      <w:bookmarkEnd w:id="56"/>
     </w:p>
     <w:p>
       <w:pPr>
@@ -5278,10 +5432,12 @@
           <w:szCs w:val="20"/>
           <w:lang w:eastAsia="pt-PT"/>
         </w:rPr>
-        <w:t xml:space="preserve">Figure 6: Class statistics regarding average number of characters, words and presence of URL and </w:t>
-      </w:r>
-      <w:proofErr w:type="spellStart"/>
-      <w:r>
+        <w:t>Figure 6: Class statistics regarding average number of characters, words and presence of URL and cashtag</w:t>
+      </w:r>
+    </w:p>
+    <w:p>
+      <w:pPr>
+        <w:jc w:val="center"/>
         <w:rPr>
           <w:rFonts w:ascii="Arial" w:hAnsi="Arial" w:cs="Arial"/>
           <w:i/>
@@ -5290,21 +5446,6 @@
           <w:szCs w:val="20"/>
           <w:lang w:eastAsia="pt-PT"/>
         </w:rPr>
-        <w:t>cashtag</w:t>
-      </w:r>
-      <w:proofErr w:type="spellEnd"/>
-    </w:p>
-    <w:p>
-      <w:pPr>
-        <w:jc w:val="center"/>
-        <w:rPr>
-          <w:rFonts w:ascii="Arial" w:hAnsi="Arial" w:cs="Arial"/>
-          <w:i/>
-          <w:iCs/>
-          <w:sz w:val="20"/>
-          <w:szCs w:val="20"/>
-          <w:lang w:eastAsia="pt-PT"/>
-        </w:rPr>
       </w:pPr>
     </w:p>
     <w:p>
@@ -5314,25 +5455,25 @@
           <w:rFonts w:ascii="Arial" w:hAnsi="Arial" w:cs="Arial"/>
         </w:rPr>
       </w:pPr>
-      <w:bookmarkStart w:id="54" w:name="_Annexes"/>
-      <w:bookmarkStart w:id="55" w:name="_Toc231138637"/>
-      <w:bookmarkEnd w:id="54"/>
+      <w:bookmarkStart w:id="57" w:name="_Annexes"/>
+      <w:bookmarkStart w:id="58" w:name="_Toc231292240"/>
+      <w:bookmarkEnd w:id="57"/>
       <w:r>
         <w:rPr>
           <w:rFonts w:ascii="Arial" w:hAnsi="Arial" w:cs="Arial"/>
         </w:rPr>
         <w:t>Annexes</w:t>
       </w:r>
-      <w:bookmarkEnd w:id="39"/>
-      <w:bookmarkEnd w:id="40"/>
-      <w:bookmarkEnd w:id="41"/>
       <w:bookmarkEnd w:id="42"/>
       <w:bookmarkEnd w:id="43"/>
       <w:bookmarkEnd w:id="44"/>
       <w:bookmarkEnd w:id="45"/>
       <w:bookmarkEnd w:id="46"/>
       <w:bookmarkEnd w:id="47"/>
-      <w:bookmarkEnd w:id="55"/>
+      <w:bookmarkEnd w:id="48"/>
+      <w:bookmarkEnd w:id="49"/>
+      <w:bookmarkEnd w:id="50"/>
+      <w:bookmarkEnd w:id="58"/>
       <w:r>
         <w:rPr>
           <w:rFonts w:ascii="Arial" w:hAnsi="Arial" w:cs="Arial"/>
@@ -7369,6 +7510,9 @@
         <w:ilvl w:val="3"/>
         <w:numId w:val="1"/>
       </w:numPr>
+      <w:tabs>
+        <w:tab w:val="num" w:pos="360"/>
+      </w:tabs>
       <w:spacing w:before="200" w:after="120"/>
       <w:ind w:left="851" w:hanging="851"/>
       <w:outlineLvl w:val="3"/>
@@ -8375,12 +8519,9 @@
 </file>
 
 <file path=customXml/item2.xml><?xml version="1.0" encoding="utf-8"?>
-<?mso-contentType ?>
-<FormTemplates xmlns="http://schemas.microsoft.com/sharepoint/v3/contenttype/forms">
-  <Display>DocumentLibraryForm</Display>
-  <Edit>DocumentLibraryForm</Edit>
-  <New>DocumentLibraryForm</New>
-</FormTemplates>
+<p:properties xmlns:p="http://schemas.microsoft.com/office/2006/metadata/properties" xmlns:xsi="http://www.w3.org/2001/XMLSchema-instance" xmlns:pc="http://schemas.microsoft.com/office/infopath/2007/PartnerControls">
+  <documentManagement/>
+</p:properties>
 </file>
 
 <file path=customXml/item3.xml><?xml version="1.0" encoding="utf-8"?>
@@ -8528,9 +8669,12 @@
 </file>
 
 <file path=customXml/item4.xml><?xml version="1.0" encoding="utf-8"?>
-<p:properties xmlns:p="http://schemas.microsoft.com/office/2006/metadata/properties" xmlns:xsi="http://www.w3.org/2001/XMLSchema-instance" xmlns:pc="http://schemas.microsoft.com/office/infopath/2007/PartnerControls">
-  <documentManagement/>
-</p:properties>
+<?mso-contentType ?>
+<FormTemplates xmlns="http://schemas.microsoft.com/sharepoint/v3/contenttype/forms">
+  <Display>DocumentLibraryForm</Display>
+  <Edit>DocumentLibraryForm</Edit>
+  <New>DocumentLibraryForm</New>
+</FormTemplates>
 </file>
 
 <file path=customXml/itemProps1.xml><?xml version="1.0" encoding="utf-8"?>
@@ -8542,9 +8686,10 @@
 </file>
 
 <file path=customXml/itemProps2.xml><?xml version="1.0" encoding="utf-8"?>
-<ds:datastoreItem xmlns:ds="http://schemas.openxmlformats.org/officeDocument/2006/customXml" ds:itemID="{59B26DD8-52A3-42CA-81B0-F4B8F09A41AF}">
+<ds:datastoreItem xmlns:ds="http://schemas.openxmlformats.org/officeDocument/2006/customXml" ds:itemID="{FA1E1BA7-7F9D-4F2A-A01A-7DD974292B82}">
   <ds:schemaRefs>
-    <ds:schemaRef ds:uri="http://schemas.microsoft.com/sharepoint/v3/contenttype/forms"/>
+    <ds:schemaRef ds:uri="http://schemas.microsoft.com/office/2006/metadata/properties"/>
+    <ds:schemaRef ds:uri="http://schemas.microsoft.com/office/infopath/2007/PartnerControls"/>
   </ds:schemaRefs>
 </ds:datastoreItem>
 </file>
@@ -8568,10 +8713,9 @@
 </file>
 
 <file path=customXml/itemProps4.xml><?xml version="1.0" encoding="utf-8"?>
-<ds:datastoreItem xmlns:ds="http://schemas.openxmlformats.org/officeDocument/2006/customXml" ds:itemID="{FA1E1BA7-7F9D-4F2A-A01A-7DD974292B82}">
+<ds:datastoreItem xmlns:ds="http://schemas.openxmlformats.org/officeDocument/2006/customXml" ds:itemID="{59B26DD8-52A3-42CA-81B0-F4B8F09A41AF}">
   <ds:schemaRefs>
-    <ds:schemaRef ds:uri="http://schemas.microsoft.com/office/2006/metadata/properties"/>
-    <ds:schemaRef ds:uri="http://schemas.microsoft.com/office/infopath/2007/PartnerControls"/>
+    <ds:schemaRef ds:uri="http://schemas.microsoft.com/sharepoint/v3/contenttype/forms"/>
   </ds:schemaRefs>
 </ds:datastoreItem>
 </file>
</xml_diff>

<commit_message>
*UPDATED* Transformer-based models section of the report with Bert and DistillBert content
</commit_message>
<xml_diff>
--- a/Text_Mining_Report.docx
+++ b/Text_Mining_Report.docx
@@ -18,7 +18,7 @@
           <w:noProof/>
         </w:rPr>
         <w:drawing>
-          <wp:anchor distT="0" distB="0" distL="114300" distR="114300" simplePos="0" relativeHeight="251665408" behindDoc="0" locked="0" layoutInCell="1" allowOverlap="1" wp14:anchorId="1C34D2D7" wp14:editId="7DAEB89F">
+          <wp:anchor distT="0" distB="0" distL="114300" distR="114300" simplePos="0" relativeHeight="251665408" behindDoc="0" locked="0" layoutInCell="1" allowOverlap="1" wp14:anchorId="1C34D2D7" wp14:editId="25EAFF20">
             <wp:simplePos x="0" y="0"/>
             <wp:positionH relativeFrom="page">
               <wp:align>left</wp:align>
@@ -90,7 +90,7 @@
     </w:p>
     <w:p>
       <w:pPr>
-        <w:pStyle w:val="Title"/>
+        <w:pStyle w:val="Ttulo"/>
         <w:jc w:val="center"/>
         <w:rPr>
           <w:rFonts w:asciiTheme="minorHAnsi" w:hAnsiTheme="minorHAnsi" w:cstheme="minorBidi"/>
@@ -126,7 +126,6 @@
           <w:color w:val="5C666C"/>
           <w:sz w:val="24"/>
           <w:szCs w:val="24"/>
-          <w:lang w:val="pt-PT"/>
         </w:rPr>
         <w:t xml:space="preserve">Course </w:t>
       </w:r>
@@ -135,7 +134,6 @@
           <w:color w:val="5C666C"/>
           <w:sz w:val="24"/>
           <w:szCs w:val="24"/>
-          <w:lang w:val="pt-PT"/>
         </w:rPr>
         <w:t>[200181]</w:t>
       </w:r>
@@ -144,7 +142,7 @@
     <w:p/>
     <w:p>
       <w:pPr>
-        <w:pStyle w:val="Title"/>
+        <w:pStyle w:val="Ttulo"/>
         <w:jc w:val="center"/>
         <w:rPr>
           <w:rFonts w:asciiTheme="minorHAnsi" w:hAnsiTheme="minorHAnsi" w:cstheme="minorBidi"/>
@@ -313,15 +311,28 @@
         <w:rPr>
           <w:sz w:val="32"/>
           <w:szCs w:val="32"/>
-        </w:rPr>
-      </w:pPr>
+          <w:lang w:val="pt-PT"/>
+        </w:rPr>
+      </w:pPr>
+      <w:proofErr w:type="spellStart"/>
       <w:r>
         <w:rPr>
           <w:b/>
           <w:sz w:val="32"/>
           <w:szCs w:val="32"/>
-        </w:rPr>
-        <w:t>Group 03</w:t>
+          <w:lang w:val="pt-PT"/>
+        </w:rPr>
+        <w:t>Group</w:t>
+      </w:r>
+      <w:proofErr w:type="spellEnd"/>
+      <w:r>
+        <w:rPr>
+          <w:b/>
+          <w:sz w:val="32"/>
+          <w:szCs w:val="32"/>
+          <w:lang w:val="pt-PT"/>
+        </w:rPr>
+        <w:t xml:space="preserve"> 03</w:t>
       </w:r>
     </w:p>
     <w:p>
@@ -329,6 +340,7 @@
         <w:rPr>
           <w:sz w:val="24"/>
           <w:szCs w:val="24"/>
+          <w:lang w:val="pt-PT"/>
         </w:rPr>
       </w:pPr>
     </w:p>
@@ -338,12 +350,14 @@
         <w:rPr>
           <w:sz w:val="28"/>
           <w:szCs w:val="28"/>
+          <w:lang w:val="pt-PT"/>
         </w:rPr>
       </w:pPr>
       <w:r>
         <w:rPr>
           <w:sz w:val="28"/>
           <w:szCs w:val="28"/>
+          <w:lang w:val="pt-PT"/>
         </w:rPr>
         <w:t>João Ramos, 20250413</w:t>
       </w:r>
@@ -440,7 +454,7 @@
     </w:p>
     <w:tbl>
       <w:tblPr>
-        <w:tblStyle w:val="TableGrid"/>
+        <w:tblStyle w:val="TabelacomGrelha"/>
         <w:tblW w:w="0" w:type="auto"/>
         <w:tblLook w:val="04A0" w:firstRow="1" w:lastRow="0" w:firstColumn="1" w:lastColumn="0" w:noHBand="0" w:noVBand="1"/>
       </w:tblPr>
@@ -539,7 +553,7 @@
     </w:p>
     <w:p>
       <w:pPr>
-        <w:pStyle w:val="TOC1"/>
+        <w:pStyle w:val="ndice1"/>
         <w:spacing w:before="240" w:after="0"/>
         <w:jc w:val="center"/>
         <w:rPr>
@@ -596,7 +610,7 @@
       <w:sdtContent>
         <w:p>
           <w:pPr>
-            <w:pStyle w:val="TOC1"/>
+            <w:pStyle w:val="ndice1"/>
             <w:rPr>
               <w:rFonts w:eastAsiaTheme="minorEastAsia" w:cstheme="minorBidi"/>
               <w:kern w:val="2"/>
@@ -618,7 +632,7 @@
           <w:hyperlink w:anchor="_Toc232112785" w:history="1">
             <w:r>
               <w:rPr>
-                <w:rStyle w:val="Hyperlink"/>
+                <w:rStyle w:val="Hiperligao"/>
               </w:rPr>
               <w:t>1.</w:t>
             </w:r>
@@ -635,7 +649,7 @@
             </w:r>
             <w:r>
               <w:rPr>
-                <w:rStyle w:val="Hyperlink"/>
+                <w:rStyle w:val="Hiperligao"/>
               </w:rPr>
               <w:t>Project Overview</w:t>
             </w:r>
@@ -684,7 +698,7 @@
         </w:p>
         <w:p>
           <w:pPr>
-            <w:pStyle w:val="TOC1"/>
+            <w:pStyle w:val="ndice1"/>
             <w:rPr>
               <w:rFonts w:eastAsiaTheme="minorEastAsia" w:cstheme="minorBidi"/>
               <w:kern w:val="2"/>
@@ -697,7 +711,7 @@
           <w:hyperlink w:anchor="_Toc232112786" w:history="1">
             <w:r>
               <w:rPr>
-                <w:rStyle w:val="Hyperlink"/>
+                <w:rStyle w:val="Hiperligao"/>
               </w:rPr>
               <w:t>2.</w:t>
             </w:r>
@@ -714,7 +728,7 @@
             </w:r>
             <w:r>
               <w:rPr>
-                <w:rStyle w:val="Hyperlink"/>
+                <w:rStyle w:val="Hiperligao"/>
               </w:rPr>
               <w:t>Data Analysis</w:t>
             </w:r>
@@ -763,7 +777,7 @@
         </w:p>
         <w:p>
           <w:pPr>
-            <w:pStyle w:val="TOC2"/>
+            <w:pStyle w:val="ndice2"/>
             <w:rPr>
               <w:rFonts w:eastAsiaTheme="minorEastAsia" w:cstheme="minorBidi"/>
               <w:kern w:val="2"/>
@@ -776,7 +790,7 @@
           <w:hyperlink w:anchor="_Toc232112787" w:history="1">
             <w:r>
               <w:rPr>
-                <w:rStyle w:val="Hyperlink"/>
+                <w:rStyle w:val="Hiperligao"/>
               </w:rPr>
               <w:t>2.1.</w:t>
             </w:r>
@@ -793,7 +807,7 @@
             </w:r>
             <w:r>
               <w:rPr>
-                <w:rStyle w:val="Hyperlink"/>
+                <w:rStyle w:val="Hiperligao"/>
               </w:rPr>
               <w:t>Data Description</w:t>
             </w:r>
@@ -842,7 +856,7 @@
         </w:p>
         <w:p>
           <w:pPr>
-            <w:pStyle w:val="TOC2"/>
+            <w:pStyle w:val="ndice2"/>
             <w:rPr>
               <w:rFonts w:eastAsiaTheme="minorEastAsia" w:cstheme="minorBidi"/>
               <w:kern w:val="2"/>
@@ -855,7 +869,7 @@
           <w:hyperlink w:anchor="_Toc232112788" w:history="1">
             <w:r>
               <w:rPr>
-                <w:rStyle w:val="Hyperlink"/>
+                <w:rStyle w:val="Hiperligao"/>
               </w:rPr>
               <w:t>2.2.</w:t>
             </w:r>
@@ -872,7 +886,7 @@
             </w:r>
             <w:r>
               <w:rPr>
-                <w:rStyle w:val="Hyperlink"/>
+                <w:rStyle w:val="Hiperligao"/>
               </w:rPr>
               <w:t>Data Exploration</w:t>
             </w:r>
@@ -921,7 +935,7 @@
         </w:p>
         <w:p>
           <w:pPr>
-            <w:pStyle w:val="TOC3"/>
+            <w:pStyle w:val="ndice3"/>
             <w:rPr>
               <w:rFonts w:eastAsiaTheme="minorEastAsia" w:cstheme="minorBidi"/>
               <w:kern w:val="2"/>
@@ -934,7 +948,7 @@
           <w:hyperlink w:anchor="_Toc232112789" w:history="1">
             <w:r>
               <w:rPr>
-                <w:rStyle w:val="Hyperlink"/>
+                <w:rStyle w:val="Hiperligao"/>
               </w:rPr>
               <w:t>2.2.1.</w:t>
             </w:r>
@@ -951,7 +965,7 @@
             </w:r>
             <w:r>
               <w:rPr>
-                <w:rStyle w:val="Hyperlink"/>
+                <w:rStyle w:val="Hiperligao"/>
               </w:rPr>
               <w:t>Data Visualization</w:t>
             </w:r>
@@ -1000,7 +1014,7 @@
         </w:p>
         <w:p>
           <w:pPr>
-            <w:pStyle w:val="TOC1"/>
+            <w:pStyle w:val="ndice1"/>
             <w:rPr>
               <w:rFonts w:eastAsiaTheme="minorEastAsia" w:cstheme="minorBidi"/>
               <w:kern w:val="2"/>
@@ -1013,7 +1027,7 @@
           <w:hyperlink w:anchor="_Toc232112790" w:history="1">
             <w:r>
               <w:rPr>
-                <w:rStyle w:val="Hyperlink"/>
+                <w:rStyle w:val="Hiperligao"/>
               </w:rPr>
               <w:t>3.</w:t>
             </w:r>
@@ -1030,7 +1044,7 @@
             </w:r>
             <w:r>
               <w:rPr>
-                <w:rStyle w:val="Hyperlink"/>
+                <w:rStyle w:val="Hiperligao"/>
               </w:rPr>
               <w:t>Data Preprocessing</w:t>
             </w:r>
@@ -1079,7 +1093,7 @@
         </w:p>
         <w:p>
           <w:pPr>
-            <w:pStyle w:val="TOC1"/>
+            <w:pStyle w:val="ndice1"/>
             <w:rPr>
               <w:rFonts w:eastAsiaTheme="minorEastAsia" w:cstheme="minorBidi"/>
               <w:kern w:val="2"/>
@@ -1092,7 +1106,7 @@
           <w:hyperlink w:anchor="_Toc232112791" w:history="1">
             <w:r>
               <w:rPr>
-                <w:rStyle w:val="Hyperlink"/>
+                <w:rStyle w:val="Hiperligao"/>
               </w:rPr>
               <w:t>4.</w:t>
             </w:r>
@@ -1109,7 +1123,7 @@
             </w:r>
             <w:r>
               <w:rPr>
-                <w:rStyle w:val="Hyperlink"/>
+                <w:rStyle w:val="Hiperligao"/>
               </w:rPr>
               <w:t>Feature Engineering</w:t>
             </w:r>
@@ -1158,7 +1172,7 @@
         </w:p>
         <w:p>
           <w:pPr>
-            <w:pStyle w:val="TOC2"/>
+            <w:pStyle w:val="ndice2"/>
             <w:rPr>
               <w:rFonts w:eastAsiaTheme="minorEastAsia" w:cstheme="minorBidi"/>
               <w:kern w:val="2"/>
@@ -1171,7 +1185,7 @@
           <w:hyperlink w:anchor="_Toc232112792" w:history="1">
             <w:r>
               <w:rPr>
-                <w:rStyle w:val="Hyperlink"/>
+                <w:rStyle w:val="Hiperligao"/>
               </w:rPr>
               <w:t>4.1.</w:t>
             </w:r>
@@ -1188,7 +1202,7 @@
             </w:r>
             <w:r>
               <w:rPr>
-                <w:rStyle w:val="Hyperlink"/>
+                <w:rStyle w:val="Hiperligao"/>
               </w:rPr>
               <w:t>Bag-of-Words and TF-IDF Representation</w:t>
             </w:r>
@@ -1237,7 +1251,7 @@
         </w:p>
         <w:p>
           <w:pPr>
-            <w:pStyle w:val="TOC2"/>
+            <w:pStyle w:val="ndice2"/>
             <w:rPr>
               <w:rFonts w:eastAsiaTheme="minorEastAsia" w:cstheme="minorBidi"/>
               <w:kern w:val="2"/>
@@ -1250,7 +1264,7 @@
           <w:hyperlink w:anchor="_Toc232112793" w:history="1">
             <w:r>
               <w:rPr>
-                <w:rStyle w:val="Hyperlink"/>
+                <w:rStyle w:val="Hiperligao"/>
                 <w:lang w:val="pt-PT"/>
               </w:rPr>
               <w:t>4.2.</w:t>
@@ -1268,7 +1282,7 @@
             </w:r>
             <w:r>
               <w:rPr>
-                <w:rStyle w:val="Hyperlink"/>
+                <w:rStyle w:val="Hiperligao"/>
                 <w:lang w:val="pt-PT"/>
               </w:rPr>
               <w:t>Word2Vec Embeddings</w:t>
@@ -1318,7 +1332,7 @@
         </w:p>
         <w:p>
           <w:pPr>
-            <w:pStyle w:val="TOC2"/>
+            <w:pStyle w:val="ndice2"/>
             <w:rPr>
               <w:rFonts w:eastAsiaTheme="minorEastAsia" w:cstheme="minorBidi"/>
               <w:kern w:val="2"/>
@@ -1331,7 +1345,7 @@
           <w:hyperlink w:anchor="_Toc232112794" w:history="1">
             <w:r>
               <w:rPr>
-                <w:rStyle w:val="Hyperlink"/>
+                <w:rStyle w:val="Hiperligao"/>
               </w:rPr>
               <w:t>4.3.</w:t>
             </w:r>
@@ -1348,7 +1362,7 @@
             </w:r>
             <w:r>
               <w:rPr>
-                <w:rStyle w:val="Hyperlink"/>
+                <w:rStyle w:val="Hiperligao"/>
               </w:rPr>
               <w:t>Transformer Encoders</w:t>
             </w:r>
@@ -1397,7 +1411,7 @@
         </w:p>
         <w:p>
           <w:pPr>
-            <w:pStyle w:val="TOC1"/>
+            <w:pStyle w:val="ndice1"/>
             <w:rPr>
               <w:rFonts w:eastAsiaTheme="minorEastAsia" w:cstheme="minorBidi"/>
               <w:kern w:val="2"/>
@@ -1410,7 +1424,7 @@
           <w:hyperlink w:anchor="_Toc232112795" w:history="1">
             <w:r>
               <w:rPr>
-                <w:rStyle w:val="Hyperlink"/>
+                <w:rStyle w:val="Hiperligao"/>
               </w:rPr>
               <w:t>5.</w:t>
             </w:r>
@@ -1427,7 +1441,7 @@
             </w:r>
             <w:r>
               <w:rPr>
-                <w:rStyle w:val="Hyperlink"/>
+                <w:rStyle w:val="Hiperligao"/>
               </w:rPr>
               <w:t>Classification Models</w:t>
             </w:r>
@@ -1476,7 +1490,7 @@
         </w:p>
         <w:p>
           <w:pPr>
-            <w:pStyle w:val="TOC2"/>
+            <w:pStyle w:val="ndice2"/>
             <w:rPr>
               <w:rFonts w:eastAsiaTheme="minorEastAsia" w:cstheme="minorBidi"/>
               <w:kern w:val="2"/>
@@ -1489,7 +1503,7 @@
           <w:hyperlink w:anchor="_Toc232112796" w:history="1">
             <w:r>
               <w:rPr>
-                <w:rStyle w:val="Hyperlink"/>
+                <w:rStyle w:val="Hiperligao"/>
               </w:rPr>
               <w:t>5.1.</w:t>
             </w:r>
@@ -1506,7 +1520,7 @@
             </w:r>
             <w:r>
               <w:rPr>
-                <w:rStyle w:val="Hyperlink"/>
+                <w:rStyle w:val="Hiperligao"/>
               </w:rPr>
               <w:t>Corpus Split and Validation Strategy</w:t>
             </w:r>
@@ -1555,7 +1569,7 @@
         </w:p>
         <w:p>
           <w:pPr>
-            <w:pStyle w:val="TOC2"/>
+            <w:pStyle w:val="ndice2"/>
             <w:rPr>
               <w:rFonts w:eastAsiaTheme="minorEastAsia" w:cstheme="minorBidi"/>
               <w:kern w:val="2"/>
@@ -1568,7 +1582,7 @@
           <w:hyperlink w:anchor="_Toc232112797" w:history="1">
             <w:r>
               <w:rPr>
-                <w:rStyle w:val="Hyperlink"/>
+                <w:rStyle w:val="Hiperligao"/>
               </w:rPr>
               <w:t>5.2.</w:t>
             </w:r>
@@ -1585,7 +1599,7 @@
             </w:r>
             <w:r>
               <w:rPr>
-                <w:rStyle w:val="Hyperlink"/>
+                <w:rStyle w:val="Hiperligao"/>
               </w:rPr>
               <w:t>Traditional ML Models</w:t>
             </w:r>
@@ -1634,7 +1648,7 @@
         </w:p>
         <w:p>
           <w:pPr>
-            <w:pStyle w:val="TOC3"/>
+            <w:pStyle w:val="ndice3"/>
             <w:rPr>
               <w:rFonts w:eastAsiaTheme="minorEastAsia" w:cstheme="minorBidi"/>
               <w:kern w:val="2"/>
@@ -1647,7 +1661,7 @@
           <w:hyperlink w:anchor="_Toc232112798" w:history="1">
             <w:r>
               <w:rPr>
-                <w:rStyle w:val="Hyperlink"/>
+                <w:rStyle w:val="Hiperligao"/>
                 <w:lang w:val="pt-PT"/>
               </w:rPr>
               <w:t>5.2.1.</w:t>
@@ -1665,7 +1679,7 @@
             </w:r>
             <w:r>
               <w:rPr>
-                <w:rStyle w:val="Hyperlink"/>
+                <w:rStyle w:val="Hiperligao"/>
                 <w:lang w:val="pt-PT"/>
               </w:rPr>
               <w:t>Logistic Regression</w:t>
@@ -1715,7 +1729,7 @@
         </w:p>
         <w:p>
           <w:pPr>
-            <w:pStyle w:val="TOC3"/>
+            <w:pStyle w:val="ndice3"/>
             <w:rPr>
               <w:rFonts w:eastAsiaTheme="minorEastAsia" w:cstheme="minorBidi"/>
               <w:kern w:val="2"/>
@@ -1728,7 +1742,7 @@
           <w:hyperlink w:anchor="_Toc232112799" w:history="1">
             <w:r>
               <w:rPr>
-                <w:rStyle w:val="Hyperlink"/>
+                <w:rStyle w:val="Hiperligao"/>
                 <w:lang w:val="pt-PT"/>
               </w:rPr>
               <w:t>5.2.2.</w:t>
@@ -1746,7 +1760,7 @@
             </w:r>
             <w:r>
               <w:rPr>
-                <w:rStyle w:val="Hyperlink"/>
+                <w:rStyle w:val="Hiperligao"/>
                 <w:lang w:val="pt-PT"/>
               </w:rPr>
               <w:t>Random Forest</w:t>
@@ -1796,7 +1810,7 @@
         </w:p>
         <w:p>
           <w:pPr>
-            <w:pStyle w:val="TOC1"/>
+            <w:pStyle w:val="ndice1"/>
             <w:rPr>
               <w:rFonts w:eastAsiaTheme="minorEastAsia" w:cstheme="minorBidi"/>
               <w:kern w:val="2"/>
@@ -1809,7 +1823,7 @@
           <w:hyperlink w:anchor="_Toc232112800" w:history="1">
             <w:r>
               <w:rPr>
-                <w:rStyle w:val="Hyperlink"/>
+                <w:rStyle w:val="Hiperligao"/>
                 <w:lang w:val="pt-PT"/>
               </w:rPr>
               <w:t>6.</w:t>
@@ -1827,7 +1841,7 @@
             </w:r>
             <w:r>
               <w:rPr>
-                <w:rStyle w:val="Hyperlink"/>
+                <w:rStyle w:val="Hiperligao"/>
                 <w:lang w:val="pt-PT"/>
               </w:rPr>
               <w:t>XGBoost</w:t>
@@ -1877,7 +1891,7 @@
         </w:p>
         <w:p>
           <w:pPr>
-            <w:pStyle w:val="TOC1"/>
+            <w:pStyle w:val="ndice1"/>
             <w:rPr>
               <w:rFonts w:eastAsiaTheme="minorEastAsia" w:cstheme="minorBidi"/>
               <w:kern w:val="2"/>
@@ -1890,7 +1904,7 @@
           <w:hyperlink w:anchor="_Toc232112801" w:history="1">
             <w:r>
               <w:rPr>
-                <w:rStyle w:val="Hyperlink"/>
+                <w:rStyle w:val="Hiperligao"/>
                 <w:lang w:val="pt-PT"/>
               </w:rPr>
               <w:t>7.</w:t>
@@ -1908,7 +1922,7 @@
             </w:r>
             <w:r>
               <w:rPr>
-                <w:rStyle w:val="Hyperlink"/>
+                <w:rStyle w:val="Hiperligao"/>
                 <w:lang w:val="pt-PT"/>
               </w:rPr>
               <w:t>Hyperparameter Optimisation</w:t>
@@ -1958,7 +1972,7 @@
         </w:p>
         <w:p>
           <w:pPr>
-            <w:pStyle w:val="TOC1"/>
+            <w:pStyle w:val="ndice1"/>
             <w:rPr>
               <w:rFonts w:eastAsiaTheme="minorEastAsia" w:cstheme="minorBidi"/>
               <w:kern w:val="2"/>
@@ -1971,7 +1985,7 @@
           <w:hyperlink w:anchor="_Toc232112802" w:history="1">
             <w:r>
               <w:rPr>
-                <w:rStyle w:val="Hyperlink"/>
+                <w:rStyle w:val="Hiperligao"/>
               </w:rPr>
               <w:t>8.</w:t>
             </w:r>
@@ -1988,7 +2002,7 @@
             </w:r>
             <w:r>
               <w:rPr>
-                <w:rStyle w:val="Hyperlink"/>
+                <w:rStyle w:val="Hiperligao"/>
               </w:rPr>
               <w:t>Evaluation And Results</w:t>
             </w:r>
@@ -2037,7 +2051,7 @@
         </w:p>
         <w:p>
           <w:pPr>
-            <w:pStyle w:val="TOC1"/>
+            <w:pStyle w:val="ndice1"/>
             <w:rPr>
               <w:rFonts w:eastAsiaTheme="minorEastAsia" w:cstheme="minorBidi"/>
               <w:kern w:val="2"/>
@@ -2050,7 +2064,7 @@
           <w:hyperlink w:anchor="_Toc232112803" w:history="1">
             <w:r>
               <w:rPr>
-                <w:rStyle w:val="Hyperlink"/>
+                <w:rStyle w:val="Hiperligao"/>
               </w:rPr>
               <w:t>9.</w:t>
             </w:r>
@@ -2067,7 +2081,7 @@
             </w:r>
             <w:r>
               <w:rPr>
-                <w:rStyle w:val="Hyperlink"/>
+                <w:rStyle w:val="Hiperligao"/>
               </w:rPr>
               <w:t>Appendix</w:t>
             </w:r>
@@ -2116,7 +2130,7 @@
         </w:p>
         <w:p>
           <w:pPr>
-            <w:pStyle w:val="TOC1"/>
+            <w:pStyle w:val="ndice1"/>
             <w:tabs>
               <w:tab w:val="left" w:pos="720"/>
             </w:tabs>
@@ -2132,7 +2146,7 @@
           <w:hyperlink w:anchor="_Toc232112804" w:history="1">
             <w:r>
               <w:rPr>
-                <w:rStyle w:val="Hyperlink"/>
+                <w:rStyle w:val="Hiperligao"/>
               </w:rPr>
               <w:t>10.</w:t>
             </w:r>
@@ -2149,7 +2163,7 @@
             </w:r>
             <w:r>
               <w:rPr>
-                <w:rStyle w:val="Hyperlink"/>
+                <w:rStyle w:val="Hiperligao"/>
               </w:rPr>
               <w:t>Annexes</w:t>
             </w:r>
@@ -2209,12 +2223,12 @@
     </w:sdt>
     <w:p>
       <w:pPr>
-        <w:pStyle w:val="Heading5"/>
-      </w:pPr>
-    </w:p>
-    <w:p>
-      <w:pPr>
-        <w:pStyle w:val="Heading1"/>
+        <w:pStyle w:val="Ttulo5"/>
+      </w:pPr>
+    </w:p>
+    <w:p>
+      <w:pPr>
+        <w:pStyle w:val="Ttulo1"/>
         <w:sectPr>
           <w:headerReference w:type="default" r:id="rId12"/>
           <w:footerReference w:type="default" r:id="rId13"/>
@@ -2228,24 +2242,24 @@
     </w:p>
     <w:p>
       <w:pPr>
-        <w:pStyle w:val="Heading1"/>
-      </w:pPr>
-      <w:bookmarkStart w:id="0" w:name="_Toc410990268"/>
-      <w:bookmarkStart w:id="1" w:name="_Toc410990280"/>
-      <w:bookmarkStart w:id="2" w:name="_Toc412186393"/>
-      <w:bookmarkStart w:id="3" w:name="_Toc412186498"/>
-      <w:bookmarkStart w:id="4" w:name="_Toc412186523"/>
-      <w:bookmarkStart w:id="5" w:name="_Toc412186594"/>
-      <w:bookmarkStart w:id="6" w:name="_Toc412186624"/>
-      <w:bookmarkStart w:id="7" w:name="_Toc115296802"/>
-      <w:bookmarkStart w:id="8" w:name="_Toc136960268"/>
-      <w:bookmarkStart w:id="9" w:name="_Toc141959331"/>
-      <w:bookmarkStart w:id="10" w:name="_Toc232112785"/>
+        <w:pStyle w:val="Ttulo1"/>
+      </w:pPr>
+      <w:bookmarkStart w:id="0" w:name="_Toc232112785"/>
+      <w:bookmarkStart w:id="1" w:name="_Toc410990268"/>
+      <w:bookmarkStart w:id="2" w:name="_Toc410990280"/>
+      <w:bookmarkStart w:id="3" w:name="_Toc412186393"/>
+      <w:bookmarkStart w:id="4" w:name="_Toc412186498"/>
+      <w:bookmarkStart w:id="5" w:name="_Toc412186523"/>
+      <w:bookmarkStart w:id="6" w:name="_Toc412186594"/>
+      <w:bookmarkStart w:id="7" w:name="_Toc412186624"/>
+      <w:bookmarkStart w:id="8" w:name="_Toc115296802"/>
+      <w:bookmarkStart w:id="9" w:name="_Toc136960268"/>
+      <w:bookmarkStart w:id="10" w:name="_Toc141959331"/>
       <w:r>
         <w:lastRenderedPageBreak/>
         <w:t>Project Overview</w:t>
       </w:r>
-      <w:bookmarkEnd w:id="10"/>
+      <w:bookmarkEnd w:id="0"/>
     </w:p>
     <w:p>
       <w:r>
@@ -2254,10 +2268,9 @@
     </w:p>
     <w:p>
       <w:pPr>
-        <w:pStyle w:val="Heading1"/>
+        <w:pStyle w:val="Ttulo1"/>
       </w:pPr>
       <w:bookmarkStart w:id="11" w:name="_Toc232112786"/>
-      <w:bookmarkEnd w:id="0"/>
       <w:bookmarkEnd w:id="1"/>
       <w:bookmarkEnd w:id="2"/>
       <w:bookmarkEnd w:id="3"/>
@@ -2267,6 +2280,7 @@
       <w:bookmarkEnd w:id="7"/>
       <w:bookmarkEnd w:id="8"/>
       <w:bookmarkEnd w:id="9"/>
+      <w:bookmarkEnd w:id="10"/>
       <w:r>
         <w:t xml:space="preserve">Data </w:t>
       </w:r>
@@ -2277,7 +2291,7 @@
     </w:p>
     <w:p>
       <w:pPr>
-        <w:pStyle w:val="Heading2"/>
+        <w:pStyle w:val="Ttulo2"/>
       </w:pPr>
       <w:bookmarkStart w:id="12" w:name="_Toc232112787"/>
       <w:r>
@@ -2307,7 +2321,7 @@
     </w:p>
     <w:p>
       <w:pPr>
-        <w:pStyle w:val="Heading2"/>
+        <w:pStyle w:val="Ttulo2"/>
       </w:pPr>
       <w:bookmarkStart w:id="13" w:name="_Toc232112788"/>
       <w:r>
@@ -2334,7 +2348,7 @@
       <w:hyperlink w:anchor="Figure1" w:history="1">
         <w:r>
           <w:rPr>
-            <w:rStyle w:val="Hyperlink"/>
+            <w:rStyle w:val="Hiperligao"/>
           </w:rPr>
           <w:t>Figure 1</w:t>
         </w:r>
@@ -2356,7 +2370,7 @@
       <w:hyperlink w:anchor="Figure2" w:history="1">
         <w:r>
           <w:rPr>
-            <w:rStyle w:val="Hyperlink"/>
+            <w:rStyle w:val="Hiperligao"/>
             <w:color w:val="auto"/>
             <w:u w:val="none"/>
           </w:rPr>
@@ -2395,21 +2409,13 @@
       <w:hyperlink w:anchor="Figure3" w:history="1">
         <w:r>
           <w:rPr>
-            <w:rStyle w:val="Hyperlink"/>
+            <w:rStyle w:val="Hiperligao"/>
           </w:rPr>
           <w:t>word clouds</w:t>
         </w:r>
       </w:hyperlink>
       <w:r>
-        <w:t xml:space="preserve"> as a quick way to explore the top 15 most common words in each sentiment class. This gave us an immediate visual sense of which terms stand out the most in bullish, bearish, and neutral tweets, since more frequent words appear larger and are easier to spot </w:t>
-      </w:r>
-      <w:proofErr w:type="gramStart"/>
-      <w:r>
-        <w:t>at a glance</w:t>
-      </w:r>
-      <w:proofErr w:type="gramEnd"/>
-      <w:r>
-        <w:t>.</w:t>
+        <w:t xml:space="preserve"> as a quick way to explore the top 15 most common words in each sentiment class. This gave us an immediate visual sense of which terms stand out the most in bullish, bearish, and neutral tweets, since more frequent words appear larger and are easier to spot at a glance.</w:t>
       </w:r>
     </w:p>
     <w:p>
@@ -2419,19 +2425,19 @@
       <w:hyperlink w:anchor="Figure4" w:history="1">
         <w:r>
           <w:rPr>
-            <w:rStyle w:val="Hyperlink"/>
+            <w:rStyle w:val="Hiperligao"/>
           </w:rPr>
           <w:t>bar</w:t>
         </w:r>
         <w:r>
           <w:rPr>
-            <w:rStyle w:val="Hyperlink"/>
+            <w:rStyle w:val="Hiperligao"/>
           </w:rPr>
           <w:t xml:space="preserve"> </w:t>
         </w:r>
         <w:r>
           <w:rPr>
-            <w:rStyle w:val="Hyperlink"/>
+            <w:rStyle w:val="Hiperligao"/>
           </w:rPr>
           <w:t>charts</w:t>
         </w:r>
@@ -2688,15 +2694,7 @@
     </w:p>
     <w:p>
       <w:r>
-        <w:t xml:space="preserve">Now, considering that our dataset consists of tweets, we also </w:t>
-      </w:r>
-      <w:proofErr w:type="gramStart"/>
-      <w:r>
-        <w:t>looked into</w:t>
-      </w:r>
-      <w:proofErr w:type="gramEnd"/>
-      <w:r>
-        <w:t xml:space="preserve"> the use of hashtags, mentions, and </w:t>
+        <w:t xml:space="preserve">Now, considering that our dataset consists of tweets, we also looked into the use of hashtags, mentions, and </w:t>
       </w:r>
       <w:proofErr w:type="spellStart"/>
       <w:r>
@@ -2722,7 +2720,7 @@
       <w:hyperlink w:anchor="Figure5" w:history="1">
         <w:r>
           <w:rPr>
-            <w:rStyle w:val="Hyperlink"/>
+            <w:rStyle w:val="Hiperligao"/>
           </w:rPr>
           <w:t>Figure 5</w:t>
         </w:r>
@@ -2831,15 +2829,7 @@
       </w:r>
       <w:proofErr w:type="spellEnd"/>
       <w:r>
-        <w:t xml:space="preserve"> (stock </w:t>
-      </w:r>
-      <w:proofErr w:type="gramStart"/>
-      <w:r>
-        <w:t>tickers</w:t>
-      </w:r>
-      <w:proofErr w:type="gramEnd"/>
-      <w:r>
-        <w:t>), clearer distinctions emerge. While some popular tickers like “</w:t>
+        <w:t xml:space="preserve"> (stock tickers), clearer distinctions emerge. While some popular tickers like “</w:t>
       </w:r>
       <w:r>
         <w:rPr>
@@ -2968,7 +2958,7 @@
     </w:p>
     <w:p>
       <w:pPr>
-        <w:pStyle w:val="Heading1"/>
+        <w:pStyle w:val="Ttulo1"/>
       </w:pPr>
       <w:bookmarkStart w:id="14" w:name="_Toc232112790"/>
       <w:r>
@@ -2986,34 +2976,18 @@
     </w:p>
     <w:p>
       <w:r>
-        <w:t xml:space="preserve">As a first step, all tweets were converted to lowercase to ensure consistency across the corpus and reduce vocabulary sparsity caused by capitalization differences. Contractions such as “don't”, “can't”, and </w:t>
-      </w:r>
-      <w:proofErr w:type="gramStart"/>
-      <w:r>
-        <w:t>“it's”</w:t>
+        <w:t>As a first step, all tweets were converted to lowercase to ensure consistency across the corpus and reduce vocabulary sparsity caused by capitalization differences. Contractions such as “don't”, “can't”, and “it's”</w:t>
       </w:r>
       <w:r>
         <w:t xml:space="preserve"> </w:t>
       </w:r>
       <w:r>
-        <w:t>were</w:t>
-      </w:r>
-      <w:proofErr w:type="gramEnd"/>
-      <w:r>
-        <w:t xml:space="preserve"> expanded into their full forms before further processing, improving linguistic consistency and allowing negation patterns to be identified more reliably.</w:t>
-      </w:r>
-    </w:p>
-    <w:p>
-      <w:r>
-        <w:t xml:space="preserve">The EDA showed that bullish and bearish tweets frequently </w:t>
-      </w:r>
-      <w:proofErr w:type="gramStart"/>
-      <w:r>
-        <w:t>contained</w:t>
-      </w:r>
-      <w:proofErr w:type="gramEnd"/>
-      <w:r>
-        <w:t xml:space="preserve"> words associated with market movements and company performance, such as </w:t>
+        <w:t>were expanded into their full forms before further processing, improving linguistic consistency and allowing negation patterns to be identified more reliably.</w:t>
+      </w:r>
+    </w:p>
+    <w:p>
+      <w:r>
+        <w:t xml:space="preserve">The EDA showed that bullish and bearish tweets frequently contained words associated with market movements and company performance, such as </w:t>
       </w:r>
       <w:r>
         <w:rPr>
@@ -3354,7 +3328,7 @@
     </w:p>
     <w:p>
       <w:pPr>
-        <w:pStyle w:val="Heading1"/>
+        <w:pStyle w:val="Ttulo1"/>
       </w:pPr>
       <w:bookmarkStart w:id="15" w:name="_Toc232112791"/>
       <w:r>
@@ -3383,7 +3357,7 @@
     </w:p>
     <w:p>
       <w:pPr>
-        <w:pStyle w:val="Heading2"/>
+        <w:pStyle w:val="Ttulo2"/>
       </w:pPr>
       <w:bookmarkStart w:id="16" w:name="_Toc232112792"/>
       <w:r>
@@ -3422,16 +3396,10 @@
     </w:p>
     <w:p>
       <w:pPr>
-        <w:pStyle w:val="Heading2"/>
-        <w:rPr>
-          <w:lang w:val="pt-PT"/>
-        </w:rPr>
+        <w:pStyle w:val="Ttulo2"/>
       </w:pPr>
       <w:bookmarkStart w:id="17" w:name="_Toc232112793"/>
       <w:r>
-        <w:rPr>
-          <w:lang w:val="pt-PT"/>
-        </w:rPr>
         <w:t>Word2Vec Embeddings</w:t>
       </w:r>
       <w:bookmarkEnd w:id="17"/>
@@ -3453,7 +3421,7 @@
     </w:p>
     <w:p>
       <w:pPr>
-        <w:pStyle w:val="Heading1"/>
+        <w:pStyle w:val="Ttulo1"/>
       </w:pPr>
       <w:bookmarkStart w:id="18" w:name="_Toc232112795"/>
       <w:r>
@@ -3463,7 +3431,7 @@
     </w:p>
     <w:p>
       <w:pPr>
-        <w:pStyle w:val="Heading2"/>
+        <w:pStyle w:val="Ttulo2"/>
       </w:pPr>
       <w:bookmarkStart w:id="19" w:name="_Toc232112796"/>
       <w:r>
@@ -3513,7 +3481,7 @@
     </w:p>
     <w:p>
       <w:pPr>
-        <w:pStyle w:val="Heading2"/>
+        <w:pStyle w:val="Ttulo2"/>
       </w:pPr>
       <w:bookmarkStart w:id="20" w:name="_Toc232112797"/>
       <w:r>
@@ -3557,16 +3525,10 @@
     </w:p>
     <w:p>
       <w:pPr>
-        <w:pStyle w:val="Heading3"/>
-        <w:rPr>
-          <w:lang w:val="pt-PT"/>
-        </w:rPr>
+        <w:pStyle w:val="Ttulo3"/>
       </w:pPr>
       <w:bookmarkStart w:id="21" w:name="_Toc232112798"/>
       <w:r>
-        <w:rPr>
-          <w:lang w:val="pt-PT"/>
-        </w:rPr>
         <w:t>Logistic Regression</w:t>
       </w:r>
       <w:bookmarkEnd w:id="21"/>
@@ -3599,16 +3561,10 @@
     </w:p>
     <w:p>
       <w:pPr>
-        <w:pStyle w:val="Heading3"/>
-        <w:rPr>
-          <w:lang w:val="pt-PT"/>
-        </w:rPr>
+        <w:pStyle w:val="Ttulo3"/>
       </w:pPr>
       <w:bookmarkStart w:id="22" w:name="_Toc232112799"/>
       <w:r>
-        <w:rPr>
-          <w:lang w:val="pt-PT"/>
-        </w:rPr>
         <w:t>Random Forest</w:t>
       </w:r>
       <w:bookmarkEnd w:id="22"/>
@@ -3625,19 +3581,15 @@
     </w:p>
     <w:p>
       <w:pPr>
-        <w:pStyle w:val="Heading3"/>
-        <w:rPr>
-          <w:lang w:val="pt-PT"/>
-        </w:rPr>
+        <w:pStyle w:val="Ttulo3"/>
       </w:pPr>
       <w:bookmarkStart w:id="23" w:name="_Toc232112800"/>
-      <w:r>
-        <w:rPr>
-          <w:lang w:val="pt-PT"/>
-        </w:rPr>
+      <w:proofErr w:type="spellStart"/>
+      <w:r>
         <w:t>XGBoost</w:t>
       </w:r>
       <w:bookmarkEnd w:id="23"/>
+      <w:proofErr w:type="spellEnd"/>
     </w:p>
     <w:p>
       <w:proofErr w:type="spellStart"/>
@@ -3670,7 +3622,7 @@
     </w:p>
     <w:p>
       <w:pPr>
-        <w:pStyle w:val="Heading2"/>
+        <w:pStyle w:val="Ttulo2"/>
       </w:pPr>
       <w:r>
         <w:lastRenderedPageBreak/>
@@ -3682,25 +3634,84 @@
     </w:p>
     <w:p>
       <w:pPr>
-        <w:pStyle w:val="Heading3"/>
+        <w:pStyle w:val="Ttulo3"/>
       </w:pPr>
       <w:r>
         <w:t>BERT</w:t>
       </w:r>
     </w:p>
     <w:p>
+      <w:r>
+        <w:t>BERT was selected as the primary encoder-based transformer due to its strong performance in text classification tasks and its ability to capture contextual relationships through bidirectional self-attention. Unlike the traditional machine learning approaches, BERT operates directly on raw tweet text, performing its own tokenization and contextual representation learning without requiring manual feature engineering.</w:t>
+      </w:r>
+    </w:p>
+    <w:p>
+      <w:r>
+        <w:t xml:space="preserve">The model used was </w:t>
+      </w:r>
+      <w:r>
+        <w:rPr>
+          <w:i/>
+          <w:iCs/>
+        </w:rPr>
+        <w:t>google-</w:t>
+      </w:r>
       <w:proofErr w:type="spellStart"/>
       <w:r>
-        <w:t>Aaaa</w:t>
+        <w:rPr>
+          <w:i/>
+          <w:iCs/>
+        </w:rPr>
+        <w:t>bert</w:t>
       </w:r>
       <w:proofErr w:type="spellEnd"/>
-    </w:p>
-    <w:p>
-      <w:pPr>
-        <w:pStyle w:val="Heading3"/>
-      </w:pPr>
+      <w:r>
+        <w:rPr>
+          <w:i/>
+          <w:iCs/>
+        </w:rPr>
+        <w:t>/</w:t>
+      </w:r>
       <w:proofErr w:type="spellStart"/>
       <w:r>
+        <w:rPr>
+          <w:i/>
+          <w:iCs/>
+        </w:rPr>
+        <w:t>bert</w:t>
+      </w:r>
+      <w:proofErr w:type="spellEnd"/>
+      <w:r>
+        <w:rPr>
+          <w:i/>
+          <w:iCs/>
+        </w:rPr>
+        <w:t>-base-uncased</w:t>
+      </w:r>
+      <w:r>
+        <w:t>. During training, the pre-trained encoder was fine-tuned on the sentiment classification dataset by attaching a sequence-classification head with three output classes (bearish, bullish, and neutral). Fine-tuning was performed using a maximum sequence length of 128 tokens, batch size of 16, learning rate of 2×10⁻⁵, and 3 training epochs. Class weights were incorporated into the loss function to mitigate class imbalance, while model selection was based on the highest validation Macro-F1 score observed during training. The best-performing checkpoint was restored after training completion.</w:t>
+      </w:r>
+    </w:p>
+    <w:p>
+      <w:r>
+        <w:t xml:space="preserve">The final class prediction is obtained from the classification head, with class probabilities computed through a </w:t>
+      </w:r>
+      <w:proofErr w:type="spellStart"/>
+      <w:r>
+        <w:t>softmax</w:t>
+      </w:r>
+      <w:proofErr w:type="spellEnd"/>
+      <w:r>
+        <w:t xml:space="preserve"> activation over the output logits.</w:t>
+      </w:r>
+    </w:p>
+    <w:p/>
+    <w:p>
+      <w:pPr>
+        <w:pStyle w:val="Ttulo3"/>
+      </w:pPr>
+      <w:proofErr w:type="spellStart"/>
+      <w:r>
         <w:t>DistilBERT</w:t>
       </w:r>
       <w:proofErr w:type="spellEnd"/>
@@ -3708,13 +3719,62 @@
     <w:p>
       <w:proofErr w:type="spellStart"/>
       <w:r>
-        <w:t>Aaaa</w:t>
+        <w:t>DistilBERT</w:t>
       </w:r>
       <w:proofErr w:type="spellEnd"/>
-    </w:p>
-    <w:p>
-      <w:pPr>
-        <w:pStyle w:val="Heading3"/>
+      <w:r>
+        <w:t xml:space="preserve"> was included as a lightweight alternative to BERT, designed to provide comparable language understanding capabilities while reducing computational requirements. Through knowledge distillation, </w:t>
+      </w:r>
+      <w:proofErr w:type="spellStart"/>
+      <w:r>
+        <w:t>DistilBERT</w:t>
+      </w:r>
+      <w:proofErr w:type="spellEnd"/>
+      <w:r>
+        <w:t xml:space="preserve"> retains much of BERT's predictive performance despite having fewer parameters, making it particularly suitable for scenarios where inference speed and resource efficiency are important considerations.</w:t>
+      </w:r>
+    </w:p>
+    <w:p>
+      <w:r>
+        <w:t xml:space="preserve">The model used was </w:t>
+      </w:r>
+      <w:proofErr w:type="spellStart"/>
+      <w:r>
+        <w:rPr>
+          <w:i/>
+          <w:iCs/>
+        </w:rPr>
+        <w:t>distilbert</w:t>
+      </w:r>
+      <w:proofErr w:type="spellEnd"/>
+      <w:r>
+        <w:rPr>
+          <w:i/>
+          <w:iCs/>
+        </w:rPr>
+        <w:t>-base-uncased</w:t>
+      </w:r>
+      <w:r>
+        <w:t>. Similar to BERT, the model was fine-tuned end-to-end for three-class sentiment classification using raw tweet text as input. Training employed a maximum sequence length of 128 tokens, batch size of 16, learning rate of 2×10⁻⁵, and 3 training epochs. Class weighting was applied to address class imbalance, and the checkpoint achieving the highest validation Macro-F1 score was retained as the final model.</w:t>
+      </w:r>
+    </w:p>
+    <w:p>
+      <w:r>
+        <w:t xml:space="preserve">As with BERT, sentiment predictions are produced by a sequence-classification head, with posterior class probabilities obtained via </w:t>
+      </w:r>
+      <w:proofErr w:type="spellStart"/>
+      <w:r>
+        <w:t>softmax</w:t>
+      </w:r>
+      <w:proofErr w:type="spellEnd"/>
+      <w:r>
+        <w:t xml:space="preserve"> over the model's output logits.</w:t>
+      </w:r>
+    </w:p>
+    <w:p/>
+    <w:p>
+      <w:pPr>
+        <w:pStyle w:val="Ttulo3"/>
       </w:pPr>
       <w:r>
         <w:t>FLAN-T5</w:t>
@@ -3790,16 +3850,10 @@
     </w:p>
     <w:p>
       <w:pPr>
-        <w:pStyle w:val="Heading1"/>
-        <w:rPr>
-          <w:lang w:val="pt-PT"/>
-        </w:rPr>
+        <w:pStyle w:val="Ttulo1"/>
       </w:pPr>
       <w:bookmarkStart w:id="24" w:name="_Toc232112801"/>
       <w:r>
-        <w:rPr>
-          <w:lang w:val="pt-PT"/>
-        </w:rPr>
         <w:t>Hyperparameter Optimisation</w:t>
       </w:r>
       <w:bookmarkEnd w:id="24"/>
@@ -3808,19 +3862,19 @@
       <w:r>
         <w:t xml:space="preserve">To ensure fair model comparison and prevent data leakage, hyperparameter tuning was performed before the final evaluation stage. Each model was </w:t>
       </w:r>
-      <w:proofErr w:type="spellStart"/>
-      <w:r>
-        <w:t>optimised</w:t>
-      </w:r>
-      <w:proofErr w:type="spellEnd"/>
-      <w:r>
-        <w:t xml:space="preserve"> using Grid Search combined with stratified cross-validation. The </w:t>
-      </w:r>
-      <w:proofErr w:type="spellStart"/>
-      <w:r>
-        <w:t>optimisation</w:t>
-      </w:r>
-      <w:proofErr w:type="spellEnd"/>
+      <w:r>
+        <w:t>optimized</w:t>
+      </w:r>
+      <w:r>
+        <w:t xml:space="preserve"> using Grid Search combined with stratified </w:t>
+      </w:r>
+      <w:r>
+        <w:lastRenderedPageBreak/>
+        <w:t xml:space="preserve">cross-validation. The </w:t>
+      </w:r>
+      <w:r>
+        <w:t>optimization</w:t>
+      </w:r>
       <w:r>
         <w:t xml:space="preserve"> objective was the macro-averaged F1 score, which was selected because it assigns equal importance to all sentiment classes regardless of their frequency.</w:t>
       </w:r>
@@ -3835,39 +3889,1032 @@
         <w:t>After identifying the best hyperparameter configuration, the corresponding model was retained and used for subsequent evaluation. The selected configuration was stored together with the preprocessing and feature extraction pipeline to ensure reproducibility and consistency during later testing stages.</w:t>
       </w:r>
     </w:p>
-    <w:p>
-      <w:pPr>
-        <w:pStyle w:val="Heading1"/>
-      </w:pPr>
-      <w:bookmarkStart w:id="25" w:name="_Toc410990277"/>
-      <w:bookmarkStart w:id="26" w:name="_Toc410990289"/>
-      <w:bookmarkStart w:id="27" w:name="_Toc412186402"/>
-      <w:bookmarkStart w:id="28" w:name="_Toc412186507"/>
-      <w:bookmarkStart w:id="29" w:name="_Toc412186532"/>
-      <w:bookmarkStart w:id="30" w:name="_Toc412186603"/>
-      <w:bookmarkStart w:id="31" w:name="_Toc412186633"/>
-      <w:bookmarkStart w:id="32" w:name="_Toc115296810"/>
-      <w:bookmarkStart w:id="33" w:name="_Toc141959339"/>
-      <w:bookmarkStart w:id="34" w:name="_Toc232112802"/>
-      <w:proofErr w:type="gramStart"/>
+    <w:p/>
+    <w:p>
+      <w:pPr>
+        <w:pStyle w:val="Ttulo1"/>
+      </w:pPr>
+      <w:r>
+        <w:t xml:space="preserve">Extra Challenge 2 </w:t>
+      </w:r>
+    </w:p>
+    <w:p>
+      <w:pPr>
+        <w:pStyle w:val="Ttulo2"/>
+      </w:pPr>
+      <w:r>
+        <w:t>Architecture Overview</w:t>
+      </w:r>
+    </w:p>
+    <w:p>
+      <w:r>
+        <w:t>To address Extra Challenge 2, an agentic AI-based workflow was designed and implemented around three components: a set of tools that wrap the classification pipeline, a LangChain agent powered by Azure OpenAI that decides which tools to invoke, and a session-aware memory mechanism that maintains conversational context across turns.</w:t>
+      </w:r>
+    </w:p>
+    <w:p>
+      <w:pPr>
+        <w:pStyle w:val="Ttulo2"/>
+      </w:pPr>
+      <w:r>
+        <w:t>Tools</w:t>
+      </w:r>
+    </w:p>
+    <w:p>
+      <w:pPr>
+        <w:rPr>
+          <w:rFonts w:ascii="Calibri" w:hAnsi="Calibri" w:cs="Calibri"/>
+        </w:rPr>
+      </w:pPr>
+      <w:r>
+        <w:rPr>
+          <w:rFonts w:ascii="Calibri" w:hAnsi="Calibri" w:cs="Calibri"/>
+        </w:rPr>
+        <w:t xml:space="preserve">Four </w:t>
+      </w:r>
+      <w:r>
+        <w:rPr>
+          <w:rFonts w:ascii="Calibri" w:hAnsi="Calibri" w:cs="Calibri"/>
+        </w:rPr>
+        <w:t xml:space="preserve">tools were implemented inside a </w:t>
+      </w:r>
+      <w:r>
+        <w:rPr>
+          <w:rFonts w:ascii="Calibri" w:hAnsi="Calibri" w:cs="Calibri"/>
+          <w:i/>
+          <w:iCs/>
+        </w:rPr>
+        <w:t>build_tools</w:t>
+      </w:r>
+      <w:r>
+        <w:rPr>
+          <w:rFonts w:ascii="Calibri" w:hAnsi="Calibri" w:cs="Calibri"/>
+        </w:rPr>
+        <w:t xml:space="preserve"> factory function, which injects the model bundles into each tool via closure, keeping tools as stateless plain functions with no dependency on the agent itself. Two different </w:t>
+      </w:r>
+      <w:r>
+        <w:rPr>
+          <w:rFonts w:ascii="Calibri" w:hAnsi="Calibri" w:cs="Calibri"/>
+          <w:i/>
+          <w:iCs/>
+        </w:rPr>
+        <w:t>LangChain</w:t>
+      </w:r>
+      <w:r>
+        <w:rPr>
+          <w:rFonts w:ascii="Calibri" w:hAnsi="Calibri" w:cs="Calibri"/>
+        </w:rPr>
+        <w:t xml:space="preserve"> tool construction approaches were used depending on each tool's signature.</w:t>
+      </w:r>
+    </w:p>
+    <w:p>
+      <w:pPr>
+        <w:pStyle w:val="Ttulo3"/>
+        <w:rPr>
+          <w:rStyle w:val="CdigoHTML"/>
+          <w:rFonts w:ascii="Calibri" w:hAnsi="Calibri" w:cs="Calibri"/>
+          <w:sz w:val="24"/>
+          <w:szCs w:val="24"/>
+        </w:rPr>
+      </w:pPr>
+      <w:bookmarkStart w:id="25" w:name="_Toc232168914"/>
+      <w:r>
+        <w:rPr>
+          <w:rStyle w:val="CdigoHTML"/>
+          <w:rFonts w:ascii="Calibri" w:hAnsi="Calibri" w:cs="Calibri"/>
+          <w:sz w:val="24"/>
+          <w:szCs w:val="24"/>
+        </w:rPr>
+        <w:t>Single-Argument Tools (@tool)</w:t>
+      </w:r>
+      <w:bookmarkEnd w:id="25"/>
+    </w:p>
+    <w:p>
+      <w:pPr>
+        <w:rPr>
+          <w:rFonts w:ascii="Calibri" w:hAnsi="Calibri" w:cs="Calibri"/>
+        </w:rPr>
+      </w:pPr>
+      <w:r>
+        <w:rPr>
+          <w:rFonts w:ascii="Calibri" w:hAnsi="Calibri" w:cs="Calibri"/>
+        </w:rPr>
+        <w:t xml:space="preserve">Tools that take a single string argument were decorated with </w:t>
+      </w:r>
+      <w:r>
+        <w:rPr>
+          <w:rFonts w:ascii="Calibri" w:hAnsi="Calibri" w:cs="Calibri"/>
+          <w:i/>
+          <w:iCs/>
+        </w:rPr>
+        <w:t>LangChain’s @tool</w:t>
+      </w:r>
+      <w:r>
+        <w:rPr>
+          <w:rFonts w:ascii="Calibri" w:hAnsi="Calibri" w:cs="Calibri"/>
+        </w:rPr>
+        <w:t xml:space="preserve"> decorator directly, as it handles single-argument functions</w:t>
+      </w:r>
+      <w:r>
+        <w:rPr>
+          <w:rFonts w:ascii="Calibri" w:hAnsi="Calibri" w:cs="Calibri"/>
+        </w:rPr>
+        <w:t xml:space="preserve"> natively without requiring an explicit schema.</w:t>
+      </w:r>
+    </w:p>
+    <w:p>
+      <w:pPr>
+        <w:rPr>
+          <w:rFonts w:ascii="Calibri" w:hAnsi="Calibri" w:cs="Calibri"/>
+        </w:rPr>
+      </w:pPr>
+      <w:r>
+        <w:rPr>
+          <w:rFonts w:ascii="Calibri" w:hAnsi="Calibri" w:cs="Calibri"/>
+        </w:rPr>
+        <w:t>These are:</w:t>
+      </w:r>
+    </w:p>
+    <w:p>
+      <w:pPr>
+        <w:pStyle w:val="font-claude-response-body"/>
+        <w:rPr>
+          <w:rFonts w:ascii="Calibri" w:hAnsi="Calibri" w:cs="Calibri"/>
+          <w:sz w:val="22"/>
+          <w:szCs w:val="22"/>
+          <w:lang w:val="en-US"/>
+        </w:rPr>
+      </w:pPr>
+      <w:r>
+        <w:rPr>
+          <w:rFonts w:ascii="Calibri" w:hAnsi="Calibri" w:cs="Calibri"/>
+          <w:i/>
+          <w:iCs/>
+          <w:sz w:val="22"/>
+          <w:szCs w:val="22"/>
+          <w:lang w:val="en-US"/>
+        </w:rPr>
+        <w:t>list_available_models</w:t>
+      </w:r>
+      <w:r>
+        <w:rPr>
+          <w:rFonts w:ascii="Calibri" w:hAnsi="Calibri" w:cs="Calibri"/>
+          <w:i/>
+          <w:iCs/>
+          <w:sz w:val="22"/>
+          <w:szCs w:val="22"/>
+          <w:lang w:val="en-US"/>
+        </w:rPr>
+        <w:t xml:space="preserve"> </w:t>
+      </w:r>
+      <w:r>
+        <w:rPr>
+          <w:rFonts w:ascii="Calibri" w:hAnsi="Calibri" w:cs="Calibri"/>
+          <w:sz w:val="22"/>
+          <w:szCs w:val="22"/>
+          <w:lang w:val="en-US"/>
+        </w:rPr>
+        <w:t xml:space="preserve">returns the names and types of all loaded model bundles, including whether each supports probability estimation via </w:t>
+      </w:r>
+      <w:r>
+        <w:rPr>
+          <w:rStyle w:val="CdigoHTML"/>
+          <w:rFonts w:ascii="Calibri" w:hAnsi="Calibri" w:cs="Calibri"/>
+          <w:i/>
+          <w:iCs/>
+          <w:sz w:val="22"/>
+          <w:szCs w:val="22"/>
+          <w:lang w:val="en-US"/>
+        </w:rPr>
+        <w:t>predict_proba</w:t>
+      </w:r>
+      <w:r>
+        <w:rPr>
+          <w:rFonts w:ascii="Calibri" w:hAnsi="Calibri" w:cs="Calibri"/>
+          <w:sz w:val="22"/>
+          <w:szCs w:val="22"/>
+          <w:lang w:val="en-US"/>
+        </w:rPr>
+        <w:t>.</w:t>
+      </w:r>
+    </w:p>
+    <w:p>
+      <w:pPr>
+        <w:pStyle w:val="font-claude-response-body"/>
+        <w:rPr>
+          <w:rFonts w:ascii="Calibri" w:hAnsi="Calibri" w:cs="Calibri"/>
+          <w:sz w:val="22"/>
+          <w:szCs w:val="22"/>
+          <w:lang w:val="en-US"/>
+        </w:rPr>
+      </w:pPr>
+      <w:r>
+        <w:rPr>
+          <w:rFonts w:ascii="Calibri" w:hAnsi="Calibri" w:cs="Calibri"/>
+          <w:i/>
+          <w:iCs/>
+          <w:sz w:val="22"/>
+          <w:szCs w:val="22"/>
+          <w:lang w:val="en-US"/>
+        </w:rPr>
+        <w:t>route_tweet</w:t>
+      </w:r>
+      <w:r>
+        <w:rPr>
+          <w:rFonts w:ascii="Calibri" w:hAnsi="Calibri" w:cs="Calibri"/>
+          <w:sz w:val="22"/>
+          <w:szCs w:val="22"/>
+          <w:lang w:val="en-US"/>
+        </w:rPr>
+        <w:t xml:space="preserve"> automatically selects the most appropriate model family by evaluating linguistic and financial signals within the input tweet. The routing decision is based on a scoring mechanism and is returned together with the prediction and its rationale.</w:t>
+      </w:r>
+    </w:p>
+    <w:p>
+      <w:pPr>
+        <w:pStyle w:val="Ttulo3"/>
+        <w:rPr>
+          <w:rFonts w:ascii="Calibri" w:hAnsi="Calibri" w:cs="Calibri"/>
+        </w:rPr>
+      </w:pPr>
+      <w:bookmarkStart w:id="26" w:name="_Toc232168915"/>
+      <w:r>
+        <w:rPr>
+          <w:rFonts w:ascii="Calibri" w:hAnsi="Calibri" w:cs="Calibri"/>
+        </w:rPr>
+        <w:t>Multi-Argument Tools (StructuredTool)</w:t>
+      </w:r>
+      <w:bookmarkEnd w:id="26"/>
+    </w:p>
+    <w:p>
+      <w:pPr>
+        <w:rPr>
+          <w:rFonts w:ascii="Calibri" w:hAnsi="Calibri" w:cs="Calibri"/>
+        </w:rPr>
+      </w:pPr>
+      <w:r>
+        <w:rPr>
+          <w:rFonts w:ascii="Calibri" w:hAnsi="Calibri" w:cs="Calibri"/>
+        </w:rPr>
+        <w:t xml:space="preserve">Tools that require multiple typed arguments were built using </w:t>
+      </w:r>
+      <w:r>
+        <w:rPr>
+          <w:rFonts w:ascii="Calibri" w:hAnsi="Calibri" w:cs="Calibri"/>
+          <w:i/>
+          <w:iCs/>
+        </w:rPr>
+        <w:t>StructuredTool.from_function</w:t>
+      </w:r>
+      <w:r>
+        <w:rPr>
+          <w:rFonts w:ascii="Calibri" w:hAnsi="Calibri" w:cs="Calibri"/>
+        </w:rPr>
+        <w:t xml:space="preserve"> </w:t>
+      </w:r>
+      <w:r>
+        <w:rPr>
+          <w:rFonts w:ascii="Calibri" w:hAnsi="Calibri" w:cs="Calibri"/>
+        </w:rPr>
+        <w:t xml:space="preserve">with a </w:t>
+      </w:r>
+      <w:r>
+        <w:rPr>
+          <w:rFonts w:ascii="Calibri" w:hAnsi="Calibri" w:cs="Calibri"/>
+          <w:i/>
+          <w:iCs/>
+        </w:rPr>
+        <w:t>Pydantic BaseModel</w:t>
+      </w:r>
+      <w:r>
+        <w:rPr>
+          <w:rFonts w:ascii="Calibri" w:hAnsi="Calibri" w:cs="Calibri"/>
+        </w:rPr>
+        <w:t xml:space="preserve"> as the </w:t>
+      </w:r>
+      <w:r>
+        <w:rPr>
+          <w:rStyle w:val="CdigoHTML"/>
+          <w:rFonts w:ascii="Calibri" w:eastAsia="Calibri" w:hAnsi="Calibri" w:cs="Calibri"/>
+          <w:i/>
+          <w:iCs/>
+          <w:sz w:val="22"/>
+          <w:szCs w:val="22"/>
+        </w:rPr>
+        <w:t>args_schema</w:t>
+      </w:r>
+      <w:r>
+        <w:rPr>
+          <w:rFonts w:ascii="Calibri" w:hAnsi="Calibri" w:cs="Calibri"/>
+        </w:rPr>
+        <w:t xml:space="preserve">. This is necessary because </w:t>
+      </w:r>
+      <w:r>
+        <w:rPr>
+          <w:rFonts w:ascii="Calibri" w:hAnsi="Calibri" w:cs="Calibri"/>
+          <w:i/>
+          <w:iCs/>
+        </w:rPr>
+        <w:t>LangChain</w:t>
+      </w:r>
+      <w:r>
+        <w:rPr>
+          <w:rFonts w:ascii="Calibri" w:hAnsi="Calibri" w:cs="Calibri"/>
+        </w:rPr>
+        <w:t xml:space="preserve"> passes multi-argument tool inputs as a dictionary, which must be validated against a schema before being unpacked into the function's parameters, without this, a </w:t>
+      </w:r>
+      <w:r>
+        <w:rPr>
+          <w:rStyle w:val="CdigoHTML"/>
+          <w:rFonts w:ascii="Calibri" w:eastAsia="Calibri" w:hAnsi="Calibri" w:cs="Calibri"/>
+          <w:i/>
+          <w:iCs/>
+          <w:sz w:val="22"/>
+          <w:szCs w:val="22"/>
+        </w:rPr>
+        <w:t>ValidationError</w:t>
+      </w:r>
+      <w:r>
+        <w:rPr>
+          <w:rFonts w:ascii="Calibri" w:hAnsi="Calibri" w:cs="Calibri"/>
+        </w:rPr>
+        <w:t xml:space="preserve"> is raised at runtime.</w:t>
+      </w:r>
+    </w:p>
+    <w:p>
+      <w:pPr>
+        <w:pStyle w:val="font-claude-response-body"/>
+        <w:rPr>
+          <w:rFonts w:ascii="Calibri" w:hAnsi="Calibri" w:cs="Calibri"/>
+          <w:sz w:val="22"/>
+          <w:szCs w:val="22"/>
+          <w:lang w:val="en-US"/>
+        </w:rPr>
+      </w:pPr>
+      <w:r>
+        <w:rPr>
+          <w:rFonts w:ascii="Calibri" w:hAnsi="Calibri" w:cs="Calibri"/>
+          <w:i/>
+          <w:iCs/>
+          <w:sz w:val="22"/>
+          <w:szCs w:val="22"/>
+          <w:lang w:val="en-US"/>
+        </w:rPr>
+        <w:t>classify_with_mode</w:t>
+      </w:r>
+      <w:r>
+        <w:rPr>
+          <w:rFonts w:ascii="Calibri" w:hAnsi="Calibri" w:cs="Calibri"/>
+          <w:sz w:val="22"/>
+          <w:szCs w:val="22"/>
+          <w:lang w:val="en-US"/>
+        </w:rPr>
+        <w:t>l</w:t>
+      </w:r>
+      <w:r>
+        <w:rPr>
+          <w:rFonts w:ascii="Calibri" w:hAnsi="Calibri" w:cs="Calibri"/>
+          <w:sz w:val="22"/>
+          <w:szCs w:val="22"/>
+          <w:lang w:val="en-US"/>
+        </w:rPr>
+        <w:t xml:space="preserve"> runs a single named model on a given tweet and returns the predicted sentiment label alongside a confidence score derived from </w:t>
+      </w:r>
+      <w:r>
+        <w:rPr>
+          <w:rStyle w:val="CdigoHTML"/>
+          <w:rFonts w:ascii="Calibri" w:hAnsi="Calibri" w:cs="Calibri"/>
+          <w:i/>
+          <w:iCs/>
+          <w:sz w:val="22"/>
+          <w:szCs w:val="22"/>
+          <w:lang w:val="en-US"/>
+        </w:rPr>
+        <w:t>predict_proba</w:t>
+      </w:r>
+      <w:r>
+        <w:rPr>
+          <w:rFonts w:ascii="Calibri" w:hAnsi="Calibri" w:cs="Calibri"/>
+          <w:sz w:val="22"/>
+          <w:szCs w:val="22"/>
+          <w:lang w:val="en-US"/>
+        </w:rPr>
+        <w:t>. Its schema (</w:t>
+      </w:r>
+      <w:r>
+        <w:rPr>
+          <w:rStyle w:val="CdigoHTML"/>
+          <w:rFonts w:ascii="Calibri" w:hAnsi="Calibri" w:cs="Calibri"/>
+          <w:i/>
+          <w:iCs/>
+          <w:sz w:val="22"/>
+          <w:szCs w:val="22"/>
+          <w:lang w:val="en-US"/>
+        </w:rPr>
+        <w:t>ClassifyInput</w:t>
+      </w:r>
+      <w:r>
+        <w:rPr>
+          <w:rFonts w:ascii="Calibri" w:hAnsi="Calibri" w:cs="Calibri"/>
+          <w:sz w:val="22"/>
+          <w:szCs w:val="22"/>
+          <w:lang w:val="en-US"/>
+        </w:rPr>
+        <w:t xml:space="preserve">) defines two required fields: </w:t>
+      </w:r>
+      <w:r>
+        <w:rPr>
+          <w:rStyle w:val="CdigoHTML"/>
+          <w:rFonts w:ascii="Calibri" w:hAnsi="Calibri" w:cs="Calibri"/>
+          <w:i/>
+          <w:iCs/>
+          <w:sz w:val="22"/>
+          <w:szCs w:val="22"/>
+          <w:lang w:val="en-US"/>
+        </w:rPr>
+        <w:t>tweet</w:t>
+      </w:r>
+      <w:r>
+        <w:rPr>
+          <w:rFonts w:ascii="Calibri" w:hAnsi="Calibri" w:cs="Calibri"/>
+          <w:sz w:val="22"/>
+          <w:szCs w:val="22"/>
+          <w:lang w:val="en-US"/>
+        </w:rPr>
+        <w:t xml:space="preserve"> and </w:t>
+      </w:r>
+      <w:r>
+        <w:rPr>
+          <w:rStyle w:val="CdigoHTML"/>
+          <w:rFonts w:ascii="Calibri" w:hAnsi="Calibri" w:cs="Calibri"/>
+          <w:i/>
+          <w:iCs/>
+          <w:sz w:val="22"/>
+          <w:szCs w:val="22"/>
+          <w:lang w:val="en-US"/>
+        </w:rPr>
+        <w:t>model_name</w:t>
+      </w:r>
+      <w:r>
+        <w:rPr>
+          <w:rFonts w:ascii="Calibri" w:hAnsi="Calibri" w:cs="Calibri"/>
+          <w:sz w:val="22"/>
+          <w:szCs w:val="22"/>
+          <w:lang w:val="en-US"/>
+        </w:rPr>
+        <w:t>.</w:t>
+      </w:r>
+    </w:p>
+    <w:p>
+      <w:pPr>
+        <w:pStyle w:val="font-claude-response-body"/>
+        <w:rPr>
+          <w:rFonts w:ascii="Calibri" w:hAnsi="Calibri" w:cs="Calibri"/>
+          <w:sz w:val="22"/>
+          <w:szCs w:val="22"/>
+          <w:lang w:val="en-US"/>
+        </w:rPr>
+      </w:pPr>
+      <w:r>
+        <w:rPr>
+          <w:rFonts w:ascii="Calibri" w:hAnsi="Calibri" w:cs="Calibri"/>
+          <w:i/>
+          <w:iCs/>
+          <w:sz w:val="22"/>
+          <w:szCs w:val="22"/>
+          <w:lang w:val="en-US"/>
+        </w:rPr>
+        <w:t>compare_models_on_dataset</w:t>
+      </w:r>
+      <w:r>
+        <w:rPr>
+          <w:rFonts w:ascii="Calibri" w:hAnsi="Calibri" w:cs="Calibri"/>
+          <w:sz w:val="22"/>
+          <w:szCs w:val="22"/>
+          <w:lang w:val="en-US"/>
+        </w:rPr>
+        <w:t xml:space="preserve"> runs every loaded model bundle against a labelled dataset, ranking all models by macro F1 and identifying the best performer. Its schema (</w:t>
+      </w:r>
+      <w:r>
+        <w:rPr>
+          <w:rStyle w:val="CdigoHTML"/>
+          <w:rFonts w:ascii="Calibri" w:hAnsi="Calibri" w:cs="Calibri"/>
+          <w:i/>
+          <w:iCs/>
+          <w:sz w:val="22"/>
+          <w:szCs w:val="22"/>
+          <w:lang w:val="en-US"/>
+        </w:rPr>
+        <w:t>CompareDatasetInput</w:t>
+      </w:r>
+      <w:r>
+        <w:rPr>
+          <w:rFonts w:ascii="Calibri" w:hAnsi="Calibri" w:cs="Calibri"/>
+          <w:sz w:val="22"/>
+          <w:szCs w:val="22"/>
+          <w:lang w:val="en-US"/>
+        </w:rPr>
+        <w:t xml:space="preserve">) defines </w:t>
+      </w:r>
+      <w:r>
+        <w:rPr>
+          <w:rStyle w:val="CdigoHTML"/>
+          <w:rFonts w:ascii="Calibri" w:hAnsi="Calibri" w:cs="Calibri"/>
+          <w:i/>
+          <w:iCs/>
+          <w:sz w:val="22"/>
+          <w:szCs w:val="22"/>
+          <w:lang w:val="en-US"/>
+        </w:rPr>
+        <w:lastRenderedPageBreak/>
+        <w:t>texts</w:t>
+      </w:r>
+      <w:r>
+        <w:rPr>
+          <w:rFonts w:ascii="Calibri" w:hAnsi="Calibri" w:cs="Calibri"/>
+          <w:sz w:val="22"/>
+          <w:szCs w:val="22"/>
+          <w:lang w:val="en-US"/>
+        </w:rPr>
+        <w:t xml:space="preserve"> and </w:t>
+      </w:r>
+      <w:r>
+        <w:rPr>
+          <w:rStyle w:val="CdigoHTML"/>
+          <w:rFonts w:ascii="Calibri" w:hAnsi="Calibri" w:cs="Calibri"/>
+          <w:i/>
+          <w:iCs/>
+          <w:sz w:val="22"/>
+          <w:szCs w:val="22"/>
+          <w:lang w:val="en-US"/>
+        </w:rPr>
+        <w:t>true_labels</w:t>
+      </w:r>
+      <w:r>
+        <w:rPr>
+          <w:rFonts w:ascii="Calibri" w:hAnsi="Calibri" w:cs="Calibri"/>
+          <w:sz w:val="22"/>
+          <w:szCs w:val="22"/>
+          <w:lang w:val="en-US"/>
+        </w:rPr>
+        <w:t xml:space="preserve"> as typed list fields, enabling the agent to trigger automated model comparison and selection from a single conversational prompt.</w:t>
+      </w:r>
+    </w:p>
+    <w:p>
+      <w:pPr>
+        <w:pStyle w:val="Ttulo2"/>
+      </w:pPr>
+      <w:r>
+        <w:t>Agent and Memory</w:t>
+      </w:r>
+    </w:p>
+    <w:p>
+      <w:pPr>
+        <w:pStyle w:val="Ttulo3"/>
+        <w:rPr>
+          <w:rStyle w:val="CdigoHTML"/>
+          <w:rFonts w:ascii="Calibri" w:hAnsi="Calibri" w:cs="Calibri"/>
+          <w:sz w:val="24"/>
+          <w:szCs w:val="24"/>
+        </w:rPr>
+      </w:pPr>
+      <w:r>
+        <w:rPr>
+          <w:rStyle w:val="CdigoHTML"/>
+          <w:rFonts w:ascii="Calibri" w:hAnsi="Calibri" w:cs="Calibri"/>
+          <w:sz w:val="24"/>
+          <w:szCs w:val="24"/>
+        </w:rPr>
+        <w:t>SentimentAgent Initialization</w:t>
+      </w:r>
+    </w:p>
+    <w:p>
+      <w:pPr>
+        <w:rPr>
+          <w:rFonts w:ascii="Calibri" w:hAnsi="Calibri" w:cs="Calibri"/>
+        </w:rPr>
+      </w:pPr>
+      <w:r>
+        <w:t xml:space="preserve">The conversational layer of the system is implemented through the </w:t>
+      </w:r>
+      <w:r>
+        <w:rPr>
+          <w:rFonts w:ascii="Calibri" w:eastAsia="Times New Roman" w:hAnsi="Calibri" w:cs="Calibri"/>
+          <w:i/>
+          <w:iCs/>
+        </w:rPr>
+        <w:t>SentimentAgent</w:t>
+      </w:r>
+      <w:r>
+        <w:rPr>
+          <w:rFonts w:ascii="Calibri" w:eastAsia="Times New Roman" w:hAnsi="Calibri" w:cs="Calibri"/>
+        </w:rPr>
+        <w:t xml:space="preserve"> class, which serves as the central orchestration component between the Large Language Model (LLM), the sentiment classification models, and the tool ecosystem exposed to the agent. </w:t>
+      </w:r>
+    </w:p>
+    <w:p>
+      <w:pPr>
+        <w:spacing w:before="100" w:beforeAutospacing="1" w:after="100" w:afterAutospacing="1" w:line="240" w:lineRule="auto"/>
+        <w:jc w:val="left"/>
+        <w:rPr>
+          <w:rFonts w:ascii="Calibri" w:eastAsia="Times New Roman" w:hAnsi="Calibri" w:cs="Calibri"/>
+        </w:rPr>
+      </w:pPr>
+      <w:r>
+        <w:rPr>
+          <w:rFonts w:ascii="Calibri" w:eastAsia="Times New Roman" w:hAnsi="Calibri" w:cs="Calibri"/>
+        </w:rPr>
+        <w:t>During initialization, the class receives the collection of trained model bundles and creates both the LLM instance and the set of tools available to the agent. The LLM is instantiated through Azure OpenAI's GPT-4 deployment with a temperature of 0.0, ensuring deterministic behavior and consistent tool-selection decisions. The available tools include model discovery, tweet classification, intelligent model routing, and model evaluation functions.</w:t>
+      </w:r>
+    </w:p>
+    <w:p>
+      <w:pPr>
+        <w:pStyle w:val="Ttulo3"/>
+        <w:rPr>
+          <w:rStyle w:val="CdigoHTML"/>
+          <w:rFonts w:ascii="Calibri" w:hAnsi="Calibri" w:cs="Calibri"/>
+          <w:sz w:val="24"/>
+          <w:szCs w:val="24"/>
+        </w:rPr>
+      </w:pPr>
+      <w:r>
+        <w:rPr>
+          <w:rStyle w:val="CdigoHTML"/>
+          <w:rFonts w:ascii="Calibri" w:hAnsi="Calibri" w:cs="Calibri"/>
+          <w:sz w:val="24"/>
+          <w:szCs w:val="24"/>
+        </w:rPr>
+        <w:t>Agent Creation and System Prompt Design</w:t>
+      </w:r>
+    </w:p>
+    <w:p>
+      <w:pPr>
+        <w:rPr>
+          <w:rFonts w:ascii="Calibri" w:hAnsi="Calibri" w:cs="Calibri"/>
+        </w:rPr>
+      </w:pPr>
+      <w:r>
+        <w:t xml:space="preserve">The agent instantiated using LangChain’s </w:t>
+      </w:r>
+      <w:r>
+        <w:rPr>
+          <w:i/>
+          <w:iCs/>
+        </w:rPr>
+        <w:t>create_tool_calling_agent</w:t>
+      </w:r>
+      <w:r>
+        <w:t xml:space="preserve">. </w:t>
+      </w:r>
+      <w:r>
+        <w:t>Its</w:t>
+      </w:r>
+      <w:r>
+        <w:t xml:space="preserve"> </w:t>
+      </w:r>
+      <w:r>
+        <w:t>behavior</w:t>
+      </w:r>
+      <w:r>
+        <w:t xml:space="preserve"> is governed by a custom system prompt that defines the agent’s role as a financial market tweet sentiment analysis assistant and provides explicit decision rules for tool selection. For example, request</w:t>
+      </w:r>
+      <w:r>
+        <w:t>s</w:t>
+      </w:r>
+      <w:r>
+        <w:t xml:space="preserve"> mentioning a specific model</w:t>
+      </w:r>
+      <w:r>
+        <w:t xml:space="preserve"> are routed to the classification tool, whereas requests asking for the best model trigger the routing mechanism.</w:t>
+      </w:r>
+      <w:r>
+        <w:rPr>
+          <w:rFonts w:ascii="Calibri" w:hAnsi="Calibri" w:cs="Calibri"/>
+        </w:rPr>
+        <w:t xml:space="preserve"> </w:t>
+      </w:r>
+    </w:p>
+    <w:p>
+      <w:pPr>
+        <w:rPr>
+          <w:rFonts w:ascii="Calibri" w:hAnsi="Calibri" w:cs="Calibri"/>
+        </w:rPr>
+      </w:pPr>
+      <w:r>
+        <w:rPr>
+          <w:rFonts w:ascii="Calibri" w:eastAsia="Times New Roman" w:hAnsi="Calibri" w:cs="Calibri"/>
+        </w:rPr>
+        <w:t>The prompt architecture consists of four components:</w:t>
+      </w:r>
+    </w:p>
+    <w:p>
+      <w:pPr>
+        <w:pStyle w:val="PargrafodaLista"/>
+        <w:numPr>
+          <w:ilvl w:val="0"/>
+          <w:numId w:val="16"/>
+        </w:numPr>
+        <w:rPr>
+          <w:rFonts w:ascii="Calibri" w:hAnsi="Calibri" w:cs="Calibri"/>
+        </w:rPr>
+      </w:pPr>
+      <w:r>
+        <w:rPr>
+          <w:rFonts w:ascii="Calibri" w:eastAsia="Times New Roman" w:hAnsi="Calibri" w:cs="Calibri"/>
+        </w:rPr>
+        <w:t>System Message - defines the agent's objectives, available tools, and decision guidelines.</w:t>
+      </w:r>
+    </w:p>
+    <w:p>
+      <w:pPr>
+        <w:pStyle w:val="PargrafodaLista"/>
+        <w:numPr>
+          <w:ilvl w:val="0"/>
+          <w:numId w:val="16"/>
+        </w:numPr>
+        <w:spacing w:before="100" w:beforeAutospacing="1" w:after="100" w:afterAutospacing="1" w:line="240" w:lineRule="auto"/>
+        <w:jc w:val="left"/>
+        <w:rPr>
+          <w:rFonts w:ascii="Calibri" w:eastAsia="Times New Roman" w:hAnsi="Calibri" w:cs="Calibri"/>
+        </w:rPr>
+      </w:pPr>
+      <w:r>
+        <w:rPr>
+          <w:rFonts w:ascii="Calibri" w:eastAsia="Times New Roman" w:hAnsi="Calibri" w:cs="Calibri"/>
+        </w:rPr>
+        <w:t>Chat History Placeholder - injects previous conversation turns into the prompt.</w:t>
+      </w:r>
+    </w:p>
+    <w:p>
+      <w:pPr>
+        <w:pStyle w:val="PargrafodaLista"/>
+        <w:numPr>
+          <w:ilvl w:val="0"/>
+          <w:numId w:val="16"/>
+        </w:numPr>
+        <w:spacing w:before="100" w:beforeAutospacing="1" w:after="100" w:afterAutospacing="1" w:line="240" w:lineRule="auto"/>
+        <w:jc w:val="left"/>
+        <w:rPr>
+          <w:rFonts w:ascii="Calibri" w:eastAsia="Times New Roman" w:hAnsi="Calibri" w:cs="Calibri"/>
+        </w:rPr>
+      </w:pPr>
+      <w:r>
+        <w:rPr>
+          <w:rFonts w:ascii="Calibri" w:eastAsia="Times New Roman" w:hAnsi="Calibri" w:cs="Calibri"/>
+        </w:rPr>
+        <w:t>Human Input - contains the user's current request.</w:t>
+      </w:r>
+    </w:p>
+    <w:p>
+      <w:pPr>
+        <w:pStyle w:val="PargrafodaLista"/>
+        <w:numPr>
+          <w:ilvl w:val="0"/>
+          <w:numId w:val="16"/>
+        </w:numPr>
+        <w:spacing w:before="100" w:beforeAutospacing="1" w:after="100" w:afterAutospacing="1" w:line="240" w:lineRule="auto"/>
+        <w:jc w:val="left"/>
+        <w:rPr>
+          <w:rFonts w:ascii="Calibri" w:eastAsia="Times New Roman" w:hAnsi="Calibri" w:cs="Calibri"/>
+        </w:rPr>
+      </w:pPr>
+      <w:r>
+        <w:rPr>
+          <w:rFonts w:ascii="Calibri" w:eastAsia="Times New Roman" w:hAnsi="Calibri" w:cs="Calibri"/>
+        </w:rPr>
+        <w:t>Agent Scratchpad - stores intermediate reasoning and tool-calling traces generated during execution.</w:t>
+      </w:r>
+    </w:p>
+    <w:p/>
+    <w:p>
+      <w:pPr>
+        <w:pStyle w:val="Ttulo3"/>
+        <w:rPr>
+          <w:rStyle w:val="CdigoHTML"/>
+          <w:rFonts w:ascii="Calibri" w:hAnsi="Calibri" w:cs="Calibri"/>
+          <w:sz w:val="24"/>
+          <w:szCs w:val="24"/>
+        </w:rPr>
+      </w:pPr>
+      <w:r>
+        <w:rPr>
+          <w:rStyle w:val="CdigoHTML"/>
+          <w:rFonts w:ascii="Calibri" w:hAnsi="Calibri" w:cs="Calibri"/>
+          <w:sz w:val="24"/>
+          <w:szCs w:val="24"/>
+        </w:rPr>
+        <w:t>Conversational Memory and Context Handling</w:t>
+      </w:r>
+    </w:p>
+    <w:p>
+      <w:pPr>
+        <w:rPr>
+          <w:rFonts w:ascii="Calibri" w:hAnsi="Calibri" w:cs="Calibri"/>
+        </w:rPr>
+      </w:pPr>
+      <w:r>
+        <w:t>To support</w:t>
+      </w:r>
+      <w:r>
+        <w:rPr>
+          <w:rFonts w:ascii="Calibri" w:hAnsi="Calibri" w:cs="Calibri"/>
+        </w:rPr>
+        <w:t xml:space="preserve"> </w:t>
+      </w:r>
+      <w:r>
+        <w:rPr>
+          <w:rFonts w:ascii="Calibri" w:eastAsia="Times New Roman" w:hAnsi="Calibri" w:cs="Calibri"/>
+        </w:rPr>
+        <w:t xml:space="preserve">multi-turn interactions, the system employs LangChain's </w:t>
+      </w:r>
+      <w:r>
+        <w:rPr>
+          <w:rFonts w:ascii="Calibri" w:eastAsia="Times New Roman" w:hAnsi="Calibri" w:cs="Calibri"/>
+          <w:i/>
+          <w:iCs/>
+        </w:rPr>
+        <w:t>RunnableWithMessageHistory</w:t>
+      </w:r>
+      <w:r>
+        <w:rPr>
+          <w:rFonts w:ascii="Calibri" w:eastAsia="Times New Roman" w:hAnsi="Calibri" w:cs="Calibri"/>
+        </w:rPr>
+        <w:t xml:space="preserve"> wrapper. Conversation history is stored in </w:t>
+      </w:r>
+      <w:r>
+        <w:rPr>
+          <w:rFonts w:ascii="Calibri" w:eastAsia="Times New Roman" w:hAnsi="Calibri" w:cs="Calibri"/>
+          <w:i/>
+          <w:iCs/>
+        </w:rPr>
+        <w:t>ChatMessageHistory</w:t>
+      </w:r>
+      <w:r>
+        <w:rPr>
+          <w:rFonts w:ascii="Calibri" w:eastAsia="Times New Roman" w:hAnsi="Calibri" w:cs="Calibri"/>
+        </w:rPr>
+        <w:t xml:space="preserve"> objects and indexed by session identifier. When a new message is received, the corresponding history is automatically retrieved and injected into the prompt, enabling the agent to maintain contextual awareness across multiple turns. As a result, users can refer to previous actions without restating all information. For example, after asking the agent to identify the best-performing model, a follow-up request such as </w:t>
+      </w:r>
+      <w:r>
+        <w:rPr>
+          <w:rFonts w:ascii="Calibri" w:eastAsia="Times New Roman" w:hAnsi="Calibri" w:cs="Calibri"/>
+          <w:i/>
+          <w:iCs/>
+        </w:rPr>
+        <w:t>"Classify this tweet using that model"</w:t>
+      </w:r>
+      <w:r>
+        <w:rPr>
+          <w:rFonts w:ascii="Calibri" w:eastAsia="Times New Roman" w:hAnsi="Calibri" w:cs="Calibri"/>
+        </w:rPr>
+        <w:t xml:space="preserve"> can be resolved correctly because the previous conversation state is retained</w:t>
+      </w:r>
+      <w:r>
+        <w:rPr>
+          <w:rFonts w:ascii="Calibri" w:eastAsia="Times New Roman" w:hAnsi="Calibri" w:cs="Calibri"/>
+        </w:rPr>
+        <w:t>.</w:t>
+      </w:r>
+    </w:p>
+    <w:p>
+      <w:pPr>
+        <w:pStyle w:val="Ttulo3"/>
+        <w:rPr>
+          <w:rStyle w:val="CdigoHTML"/>
+          <w:rFonts w:ascii="Calibri" w:hAnsi="Calibri" w:cs="Calibri"/>
+          <w:sz w:val="24"/>
+          <w:szCs w:val="24"/>
+        </w:rPr>
+      </w:pPr>
+      <w:r>
+        <w:rPr>
+          <w:rStyle w:val="CdigoHTML"/>
+          <w:rFonts w:ascii="Calibri" w:hAnsi="Calibri" w:cs="Calibri"/>
+          <w:sz w:val="24"/>
+          <w:szCs w:val="24"/>
+        </w:rPr>
+        <w:t>Execution Loop and Runtime Configuration</w:t>
+      </w:r>
+    </w:p>
+    <w:p>
+      <w:pPr>
+        <w:rPr>
+          <w:rFonts w:ascii="Calibri" w:hAnsi="Calibri" w:cs="Calibri"/>
+        </w:rPr>
+      </w:pPr>
+      <w:r>
+        <w:rPr>
+          <w:rFonts w:ascii="Calibri" w:eastAsia="Times New Roman" w:hAnsi="Calibri" w:cs="Calibri"/>
+        </w:rPr>
+        <w:t xml:space="preserve">The execution loop is managed through LangChain's </w:t>
+      </w:r>
+      <w:r>
+        <w:rPr>
+          <w:rFonts w:ascii="Calibri" w:eastAsia="Times New Roman" w:hAnsi="Calibri" w:cs="Calibri"/>
+          <w:i/>
+          <w:iCs/>
+        </w:rPr>
+        <w:t>AgentExecutor</w:t>
+      </w:r>
+      <w:r>
+        <w:rPr>
+          <w:rFonts w:ascii="Calibri" w:eastAsia="Times New Roman" w:hAnsi="Calibri" w:cs="Calibri"/>
+        </w:rPr>
+        <w:t xml:space="preserve">, which combines the LLM-generated reasoning process with the available tools. The executor is configured with </w:t>
+      </w:r>
+      <w:r>
+        <w:rPr>
+          <w:rFonts w:ascii="Calibri" w:eastAsia="Times New Roman" w:hAnsi="Calibri" w:cs="Calibri"/>
+          <w:i/>
+          <w:iCs/>
+        </w:rPr>
+        <w:t>handle_parsing_errors=True</w:t>
+      </w:r>
+      <w:r>
+        <w:rPr>
+          <w:rFonts w:ascii="Calibri" w:eastAsia="Times New Roman" w:hAnsi="Calibri" w:cs="Calibri"/>
+        </w:rPr>
+        <w:t>, allowing recovery from malformed tool outputs, and verbose=True, which exposes intermediate reasoning steps and tool invocations during execution.</w:t>
+      </w:r>
+    </w:p>
+    <w:p>
+      <w:pPr>
+        <w:spacing w:before="100" w:beforeAutospacing="1" w:after="100" w:afterAutospacing="1" w:line="240" w:lineRule="auto"/>
+        <w:rPr>
+          <w:rFonts w:ascii="Calibri" w:eastAsia="Times New Roman" w:hAnsi="Calibri" w:cs="Calibri"/>
+        </w:rPr>
+      </w:pPr>
+      <w:r>
+        <w:rPr>
+          <w:rFonts w:ascii="Calibri" w:eastAsia="Times New Roman" w:hAnsi="Calibri" w:cs="Calibri"/>
+        </w:rPr>
+        <w:t xml:space="preserve">Finally, the SentimentAgent class exposes a simple </w:t>
+      </w:r>
+      <w:r>
+        <w:rPr>
+          <w:rFonts w:ascii="Calibri" w:eastAsia="Times New Roman" w:hAnsi="Calibri" w:cs="Calibri"/>
+          <w:i/>
+          <w:iCs/>
+        </w:rPr>
+        <w:t>chat()</w:t>
+      </w:r>
+      <w:r>
+        <w:rPr>
+          <w:rFonts w:ascii="Calibri" w:eastAsia="Times New Roman" w:hAnsi="Calibri" w:cs="Calibri"/>
+        </w:rPr>
+        <w:t xml:space="preserve"> method that serves as the primary interface between the user and the system. Incoming messages are passed to the agent together with the corresponding session history, after which the agent autonomously determines whether a tool should </w:t>
+      </w:r>
+      <w:r>
+        <w:rPr>
+          <w:rFonts w:ascii="Calibri" w:eastAsia="Times New Roman" w:hAnsi="Calibri" w:cs="Calibri"/>
+        </w:rPr>
+        <w:lastRenderedPageBreak/>
+        <w:t xml:space="preserve">be invoked or whether a direct response can be generated. A complementary </w:t>
+      </w:r>
+      <w:r>
+        <w:rPr>
+          <w:rFonts w:ascii="Calibri" w:eastAsia="Times New Roman" w:hAnsi="Calibri" w:cs="Calibri"/>
+          <w:i/>
+          <w:iCs/>
+        </w:rPr>
+        <w:t>reset()</w:t>
+      </w:r>
+      <w:r>
+        <w:rPr>
+          <w:rFonts w:ascii="Calibri" w:eastAsia="Times New Roman" w:hAnsi="Calibri" w:cs="Calibri"/>
+        </w:rPr>
+        <w:t xml:space="preserve"> method is also provided to clear the stored conversation history and start a new session when required.</w:t>
+      </w:r>
+    </w:p>
+    <w:p>
+      <w:pPr>
+        <w:pStyle w:val="Ttulo1"/>
+      </w:pPr>
+      <w:bookmarkStart w:id="27" w:name="_Toc232112802"/>
+      <w:bookmarkStart w:id="28" w:name="_Toc410990277"/>
+      <w:bookmarkStart w:id="29" w:name="_Toc410990289"/>
+      <w:bookmarkStart w:id="30" w:name="_Toc412186402"/>
+      <w:bookmarkStart w:id="31" w:name="_Toc412186507"/>
+      <w:bookmarkStart w:id="32" w:name="_Toc412186532"/>
+      <w:bookmarkStart w:id="33" w:name="_Toc412186603"/>
+      <w:bookmarkStart w:id="34" w:name="_Toc412186633"/>
+      <w:bookmarkStart w:id="35" w:name="_Toc115296810"/>
+      <w:bookmarkStart w:id="36" w:name="_Toc141959339"/>
       <w:r>
         <w:t>Evaluation</w:t>
       </w:r>
-      <w:proofErr w:type="gramEnd"/>
       <w:r>
         <w:t xml:space="preserve"> And Results</w:t>
       </w:r>
-      <w:bookmarkEnd w:id="34"/>
-    </w:p>
-    <w:bookmarkEnd w:id="25"/>
-    <w:bookmarkEnd w:id="26"/>
-    <w:bookmarkEnd w:id="27"/>
+      <w:bookmarkEnd w:id="27"/>
+    </w:p>
     <w:bookmarkEnd w:id="28"/>
     <w:bookmarkEnd w:id="29"/>
     <w:bookmarkEnd w:id="30"/>
     <w:bookmarkEnd w:id="31"/>
     <w:bookmarkEnd w:id="32"/>
     <w:bookmarkEnd w:id="33"/>
+    <w:bookmarkEnd w:id="34"/>
+    <w:bookmarkEnd w:id="35"/>
+    <w:bookmarkEnd w:id="36"/>
     <w:p/>
     <w:p>
       <w:pPr>
@@ -3883,39 +4930,37 @@
           <w:szCs w:val="32"/>
         </w:rPr>
       </w:pPr>
-      <w:bookmarkStart w:id="35" w:name="_Toc410990278"/>
-      <w:bookmarkStart w:id="36" w:name="_Toc410990290"/>
-      <w:bookmarkStart w:id="37" w:name="_Toc412186403"/>
-      <w:bookmarkStart w:id="38" w:name="_Toc412186508"/>
-      <w:bookmarkStart w:id="39" w:name="_Toc412186533"/>
-      <w:bookmarkStart w:id="40" w:name="_Toc412186604"/>
-      <w:bookmarkStart w:id="41" w:name="_Toc412186634"/>
-      <w:bookmarkStart w:id="42" w:name="_Toc115296811"/>
-      <w:bookmarkStart w:id="43" w:name="_Toc141959340"/>
-      <w:bookmarkStart w:id="44" w:name="_Toc232112803"/>
+      <w:bookmarkStart w:id="37" w:name="_Toc410990278"/>
+      <w:bookmarkStart w:id="38" w:name="_Toc410990290"/>
+      <w:bookmarkStart w:id="39" w:name="_Toc412186403"/>
+      <w:bookmarkStart w:id="40" w:name="_Toc412186508"/>
+      <w:bookmarkStart w:id="41" w:name="_Toc412186533"/>
+      <w:bookmarkStart w:id="42" w:name="_Toc412186604"/>
+      <w:bookmarkStart w:id="43" w:name="_Toc412186634"/>
+      <w:bookmarkStart w:id="44" w:name="_Toc115296811"/>
+      <w:bookmarkStart w:id="45" w:name="_Toc141959340"/>
+      <w:bookmarkStart w:id="46" w:name="_Toc232112803"/>
       <w:r>
         <w:br w:type="page"/>
       </w:r>
     </w:p>
     <w:p>
       <w:pPr>
-        <w:pStyle w:val="Heading1"/>
+        <w:pStyle w:val="Ttulo1"/>
       </w:pPr>
       <w:r>
         <w:lastRenderedPageBreak/>
         <w:t>Appendix</w:t>
       </w:r>
-      <w:bookmarkStart w:id="45" w:name="_Toc410990279"/>
-      <w:bookmarkStart w:id="46" w:name="_Toc410990291"/>
-      <w:bookmarkStart w:id="47" w:name="_Toc412186404"/>
-      <w:bookmarkStart w:id="48" w:name="_Toc412186509"/>
-      <w:bookmarkStart w:id="49" w:name="_Toc412186534"/>
-      <w:bookmarkStart w:id="50" w:name="_Toc412186605"/>
-      <w:bookmarkStart w:id="51" w:name="_Toc412186635"/>
-      <w:bookmarkStart w:id="52" w:name="_Toc115296812"/>
-      <w:bookmarkStart w:id="53" w:name="_Toc141959341"/>
-      <w:bookmarkEnd w:id="35"/>
-      <w:bookmarkEnd w:id="36"/>
+      <w:bookmarkStart w:id="47" w:name="_Toc410990279"/>
+      <w:bookmarkStart w:id="48" w:name="_Toc410990291"/>
+      <w:bookmarkStart w:id="49" w:name="_Toc412186404"/>
+      <w:bookmarkStart w:id="50" w:name="_Toc412186509"/>
+      <w:bookmarkStart w:id="51" w:name="_Toc412186534"/>
+      <w:bookmarkStart w:id="52" w:name="_Toc412186605"/>
+      <w:bookmarkStart w:id="53" w:name="_Toc412186635"/>
+      <w:bookmarkStart w:id="54" w:name="_Toc115296812"/>
+      <w:bookmarkStart w:id="55" w:name="_Toc141959341"/>
       <w:bookmarkEnd w:id="37"/>
       <w:bookmarkEnd w:id="38"/>
       <w:bookmarkEnd w:id="39"/>
@@ -3924,13 +4969,15 @@
       <w:bookmarkEnd w:id="42"/>
       <w:bookmarkEnd w:id="43"/>
       <w:bookmarkEnd w:id="44"/>
+      <w:bookmarkEnd w:id="45"/>
+      <w:bookmarkEnd w:id="46"/>
     </w:p>
     <w:p/>
     <w:p>
       <w:pPr>
         <w:jc w:val="center"/>
       </w:pPr>
-      <w:bookmarkStart w:id="54" w:name="Figure1"/>
+      <w:bookmarkStart w:id="56" w:name="Figure1"/>
       <w:r>
         <w:rPr>
           <w:b/>
@@ -3994,7 +5041,7 @@
           </wp:anchor>
         </w:drawing>
       </w:r>
-      <w:bookmarkEnd w:id="54"/>
+      <w:bookmarkEnd w:id="56"/>
       <w:r>
         <w:rPr>
           <w:b/>
@@ -4018,7 +5065,7 @@
       <w:pPr>
         <w:jc w:val="center"/>
       </w:pPr>
-      <w:bookmarkStart w:id="55" w:name="Figure2"/>
+      <w:bookmarkStart w:id="57" w:name="Figure2"/>
       <w:r>
         <w:rPr>
           <w:b/>
@@ -4082,7 +5129,7 @@
           </wp:anchor>
         </w:drawing>
       </w:r>
-      <w:bookmarkEnd w:id="55"/>
+      <w:bookmarkEnd w:id="57"/>
       <w:r>
         <w:rPr>
           <w:b/>
@@ -4112,8 +5159,8 @@
       <w:pPr>
         <w:jc w:val="center"/>
       </w:pPr>
-      <w:bookmarkStart w:id="56" w:name="Figure4"/>
-      <w:bookmarkStart w:id="57" w:name="Figure3"/>
+      <w:bookmarkStart w:id="58" w:name="Figure4"/>
+      <w:bookmarkStart w:id="59" w:name="Figure3"/>
       <w:r>
         <w:rPr>
           <w:b/>
@@ -4177,8 +5224,8 @@
           </wp:anchor>
         </w:drawing>
       </w:r>
-      <w:bookmarkEnd w:id="56"/>
-      <w:bookmarkEnd w:id="57"/>
+      <w:bookmarkEnd w:id="58"/>
+      <w:bookmarkEnd w:id="59"/>
       <w:r>
         <w:rPr>
           <w:b/>
@@ -4216,7 +5263,7 @@
         </w:rPr>
         <w:lastRenderedPageBreak/>
         <w:drawing>
-          <wp:anchor distT="0" distB="0" distL="114300" distR="114300" simplePos="0" relativeHeight="251660288" behindDoc="1" locked="0" layoutInCell="1" allowOverlap="1" wp14:anchorId="6BE2B909" wp14:editId="78B62133">
+          <wp:anchor distT="0" distB="0" distL="114300" distR="114300" simplePos="0" relativeHeight="251660288" behindDoc="1" locked="0" layoutInCell="1" allowOverlap="1" wp14:anchorId="6BE2B909" wp14:editId="4E1F6824">
             <wp:simplePos x="0" y="0"/>
             <wp:positionH relativeFrom="page">
               <wp:posOffset>720090</wp:posOffset>
@@ -4294,7 +5341,7 @@
       <w:pPr>
         <w:jc w:val="center"/>
       </w:pPr>
-      <w:bookmarkStart w:id="58" w:name="Figure5"/>
+      <w:bookmarkStart w:id="60" w:name="Figure5"/>
       <w:r>
         <w:rPr>
           <w:noProof/>
@@ -4355,7 +5402,7 @@
           </wp:anchor>
         </w:drawing>
       </w:r>
-      <w:bookmarkEnd w:id="58"/>
+      <w:bookmarkEnd w:id="60"/>
       <w:r>
         <w:rPr>
           <w:b/>
@@ -4396,7 +5443,7 @@
       <w:pPr>
         <w:jc w:val="center"/>
       </w:pPr>
-      <w:bookmarkStart w:id="59" w:name="Figure6"/>
+      <w:bookmarkStart w:id="61" w:name="Figure6"/>
       <w:r>
         <w:rPr>
           <w:noProof/>
@@ -4604,7 +5651,7 @@
           </wp:anchor>
         </w:drawing>
       </w:r>
-      <w:bookmarkEnd w:id="59"/>
+      <w:bookmarkEnd w:id="61"/>
       <w:r>
         <w:rPr>
           <w:b/>
@@ -4646,16 +5693,14 @@
     <w:p/>
     <w:p>
       <w:pPr>
-        <w:pStyle w:val="Heading1"/>
-      </w:pPr>
-      <w:bookmarkStart w:id="60" w:name="_Annexes"/>
-      <w:bookmarkStart w:id="61" w:name="_Toc232112804"/>
-      <w:bookmarkEnd w:id="60"/>
+        <w:pStyle w:val="Ttulo1"/>
+      </w:pPr>
+      <w:bookmarkStart w:id="62" w:name="_Annexes"/>
+      <w:bookmarkStart w:id="63" w:name="_Toc232112804"/>
+      <w:bookmarkEnd w:id="62"/>
       <w:r>
         <w:t>Annexes</w:t>
       </w:r>
-      <w:bookmarkEnd w:id="45"/>
-      <w:bookmarkEnd w:id="46"/>
       <w:bookmarkEnd w:id="47"/>
       <w:bookmarkEnd w:id="48"/>
       <w:bookmarkEnd w:id="49"/>
@@ -4663,7 +5708,9 @@
       <w:bookmarkEnd w:id="51"/>
       <w:bookmarkEnd w:id="52"/>
       <w:bookmarkEnd w:id="53"/>
-      <w:bookmarkEnd w:id="61"/>
+      <w:bookmarkEnd w:id="54"/>
+      <w:bookmarkEnd w:id="55"/>
+      <w:bookmarkEnd w:id="63"/>
       <w:r>
         <w:t xml:space="preserve"> </w:t>
       </w:r>
@@ -4718,7 +5765,7 @@
     <w:sdtContent>
       <w:p>
         <w:pPr>
-          <w:pStyle w:val="Footer"/>
+          <w:pStyle w:val="Rodap"/>
         </w:pPr>
         <w:r>
           <w:fldChar w:fldCharType="begin"/>
@@ -4746,7 +5793,7 @@
   </w:sdt>
   <w:p>
     <w:pPr>
-      <w:pStyle w:val="Footer"/>
+      <w:pStyle w:val="Rodap"/>
     </w:pPr>
   </w:p>
 </w:ftr>
@@ -4794,7 +5841,7 @@
         </w:tcPr>
         <w:p>
           <w:pPr>
-            <w:pStyle w:val="Header"/>
+            <w:pStyle w:val="Cabealho"/>
           </w:pPr>
           <w:r>
             <w:rPr>
@@ -4850,7 +5897,7 @@
         </w:tcPr>
         <w:p>
           <w:pPr>
-            <w:pStyle w:val="Header"/>
+            <w:pStyle w:val="Cabealho"/>
           </w:pPr>
         </w:p>
       </w:tc>
@@ -4860,7 +5907,7 @@
         </w:tcPr>
         <w:p>
           <w:pPr>
-            <w:pStyle w:val="Header"/>
+            <w:pStyle w:val="Cabealho"/>
           </w:pPr>
         </w:p>
       </w:tc>
@@ -4868,7 +5915,7 @@
   </w:tbl>
   <w:p>
     <w:pPr>
-      <w:pStyle w:val="Header"/>
+      <w:pStyle w:val="Cabealho"/>
     </w:pPr>
   </w:p>
 </w:hdr>
@@ -4897,7 +5944,7 @@
         </w:tcPr>
         <w:p>
           <w:pPr>
-            <w:pStyle w:val="Header"/>
+            <w:pStyle w:val="Cabealho"/>
           </w:pPr>
         </w:p>
       </w:tc>
@@ -4907,7 +5954,7 @@
         </w:tcPr>
         <w:p>
           <w:pPr>
-            <w:pStyle w:val="Header"/>
+            <w:pStyle w:val="Cabealho"/>
           </w:pPr>
         </w:p>
       </w:tc>
@@ -4917,7 +5964,7 @@
         </w:tcPr>
         <w:p>
           <w:pPr>
-            <w:pStyle w:val="Header"/>
+            <w:pStyle w:val="Cabealho"/>
           </w:pPr>
         </w:p>
       </w:tc>
@@ -4925,7 +5972,7 @@
   </w:tbl>
   <w:p>
     <w:pPr>
-      <w:pStyle w:val="Header"/>
+      <w:pStyle w:val="Cabealho"/>
     </w:pPr>
   </w:p>
 </w:hdr>
@@ -5247,6 +6294,119 @@
     </w:lvl>
   </w:abstractNum>
   <w:abstractNum w:abstractNumId="3" w15:restartNumberingAfterBreak="0">
+    <w:nsid w:val="44A5393A"/>
+    <w:multiLevelType w:val="hybridMultilevel"/>
+    <w:tmpl w:val="9D3ED85C"/>
+    <w:lvl w:ilvl="0" w:tplc="08160001">
+      <w:start w:val="1"/>
+      <w:numFmt w:val="bullet"/>
+      <w:lvlText w:val=""/>
+      <w:lvlJc w:val="left"/>
+      <w:pPr>
+        <w:ind w:left="720" w:hanging="360"/>
+      </w:pPr>
+      <w:rPr>
+        <w:rFonts w:ascii="Symbol" w:hAnsi="Symbol" w:hint="default"/>
+      </w:rPr>
+    </w:lvl>
+    <w:lvl w:ilvl="1" w:tplc="08160003" w:tentative="1">
+      <w:start w:val="1"/>
+      <w:numFmt w:val="bullet"/>
+      <w:lvlText w:val="o"/>
+      <w:lvlJc w:val="left"/>
+      <w:pPr>
+        <w:ind w:left="1440" w:hanging="360"/>
+      </w:pPr>
+      <w:rPr>
+        <w:rFonts w:ascii="Courier New" w:hAnsi="Courier New" w:cs="Courier New" w:hint="default"/>
+      </w:rPr>
+    </w:lvl>
+    <w:lvl w:ilvl="2" w:tplc="08160005" w:tentative="1">
+      <w:start w:val="1"/>
+      <w:numFmt w:val="bullet"/>
+      <w:lvlText w:val=""/>
+      <w:lvlJc w:val="left"/>
+      <w:pPr>
+        <w:ind w:left="2160" w:hanging="360"/>
+      </w:pPr>
+      <w:rPr>
+        <w:rFonts w:ascii="Wingdings" w:hAnsi="Wingdings" w:hint="default"/>
+      </w:rPr>
+    </w:lvl>
+    <w:lvl w:ilvl="3" w:tplc="08160001" w:tentative="1">
+      <w:start w:val="1"/>
+      <w:numFmt w:val="bullet"/>
+      <w:lvlText w:val=""/>
+      <w:lvlJc w:val="left"/>
+      <w:pPr>
+        <w:ind w:left="2880" w:hanging="360"/>
+      </w:pPr>
+      <w:rPr>
+        <w:rFonts w:ascii="Symbol" w:hAnsi="Symbol" w:hint="default"/>
+      </w:rPr>
+    </w:lvl>
+    <w:lvl w:ilvl="4" w:tplc="08160003" w:tentative="1">
+      <w:start w:val="1"/>
+      <w:numFmt w:val="bullet"/>
+      <w:lvlText w:val="o"/>
+      <w:lvlJc w:val="left"/>
+      <w:pPr>
+        <w:ind w:left="3600" w:hanging="360"/>
+      </w:pPr>
+      <w:rPr>
+        <w:rFonts w:ascii="Courier New" w:hAnsi="Courier New" w:cs="Courier New" w:hint="default"/>
+      </w:rPr>
+    </w:lvl>
+    <w:lvl w:ilvl="5" w:tplc="08160005" w:tentative="1">
+      <w:start w:val="1"/>
+      <w:numFmt w:val="bullet"/>
+      <w:lvlText w:val=""/>
+      <w:lvlJc w:val="left"/>
+      <w:pPr>
+        <w:ind w:left="4320" w:hanging="360"/>
+      </w:pPr>
+      <w:rPr>
+        <w:rFonts w:ascii="Wingdings" w:hAnsi="Wingdings" w:hint="default"/>
+      </w:rPr>
+    </w:lvl>
+    <w:lvl w:ilvl="6" w:tplc="08160001" w:tentative="1">
+      <w:start w:val="1"/>
+      <w:numFmt w:val="bullet"/>
+      <w:lvlText w:val=""/>
+      <w:lvlJc w:val="left"/>
+      <w:pPr>
+        <w:ind w:left="5040" w:hanging="360"/>
+      </w:pPr>
+      <w:rPr>
+        <w:rFonts w:ascii="Symbol" w:hAnsi="Symbol" w:hint="default"/>
+      </w:rPr>
+    </w:lvl>
+    <w:lvl w:ilvl="7" w:tplc="08160003" w:tentative="1">
+      <w:start w:val="1"/>
+      <w:numFmt w:val="bullet"/>
+      <w:lvlText w:val="o"/>
+      <w:lvlJc w:val="left"/>
+      <w:pPr>
+        <w:ind w:left="5760" w:hanging="360"/>
+      </w:pPr>
+      <w:rPr>
+        <w:rFonts w:ascii="Courier New" w:hAnsi="Courier New" w:cs="Courier New" w:hint="default"/>
+      </w:rPr>
+    </w:lvl>
+    <w:lvl w:ilvl="8" w:tplc="08160005" w:tentative="1">
+      <w:start w:val="1"/>
+      <w:numFmt w:val="bullet"/>
+      <w:lvlText w:val=""/>
+      <w:lvlJc w:val="left"/>
+      <w:pPr>
+        <w:ind w:left="6480" w:hanging="360"/>
+      </w:pPr>
+      <w:rPr>
+        <w:rFonts w:ascii="Wingdings" w:hAnsi="Wingdings" w:hint="default"/>
+      </w:rPr>
+    </w:lvl>
+  </w:abstractNum>
+  <w:abstractNum w:abstractNumId="4" w15:restartNumberingAfterBreak="0">
     <w:nsid w:val="4B55EA7E"/>
     <w:multiLevelType w:val="hybridMultilevel"/>
     <w:tmpl w:val="FFFFFFFF"/>
@@ -5359,7 +6519,7 @@
       </w:rPr>
     </w:lvl>
   </w:abstractNum>
-  <w:abstractNum w:abstractNumId="4" w15:restartNumberingAfterBreak="0">
+  <w:abstractNum w:abstractNumId="5" w15:restartNumberingAfterBreak="0">
     <w:nsid w:val="538E3B11"/>
     <w:multiLevelType w:val="multilevel"/>
     <w:tmpl w:val="90B03702"/>
@@ -5446,7 +6606,7 @@
       </w:pPr>
     </w:lvl>
   </w:abstractNum>
-  <w:abstractNum w:abstractNumId="5" w15:restartNumberingAfterBreak="0">
+  <w:abstractNum w:abstractNumId="6" w15:restartNumberingAfterBreak="0">
     <w:nsid w:val="59C6381E"/>
     <w:multiLevelType w:val="hybridMultilevel"/>
     <w:tmpl w:val="41CC7ACA"/>
@@ -5559,7 +6719,7 @@
       </w:rPr>
     </w:lvl>
   </w:abstractNum>
-  <w:abstractNum w:abstractNumId="6" w15:restartNumberingAfterBreak="0">
+  <w:abstractNum w:abstractNumId="7" w15:restartNumberingAfterBreak="0">
     <w:nsid w:val="62052EBD"/>
     <w:multiLevelType w:val="multilevel"/>
     <w:tmpl w:val="EF460196"/>
@@ -5593,7 +6753,7 @@
     <w:lvl w:ilvl="3">
       <w:start w:val="1"/>
       <w:numFmt w:val="decimal"/>
-      <w:pStyle w:val="Heading4"/>
+      <w:pStyle w:val="Ttulo4"/>
       <w:lvlText w:val="%1.%2.%3.%4."/>
       <w:lvlJc w:val="left"/>
       <w:pPr>
@@ -5646,7 +6806,7 @@
       </w:pPr>
     </w:lvl>
   </w:abstractNum>
-  <w:abstractNum w:abstractNumId="7" w15:restartNumberingAfterBreak="0">
+  <w:abstractNum w:abstractNumId="8" w15:restartNumberingAfterBreak="0">
     <w:nsid w:val="64B4103A"/>
     <w:multiLevelType w:val="hybridMultilevel"/>
     <w:tmpl w:val="2696A324"/>
@@ -5735,7 +6895,7 @@
       </w:pPr>
     </w:lvl>
   </w:abstractNum>
-  <w:abstractNum w:abstractNumId="8" w15:restartNumberingAfterBreak="0">
+  <w:abstractNum w:abstractNumId="9" w15:restartNumberingAfterBreak="0">
     <w:nsid w:val="66B16689"/>
     <w:multiLevelType w:val="multilevel"/>
     <w:tmpl w:val="AD4EFAE0"/>
@@ -5884,7 +7044,7 @@
       </w:rPr>
     </w:lvl>
   </w:abstractNum>
-  <w:abstractNum w:abstractNumId="9" w15:restartNumberingAfterBreak="0">
+  <w:abstractNum w:abstractNumId="10" w15:restartNumberingAfterBreak="0">
     <w:nsid w:val="74CF00DC"/>
     <w:multiLevelType w:val="hybridMultilevel"/>
     <w:tmpl w:val="BAD4ED26"/>
@@ -5997,7 +7157,7 @@
       </w:rPr>
     </w:lvl>
   </w:abstractNum>
-  <w:abstractNum w:abstractNumId="10" w15:restartNumberingAfterBreak="0">
+  <w:abstractNum w:abstractNumId="11" w15:restartNumberingAfterBreak="0">
     <w:nsid w:val="759ED340"/>
     <w:multiLevelType w:val="hybridMultilevel"/>
     <w:tmpl w:val="FFFFFFFF"/>
@@ -6111,49 +7271,52 @@
     </w:lvl>
   </w:abstractNum>
   <w:num w:numId="1" w16cid:durableId="781874891">
-    <w:abstractNumId w:val="6"/>
+    <w:abstractNumId w:val="7"/>
   </w:num>
   <w:num w:numId="2" w16cid:durableId="521894879">
     <w:abstractNumId w:val="1"/>
   </w:num>
   <w:num w:numId="3" w16cid:durableId="1693727371">
+    <w:abstractNumId w:val="8"/>
+  </w:num>
+  <w:num w:numId="4" w16cid:durableId="1332566552">
     <w:abstractNumId w:val="7"/>
   </w:num>
-  <w:num w:numId="4" w16cid:durableId="1332566552">
-    <w:abstractNumId w:val="6"/>
-  </w:num>
   <w:num w:numId="5" w16cid:durableId="1375349146">
-    <w:abstractNumId w:val="6"/>
+    <w:abstractNumId w:val="7"/>
   </w:num>
   <w:num w:numId="6" w16cid:durableId="1213418178">
+    <w:abstractNumId w:val="5"/>
+  </w:num>
+  <w:num w:numId="7" w16cid:durableId="560753691">
+    <w:abstractNumId w:val="8"/>
+  </w:num>
+  <w:num w:numId="8" w16cid:durableId="172308604">
     <w:abstractNumId w:val="4"/>
   </w:num>
-  <w:num w:numId="7" w16cid:durableId="560753691">
-    <w:abstractNumId w:val="7"/>
-  </w:num>
-  <w:num w:numId="8" w16cid:durableId="172308604">
-    <w:abstractNumId w:val="3"/>
-  </w:num>
   <w:num w:numId="9" w16cid:durableId="1448891286">
-    <w:abstractNumId w:val="5"/>
+    <w:abstractNumId w:val="6"/>
   </w:num>
   <w:num w:numId="10" w16cid:durableId="1333952194">
     <w:abstractNumId w:val="0"/>
   </w:num>
   <w:num w:numId="11" w16cid:durableId="244655233">
-    <w:abstractNumId w:val="10"/>
+    <w:abstractNumId w:val="11"/>
   </w:num>
   <w:num w:numId="12" w16cid:durableId="925770493">
-    <w:abstractNumId w:val="9"/>
+    <w:abstractNumId w:val="10"/>
   </w:num>
   <w:num w:numId="13" w16cid:durableId="672299657">
     <w:abstractNumId w:val="2"/>
   </w:num>
   <w:num w:numId="14" w16cid:durableId="192882839">
-    <w:abstractNumId w:val="8"/>
+    <w:abstractNumId w:val="9"/>
   </w:num>
   <w:num w:numId="15" w16cid:durableId="941567067">
-    <w:abstractNumId w:val="6"/>
+    <w:abstractNumId w:val="7"/>
+  </w:num>
+  <w:num w:numId="16" w16cid:durableId="1913392994">
+    <w:abstractNumId w:val="3"/>
   </w:num>
 </w:numbering>
 </file>
@@ -6562,11 +7725,11 @@
       <w:lang w:val="en-US"/>
     </w:rPr>
   </w:style>
-  <w:style w:type="paragraph" w:styleId="Heading1">
+  <w:style w:type="paragraph" w:styleId="Ttulo1">
     <w:name w:val="heading 1"/>
     <w:basedOn w:val="Normal"/>
     <w:next w:val="Normal"/>
-    <w:link w:val="Heading1Char"/>
+    <w:link w:val="Ttulo1Carter"/>
     <w:uiPriority w:val="9"/>
     <w:qFormat/>
     <w:rsid w:val="00586A8E"/>
@@ -6587,11 +7750,11 @@
       <w:szCs w:val="32"/>
     </w:rPr>
   </w:style>
-  <w:style w:type="paragraph" w:styleId="Heading2">
+  <w:style w:type="paragraph" w:styleId="Ttulo2">
     <w:name w:val="heading 2"/>
     <w:basedOn w:val="Normal"/>
     <w:next w:val="Normal"/>
-    <w:link w:val="Heading2Char"/>
+    <w:link w:val="Ttulo2Carter"/>
     <w:uiPriority w:val="9"/>
     <w:unhideWhenUsed/>
     <w:qFormat/>
@@ -6610,11 +7773,11 @@
       <w:szCs w:val="28"/>
     </w:rPr>
   </w:style>
-  <w:style w:type="paragraph" w:styleId="Heading3">
+  <w:style w:type="paragraph" w:styleId="Ttulo3">
     <w:name w:val="heading 3"/>
     <w:basedOn w:val="Normal"/>
     <w:next w:val="Normal"/>
-    <w:link w:val="Heading3Char"/>
+    <w:link w:val="Ttulo3Carter"/>
     <w:uiPriority w:val="9"/>
     <w:unhideWhenUsed/>
     <w:qFormat/>
@@ -6635,11 +7798,11 @@
       <w:szCs w:val="24"/>
     </w:rPr>
   </w:style>
-  <w:style w:type="paragraph" w:styleId="Heading4">
+  <w:style w:type="paragraph" w:styleId="Ttulo4">
     <w:name w:val="heading 4"/>
     <w:basedOn w:val="Normal"/>
     <w:next w:val="Normal"/>
-    <w:link w:val="Heading4Char"/>
+    <w:link w:val="Ttulo4Carter"/>
     <w:uiPriority w:val="9"/>
     <w:unhideWhenUsed/>
     <w:qFormat/>
@@ -6666,11 +7829,11 @@
       <w:szCs w:val="26"/>
     </w:rPr>
   </w:style>
-  <w:style w:type="paragraph" w:styleId="Heading5">
+  <w:style w:type="paragraph" w:styleId="Ttulo5">
     <w:name w:val="heading 5"/>
     <w:basedOn w:val="Normal"/>
     <w:next w:val="Normal"/>
-    <w:link w:val="Heading5Char"/>
+    <w:link w:val="Ttulo5Carter"/>
     <w:uiPriority w:val="9"/>
     <w:unhideWhenUsed/>
     <w:qFormat/>
@@ -6691,12 +7854,12 @@
       <w:szCs w:val="32"/>
     </w:rPr>
   </w:style>
-  <w:style w:type="character" w:default="1" w:styleId="DefaultParagraphFont">
+  <w:style w:type="character" w:default="1" w:styleId="Tipodeletrapredefinidodopargrafo">
     <w:name w:val="Default Paragraph Font"/>
     <w:uiPriority w:val="1"/>
     <w:unhideWhenUsed/>
   </w:style>
-  <w:style w:type="table" w:default="1" w:styleId="TableNormal">
+  <w:style w:type="table" w:default="1" w:styleId="Tabelanormal">
     <w:name w:val="Normal Table"/>
     <w:uiPriority w:val="99"/>
     <w:semiHidden/>
@@ -6711,15 +7874,15 @@
       </w:tblCellMar>
     </w:tblPr>
   </w:style>
-  <w:style w:type="numbering" w:default="1" w:styleId="NoList">
+  <w:style w:type="numbering" w:default="1" w:styleId="Semlista">
     <w:name w:val="No List"/>
     <w:uiPriority w:val="99"/>
     <w:semiHidden/>
     <w:unhideWhenUsed/>
   </w:style>
-  <w:style w:type="character" w:customStyle="1" w:styleId="Heading1Char">
-    <w:name w:val="Heading 1 Char"/>
-    <w:link w:val="Heading1"/>
+  <w:style w:type="character" w:customStyle="1" w:styleId="Ttulo1Carter">
+    <w:name w:val="Título 1 Caráter"/>
+    <w:link w:val="Ttulo1"/>
     <w:uiPriority w:val="9"/>
     <w:rsid w:val="00586A8E"/>
     <w:rPr>
@@ -6733,9 +7896,9 @@
       <w:lang w:val="en-US"/>
     </w:rPr>
   </w:style>
-  <w:style w:type="character" w:customStyle="1" w:styleId="Heading2Char">
-    <w:name w:val="Heading 2 Char"/>
-    <w:link w:val="Heading2"/>
+  <w:style w:type="character" w:customStyle="1" w:styleId="Ttulo2Carter">
+    <w:name w:val="Título 2 Caráter"/>
+    <w:link w:val="Ttulo2"/>
     <w:uiPriority w:val="9"/>
     <w:rsid w:val="004672CD"/>
     <w:rPr>
@@ -6747,9 +7910,9 @@
       <w:lang w:val="en-US"/>
     </w:rPr>
   </w:style>
-  <w:style w:type="character" w:customStyle="1" w:styleId="Heading3Char">
-    <w:name w:val="Heading 3 Char"/>
-    <w:link w:val="Heading3"/>
+  <w:style w:type="character" w:customStyle="1" w:styleId="Ttulo3Carter">
+    <w:name w:val="Título 3 Caráter"/>
+    <w:link w:val="Ttulo3"/>
     <w:uiPriority w:val="9"/>
     <w:rsid w:val="004672CD"/>
     <w:rPr>
@@ -6763,9 +7926,9 @@
       <w:lang w:val="en-US"/>
     </w:rPr>
   </w:style>
-  <w:style w:type="character" w:customStyle="1" w:styleId="Heading4Char">
-    <w:name w:val="Heading 4 Char"/>
-    <w:link w:val="Heading4"/>
+  <w:style w:type="character" w:customStyle="1" w:styleId="Ttulo4Carter">
+    <w:name w:val="Título 4 Caráter"/>
+    <w:link w:val="Ttulo4"/>
     <w:uiPriority w:val="9"/>
     <w:rsid w:val="00090D29"/>
     <w:rPr>
@@ -6810,10 +7973,10 @@
       <w:rFonts w:eastAsia="Times New Roman"/>
     </w:rPr>
   </w:style>
-  <w:style w:type="paragraph" w:styleId="Header">
+  <w:style w:type="paragraph" w:styleId="Cabealho">
     <w:name w:val="header"/>
     <w:basedOn w:val="Normal"/>
-    <w:link w:val="HeaderChar"/>
+    <w:link w:val="CabealhoCarter"/>
     <w:uiPriority w:val="99"/>
     <w:unhideWhenUsed/>
     <w:rsid w:val="7979C0CF"/>
@@ -6824,10 +7987,10 @@
       </w:tabs>
     </w:pPr>
   </w:style>
-  <w:style w:type="character" w:customStyle="1" w:styleId="HeaderChar">
-    <w:name w:val="Header Char"/>
-    <w:basedOn w:val="DefaultParagraphFont"/>
-    <w:link w:val="Header"/>
+  <w:style w:type="character" w:customStyle="1" w:styleId="CabealhoCarter">
+    <w:name w:val="Cabeçalho Caráter"/>
+    <w:basedOn w:val="Tipodeletrapredefinidodopargrafo"/>
+    <w:link w:val="Cabealho"/>
     <w:uiPriority w:val="99"/>
     <w:rsid w:val="00940100"/>
     <w:rPr>
@@ -6836,10 +7999,10 @@
       <w:lang w:val="en-US" w:eastAsia="en-US"/>
     </w:rPr>
   </w:style>
-  <w:style w:type="paragraph" w:styleId="Footer">
+  <w:style w:type="paragraph" w:styleId="Rodap">
     <w:name w:val="footer"/>
     <w:basedOn w:val="Normal"/>
-    <w:link w:val="FooterChar"/>
+    <w:link w:val="RodapCarter"/>
     <w:uiPriority w:val="99"/>
     <w:unhideWhenUsed/>
     <w:rsid w:val="7979C0CF"/>
@@ -6850,10 +8013,10 @@
       </w:tabs>
     </w:pPr>
   </w:style>
-  <w:style w:type="character" w:customStyle="1" w:styleId="FooterChar">
-    <w:name w:val="Footer Char"/>
-    <w:basedOn w:val="DefaultParagraphFont"/>
-    <w:link w:val="Footer"/>
+  <w:style w:type="character" w:customStyle="1" w:styleId="RodapCarter">
+    <w:name w:val="Rodapé Caráter"/>
+    <w:basedOn w:val="Tipodeletrapredefinidodopargrafo"/>
+    <w:link w:val="Rodap"/>
     <w:uiPriority w:val="99"/>
     <w:rsid w:val="00940100"/>
     <w:rPr>
@@ -6872,7 +8035,7 @@
       <w:rFonts w:eastAsia="Times New Roman"/>
     </w:rPr>
   </w:style>
-  <w:style w:type="paragraph" w:styleId="TOC1">
+  <w:style w:type="paragraph" w:styleId="ndice1">
     <w:name w:val="toc 1"/>
     <w:basedOn w:val="Normal"/>
     <w:next w:val="Normal"/>
@@ -6891,7 +8054,7 @@
       <w:noProof/>
     </w:rPr>
   </w:style>
-  <w:style w:type="paragraph" w:styleId="TOC2">
+  <w:style w:type="paragraph" w:styleId="ndice2">
     <w:name w:val="toc 2"/>
     <w:basedOn w:val="Normal"/>
     <w:next w:val="Normal"/>
@@ -6911,7 +8074,7 @@
       <w:noProof/>
     </w:rPr>
   </w:style>
-  <w:style w:type="paragraph" w:styleId="TOC3">
+  <w:style w:type="paragraph" w:styleId="ndice3">
     <w:name w:val="toc 3"/>
     <w:basedOn w:val="Normal"/>
     <w:next w:val="Normal"/>
@@ -6931,7 +8094,7 @@
       <w:noProof/>
     </w:rPr>
   </w:style>
-  <w:style w:type="paragraph" w:styleId="TableofFigures">
+  <w:style w:type="paragraph" w:styleId="ndicedeilustraes">
     <w:name w:val="table of figures"/>
     <w:basedOn w:val="Normal"/>
     <w:next w:val="Normal"/>
@@ -6945,10 +8108,10 @@
       <w:rFonts w:eastAsia="Times New Roman"/>
     </w:rPr>
   </w:style>
-  <w:style w:type="paragraph" w:styleId="FootnoteText">
+  <w:style w:type="paragraph" w:styleId="Textodenotaderodap">
     <w:name w:val="footnote text"/>
     <w:basedOn w:val="Normal"/>
-    <w:link w:val="FootnoteTextChar"/>
+    <w:link w:val="TextodenotaderodapCarter"/>
     <w:uiPriority w:val="99"/>
     <w:unhideWhenUsed/>
     <w:rsid w:val="7979C0CF"/>
@@ -6961,9 +8124,9 @@
       <w:szCs w:val="20"/>
     </w:rPr>
   </w:style>
-  <w:style w:type="character" w:customStyle="1" w:styleId="FootnoteTextChar">
-    <w:name w:val="Footnote Text Char"/>
-    <w:link w:val="FootnoteText"/>
+  <w:style w:type="character" w:customStyle="1" w:styleId="TextodenotaderodapCarter">
+    <w:name w:val="Texto de nota de rodapé Caráter"/>
+    <w:link w:val="Textodenotaderodap"/>
     <w:uiPriority w:val="99"/>
     <w:qFormat/>
     <w:rsid w:val="00940100"/>
@@ -6972,7 +8135,7 @@
       <w:lang w:val="en-US"/>
     </w:rPr>
   </w:style>
-  <w:style w:type="character" w:styleId="FootnoteReference">
+  <w:style w:type="character" w:styleId="Refdenotaderodap">
     <w:name w:val="footnote reference"/>
     <w:uiPriority w:val="99"/>
     <w:unhideWhenUsed/>
@@ -6981,7 +8144,7 @@
       <w:vertAlign w:val="superscript"/>
     </w:rPr>
   </w:style>
-  <w:style w:type="paragraph" w:styleId="Caption">
+  <w:style w:type="paragraph" w:styleId="Legenda">
     <w:name w:val="caption"/>
     <w:basedOn w:val="Normal"/>
     <w:next w:val="Normal"/>
@@ -6998,9 +8161,9 @@
       <w:color w:val="000000" w:themeColor="text1"/>
     </w:rPr>
   </w:style>
-  <w:style w:type="table" w:styleId="TableGrid">
+  <w:style w:type="table" w:styleId="TabelacomGrelha">
     <w:name w:val="Table Grid"/>
-    <w:basedOn w:val="TableNormal"/>
+    <w:basedOn w:val="Tabelanormal"/>
     <w:uiPriority w:val="59"/>
     <w:rsid w:val="00940100"/>
     <w:rPr>
@@ -7024,7 +8187,7 @@
   </w:style>
   <w:style w:type="paragraph" w:customStyle="1" w:styleId="Lista1">
     <w:name w:val="Lista1"/>
-    <w:basedOn w:val="ListParagraph"/>
+    <w:basedOn w:val="PargrafodaLista"/>
     <w:qFormat/>
     <w:rsid w:val="000D6611"/>
     <w:pPr>
@@ -7037,7 +8200,7 @@
   </w:style>
   <w:style w:type="paragraph" w:customStyle="1" w:styleId="Listanumerada1">
     <w:name w:val="Lista numerada1"/>
-    <w:basedOn w:val="ListParagraph"/>
+    <w:basedOn w:val="PargrafodaLista"/>
     <w:qFormat/>
     <w:rsid w:val="000D6611"/>
     <w:pPr>
@@ -7050,7 +8213,7 @@
       <w:rFonts w:eastAsia="Times New Roman"/>
     </w:rPr>
   </w:style>
-  <w:style w:type="paragraph" w:styleId="ListParagraph">
+  <w:style w:type="paragraph" w:styleId="PargrafodaLista">
     <w:name w:val="List Paragraph"/>
     <w:basedOn w:val="Normal"/>
     <w:uiPriority w:val="34"/>
@@ -7061,7 +8224,7 @@
       <w:contextualSpacing/>
     </w:pPr>
   </w:style>
-  <w:style w:type="paragraph" w:styleId="TOCHeading">
+  <w:style w:type="paragraph" w:styleId="Cabealhodondice">
     <w:name w:val="TOC Heading"/>
     <w:next w:val="Normal"/>
     <w:uiPriority w:val="39"/>
@@ -7082,7 +8245,7 @@
       <w:lang w:val="en-US" w:eastAsia="en-US"/>
     </w:rPr>
   </w:style>
-  <w:style w:type="character" w:styleId="Hyperlink">
+  <w:style w:type="character" w:styleId="Hiperligao">
     <w:name w:val="Hyperlink"/>
     <w:uiPriority w:val="99"/>
     <w:unhideWhenUsed/>
@@ -7094,7 +8257,7 @@
   </w:style>
   <w:style w:type="character" w:customStyle="1" w:styleId="fontstyle01">
     <w:name w:val="fontstyle01"/>
-    <w:basedOn w:val="DefaultParagraphFont"/>
+    <w:basedOn w:val="Tipodeletrapredefinidodopargrafo"/>
     <w:rsid w:val="00F1488F"/>
     <w:rPr>
       <w:rFonts w:ascii="NewsGotT-Bol" w:hAnsi="NewsGotT-Bol" w:hint="default"/>
@@ -7109,7 +8272,7 @@
   </w:style>
   <w:style w:type="character" w:customStyle="1" w:styleId="fontstyle21">
     <w:name w:val="fontstyle21"/>
-    <w:basedOn w:val="DefaultParagraphFont"/>
+    <w:basedOn w:val="Tipodeletrapredefinidodopargrafo"/>
     <w:rsid w:val="00F1488F"/>
     <w:rPr>
       <w:rFonts w:ascii="NewsGotT-Reg" w:hAnsi="NewsGotT-Reg" w:hint="default"/>
@@ -7122,9 +8285,9 @@
       <w:szCs w:val="22"/>
     </w:rPr>
   </w:style>
-  <w:style w:type="character" w:styleId="UnresolvedMention">
+  <w:style w:type="character" w:styleId="MenoNoResolvida">
     <w:name w:val="Unresolved Mention"/>
-    <w:basedOn w:val="DefaultParagraphFont"/>
+    <w:basedOn w:val="Tipodeletrapredefinidodopargrafo"/>
     <w:uiPriority w:val="99"/>
     <w:semiHidden/>
     <w:unhideWhenUsed/>
@@ -7134,9 +8297,9 @@
       <w:shd w:val="clear" w:color="auto" w:fill="E1DFDD"/>
     </w:rPr>
   </w:style>
-  <w:style w:type="character" w:styleId="FollowedHyperlink">
+  <w:style w:type="character" w:styleId="Hiperligaovisitada">
     <w:name w:val="FollowedHyperlink"/>
-    <w:basedOn w:val="DefaultParagraphFont"/>
+    <w:basedOn w:val="Tipodeletrapredefinidodopargrafo"/>
     <w:uiPriority w:val="99"/>
     <w:semiHidden/>
     <w:unhideWhenUsed/>
@@ -7146,10 +8309,10 @@
       <w:u w:val="single"/>
     </w:rPr>
   </w:style>
-  <w:style w:type="character" w:customStyle="1" w:styleId="Heading5Char">
-    <w:name w:val="Heading 5 Char"/>
-    <w:basedOn w:val="DefaultParagraphFont"/>
-    <w:link w:val="Heading5"/>
+  <w:style w:type="character" w:customStyle="1" w:styleId="Ttulo5Carter">
+    <w:name w:val="Título 5 Caráter"/>
+    <w:basedOn w:val="Tipodeletrapredefinidodopargrafo"/>
+    <w:link w:val="Ttulo5"/>
     <w:uiPriority w:val="9"/>
     <w:rsid w:val="00D4604C"/>
     <w:rPr>
@@ -7162,7 +8325,7 @@
       <w:lang w:val="en-US" w:eastAsia="en-US"/>
     </w:rPr>
   </w:style>
-  <w:style w:type="paragraph" w:styleId="TOC4">
+  <w:style w:type="paragraph" w:styleId="ndice4">
     <w:name w:val="toc 4"/>
     <w:basedOn w:val="Normal"/>
     <w:next w:val="Normal"/>
@@ -7205,11 +8368,11 @@
       <w:vertAlign w:val="superscript"/>
     </w:rPr>
   </w:style>
-  <w:style w:type="paragraph" w:styleId="Title">
+  <w:style w:type="paragraph" w:styleId="Ttulo">
     <w:name w:val="Title"/>
     <w:basedOn w:val="Normal"/>
     <w:next w:val="Normal"/>
-    <w:link w:val="TitleChar"/>
+    <w:link w:val="TtuloCarter"/>
     <w:uiPriority w:val="10"/>
     <w:qFormat/>
     <w:rsid w:val="7979C0CF"/>
@@ -7222,10 +8385,10 @@
       <w:szCs w:val="56"/>
     </w:rPr>
   </w:style>
-  <w:style w:type="character" w:customStyle="1" w:styleId="TitleChar">
-    <w:name w:val="Title Char"/>
-    <w:basedOn w:val="DefaultParagraphFont"/>
-    <w:link w:val="Title"/>
+  <w:style w:type="character" w:customStyle="1" w:styleId="TtuloCarter">
+    <w:name w:val="Título Caráter"/>
+    <w:basedOn w:val="Tipodeletrapredefinidodopargrafo"/>
+    <w:link w:val="Ttulo"/>
     <w:uiPriority w:val="10"/>
     <w:rsid w:val="007944CF"/>
     <w:rPr>
@@ -7253,9 +8416,9 @@
       <w:lang w:val="en-GB" w:eastAsia="en-GB"/>
     </w:rPr>
   </w:style>
-  <w:style w:type="character" w:styleId="Strong">
+  <w:style w:type="character" w:styleId="Forte">
     <w:name w:val="Strong"/>
-    <w:basedOn w:val="DefaultParagraphFont"/>
+    <w:basedOn w:val="Tipodeletrapredefinidodopargrafo"/>
     <w:uiPriority w:val="22"/>
     <w:qFormat/>
     <w:rsid w:val="001E6428"/>
@@ -7264,9 +8427,9 @@
       <w:bCs/>
     </w:rPr>
   </w:style>
-  <w:style w:type="character" w:styleId="HTMLCode">
+  <w:style w:type="character" w:styleId="CdigoHTML">
     <w:name w:val="HTML Code"/>
-    <w:basedOn w:val="DefaultParagraphFont"/>
+    <w:basedOn w:val="Tipodeletrapredefinidodopargrafo"/>
     <w:uiPriority w:val="99"/>
     <w:semiHidden/>
     <w:unhideWhenUsed/>
@@ -7277,9 +8440,9 @@
       <w:szCs w:val="20"/>
     </w:rPr>
   </w:style>
-  <w:style w:type="character" w:styleId="CommentReference">
+  <w:style w:type="character" w:styleId="Refdecomentrio">
     <w:name w:val="annotation reference"/>
-    <w:basedOn w:val="DefaultParagraphFont"/>
+    <w:basedOn w:val="Tipodeletrapredefinidodopargrafo"/>
     <w:uiPriority w:val="99"/>
     <w:semiHidden/>
     <w:unhideWhenUsed/>
@@ -7289,10 +8452,10 @@
       <w:szCs w:val="16"/>
     </w:rPr>
   </w:style>
-  <w:style w:type="paragraph" w:styleId="CommentText">
+  <w:style w:type="paragraph" w:styleId="Textodecomentrio">
     <w:name w:val="annotation text"/>
     <w:basedOn w:val="Normal"/>
-    <w:link w:val="CommentTextChar"/>
+    <w:link w:val="TextodecomentrioCarter"/>
     <w:uiPriority w:val="99"/>
     <w:unhideWhenUsed/>
     <w:rsid w:val="7979C0CF"/>
@@ -7301,21 +8464,21 @@
       <w:szCs w:val="20"/>
     </w:rPr>
   </w:style>
-  <w:style w:type="character" w:customStyle="1" w:styleId="CommentTextChar">
-    <w:name w:val="Comment Text Char"/>
-    <w:basedOn w:val="DefaultParagraphFont"/>
-    <w:link w:val="CommentText"/>
+  <w:style w:type="character" w:customStyle="1" w:styleId="TextodecomentrioCarter">
+    <w:name w:val="Texto de comentário Caráter"/>
+    <w:basedOn w:val="Tipodeletrapredefinidodopargrafo"/>
+    <w:link w:val="Textodecomentrio"/>
     <w:uiPriority w:val="99"/>
     <w:rsid w:val="002E4587"/>
     <w:rPr>
       <w:lang w:val="en-US" w:eastAsia="en-US"/>
     </w:rPr>
   </w:style>
-  <w:style w:type="paragraph" w:styleId="CommentSubject">
+  <w:style w:type="paragraph" w:styleId="Assuntodecomentrio">
     <w:name w:val="annotation subject"/>
-    <w:basedOn w:val="CommentText"/>
-    <w:next w:val="CommentText"/>
-    <w:link w:val="CommentSubjectChar"/>
+    <w:basedOn w:val="Textodecomentrio"/>
+    <w:next w:val="Textodecomentrio"/>
+    <w:link w:val="AssuntodecomentrioCarter"/>
     <w:uiPriority w:val="99"/>
     <w:semiHidden/>
     <w:unhideWhenUsed/>
@@ -7325,10 +8488,10 @@
       <w:bCs/>
     </w:rPr>
   </w:style>
-  <w:style w:type="character" w:customStyle="1" w:styleId="CommentSubjectChar">
-    <w:name w:val="Comment Subject Char"/>
-    <w:basedOn w:val="CommentTextChar"/>
-    <w:link w:val="CommentSubject"/>
+  <w:style w:type="character" w:customStyle="1" w:styleId="AssuntodecomentrioCarter">
+    <w:name w:val="Assunto de comentário Caráter"/>
+    <w:basedOn w:val="TextodecomentrioCarter"/>
+    <w:link w:val="Assuntodecomentrio"/>
     <w:uiPriority w:val="99"/>
     <w:semiHidden/>
     <w:rsid w:val="002E4587"/>
@@ -7338,14 +8501,29 @@
       <w:lang w:val="en-US" w:eastAsia="en-US"/>
     </w:rPr>
   </w:style>
-  <w:style w:type="character" w:styleId="PlaceholderText">
+  <w:style w:type="character" w:styleId="TextodoMarcadordePosio">
     <w:name w:val="Placeholder Text"/>
-    <w:basedOn w:val="DefaultParagraphFont"/>
+    <w:basedOn w:val="Tipodeletrapredefinidodopargrafo"/>
     <w:uiPriority w:val="99"/>
     <w:semiHidden/>
     <w:rsid w:val="006D5055"/>
     <w:rPr>
       <w:color w:val="666666"/>
+    </w:rPr>
+  </w:style>
+  <w:style w:type="paragraph" w:customStyle="1" w:styleId="font-claude-response-body">
+    <w:name w:val="font-claude-response-body"/>
+    <w:basedOn w:val="Normal"/>
+    <w:rsid w:val="00593E5B"/>
+    <w:pPr>
+      <w:spacing w:before="100" w:beforeAutospacing="1" w:after="100" w:afterAutospacing="1" w:line="240" w:lineRule="auto"/>
+      <w:jc w:val="left"/>
+    </w:pPr>
+    <w:rPr>
+      <w:rFonts w:ascii="Times New Roman" w:eastAsia="Times New Roman" w:hAnsi="Times New Roman" w:cs="Times New Roman"/>
+      <w:sz w:val="24"/>
+      <w:szCs w:val="24"/>
+      <w:lang w:val="pt-PT"/>
     </w:rPr>
   </w:style>
 </w:styles>
@@ -7653,19 +8831,6 @@
 </file>
 
 <file path=customXml/item2.xml><?xml version="1.0" encoding="utf-8"?>
-<b:Sources xmlns:b="http://schemas.openxmlformats.org/officeDocument/2006/bibliography" xmlns="http://schemas.openxmlformats.org/officeDocument/2006/bibliography" SelectedStyle="\APASixthEditionOfficeOnline.xsl" StyleName="APA" Version="6"/>
-</file>
-
-<file path=customXml/item3.xml><?xml version="1.0" encoding="utf-8"?>
-<?mso-contentType ?>
-<FormTemplates xmlns="http://schemas.microsoft.com/sharepoint/v3/contenttype/forms">
-  <Display>DocumentLibraryForm</Display>
-  <Edit>DocumentLibraryForm</Edit>
-  <New>DocumentLibraryForm</New>
-</FormTemplates>
-</file>
-
-<file path=customXml/item4.xml><?xml version="1.0" encoding="utf-8"?>
 <ct:contentTypeSchema xmlns:ct="http://schemas.microsoft.com/office/2006/metadata/contentType" xmlns:ma="http://schemas.microsoft.com/office/2006/metadata/properties/metaAttributes" ct:_="" ma:_="" ma:contentTypeName="Document" ma:contentTypeID="0x010100B3D3540E55593C4EB1DE67B7F8AAE2D7" ma:contentTypeVersion="4" ma:contentTypeDescription="Create a new document." ma:contentTypeScope="" ma:versionID="f90533ddb121303acd1ffe5ebae05d10">
   <xsd:schema xmlns:xsd="http://www.w3.org/2001/XMLSchema" xmlns:xs="http://www.w3.org/2001/XMLSchema" xmlns:p="http://schemas.microsoft.com/office/2006/metadata/properties" xmlns:ns3="4db13818-c84e-44f1-ae00-44df83455ab8" targetNamespace="http://schemas.microsoft.com/office/2006/metadata/properties" ma:root="true" ma:fieldsID="f0407362e9002ea0f40fdfa301f1b764" ns3:_="">
     <xsd:import namespace="4db13818-c84e-44f1-ae00-44df83455ab8"/>
@@ -7809,6 +8974,19 @@
 </ct:contentTypeSchema>
 </file>
 
+<file path=customXml/item3.xml><?xml version="1.0" encoding="utf-8"?>
+<?mso-contentType ?>
+<FormTemplates xmlns="http://schemas.microsoft.com/sharepoint/v3/contenttype/forms">
+  <Display>DocumentLibraryForm</Display>
+  <Edit>DocumentLibraryForm</Edit>
+  <New>DocumentLibraryForm</New>
+</FormTemplates>
+</file>
+
+<file path=customXml/item4.xml><?xml version="1.0" encoding="utf-8"?>
+<b:Sources xmlns:b="http://schemas.openxmlformats.org/officeDocument/2006/bibliography" xmlns="http://schemas.openxmlformats.org/officeDocument/2006/bibliography" SelectedStyle="\APASixthEditionOfficeOnline.xsl" StyleName="APA" Version="6"/>
+</file>
+
 <file path=customXml/itemProps1.xml><?xml version="1.0" encoding="utf-8"?>
 <ds:datastoreItem xmlns:ds="http://schemas.openxmlformats.org/officeDocument/2006/customXml" ds:itemID="{FA1E1BA7-7F9D-4F2A-A01A-7DD974292B82}">
   <ds:schemaRefs>
@@ -7819,22 +8997,6 @@
 </file>
 
 <file path=customXml/itemProps2.xml><?xml version="1.0" encoding="utf-8"?>
-<ds:datastoreItem xmlns:ds="http://schemas.openxmlformats.org/officeDocument/2006/customXml" ds:itemID="{AEAB09FA-131D-430F-B505-EEAD1AC2D1DB}">
-  <ds:schemaRefs>
-    <ds:schemaRef ds:uri="http://schemas.openxmlformats.org/officeDocument/2006/bibliography"/>
-  </ds:schemaRefs>
-</ds:datastoreItem>
-</file>
-
-<file path=customXml/itemProps3.xml><?xml version="1.0" encoding="utf-8"?>
-<ds:datastoreItem xmlns:ds="http://schemas.openxmlformats.org/officeDocument/2006/customXml" ds:itemID="{59B26DD8-52A3-42CA-81B0-F4B8F09A41AF}">
-  <ds:schemaRefs>
-    <ds:schemaRef ds:uri="http://schemas.microsoft.com/sharepoint/v3/contenttype/forms"/>
-  </ds:schemaRefs>
-</ds:datastoreItem>
-</file>
-
-<file path=customXml/itemProps4.xml><?xml version="1.0" encoding="utf-8"?>
 <ds:datastoreItem xmlns:ds="http://schemas.openxmlformats.org/officeDocument/2006/customXml" ds:itemID="{A477EE12-4B1B-4624-A466-22E1B8E6DAA8}">
   <ds:schemaRefs>
     <ds:schemaRef ds:uri="http://schemas.microsoft.com/office/2006/metadata/contentType"/>
@@ -7850,4 +9012,20 @@
     <ds:schemaRef ds:uri="http://schemas.microsoft.com/internal/obd"/>
   </ds:schemaRefs>
 </ds:datastoreItem>
+</file>
+
+<file path=customXml/itemProps3.xml><?xml version="1.0" encoding="utf-8"?>
+<ds:datastoreItem xmlns:ds="http://schemas.openxmlformats.org/officeDocument/2006/customXml" ds:itemID="{59B26DD8-52A3-42CA-81B0-F4B8F09A41AF}">
+  <ds:schemaRefs>
+    <ds:schemaRef ds:uri="http://schemas.microsoft.com/sharepoint/v3/contenttype/forms"/>
+  </ds:schemaRefs>
+</ds:datastoreItem>
+</file>
+
+<file path=customXml/itemProps4.xml><?xml version="1.0" encoding="utf-8"?>
+<ds:datastoreItem xmlns:ds="http://schemas.openxmlformats.org/officeDocument/2006/customXml" ds:itemID="{AEAB09FA-131D-430F-B505-EEAD1AC2D1DB}">
+  <ds:schemaRefs>
+    <ds:schemaRef ds:uri="http://schemas.openxmlformats.org/officeDocument/2006/bibliography"/>
+  </ds:schemaRefs>
+</ds:datastoreItem>
 </file>
</xml_diff>

<commit_message>
*UPDATED* report with evaluation and results
</commit_message>
<xml_diff>
--- a/Text_Mining_Report.docx
+++ b/Text_Mining_Report.docx
@@ -18,7 +18,7 @@
           <w:noProof/>
         </w:rPr>
         <w:drawing>
-          <wp:anchor distT="0" distB="0" distL="114300" distR="114300" simplePos="0" relativeHeight="251665408" behindDoc="0" locked="0" layoutInCell="1" allowOverlap="1" wp14:anchorId="1C34D2D7" wp14:editId="71F46E25">
+          <wp:anchor distT="0" distB="0" distL="114300" distR="114300" simplePos="0" relativeHeight="251665408" behindDoc="0" locked="0" layoutInCell="1" allowOverlap="1" wp14:anchorId="1C34D2D7" wp14:editId="10EB3FB0">
             <wp:simplePos x="0" y="0"/>
             <wp:positionH relativeFrom="page">
               <wp:align>left</wp:align>
@@ -90,7 +90,7 @@
     </w:p>
     <w:p>
       <w:pPr>
-        <w:pStyle w:val="Title"/>
+        <w:pStyle w:val="Ttulo"/>
         <w:jc w:val="center"/>
         <w:rPr>
           <w:rFonts w:asciiTheme="minorHAnsi" w:hAnsiTheme="minorHAnsi" w:cstheme="minorBidi"/>
@@ -142,7 +142,7 @@
     <w:p/>
     <w:p>
       <w:pPr>
-        <w:pStyle w:val="Title"/>
+        <w:pStyle w:val="Ttulo"/>
         <w:jc w:val="center"/>
         <w:rPr>
           <w:rFonts w:asciiTheme="minorHAnsi" w:hAnsiTheme="minorHAnsi" w:cstheme="minorBidi"/>
@@ -443,7 +443,7 @@
     </w:p>
     <w:tbl>
       <w:tblPr>
-        <w:tblStyle w:val="TableGrid"/>
+        <w:tblStyle w:val="TabelacomGrelha"/>
         <w:tblW w:w="0" w:type="auto"/>
         <w:tblLook w:val="04A0" w:firstRow="1" w:lastRow="0" w:firstColumn="1" w:lastColumn="0" w:noHBand="0" w:noVBand="1"/>
       </w:tblPr>
@@ -542,7 +542,7 @@
     </w:p>
     <w:p>
       <w:pPr>
-        <w:pStyle w:val="TOC1"/>
+        <w:pStyle w:val="ndice1"/>
         <w:spacing w:before="240" w:after="0"/>
         <w:jc w:val="center"/>
         <w:rPr>
@@ -599,7 +599,7 @@
       <w:sdtContent>
         <w:p>
           <w:pPr>
-            <w:pStyle w:val="TOC1"/>
+            <w:pStyle w:val="ndice1"/>
             <w:rPr>
               <w:rFonts w:eastAsiaTheme="minorEastAsia" w:cstheme="minorBidi"/>
               <w:kern w:val="2"/>
@@ -621,7 +621,7 @@
           <w:hyperlink w:anchor="_Toc232200561" w:history="1">
             <w:r>
               <w:rPr>
-                <w:rStyle w:val="Hyperlink"/>
+                <w:rStyle w:val="Hiperligao"/>
               </w:rPr>
               <w:t>Project Overview</w:t>
             </w:r>
@@ -670,7 +670,7 @@
         </w:p>
         <w:p>
           <w:pPr>
-            <w:pStyle w:val="TOC1"/>
+            <w:pStyle w:val="ndice1"/>
             <w:rPr>
               <w:rFonts w:eastAsiaTheme="minorEastAsia" w:cstheme="minorBidi"/>
               <w:kern w:val="2"/>
@@ -683,7 +683,7 @@
           <w:hyperlink w:anchor="_Toc232200562" w:history="1">
             <w:r>
               <w:rPr>
-                <w:rStyle w:val="Hyperlink"/>
+                <w:rStyle w:val="Hiperligao"/>
               </w:rPr>
               <w:t>Data Analysis</w:t>
             </w:r>
@@ -732,7 +732,7 @@
         </w:p>
         <w:p>
           <w:pPr>
-            <w:pStyle w:val="TOC2"/>
+            <w:pStyle w:val="ndice2"/>
             <w:rPr>
               <w:rFonts w:eastAsiaTheme="minorEastAsia" w:cstheme="minorBidi"/>
               <w:kern w:val="2"/>
@@ -745,7 +745,7 @@
           <w:hyperlink w:anchor="_Toc232200563" w:history="1">
             <w:r>
               <w:rPr>
-                <w:rStyle w:val="Hyperlink"/>
+                <w:rStyle w:val="Hiperligao"/>
               </w:rPr>
               <w:t>Data Description</w:t>
             </w:r>
@@ -794,7 +794,7 @@
         </w:p>
         <w:p>
           <w:pPr>
-            <w:pStyle w:val="TOC2"/>
+            <w:pStyle w:val="ndice2"/>
             <w:rPr>
               <w:rFonts w:eastAsiaTheme="minorEastAsia" w:cstheme="minorBidi"/>
               <w:kern w:val="2"/>
@@ -807,7 +807,7 @@
           <w:hyperlink w:anchor="_Toc232200564" w:history="1">
             <w:r>
               <w:rPr>
-                <w:rStyle w:val="Hyperlink"/>
+                <w:rStyle w:val="Hiperligao"/>
               </w:rPr>
               <w:t>Data Exploration</w:t>
             </w:r>
@@ -856,7 +856,7 @@
         </w:p>
         <w:p>
           <w:pPr>
-            <w:pStyle w:val="TOC1"/>
+            <w:pStyle w:val="ndice1"/>
             <w:rPr>
               <w:rFonts w:eastAsiaTheme="minorEastAsia" w:cstheme="minorBidi"/>
               <w:kern w:val="2"/>
@@ -869,7 +869,7 @@
           <w:hyperlink w:anchor="_Toc232200565" w:history="1">
             <w:r>
               <w:rPr>
-                <w:rStyle w:val="Hyperlink"/>
+                <w:rStyle w:val="Hiperligao"/>
               </w:rPr>
               <w:t>Data Preprocessing</w:t>
             </w:r>
@@ -918,7 +918,7 @@
         </w:p>
         <w:p>
           <w:pPr>
-            <w:pStyle w:val="TOC1"/>
+            <w:pStyle w:val="ndice1"/>
             <w:rPr>
               <w:rFonts w:eastAsiaTheme="minorEastAsia" w:cstheme="minorBidi"/>
               <w:kern w:val="2"/>
@@ -931,7 +931,7 @@
           <w:hyperlink w:anchor="_Toc232200566" w:history="1">
             <w:r>
               <w:rPr>
-                <w:rStyle w:val="Hyperlink"/>
+                <w:rStyle w:val="Hiperligao"/>
               </w:rPr>
               <w:t>Feature Engineering</w:t>
             </w:r>
@@ -980,7 +980,7 @@
         </w:p>
         <w:p>
           <w:pPr>
-            <w:pStyle w:val="TOC2"/>
+            <w:pStyle w:val="ndice2"/>
             <w:rPr>
               <w:rFonts w:eastAsiaTheme="minorEastAsia" w:cstheme="minorBidi"/>
               <w:kern w:val="2"/>
@@ -993,7 +993,7 @@
           <w:hyperlink w:anchor="_Toc232200567" w:history="1">
             <w:r>
               <w:rPr>
-                <w:rStyle w:val="Hyperlink"/>
+                <w:rStyle w:val="Hiperligao"/>
               </w:rPr>
               <w:t>Bag-of-Words and TF-IDF Representation</w:t>
             </w:r>
@@ -1042,7 +1042,7 @@
         </w:p>
         <w:p>
           <w:pPr>
-            <w:pStyle w:val="TOC2"/>
+            <w:pStyle w:val="ndice2"/>
             <w:rPr>
               <w:rFonts w:eastAsiaTheme="minorEastAsia" w:cstheme="minorBidi"/>
               <w:kern w:val="2"/>
@@ -1055,7 +1055,7 @@
           <w:hyperlink w:anchor="_Toc232200568" w:history="1">
             <w:r>
               <w:rPr>
-                <w:rStyle w:val="Hyperlink"/>
+                <w:rStyle w:val="Hiperligao"/>
               </w:rPr>
               <w:t>Word2Vec Embeddings</w:t>
             </w:r>
@@ -1104,7 +1104,7 @@
         </w:p>
         <w:p>
           <w:pPr>
-            <w:pStyle w:val="TOC1"/>
+            <w:pStyle w:val="ndice1"/>
             <w:rPr>
               <w:rFonts w:eastAsiaTheme="minorEastAsia" w:cstheme="minorBidi"/>
               <w:kern w:val="2"/>
@@ -1117,7 +1117,7 @@
           <w:hyperlink w:anchor="_Toc232200569" w:history="1">
             <w:r>
               <w:rPr>
-                <w:rStyle w:val="Hyperlink"/>
+                <w:rStyle w:val="Hiperligao"/>
               </w:rPr>
               <w:t>Classification Models</w:t>
             </w:r>
@@ -1166,7 +1166,7 @@
         </w:p>
         <w:p>
           <w:pPr>
-            <w:pStyle w:val="TOC2"/>
+            <w:pStyle w:val="ndice2"/>
             <w:rPr>
               <w:rFonts w:eastAsiaTheme="minorEastAsia" w:cstheme="minorBidi"/>
               <w:kern w:val="2"/>
@@ -1179,7 +1179,7 @@
           <w:hyperlink w:anchor="_Toc232200570" w:history="1">
             <w:r>
               <w:rPr>
-                <w:rStyle w:val="Hyperlink"/>
+                <w:rStyle w:val="Hiperligao"/>
               </w:rPr>
               <w:t>Corpus Split and Validation Strategy</w:t>
             </w:r>
@@ -1228,7 +1228,7 @@
         </w:p>
         <w:p>
           <w:pPr>
-            <w:pStyle w:val="TOC2"/>
+            <w:pStyle w:val="ndice2"/>
             <w:rPr>
               <w:rFonts w:eastAsiaTheme="minorEastAsia" w:cstheme="minorBidi"/>
               <w:kern w:val="2"/>
@@ -1241,7 +1241,7 @@
           <w:hyperlink w:anchor="_Toc232200571" w:history="1">
             <w:r>
               <w:rPr>
-                <w:rStyle w:val="Hyperlink"/>
+                <w:rStyle w:val="Hiperligao"/>
               </w:rPr>
               <w:t>Traditional ML Models</w:t>
             </w:r>
@@ -1290,7 +1290,7 @@
         </w:p>
         <w:p>
           <w:pPr>
-            <w:pStyle w:val="TOC3"/>
+            <w:pStyle w:val="ndice3"/>
             <w:rPr>
               <w:rFonts w:eastAsiaTheme="minorEastAsia" w:cstheme="minorBidi"/>
               <w:kern w:val="2"/>
@@ -1303,7 +1303,7 @@
           <w:hyperlink w:anchor="_Toc232200572" w:history="1">
             <w:r>
               <w:rPr>
-                <w:rStyle w:val="Hyperlink"/>
+                <w:rStyle w:val="Hiperligao"/>
               </w:rPr>
               <w:t>Logistic Regression</w:t>
             </w:r>
@@ -1352,7 +1352,7 @@
         </w:p>
         <w:p>
           <w:pPr>
-            <w:pStyle w:val="TOC3"/>
+            <w:pStyle w:val="ndice3"/>
             <w:rPr>
               <w:rFonts w:eastAsiaTheme="minorEastAsia" w:cstheme="minorBidi"/>
               <w:kern w:val="2"/>
@@ -1365,7 +1365,7 @@
           <w:hyperlink w:anchor="_Toc232200573" w:history="1">
             <w:r>
               <w:rPr>
-                <w:rStyle w:val="Hyperlink"/>
+                <w:rStyle w:val="Hiperligao"/>
               </w:rPr>
               <w:t>Random Forest</w:t>
             </w:r>
@@ -1414,7 +1414,7 @@
         </w:p>
         <w:p>
           <w:pPr>
-            <w:pStyle w:val="TOC3"/>
+            <w:pStyle w:val="ndice3"/>
             <w:rPr>
               <w:rFonts w:eastAsiaTheme="minorEastAsia" w:cstheme="minorBidi"/>
               <w:kern w:val="2"/>
@@ -1427,7 +1427,7 @@
           <w:hyperlink w:anchor="_Toc232200574" w:history="1">
             <w:r>
               <w:rPr>
-                <w:rStyle w:val="Hyperlink"/>
+                <w:rStyle w:val="Hiperligao"/>
               </w:rPr>
               <w:t>XGBoost</w:t>
             </w:r>
@@ -1476,7 +1476,7 @@
         </w:p>
         <w:p>
           <w:pPr>
-            <w:pStyle w:val="TOC2"/>
+            <w:pStyle w:val="ndice2"/>
             <w:rPr>
               <w:rFonts w:eastAsiaTheme="minorEastAsia" w:cstheme="minorBidi"/>
               <w:kern w:val="2"/>
@@ -1489,7 +1489,7 @@
           <w:hyperlink w:anchor="_Toc232200575" w:history="1">
             <w:r>
               <w:rPr>
-                <w:rStyle w:val="Hyperlink"/>
+                <w:rStyle w:val="Hiperligao"/>
               </w:rPr>
               <w:t>Transformer-based Models</w:t>
             </w:r>
@@ -1538,7 +1538,7 @@
         </w:p>
         <w:p>
           <w:pPr>
-            <w:pStyle w:val="TOC3"/>
+            <w:pStyle w:val="ndice3"/>
             <w:rPr>
               <w:rFonts w:eastAsiaTheme="minorEastAsia" w:cstheme="minorBidi"/>
               <w:kern w:val="2"/>
@@ -1551,7 +1551,7 @@
           <w:hyperlink w:anchor="_Toc232200576" w:history="1">
             <w:r>
               <w:rPr>
-                <w:rStyle w:val="Hyperlink"/>
+                <w:rStyle w:val="Hiperligao"/>
               </w:rPr>
               <w:t>BERT</w:t>
             </w:r>
@@ -1600,7 +1600,7 @@
         </w:p>
         <w:p>
           <w:pPr>
-            <w:pStyle w:val="TOC3"/>
+            <w:pStyle w:val="ndice3"/>
             <w:rPr>
               <w:rFonts w:eastAsiaTheme="minorEastAsia" w:cstheme="minorBidi"/>
               <w:kern w:val="2"/>
@@ -1613,7 +1613,7 @@
           <w:hyperlink w:anchor="_Toc232200577" w:history="1">
             <w:r>
               <w:rPr>
-                <w:rStyle w:val="Hyperlink"/>
+                <w:rStyle w:val="Hiperligao"/>
               </w:rPr>
               <w:t>DistilBERT</w:t>
             </w:r>
@@ -1662,7 +1662,7 @@
         </w:p>
         <w:p>
           <w:pPr>
-            <w:pStyle w:val="TOC3"/>
+            <w:pStyle w:val="ndice3"/>
             <w:rPr>
               <w:rFonts w:eastAsiaTheme="minorEastAsia" w:cstheme="minorBidi"/>
               <w:kern w:val="2"/>
@@ -1675,7 +1675,7 @@
           <w:hyperlink w:anchor="_Toc232200578" w:history="1">
             <w:r>
               <w:rPr>
-                <w:rStyle w:val="Hyperlink"/>
+                <w:rStyle w:val="Hiperligao"/>
               </w:rPr>
               <w:t>FinBERT</w:t>
             </w:r>
@@ -1724,7 +1724,7 @@
         </w:p>
         <w:p>
           <w:pPr>
-            <w:pStyle w:val="TOC3"/>
+            <w:pStyle w:val="ndice3"/>
             <w:rPr>
               <w:rFonts w:eastAsiaTheme="minorEastAsia" w:cstheme="minorBidi"/>
               <w:kern w:val="2"/>
@@ -1737,7 +1737,7 @@
           <w:hyperlink w:anchor="_Toc232200579" w:history="1">
             <w:r>
               <w:rPr>
-                <w:rStyle w:val="Hyperlink"/>
+                <w:rStyle w:val="Hiperligao"/>
               </w:rPr>
               <w:t>FLAN-T5</w:t>
             </w:r>
@@ -1786,7 +1786,7 @@
         </w:p>
         <w:p>
           <w:pPr>
-            <w:pStyle w:val="TOC1"/>
+            <w:pStyle w:val="ndice1"/>
             <w:rPr>
               <w:rFonts w:eastAsiaTheme="minorEastAsia" w:cstheme="minorBidi"/>
               <w:kern w:val="2"/>
@@ -1799,7 +1799,7 @@
           <w:hyperlink w:anchor="_Toc232200580" w:history="1">
             <w:r>
               <w:rPr>
-                <w:rStyle w:val="Hyperlink"/>
+                <w:rStyle w:val="Hiperligao"/>
               </w:rPr>
               <w:t>Hyperparameter Optimisation</w:t>
             </w:r>
@@ -1848,7 +1848,7 @@
         </w:p>
         <w:p>
           <w:pPr>
-            <w:pStyle w:val="TOC1"/>
+            <w:pStyle w:val="ndice1"/>
             <w:rPr>
               <w:rFonts w:eastAsiaTheme="minorEastAsia" w:cstheme="minorBidi"/>
               <w:kern w:val="2"/>
@@ -1861,7 +1861,7 @@
           <w:hyperlink w:anchor="_Toc232200581" w:history="1">
             <w:r>
               <w:rPr>
-                <w:rStyle w:val="Hyperlink"/>
+                <w:rStyle w:val="Hiperligao"/>
               </w:rPr>
               <w:t>Extra Challenge 2</w:t>
             </w:r>
@@ -1910,7 +1910,7 @@
         </w:p>
         <w:p>
           <w:pPr>
-            <w:pStyle w:val="TOC2"/>
+            <w:pStyle w:val="ndice2"/>
             <w:rPr>
               <w:rFonts w:eastAsiaTheme="minorEastAsia" w:cstheme="minorBidi"/>
               <w:kern w:val="2"/>
@@ -1923,7 +1923,7 @@
           <w:hyperlink w:anchor="_Toc232200582" w:history="1">
             <w:r>
               <w:rPr>
-                <w:rStyle w:val="Hyperlink"/>
+                <w:rStyle w:val="Hiperligao"/>
               </w:rPr>
               <w:t>Architecture Overview</w:t>
             </w:r>
@@ -1972,7 +1972,7 @@
         </w:p>
         <w:p>
           <w:pPr>
-            <w:pStyle w:val="TOC2"/>
+            <w:pStyle w:val="ndice2"/>
             <w:rPr>
               <w:rFonts w:eastAsiaTheme="minorEastAsia" w:cstheme="minorBidi"/>
               <w:kern w:val="2"/>
@@ -1985,7 +1985,7 @@
           <w:hyperlink w:anchor="_Toc232200583" w:history="1">
             <w:r>
               <w:rPr>
-                <w:rStyle w:val="Hyperlink"/>
+                <w:rStyle w:val="Hiperligao"/>
               </w:rPr>
               <w:t>Tools</w:t>
             </w:r>
@@ -2034,7 +2034,7 @@
         </w:p>
         <w:p>
           <w:pPr>
-            <w:pStyle w:val="TOC3"/>
+            <w:pStyle w:val="ndice3"/>
             <w:rPr>
               <w:rFonts w:eastAsiaTheme="minorEastAsia" w:cstheme="minorBidi"/>
               <w:kern w:val="2"/>
@@ -2047,7 +2047,7 @@
           <w:hyperlink w:anchor="_Toc232200584" w:history="1">
             <w:r>
               <w:rPr>
-                <w:rStyle w:val="Hyperlink"/>
+                <w:rStyle w:val="Hiperligao"/>
                 <w:rFonts w:ascii="Calibri" w:hAnsi="Calibri" w:cs="Calibri"/>
               </w:rPr>
               <w:t>Single-Argument Tools (@tool)</w:t>
@@ -2097,7 +2097,7 @@
         </w:p>
         <w:p>
           <w:pPr>
-            <w:pStyle w:val="TOC3"/>
+            <w:pStyle w:val="ndice3"/>
             <w:rPr>
               <w:rFonts w:eastAsiaTheme="minorEastAsia" w:cstheme="minorBidi"/>
               <w:kern w:val="2"/>
@@ -2110,7 +2110,7 @@
           <w:hyperlink w:anchor="_Toc232200585" w:history="1">
             <w:r>
               <w:rPr>
-                <w:rStyle w:val="Hyperlink"/>
+                <w:rStyle w:val="Hiperligao"/>
                 <w:rFonts w:ascii="Calibri" w:hAnsi="Calibri" w:cs="Calibri"/>
               </w:rPr>
               <w:t>Multi-Argument Tools (StructuredTool)</w:t>
@@ -2160,7 +2160,7 @@
         </w:p>
         <w:p>
           <w:pPr>
-            <w:pStyle w:val="TOC2"/>
+            <w:pStyle w:val="ndice2"/>
             <w:rPr>
               <w:rFonts w:eastAsiaTheme="minorEastAsia" w:cstheme="minorBidi"/>
               <w:kern w:val="2"/>
@@ -2173,7 +2173,7 @@
           <w:hyperlink w:anchor="_Toc232200586" w:history="1">
             <w:r>
               <w:rPr>
-                <w:rStyle w:val="Hyperlink"/>
+                <w:rStyle w:val="Hiperligao"/>
               </w:rPr>
               <w:t>Agent and Memory</w:t>
             </w:r>
@@ -2222,7 +2222,7 @@
         </w:p>
         <w:p>
           <w:pPr>
-            <w:pStyle w:val="TOC3"/>
+            <w:pStyle w:val="ndice3"/>
             <w:rPr>
               <w:rFonts w:eastAsiaTheme="minorEastAsia" w:cstheme="minorBidi"/>
               <w:kern w:val="2"/>
@@ -2235,7 +2235,7 @@
           <w:hyperlink w:anchor="_Toc232200587" w:history="1">
             <w:r>
               <w:rPr>
-                <w:rStyle w:val="Hyperlink"/>
+                <w:rStyle w:val="Hiperligao"/>
                 <w:rFonts w:ascii="Calibri" w:hAnsi="Calibri" w:cs="Calibri"/>
               </w:rPr>
               <w:t>SentimentAgent Initialization</w:t>
@@ -2285,7 +2285,7 @@
         </w:p>
         <w:p>
           <w:pPr>
-            <w:pStyle w:val="TOC3"/>
+            <w:pStyle w:val="ndice3"/>
             <w:rPr>
               <w:rFonts w:eastAsiaTheme="minorEastAsia" w:cstheme="minorBidi"/>
               <w:kern w:val="2"/>
@@ -2298,7 +2298,7 @@
           <w:hyperlink w:anchor="_Toc232200588" w:history="1">
             <w:r>
               <w:rPr>
-                <w:rStyle w:val="Hyperlink"/>
+                <w:rStyle w:val="Hiperligao"/>
                 <w:rFonts w:ascii="Calibri" w:hAnsi="Calibri" w:cs="Calibri"/>
               </w:rPr>
               <w:t>Agent Creation and System Prompt Design</w:t>
@@ -2348,7 +2348,7 @@
         </w:p>
         <w:p>
           <w:pPr>
-            <w:pStyle w:val="TOC3"/>
+            <w:pStyle w:val="ndice3"/>
             <w:rPr>
               <w:rFonts w:eastAsiaTheme="minorEastAsia" w:cstheme="minorBidi"/>
               <w:kern w:val="2"/>
@@ -2361,7 +2361,7 @@
           <w:hyperlink w:anchor="_Toc232200589" w:history="1">
             <w:r>
               <w:rPr>
-                <w:rStyle w:val="Hyperlink"/>
+                <w:rStyle w:val="Hiperligao"/>
                 <w:rFonts w:ascii="Calibri" w:hAnsi="Calibri" w:cs="Calibri"/>
               </w:rPr>
               <w:t>Conversational Memory and Context Handling</w:t>
@@ -2411,7 +2411,7 @@
         </w:p>
         <w:p>
           <w:pPr>
-            <w:pStyle w:val="TOC3"/>
+            <w:pStyle w:val="ndice3"/>
             <w:rPr>
               <w:rFonts w:eastAsiaTheme="minorEastAsia" w:cstheme="minorBidi"/>
               <w:kern w:val="2"/>
@@ -2424,7 +2424,7 @@
           <w:hyperlink w:anchor="_Toc232200590" w:history="1">
             <w:r>
               <w:rPr>
-                <w:rStyle w:val="Hyperlink"/>
+                <w:rStyle w:val="Hiperligao"/>
                 <w:rFonts w:ascii="Calibri" w:hAnsi="Calibri" w:cs="Calibri"/>
               </w:rPr>
               <w:t>Execution Loop and Runtime Configuration</w:t>
@@ -2474,7 +2474,7 @@
         </w:p>
         <w:p>
           <w:pPr>
-            <w:pStyle w:val="TOC1"/>
+            <w:pStyle w:val="ndice1"/>
             <w:rPr>
               <w:rFonts w:eastAsiaTheme="minorEastAsia" w:cstheme="minorBidi"/>
               <w:kern w:val="2"/>
@@ -2487,7 +2487,7 @@
           <w:hyperlink w:anchor="_Toc232200591" w:history="1">
             <w:r>
               <w:rPr>
-                <w:rStyle w:val="Hyperlink"/>
+                <w:rStyle w:val="Hiperligao"/>
               </w:rPr>
               <w:t>Evaluation And Results</w:t>
             </w:r>
@@ -2536,7 +2536,7 @@
         </w:p>
         <w:p>
           <w:pPr>
-            <w:pStyle w:val="TOC1"/>
+            <w:pStyle w:val="ndice1"/>
             <w:rPr>
               <w:rFonts w:eastAsiaTheme="minorEastAsia" w:cstheme="minorBidi"/>
               <w:kern w:val="2"/>
@@ -2549,7 +2549,7 @@
           <w:hyperlink w:anchor="_Toc232200592" w:history="1">
             <w:r>
               <w:rPr>
-                <w:rStyle w:val="Hyperlink"/>
+                <w:rStyle w:val="Hiperligao"/>
               </w:rPr>
               <w:t>Appendix</w:t>
             </w:r>
@@ -2609,12 +2609,12 @@
     </w:sdt>
     <w:p>
       <w:pPr>
-        <w:pStyle w:val="Heading5"/>
-      </w:pPr>
-    </w:p>
-    <w:p>
-      <w:pPr>
-        <w:pStyle w:val="Heading1"/>
+        <w:pStyle w:val="Ttulo5"/>
+      </w:pPr>
+    </w:p>
+    <w:p>
+      <w:pPr>
+        <w:pStyle w:val="Ttulo1"/>
         <w:sectPr>
           <w:headerReference w:type="even" r:id="rId12"/>
           <w:headerReference w:type="default" r:id="rId13"/>
@@ -2632,24 +2632,24 @@
     </w:p>
     <w:p>
       <w:pPr>
-        <w:pStyle w:val="Heading1"/>
-      </w:pPr>
-      <w:bookmarkStart w:id="0" w:name="_Toc410990268"/>
-      <w:bookmarkStart w:id="1" w:name="_Toc410990280"/>
-      <w:bookmarkStart w:id="2" w:name="_Toc412186393"/>
-      <w:bookmarkStart w:id="3" w:name="_Toc412186498"/>
-      <w:bookmarkStart w:id="4" w:name="_Toc412186523"/>
-      <w:bookmarkStart w:id="5" w:name="_Toc412186594"/>
-      <w:bookmarkStart w:id="6" w:name="_Toc412186624"/>
-      <w:bookmarkStart w:id="7" w:name="_Toc115296802"/>
-      <w:bookmarkStart w:id="8" w:name="_Toc136960268"/>
-      <w:bookmarkStart w:id="9" w:name="_Toc141959331"/>
-      <w:bookmarkStart w:id="10" w:name="_Toc232200561"/>
+        <w:pStyle w:val="Ttulo1"/>
+      </w:pPr>
+      <w:bookmarkStart w:id="0" w:name="_Toc232200561"/>
+      <w:bookmarkStart w:id="1" w:name="_Toc410990268"/>
+      <w:bookmarkStart w:id="2" w:name="_Toc410990280"/>
+      <w:bookmarkStart w:id="3" w:name="_Toc412186393"/>
+      <w:bookmarkStart w:id="4" w:name="_Toc412186498"/>
+      <w:bookmarkStart w:id="5" w:name="_Toc412186523"/>
+      <w:bookmarkStart w:id="6" w:name="_Toc412186594"/>
+      <w:bookmarkStart w:id="7" w:name="_Toc412186624"/>
+      <w:bookmarkStart w:id="8" w:name="_Toc115296802"/>
+      <w:bookmarkStart w:id="9" w:name="_Toc136960268"/>
+      <w:bookmarkStart w:id="10" w:name="_Toc141959331"/>
       <w:r>
         <w:lastRenderedPageBreak/>
         <w:t>Project Overview</w:t>
       </w:r>
-      <w:bookmarkEnd w:id="10"/>
+      <w:bookmarkEnd w:id="0"/>
     </w:p>
     <w:p>
       <w:r>
@@ -2658,10 +2658,9 @@
     </w:p>
     <w:p>
       <w:pPr>
-        <w:pStyle w:val="Heading1"/>
+        <w:pStyle w:val="Ttulo1"/>
       </w:pPr>
       <w:bookmarkStart w:id="11" w:name="_Toc232200562"/>
-      <w:bookmarkEnd w:id="0"/>
       <w:bookmarkEnd w:id="1"/>
       <w:bookmarkEnd w:id="2"/>
       <w:bookmarkEnd w:id="3"/>
@@ -2671,6 +2670,7 @@
       <w:bookmarkEnd w:id="7"/>
       <w:bookmarkEnd w:id="8"/>
       <w:bookmarkEnd w:id="9"/>
+      <w:bookmarkEnd w:id="10"/>
       <w:r>
         <w:t xml:space="preserve">Data </w:t>
       </w:r>
@@ -2681,7 +2681,7 @@
     </w:p>
     <w:p>
       <w:pPr>
-        <w:pStyle w:val="Heading2"/>
+        <w:pStyle w:val="Ttulo2"/>
       </w:pPr>
       <w:bookmarkStart w:id="12" w:name="_Toc232200563"/>
       <w:r>
@@ -2711,7 +2711,7 @@
     </w:p>
     <w:p>
       <w:pPr>
-        <w:pStyle w:val="Heading2"/>
+        <w:pStyle w:val="Ttulo2"/>
       </w:pPr>
       <w:bookmarkStart w:id="13" w:name="_Toc232200564"/>
       <w:r>
@@ -2738,7 +2738,7 @@
       <w:hyperlink w:anchor="Figure1" w:history="1">
         <w:r>
           <w:rPr>
-            <w:rStyle w:val="Hyperlink"/>
+            <w:rStyle w:val="Hiperligao"/>
           </w:rPr>
           <w:t>Figure 1</w:t>
         </w:r>
@@ -2760,7 +2760,7 @@
       <w:hyperlink w:anchor="Figure2" w:history="1">
         <w:r>
           <w:rPr>
-            <w:rStyle w:val="Hyperlink"/>
+            <w:rStyle w:val="Hiperligao"/>
             <w:color w:val="auto"/>
             <w:u w:val="none"/>
           </w:rPr>
@@ -2799,21 +2799,13 @@
       <w:hyperlink w:anchor="Figure3" w:history="1">
         <w:r>
           <w:rPr>
-            <w:rStyle w:val="Hyperlink"/>
+            <w:rStyle w:val="Hiperligao"/>
           </w:rPr>
           <w:t>word clouds</w:t>
         </w:r>
       </w:hyperlink>
       <w:r>
-        <w:t xml:space="preserve"> as a quick way to explore the top 15 most common words in each sentiment class. This gave us an immediate visual sense of which terms stand out the most in bullish, bearish, and neutral tweets, since more frequent words appear larger and are easier to spot </w:t>
-      </w:r>
-      <w:proofErr w:type="gramStart"/>
-      <w:r>
-        <w:t>at a glance</w:t>
-      </w:r>
-      <w:proofErr w:type="gramEnd"/>
-      <w:r>
-        <w:t>.</w:t>
+        <w:t xml:space="preserve"> as a quick way to explore the top 15 most common words in each sentiment class. This gave us an immediate visual sense of which terms stand out the most in bullish, bearish, and neutral tweets, since more frequent words appear larger and are easier to spot at a glance.</w:t>
       </w:r>
     </w:p>
     <w:p>
@@ -2823,19 +2815,19 @@
       <w:hyperlink w:anchor="Figure4" w:history="1">
         <w:r>
           <w:rPr>
-            <w:rStyle w:val="Hyperlink"/>
+            <w:rStyle w:val="Hiperligao"/>
           </w:rPr>
           <w:t>bar</w:t>
         </w:r>
         <w:r>
           <w:rPr>
-            <w:rStyle w:val="Hyperlink"/>
+            <w:rStyle w:val="Hiperligao"/>
           </w:rPr>
           <w:t xml:space="preserve"> </w:t>
         </w:r>
         <w:r>
           <w:rPr>
-            <w:rStyle w:val="Hyperlink"/>
+            <w:rStyle w:val="Hiperligao"/>
           </w:rPr>
           <w:t>charts</w:t>
         </w:r>
@@ -2908,7 +2900,6 @@
       <w:r>
         <w:t>” are common, pointing to negative earnings results, downward revisions, and broader economic concerns. Terms like “</w:t>
       </w:r>
-      <w:proofErr w:type="spellStart"/>
       <w:r>
         <w:rPr>
           <w:i/>
@@ -2916,7 +2907,6 @@
         </w:rPr>
         <w:t>china</w:t>
       </w:r>
-      <w:proofErr w:type="spellEnd"/>
       <w:r>
         <w:t>” and “</w:t>
       </w:r>
@@ -3020,7 +3010,6 @@
       <w:r>
         <w:t>The neutral class is more focused on factual or informational language, with words like “</w:t>
       </w:r>
-      <w:proofErr w:type="spellStart"/>
       <w:r>
         <w:rPr>
           <w:i/>
@@ -3028,7 +3017,6 @@
         </w:rPr>
         <w:t>marketscreener</w:t>
       </w:r>
-      <w:proofErr w:type="spellEnd"/>
       <w:r>
         <w:t>,” “</w:t>
       </w:r>
@@ -3092,55 +3080,23 @@
     </w:p>
     <w:p>
       <w:r>
-        <w:t xml:space="preserve">Now, considering that our dataset consists of tweets, we also </w:t>
-      </w:r>
-      <w:proofErr w:type="gramStart"/>
-      <w:r>
-        <w:t>looked into</w:t>
-      </w:r>
-      <w:proofErr w:type="gramEnd"/>
-      <w:r>
-        <w:t xml:space="preserve"> the use of hashtags, mentions, and </w:t>
-      </w:r>
-      <w:proofErr w:type="spellStart"/>
-      <w:r>
-        <w:t>cashtags</w:t>
-      </w:r>
-      <w:proofErr w:type="spellEnd"/>
-      <w:r>
-        <w:t>, since these are very common elements in this type of text and often carry useful context about topics or specific stocks being discussed.</w:t>
-      </w:r>
-    </w:p>
-    <w:p>
-      <w:r>
-        <w:t xml:space="preserve">We started by analyzing the top 15 most frequent hashtags and </w:t>
-      </w:r>
-      <w:proofErr w:type="spellStart"/>
-      <w:r>
-        <w:t>cashtags</w:t>
-      </w:r>
-      <w:proofErr w:type="spellEnd"/>
-      <w:r>
-        <w:t xml:space="preserve"> for each sentiment class, as shown in </w:t>
+        <w:t>Now, considering that our dataset consists of tweets, we also looked into the use of hashtags, mentions, and cashtags, since these are very common elements in this type of text and often carry useful context about topics or specific stocks being discussed.</w:t>
+      </w:r>
+    </w:p>
+    <w:p>
+      <w:r>
+        <w:t xml:space="preserve">We started by analyzing the top 15 most frequent hashtags and cashtags for each sentiment class, as shown in </w:t>
       </w:r>
       <w:hyperlink w:anchor="Figure5" w:history="1">
         <w:r>
           <w:rPr>
-            <w:rStyle w:val="Hyperlink"/>
+            <w:rStyle w:val="Hiperligao"/>
           </w:rPr>
           <w:t>Figure 5</w:t>
         </w:r>
       </w:hyperlink>
       <w:r>
-        <w:t>. From the hashtag plots, we can see that some terms appear across all classes, such as “</w:t>
-      </w:r>
-      <w:proofErr w:type="spellStart"/>
-      <w:r>
-        <w:t>marketscreener</w:t>
-      </w:r>
-      <w:proofErr w:type="spellEnd"/>
-      <w:r>
-        <w:t>,” “stock,” and “economy,” which suggests they are general-purpose tags not strongly tied to a specific sentiment. However, there are still some differences: bearish tweets include tags like “</w:t>
+        <w:t>. From the hashtag plots, we can see that some terms appear across all classes, such as “marketscreener,” “stock,” and “economy,” which suggests they are general-purpose tags not strongly tied to a specific sentiment. However, there are still some differences: bearish tweets include tags like “</w:t>
       </w:r>
       <w:r>
         <w:rPr>
@@ -3152,7 +3108,6 @@
       <w:r>
         <w:t>” and “</w:t>
       </w:r>
-      <w:proofErr w:type="spellStart"/>
       <w:r>
         <w:rPr>
           <w:i/>
@@ -3160,7 +3115,6 @@
         </w:rPr>
         <w:t>wti</w:t>
       </w:r>
-      <w:proofErr w:type="spellEnd"/>
       <w:r>
         <w:t>” pointing to negative macroeconomic events, while bullish tweets lean more toward terms like “</w:t>
       </w:r>
@@ -3227,23 +3181,7 @@
     </w:p>
     <w:p>
       <w:r>
-        <w:t xml:space="preserve">Looking at </w:t>
-      </w:r>
-      <w:proofErr w:type="spellStart"/>
-      <w:r>
-        <w:t>cashtags</w:t>
-      </w:r>
-      <w:proofErr w:type="spellEnd"/>
-      <w:r>
-        <w:t xml:space="preserve"> (stock </w:t>
-      </w:r>
-      <w:proofErr w:type="gramStart"/>
-      <w:r>
-        <w:t>tickers</w:t>
-      </w:r>
-      <w:proofErr w:type="gramEnd"/>
-      <w:r>
-        <w:t>), clearer distinctions emerge. While some popular tickers like “</w:t>
+        <w:t>Looking at cashtags (stock tickers), clearer distinctions emerge. While some popular tickers like “</w:t>
       </w:r>
       <w:r>
         <w:rPr>
@@ -3372,7 +3310,7 @@
     </w:p>
     <w:p>
       <w:pPr>
-        <w:pStyle w:val="Heading1"/>
+        <w:pStyle w:val="Ttulo1"/>
       </w:pPr>
       <w:bookmarkStart w:id="14" w:name="_Toc232200565"/>
       <w:r>
@@ -3390,34 +3328,18 @@
     </w:p>
     <w:p>
       <w:r>
-        <w:t xml:space="preserve">As a first step, all tweets were converted to lowercase to ensure consistency across the corpus and reduce vocabulary sparsity caused by capitalization differences. Contractions such as “don't”, “can't”, and </w:t>
-      </w:r>
-      <w:proofErr w:type="gramStart"/>
-      <w:r>
-        <w:t>“it's”</w:t>
+        <w:t>As a first step, all tweets were converted to lowercase to ensure consistency across the corpus and reduce vocabulary sparsity caused by capitalization differences. Contractions such as “don't”, “can't”, and “it's”</w:t>
       </w:r>
       <w:r>
         <w:t xml:space="preserve"> </w:t>
       </w:r>
       <w:r>
-        <w:t>were</w:t>
-      </w:r>
-      <w:proofErr w:type="gramEnd"/>
-      <w:r>
-        <w:t xml:space="preserve"> expanded into their full forms before further processing, improving linguistic consistency and allowing negation patterns to be identified more reliably.</w:t>
-      </w:r>
-    </w:p>
-    <w:p>
-      <w:r>
-        <w:t xml:space="preserve">The EDA showed that bullish and bearish tweets frequently </w:t>
-      </w:r>
-      <w:proofErr w:type="gramStart"/>
-      <w:r>
-        <w:t>contained</w:t>
-      </w:r>
-      <w:proofErr w:type="gramEnd"/>
-      <w:r>
-        <w:t xml:space="preserve"> words associated with market movements and company performance, such as </w:t>
+        <w:t>were expanded into their full forms before further processing, improving linguistic consistency and allowing negation patterns to be identified more reliably.</w:t>
+      </w:r>
+    </w:p>
+    <w:p>
+      <w:r>
+        <w:t xml:space="preserve">The EDA showed that bullish and bearish tweets frequently contained words associated with market movements and company performance, such as </w:t>
       </w:r>
       <w:r>
         <w:rPr>
@@ -3476,15 +3398,7 @@
     </w:p>
     <w:p>
       <w:r>
-        <w:t xml:space="preserve">Since the analysis of </w:t>
-      </w:r>
-      <w:proofErr w:type="spellStart"/>
-      <w:r>
-        <w:t>cashtags</w:t>
-      </w:r>
-      <w:proofErr w:type="spellEnd"/>
-      <w:r>
-        <w:t xml:space="preserve"> demonstrated that stock tickers were more prevalent in bullish tweets (24.6%) than in bearish or neutral tweets (approximately 13%), stock ticker references were explicitly preserved. Known tickers were mapped to standardized tokens (e.g., TICKER_AAPL), while unknown tickers were replaced with a generic STOCK_TICKER token. This allowed the model to retain information about stock-specific discussions while limiting vocabulary growth.</w:t>
+        <w:t>Since the analysis of cashtags demonstrated that stock tickers were more prevalent in bullish tweets (24.6%) than in bearish or neutral tweets (approximately 13%), stock ticker references were explicitly preserved. Known tickers were mapped to standardized tokens (e.g., TICKER_AAPL), while unknown tickers were replaced with a generic STOCK_TICKER token. This allowed the model to retain information about stock-specific discussions while limiting vocabulary growth.</w:t>
       </w:r>
     </w:p>
     <w:p>
@@ -3539,31 +3453,7 @@
     </w:p>
     <w:p>
       <w:r>
-        <w:t xml:space="preserve">After cleaning, tweets were tokenized using NLTK's </w:t>
-      </w:r>
-      <w:proofErr w:type="spellStart"/>
-      <w:r>
-        <w:t>TweetTokenizer</w:t>
-      </w:r>
-      <w:proofErr w:type="spellEnd"/>
-      <w:r>
-        <w:t xml:space="preserve">, which is specifically designed to handle social media text. </w:t>
-      </w:r>
-      <w:proofErr w:type="spellStart"/>
-      <w:r>
-        <w:t>Stopword</w:t>
-      </w:r>
-      <w:proofErr w:type="spellEnd"/>
-      <w:r>
-        <w:t xml:space="preserve"> removal was then applied to eliminate common words with limited discriminative value. However, unlike a standard </w:t>
-      </w:r>
-      <w:proofErr w:type="spellStart"/>
-      <w:r>
-        <w:t>stopword</w:t>
-      </w:r>
-      <w:proofErr w:type="spellEnd"/>
-      <w:r>
-        <w:t xml:space="preserve"> removal procedure, sentiment-critical financial terms identified during EDA were explicitly preserved. Words such as </w:t>
+        <w:t xml:space="preserve">After cleaning, tweets were tokenized using NLTK's TweetTokenizer, which is specifically designed to handle social media text. Stopword removal was then applied to eliminate common words with limited discriminative value. However, unlike a standard stopword removal procedure, sentiment-critical financial terms identified during EDA were explicitly preserved. Words such as </w:t>
       </w:r>
       <w:r>
         <w:rPr>
@@ -3758,7 +3648,7 @@
     </w:p>
     <w:p>
       <w:pPr>
-        <w:pStyle w:val="Heading1"/>
+        <w:pStyle w:val="Ttulo1"/>
       </w:pPr>
       <w:bookmarkStart w:id="15" w:name="_Toc232200566"/>
       <w:r>
@@ -3768,15 +3658,7 @@
     </w:p>
     <w:p>
       <w:r>
-        <w:t>To convert the preprocessed textual data into a format suitable for machine learning algorithms, multiple feature extraction techniques were explored, including Bag-of-Words (</w:t>
-      </w:r>
-      <w:proofErr w:type="spellStart"/>
-      <w:r>
-        <w:t>BoW</w:t>
-      </w:r>
-      <w:proofErr w:type="spellEnd"/>
-      <w:r>
-        <w:t>)</w:t>
+        <w:t>To convert the preprocessed textual data into a format suitable for machine learning algorithms, multiple feature extraction techniques were explored, including Bag-of-Words (BoW)</w:t>
       </w:r>
       <w:r>
         <w:t xml:space="preserve"> alongside </w:t>
@@ -3787,7 +3669,7 @@
     </w:p>
     <w:p>
       <w:pPr>
-        <w:pStyle w:val="Heading2"/>
+        <w:pStyle w:val="Ttulo2"/>
       </w:pPr>
       <w:bookmarkStart w:id="16" w:name="_Toc232200567"/>
       <w:r>
@@ -3803,15 +3685,7 @@
     <w:p>
       <w:r>
         <w:lastRenderedPageBreak/>
-        <w:t xml:space="preserve">To improve performance in the financial domain, several domain-specific </w:t>
-      </w:r>
-      <w:proofErr w:type="spellStart"/>
-      <w:r>
-        <w:t>optimisations</w:t>
-      </w:r>
-      <w:proofErr w:type="spellEnd"/>
-      <w:r>
-        <w:t xml:space="preserve"> were introduced. A maximum feature limit of 10,000 was applied to control vocabulary size and reduce computational complexity. In addition, n-gram extraction was enabled (up to trigrams), allowing the model to capture short phrases such as “price target”, “beats estimates”, and “stock market”, which are often more informative than isolated words.</w:t>
+        <w:t>To improve performance in the financial domain, several domain-specific optimisations were introduced. A maximum feature limit of 10,000 was applied to control vocabulary size and reduce computational complexity. In addition, n-gram extraction was enabled (up to trigrams), allowing the model to capture short phrases such as “price target”, “beats estimates”, and “stock market”, which are often more informative than isolated words.</w:t>
       </w:r>
     </w:p>
     <w:p>
@@ -3826,7 +3700,7 @@
     </w:p>
     <w:p>
       <w:pPr>
-        <w:pStyle w:val="Heading2"/>
+        <w:pStyle w:val="Ttulo2"/>
       </w:pPr>
       <w:bookmarkStart w:id="17" w:name="_Toc232200568"/>
       <w:r>
@@ -3851,7 +3725,7 @@
     </w:p>
     <w:p>
       <w:pPr>
-        <w:pStyle w:val="Heading1"/>
+        <w:pStyle w:val="Ttulo1"/>
       </w:pPr>
       <w:bookmarkStart w:id="18" w:name="_Toc232200569"/>
       <w:r>
@@ -3861,7 +3735,7 @@
     </w:p>
     <w:p>
       <w:pPr>
-        <w:pStyle w:val="Heading2"/>
+        <w:pStyle w:val="Ttulo2"/>
       </w:pPr>
       <w:bookmarkStart w:id="19" w:name="_Toc232200570"/>
       <w:r>
@@ -3911,7 +3785,7 @@
     </w:p>
     <w:p>
       <w:pPr>
-        <w:pStyle w:val="Heading2"/>
+        <w:pStyle w:val="Ttulo2"/>
       </w:pPr>
       <w:bookmarkStart w:id="20" w:name="_Toc232200571"/>
       <w:r>
@@ -3921,122 +3795,67 @@
     </w:p>
     <w:p>
       <w:r>
-        <w:t xml:space="preserve">To establish a strong baseline for sentiment classification, three traditional machine learning algorithms were evaluated: Logistic Regression, Random Forest, and </w:t>
-      </w:r>
-      <w:proofErr w:type="spellStart"/>
+        <w:t>To establish a strong baseline for sentiment classification, three traditional machine learning algorithms were evaluated: Logistic Regression, Random Forest, and XGBoost. These models were selected due to their widespread use in text classification tasks and their ability to provide a meaningful comparison against more computationally expensive transformer-based approaches.</w:t>
+      </w:r>
+    </w:p>
+    <w:p>
+      <w:r>
+        <w:t>A unified wrapper class, TraditionalMLClassifier, was implemented to manage model creation, hyperparameter optimisation, training, and inference. The wrapper allows different algorithms to be trained through a common interface while maintaining model-specific configurations.</w:t>
+      </w:r>
+    </w:p>
+    <w:p>
+      <w:pPr>
+        <w:pStyle w:val="Ttulo3"/>
+      </w:pPr>
+      <w:bookmarkStart w:id="21" w:name="_Toc232200572"/>
+      <w:r>
+        <w:t>Logistic Regression</w:t>
+      </w:r>
+      <w:bookmarkEnd w:id="21"/>
+    </w:p>
+    <w:p>
+      <w:r>
+        <w:t>Logistic Regression was selected as a linear baseline model due to its effectiveness in high-dimensional text classification problems. The model was configured with a maximum of 1000 training iterations and support for class weighting to compensate for class imbalance within the dataset.</w:t>
+      </w:r>
+    </w:p>
+    <w:p>
+      <w:r>
+        <w:t>The hyperparameter search explored different values of the regularisation parameter (C), which controls the trade-off between model complexity and generalisation performance.</w:t>
+      </w:r>
+    </w:p>
+    <w:p>
+      <w:pPr>
+        <w:pStyle w:val="Ttulo3"/>
+      </w:pPr>
+      <w:bookmarkStart w:id="22" w:name="_Toc232200573"/>
+      <w:r>
+        <w:t>Random Forest</w:t>
+      </w:r>
+      <w:bookmarkEnd w:id="22"/>
+    </w:p>
+    <w:p>
+      <w:r>
+        <w:t>Random Forest is an ensemble learning algorithm that combines the predictions of multiple decision trees. By aggregating the outputs of many trees, the model reduces variance and often achieves higher predictive performance than a single decision tree.</w:t>
+      </w:r>
+    </w:p>
+    <w:p>
+      <w:r>
+        <w:t>Several hyperparameters were tuned, including the number of trees, maximum tree depth, minimum number of samples required to split a node, and minimum number of samples required at leaf nodes. The balanced_subsample weighting strategy was used to mitigate the effects of class imbalance during training.</w:t>
+      </w:r>
+    </w:p>
+    <w:p>
+      <w:pPr>
+        <w:pStyle w:val="Ttulo3"/>
+      </w:pPr>
+      <w:bookmarkStart w:id="23" w:name="_Toc232200574"/>
       <w:r>
         <w:t>XGBoost</w:t>
       </w:r>
-      <w:proofErr w:type="spellEnd"/>
-      <w:r>
-        <w:t>. These models were selected due to their widespread use in text classification tasks and their ability to provide a meaningful comparison against more computationally expensive transformer-based approaches.</w:t>
-      </w:r>
-    </w:p>
-    <w:p>
-      <w:r>
-        <w:t xml:space="preserve">A unified wrapper class, </w:t>
-      </w:r>
-      <w:proofErr w:type="spellStart"/>
-      <w:r>
-        <w:t>TraditionalMLClassifier</w:t>
-      </w:r>
-      <w:proofErr w:type="spellEnd"/>
-      <w:r>
-        <w:t xml:space="preserve">, was implemented to manage model creation, hyperparameter </w:t>
-      </w:r>
-      <w:proofErr w:type="spellStart"/>
-      <w:r>
-        <w:t>optimisation</w:t>
-      </w:r>
-      <w:proofErr w:type="spellEnd"/>
-      <w:r>
-        <w:t>, training, and inference. The wrapper allows different algorithms to be trained through a common interface while maintaining model-specific configurations.</w:t>
-      </w:r>
-    </w:p>
-    <w:p>
-      <w:pPr>
-        <w:pStyle w:val="Heading3"/>
-      </w:pPr>
-      <w:bookmarkStart w:id="21" w:name="_Toc232200572"/>
-      <w:r>
-        <w:t>Logistic Regression</w:t>
-      </w:r>
-      <w:bookmarkEnd w:id="21"/>
-    </w:p>
-    <w:p>
-      <w:r>
-        <w:t>Logistic Regression was selected as a linear baseline model due to its effectiveness in high-dimensional text classification problems. The model was configured with a maximum of 1000 training iterations and support for class weighting to compensate for class imbalance within the dataset.</w:t>
-      </w:r>
-    </w:p>
-    <w:p>
-      <w:r>
-        <w:t xml:space="preserve">The hyperparameter search explored different values of the </w:t>
-      </w:r>
-      <w:proofErr w:type="spellStart"/>
-      <w:r>
-        <w:t>regularisation</w:t>
-      </w:r>
-      <w:proofErr w:type="spellEnd"/>
-      <w:r>
-        <w:t xml:space="preserve"> parameter (C), which controls the trade-off between model complexity and </w:t>
-      </w:r>
-      <w:proofErr w:type="spellStart"/>
-      <w:r>
-        <w:t>generalisation</w:t>
-      </w:r>
-      <w:proofErr w:type="spellEnd"/>
-      <w:r>
-        <w:t xml:space="preserve"> performance.</w:t>
-      </w:r>
-    </w:p>
-    <w:p>
-      <w:pPr>
-        <w:pStyle w:val="Heading3"/>
-      </w:pPr>
-      <w:bookmarkStart w:id="22" w:name="_Toc232200573"/>
-      <w:r>
-        <w:t>Random Forest</w:t>
-      </w:r>
-      <w:bookmarkEnd w:id="22"/>
-    </w:p>
-    <w:p>
-      <w:r>
-        <w:t>Random Forest is an ensemble learning algorithm that combines the predictions of multiple decision trees. By aggregating the outputs of many trees, the model reduces variance and often achieves higher predictive performance than a single decision tree.</w:t>
-      </w:r>
-    </w:p>
-    <w:p>
-      <w:r>
-        <w:t>Several hyperparameters were tuned, including the number of trees, maximum tree depth, minimum number of samples required to split a node, and minimum number of samples required at leaf nodes. The balanced_subsample weighting strategy was used to mitigate the effects of class imbalance during training.</w:t>
-      </w:r>
-    </w:p>
-    <w:p>
-      <w:pPr>
-        <w:pStyle w:val="Heading3"/>
-      </w:pPr>
-      <w:bookmarkStart w:id="23" w:name="_Toc232200574"/>
-      <w:proofErr w:type="spellStart"/>
-      <w:r>
-        <w:t>XGBoost</w:t>
-      </w:r>
       <w:bookmarkEnd w:id="23"/>
-      <w:proofErr w:type="spellEnd"/>
-    </w:p>
-    <w:p>
-      <w:proofErr w:type="spellStart"/>
-      <w:r>
-        <w:t>XGBoost</w:t>
-      </w:r>
-      <w:proofErr w:type="spellEnd"/>
-      <w:r>
-        <w:t xml:space="preserve"> is a gradient boosting framework that constructs an ensemble of decision trees sequentially, with each new tree attempting to correct the errors made by previous trees. Due to its strong performance in structured data problems and its ability to model complex decision boundaries, </w:t>
-      </w:r>
-      <w:proofErr w:type="spellStart"/>
-      <w:r>
-        <w:t>XGBoost</w:t>
-      </w:r>
-      <w:proofErr w:type="spellEnd"/>
-      <w:r>
-        <w:t xml:space="preserve"> was included as an additional traditional machine learning baseline.</w:t>
+    </w:p>
+    <w:p>
+      <w:r>
+        <w:t>XGBoost is a gradient boosting framework that constructs an ensemble of decision trees sequentially, with each new tree attempting to correct the errors made by previous trees. Due to its strong performance in structured data problems and its ability to model complex decision boundaries, XGBoost was included as an additional traditional machine learning baseline.</w:t>
       </w:r>
     </w:p>
     <w:p>
@@ -4052,7 +3871,7 @@
     </w:p>
     <w:p>
       <w:pPr>
-        <w:pStyle w:val="Heading2"/>
+        <w:pStyle w:val="Ttulo2"/>
       </w:pPr>
       <w:bookmarkStart w:id="24" w:name="_Toc232200575"/>
       <w:r>
@@ -4066,7 +3885,7 @@
     </w:p>
     <w:p>
       <w:pPr>
-        <w:pStyle w:val="Heading3"/>
+        <w:pStyle w:val="Ttulo3"/>
       </w:pPr>
       <w:bookmarkStart w:id="25" w:name="_Toc232200576"/>
       <w:r>
@@ -4088,39 +3907,7 @@
           <w:i/>
           <w:iCs/>
         </w:rPr>
-        <w:t>google-</w:t>
-      </w:r>
-      <w:proofErr w:type="spellStart"/>
-      <w:r>
-        <w:rPr>
-          <w:i/>
-          <w:iCs/>
-        </w:rPr>
-        <w:t>bert</w:t>
-      </w:r>
-      <w:proofErr w:type="spellEnd"/>
-      <w:r>
-        <w:rPr>
-          <w:i/>
-          <w:iCs/>
-        </w:rPr>
-        <w:t>/</w:t>
-      </w:r>
-      <w:proofErr w:type="spellStart"/>
-      <w:r>
-        <w:rPr>
-          <w:i/>
-          <w:iCs/>
-        </w:rPr>
-        <w:t>bert</w:t>
-      </w:r>
-      <w:proofErr w:type="spellEnd"/>
-      <w:r>
-        <w:rPr>
-          <w:i/>
-          <w:iCs/>
-        </w:rPr>
-        <w:t>-base-uncased</w:t>
+        <w:t>google-bert/bert-base-uncased</w:t>
       </w:r>
       <w:r>
         <w:t>. During training, the pre-trained encoder was fine-tuned on the sentiment classification dataset by attaching a sequence-classification head with three output classes (bearish, bullish, and neutral). Fine-tuning was performed using a maximum sequence length of 128 tokens, batch size of 16, learning rate of 2×10⁻⁵, and 3 training epochs. Class weights were incorporated into the loss function to mitigate class imbalance, while model selection was based on the highest validation Macro-F1 score observed during training. The best-performing checkpoint was restored after training completion.</w:t>
@@ -4128,227 +3915,80 @@
     </w:p>
     <w:p>
       <w:r>
-        <w:t xml:space="preserve">The final class prediction is obtained from the classification head, with class probabilities computed through a </w:t>
-      </w:r>
-      <w:proofErr w:type="spellStart"/>
-      <w:r>
-        <w:t>softmax</w:t>
-      </w:r>
-      <w:proofErr w:type="spellEnd"/>
-      <w:r>
-        <w:t xml:space="preserve"> activation over the output logits.</w:t>
-      </w:r>
-    </w:p>
-    <w:p>
-      <w:pPr>
-        <w:pStyle w:val="Heading3"/>
+        <w:t>The final class prediction is obtained from the classification head, with class probabilities computed through a softmax activation over the output logits.</w:t>
+      </w:r>
+    </w:p>
+    <w:p>
+      <w:pPr>
+        <w:pStyle w:val="Ttulo3"/>
       </w:pPr>
       <w:bookmarkStart w:id="26" w:name="_Toc232200577"/>
-      <w:proofErr w:type="spellStart"/>
       <w:r>
         <w:t>DistilBERT</w:t>
       </w:r>
       <w:bookmarkEnd w:id="26"/>
-      <w:proofErr w:type="spellEnd"/>
-    </w:p>
-    <w:p>
-      <w:proofErr w:type="spellStart"/>
-      <w:r>
-        <w:t>DistilBERT</w:t>
-      </w:r>
-      <w:proofErr w:type="spellEnd"/>
-      <w:r>
-        <w:t xml:space="preserve"> was included as a lightweight alternative to BERT, designed to provide comparable language understanding capabilities while reducing computational requirements. Through knowledge distillation, </w:t>
-      </w:r>
-      <w:proofErr w:type="spellStart"/>
-      <w:r>
-        <w:t>DistilBERT</w:t>
-      </w:r>
-      <w:proofErr w:type="spellEnd"/>
-      <w:r>
-        <w:t xml:space="preserve"> retains much of BERT's predictive performance despite having fewer parameters, making it particularly suitable for scenarios where inference speed and resource efficiency are important considerations.</w:t>
+    </w:p>
+    <w:p>
+      <w:r>
+        <w:t>DistilBERT was included as a lightweight alternative to BERT, designed to provide comparable language understanding capabilities while reducing computational requirements. Through knowledge distillation, DistilBERT retains much of BERT's predictive performance despite having fewer parameters, making it particularly suitable for scenarios where inference speed and resource efficiency are important considerations.</w:t>
       </w:r>
     </w:p>
     <w:p>
       <w:r>
         <w:t xml:space="preserve">The model used was </w:t>
       </w:r>
-      <w:proofErr w:type="spellStart"/>
-      <w:r>
-        <w:rPr>
-          <w:i/>
-          <w:iCs/>
-        </w:rPr>
-        <w:t>distilbert</w:t>
-      </w:r>
-      <w:proofErr w:type="spellEnd"/>
-      <w:r>
-        <w:rPr>
-          <w:i/>
-          <w:iCs/>
-        </w:rPr>
-        <w:t>-base-uncased</w:t>
+      <w:r>
+        <w:rPr>
+          <w:i/>
+          <w:iCs/>
+        </w:rPr>
+        <w:t>distilbert-base-uncased</w:t>
+      </w:r>
+      <w:r>
+        <w:t>. Similar to BERT, the model was fine-tuned end-to-end for three-class sentiment classification using raw tweet text as input. Training employed a maximum sequence length of 128 tokens, batch size of 16, learning rate of 2×10⁻⁵, and 3 training epochs. Class weighting was applied to address class imbalance, and the checkpoint achieving the highest validation Macro-F1 score was retained as the final model.</w:t>
+      </w:r>
+    </w:p>
+    <w:p>
+      <w:r>
+        <w:t>As with BERT, sentiment predictions are produced by a sequence-classification head, with posterior class probabilities obtained via softmax over the model's output logits.</w:t>
+      </w:r>
+    </w:p>
+    <w:p>
+      <w:pPr>
+        <w:pStyle w:val="Ttulo3"/>
+      </w:pPr>
+      <w:bookmarkStart w:id="27" w:name="_Toc232200578"/>
+      <w:r>
+        <w:t>FinBERT</w:t>
+      </w:r>
+      <w:bookmarkEnd w:id="27"/>
+    </w:p>
+    <w:p>
+      <w:r>
+        <w:t>FinBERT was included as a domain-adapted transformer baseline, designed specifically for financial language. Whereas generic BERT models are pre-trained on broad, general-purpose corpora, FinBERT is based on the BERT architecture but further pre-trained and/or fine-tuned on financial text, which can improve its understanding of finance-specific terminology, phrasing, and sentiment cues (e.g., earnings, guidance, macro headlines).</w:t>
+      </w:r>
+    </w:p>
+    <w:p>
+      <w:r>
+        <w:t xml:space="preserve">The model used was </w:t>
+      </w:r>
+      <w:r>
+        <w:rPr>
+          <w:i/>
+          <w:iCs/>
+        </w:rPr>
+        <w:t>finbert-tone</w:t>
       </w:r>
       <w:r>
         <w:t xml:space="preserve">. </w:t>
       </w:r>
-      <w:proofErr w:type="gramStart"/>
-      <w:r>
-        <w:t>Similar to</w:t>
-      </w:r>
-      <w:proofErr w:type="gramEnd"/>
-      <w:r>
-        <w:t xml:space="preserve"> BERT, the model was fine-tuned end-to-end for three-class sentiment classification using raw tweet text as input. Training employed a maximum sequence length of 128 tokens, batch size of 16, learning rate of 2×10⁻⁵, and 3 training epochs. Class weighting was applied to address class imbalance, and the checkpoint achieving the highest validation Macro-F1 score was retained as the final model.</w:t>
-      </w:r>
-    </w:p>
-    <w:p>
-      <w:r>
-        <w:t xml:space="preserve">As with BERT, sentiment predictions are produced by a sequence-classification head, with posterior class probabilities obtained via </w:t>
-      </w:r>
-      <w:proofErr w:type="spellStart"/>
-      <w:r>
-        <w:t>softmax</w:t>
-      </w:r>
-      <w:proofErr w:type="spellEnd"/>
-      <w:r>
-        <w:t xml:space="preserve"> over the model's output logits.</w:t>
-      </w:r>
-    </w:p>
-    <w:p>
-      <w:pPr>
-        <w:pStyle w:val="Heading3"/>
-      </w:pPr>
-      <w:bookmarkStart w:id="27" w:name="_Toc232200578"/>
-      <w:proofErr w:type="spellStart"/>
-      <w:r>
-        <w:t>FinBERT</w:t>
-      </w:r>
-      <w:bookmarkEnd w:id="27"/>
-      <w:proofErr w:type="spellEnd"/>
-    </w:p>
-    <w:p>
-      <w:proofErr w:type="spellStart"/>
-      <w:r>
-        <w:t>FinBERT</w:t>
-      </w:r>
-      <w:proofErr w:type="spellEnd"/>
-      <w:r>
-        <w:t xml:space="preserve"> was included as a domain-adapted transformer baseline, designed specifically for financial language. Whereas generic BERT models are pre-trained on broad, general-purpose corpora, </w:t>
-      </w:r>
-      <w:proofErr w:type="spellStart"/>
-      <w:r>
-        <w:t>FinBERT</w:t>
-      </w:r>
-      <w:proofErr w:type="spellEnd"/>
-      <w:r>
-        <w:t xml:space="preserve"> is based on the BERT architecture but further pre-trained and/or fine-tuned on financial text, which can improve its understanding of finance-specific terminology, phrasing, and sentiment cues (e.g., earnings, guidance, macro headlines).</w:t>
-      </w:r>
-    </w:p>
-    <w:p>
-      <w:r>
-        <w:t xml:space="preserve">The model used was </w:t>
-      </w:r>
-      <w:proofErr w:type="spellStart"/>
-      <w:r>
-        <w:rPr>
-          <w:i/>
-          <w:iCs/>
-        </w:rPr>
-        <w:t>finbert</w:t>
-      </w:r>
-      <w:proofErr w:type="spellEnd"/>
-      <w:r>
-        <w:rPr>
-          <w:i/>
-          <w:iCs/>
-        </w:rPr>
-        <w:t>-tone</w:t>
-      </w:r>
-      <w:r>
-        <w:t xml:space="preserve">. </w:t>
-      </w:r>
-      <w:r>
-        <w:t xml:space="preserve">A practical limitation in our setup was that we could not use </w:t>
-      </w:r>
-      <w:proofErr w:type="spellStart"/>
-      <w:r>
-        <w:t>FinBERT’s</w:t>
-      </w:r>
-      <w:proofErr w:type="spellEnd"/>
-      <w:r>
-        <w:t xml:space="preserve"> native </w:t>
-      </w:r>
-      <w:proofErr w:type="spellStart"/>
-      <w:r>
-        <w:t>tokeniser</w:t>
-      </w:r>
-      <w:proofErr w:type="spellEnd"/>
-      <w:r>
-        <w:t xml:space="preserve"> and</w:t>
-      </w:r>
-      <w:r>
-        <w:t xml:space="preserve"> instead had to </w:t>
-      </w:r>
-      <w:proofErr w:type="spellStart"/>
-      <w:r>
-        <w:t>tokenise</w:t>
-      </w:r>
-      <w:proofErr w:type="spellEnd"/>
-      <w:r>
-        <w:t xml:space="preserve"> inputs using the base BERT </w:t>
-      </w:r>
-      <w:proofErr w:type="spellStart"/>
-      <w:r>
-        <w:t>tokeniser</w:t>
-      </w:r>
-      <w:proofErr w:type="spellEnd"/>
-      <w:r>
-        <w:t xml:space="preserve">. Although </w:t>
-      </w:r>
-      <w:proofErr w:type="spellStart"/>
-      <w:r>
-        <w:t>FinBERT</w:t>
-      </w:r>
-      <w:proofErr w:type="spellEnd"/>
-      <w:r>
-        <w:t xml:space="preserve"> is BERT-based, this mismatch can still matter in practice: differences in </w:t>
-      </w:r>
-      <w:proofErr w:type="spellStart"/>
-      <w:r>
-        <w:t>tokenisation</w:t>
-      </w:r>
-      <w:proofErr w:type="spellEnd"/>
-      <w:r>
-        <w:t>/vocabulary handling (especially for finance-heavy terms, tickers, abbreviations, or unusual casing/punctuation) can lead to slightly degraded representations at the encoder input, which may have negatively impacted downstream classification performance compared with a fully aligned “</w:t>
-      </w:r>
-      <w:proofErr w:type="spellStart"/>
-      <w:r>
-        <w:t>FinBERT</w:t>
-      </w:r>
-      <w:proofErr w:type="spellEnd"/>
-      <w:r>
-        <w:t xml:space="preserve"> model + </w:t>
-      </w:r>
-      <w:proofErr w:type="spellStart"/>
-      <w:r>
-        <w:t>FinBERT</w:t>
-      </w:r>
-      <w:proofErr w:type="spellEnd"/>
-      <w:r>
-        <w:t xml:space="preserve"> </w:t>
-      </w:r>
-      <w:proofErr w:type="spellStart"/>
-      <w:r>
-        <w:t>tokeniser</w:t>
-      </w:r>
-      <w:proofErr w:type="spellEnd"/>
-      <w:r>
-        <w:t>” pipeline.</w:t>
-      </w:r>
-    </w:p>
-    <w:p>
-      <w:pPr>
-        <w:pStyle w:val="Heading3"/>
+      <w:r>
+        <w:t>A practical limitation in our setup was that we could not use FinBERT’s native tokeniser and instead had to tokenise inputs using the base BERT tokeniser. Although FinBERT is BERT-based, this mismatch can still matter in practice: differences in tokenisation/vocabulary handling (especially for finance-heavy terms, tickers, abbreviations, or unusual casing/punctuation) can lead to slightly degraded representations at the encoder input, which may have negatively impacted downstream classification performance compared with a fully aligned “FinBERT model + FinBERT tokeniser” pipeline.</w:t>
+      </w:r>
+    </w:p>
+    <w:p>
+      <w:pPr>
+        <w:pStyle w:val="Ttulo3"/>
       </w:pPr>
       <w:bookmarkStart w:id="28" w:name="_Toc232200579"/>
       <w:r>
@@ -4427,7 +4067,7 @@
     </w:p>
     <w:p>
       <w:pPr>
-        <w:pStyle w:val="Heading1"/>
+        <w:pStyle w:val="Ttulo1"/>
       </w:pPr>
       <w:bookmarkStart w:id="29" w:name="_Toc232200580"/>
       <w:r>
@@ -4464,26 +4104,126 @@
     </w:p>
     <w:p>
       <w:pPr>
-        <w:pStyle w:val="Heading1"/>
-      </w:pPr>
-      <w:bookmarkStart w:id="30" w:name="_Toc232200581"/>
+        <w:pStyle w:val="Ttulo1"/>
+      </w:pPr>
+      <w:bookmarkStart w:id="30" w:name="_Toc232179079"/>
+      <w:bookmarkStart w:id="31" w:name="_Toc410990277"/>
+      <w:bookmarkStart w:id="32" w:name="_Toc410990289"/>
+      <w:bookmarkStart w:id="33" w:name="_Toc412186402"/>
+      <w:bookmarkStart w:id="34" w:name="_Toc412186507"/>
+      <w:bookmarkStart w:id="35" w:name="_Toc412186532"/>
+      <w:bookmarkStart w:id="36" w:name="_Toc412186603"/>
+      <w:bookmarkStart w:id="37" w:name="_Toc412186633"/>
+      <w:bookmarkStart w:id="38" w:name="_Toc115296810"/>
+      <w:bookmarkStart w:id="39" w:name="_Toc141959339"/>
+      <w:r>
+        <w:t>Evaluation</w:t>
+      </w:r>
+      <w:r>
+        <w:t xml:space="preserve"> And Results</w:t>
+      </w:r>
+      <w:bookmarkEnd w:id="30"/>
+    </w:p>
+    <w:bookmarkEnd w:id="31"/>
+    <w:bookmarkEnd w:id="32"/>
+    <w:bookmarkEnd w:id="33"/>
+    <w:bookmarkEnd w:id="34"/>
+    <w:bookmarkEnd w:id="35"/>
+    <w:bookmarkEnd w:id="36"/>
+    <w:bookmarkEnd w:id="37"/>
+    <w:bookmarkEnd w:id="38"/>
+    <w:bookmarkEnd w:id="39"/>
+    <w:p>
+      <w:r>
+        <w:t>All models were evaluated using stratified 5-fold cross-validation, with Precision, Recall, Macro-F1, and Accuracy used as performance metrics.</w:t>
+      </w:r>
+      <w:r>
+        <w:t xml:space="preserve"> Following the same logic as in hyperparameter optimization,</w:t>
+      </w:r>
+      <w:r>
+        <w:t xml:space="preserve"> Macro-F1 was selected as the primary evaluation criterion because it assigns equal importance to all sentiment classes and therefore provides a balanced assessment of model performance in a multi-class classification setting. Although the dataset is imbalanced, the weighted F1-score was not used because it places greater emphasis on the majority classes, potentially inflating performance by </w:t>
+      </w:r>
+      <w:r>
+        <w:t>favoring</w:t>
+      </w:r>
+      <w:r>
+        <w:t xml:space="preserve"> models that predict those classes more accurately. Macro-F1 avoids this issue by giving each sentiment class equal weight in the final score, ensuring that performance on minority classes remains equally important during evaluation.</w:t>
+      </w:r>
+    </w:p>
+    <w:p/>
+    <w:p>
+      <w:r>
+        <w:t>The results indicate a clear advantage of transformer-based architectures over traditional machine learning approaches. Among all evaluated models, BERT achieved the strongest overall performance, obtaining a Macro-F1 score of 0.9288, Precision of 0.9283, Recall of 0.9302, and Accuracy of 0.9447. These results demonstrate the effectiveness of contextual language representations for capturing the linguistic nuances and domain-specific terminology commonly found in financial tweets.</w:t>
+      </w:r>
+    </w:p>
+    <w:p/>
+    <w:p>
+      <w:r>
+        <w:t xml:space="preserve">FLAN-T5 was the second-best performing model, achieving a Macro-F1 score of 0.9134 and an Accuracy of 0.9344. Although slightly inferior to BERT, its results demonstrate that sentiment classification can be effectively formulated as a text-to-text generation task. DistilBERT also produced competitive results, achieving a Macro-F1 score of 0.8928 and an Accuracy of 0.9162. Despite its </w:t>
+      </w:r>
+      <w:r>
+        <w:lastRenderedPageBreak/>
+        <w:t>reduced size and lower computational requirements, DistilBERT retained much of the predictive capability of the larger BERT model.</w:t>
+      </w:r>
+    </w:p>
+    <w:p/>
+    <w:p>
+      <w:r>
+        <w:t>Among the traditional machine learning approaches, XGBoost achieved the strongest performance, obtaining a Macro-F1 score of 0.8818 and an Accuracy of 0.9163. Its results were surprisingly competitive when compared with DistilBERT, suggesting that the TF-IDF feature representation captured a significant amount of sentiment-related information. Random Forest followed with a Macro-F1 score of 0.8657, while Logistic Regression produced the weakest overall performance, achieving only 0.5897 Macro-F1 and 0.6883 Accuracy.</w:t>
+      </w:r>
+    </w:p>
+    <w:p/>
+    <w:p>
+      <w:r>
+        <w:t>FinBERT achieved a Macro-F1 score of 0.8219 and an Accuracy of 0.8558, outperforming Logistic Regression but remaining noticeably behind the other transformer-based models. It is important to note that these results may not fully reflect FinBERT's potential performance. Due to technical issues encountered with the Hugging Face implementation during development, it was not possible to use FinBERT's original tokenizer, and the model had to be trained and evaluated using the BERT Base tokenizer instead. Since transformer models are designed and pre-trained jointly with their corresponding tokenizers, this mismatch may have negatively affected the quality of the input representations and, consequently, the classification performance. Therefore, the relatively weaker results obtained by FinBERT should be interpreted with caution, as they may be attributable in part to this implementation constraint rather than solely to the model's underlying capabilities.</w:t>
+      </w:r>
+    </w:p>
+    <w:p/>
+    <w:p>
+      <w:r>
+        <w:t>Analysis of the class-specific metrics reveals that the Neutral class was consistently the easiest category to classify. BERT achieved the highest Neutral F1-score of 0.9617, closely followed by FLAN-T5 with 0.9569 and XGBoost with 0.9493. The consistently high scores obtained across models indicate that neutral tweets exhibit more stable and identifiable linguistic patterns. Additionally, the Neutral class represented 64.7% of the dataset, providing all models with a substantially larger number of training examples than the other sentiment categories, which likely contributed to the strong classification performance observed.</w:t>
+      </w:r>
+    </w:p>
+    <w:p/>
+    <w:p>
+      <w:r>
+        <w:t>The Bearish class proved to be the most challenging sentiment category. Although BERT achieved the highest Bearish F1-score of 0.9038, all models exhibited lower performance on this class compared to the Neutral category. This suggests that bearish sentiment is often expressed through implicit language, uncertainty, or subtle negative signals that are more difficult to identify reliably. The difficulty is further compounded by the fact that Bearish tweets accounted for only 15.1% of the dataset, making them the least represented class. Logistic Regression struggled considerably, achieving a Bearish F1-score of only 0.4464.</w:t>
+      </w:r>
+    </w:p>
+    <w:p/>
+    <w:p>
+      <w:r>
+        <w:t>Performance on the Bullish class was generally strong across the best-performing models. BERT once again achieved the highest score, obtaining a Bullish F1-score of 0.9209, followed by FLAN-T5 with 0.9015 and DistilBERT with 0.8842. The results indicate that positive sentiment expressions are comparatively easier to distinguish than bearish sentiment, particularly when contextual information is available. However, with Bullish tweets representing only 20.22% of the dataset, the smaller number of training examples likely contributed to the slightly lower performance observed relative to the Neutral class.</w:t>
+      </w:r>
+    </w:p>
+    <w:p>
+      <w:r>
+        <w:lastRenderedPageBreak/>
+        <w:t>Overall, the results suggest that both linguistic complexity and class distribution influenced classification performance. While the dominance of the Neutral class provided a clear advantage during training, the transformer-based models demonstrated strong robustness by maintaining high performance on the less represented Bullish and Bearish categories, highlighting their ability to capture contextual sentiment patterns even in imbalanced datasets.</w:t>
+      </w:r>
+    </w:p>
+    <w:p>
+      <w:pPr>
+        <w:pStyle w:val="Ttulo1"/>
+      </w:pPr>
+      <w:bookmarkStart w:id="40" w:name="_Toc232200581"/>
       <w:r>
         <w:t>Extra Challenge 2</w:t>
       </w:r>
-      <w:bookmarkEnd w:id="30"/>
+      <w:bookmarkEnd w:id="40"/>
       <w:r>
         <w:t xml:space="preserve"> </w:t>
       </w:r>
     </w:p>
     <w:p>
       <w:pPr>
-        <w:pStyle w:val="Heading2"/>
-      </w:pPr>
-      <w:bookmarkStart w:id="31" w:name="_Toc232200582"/>
+        <w:pStyle w:val="Ttulo2"/>
+      </w:pPr>
+      <w:bookmarkStart w:id="41" w:name="_Toc232200582"/>
       <w:r>
         <w:t>Architecture Overview</w:t>
       </w:r>
-      <w:bookmarkEnd w:id="31"/>
+      <w:bookmarkEnd w:id="41"/>
     </w:p>
     <w:p>
       <w:r>
@@ -4492,13 +4232,13 @@
     </w:p>
     <w:p>
       <w:pPr>
-        <w:pStyle w:val="Heading2"/>
-      </w:pPr>
-      <w:bookmarkStart w:id="32" w:name="_Toc232200583"/>
+        <w:pStyle w:val="Ttulo2"/>
+      </w:pPr>
+      <w:bookmarkStart w:id="42" w:name="_Toc232200583"/>
       <w:r>
         <w:t>Tools</w:t>
       </w:r>
-      <w:bookmarkEnd w:id="32"/>
+      <w:bookmarkEnd w:id="42"/>
     </w:p>
     <w:p>
       <w:pPr>
@@ -4524,100 +4264,57 @@
         <w:rPr>
           <w:rFonts w:ascii="Calibri" w:hAnsi="Calibri" w:cs="Calibri"/>
         </w:rPr>
-        <w:t xml:space="preserve"> factory function, which injects the model bundles into each tool via closure, keeping </w:t>
-      </w:r>
-      <w:proofErr w:type="gramStart"/>
+        <w:t xml:space="preserve"> factory function, which injects the model bundles into each tool via closure, keeping tools as stateless plain functions with no dependency on the agent itself. Two different </w:t>
+      </w:r>
       <w:r>
         <w:rPr>
           <w:rFonts w:ascii="Calibri" w:hAnsi="Calibri" w:cs="Calibri"/>
-        </w:rPr>
-        <w:t>tools as</w:t>
-      </w:r>
-      <w:proofErr w:type="gramEnd"/>
+          <w:i/>
+          <w:iCs/>
+        </w:rPr>
+        <w:t>LangChain</w:t>
+      </w:r>
       <w:r>
         <w:rPr>
           <w:rFonts w:ascii="Calibri" w:hAnsi="Calibri" w:cs="Calibri"/>
         </w:rPr>
-        <w:t xml:space="preserve"> stateless plain functions with no dependency on the agent itself. Two different </w:t>
-      </w:r>
-      <w:r>
-        <w:rPr>
-          <w:rFonts w:ascii="Calibri" w:hAnsi="Calibri" w:cs="Calibri"/>
-          <w:i/>
-          <w:iCs/>
-        </w:rPr>
-        <w:t>LangChain</w:t>
-      </w:r>
-      <w:r>
-        <w:rPr>
-          <w:rFonts w:ascii="Calibri" w:hAnsi="Calibri" w:cs="Calibri"/>
-        </w:rPr>
         <w:t xml:space="preserve"> tool construction approaches were used depending on each tool's signature.</w:t>
       </w:r>
     </w:p>
     <w:p>
       <w:pPr>
-        <w:pStyle w:val="Heading3"/>
-        <w:rPr>
-          <w:rStyle w:val="HTMLCode"/>
+        <w:pStyle w:val="Ttulo3"/>
+        <w:rPr>
+          <w:rStyle w:val="CdigoHTML"/>
           <w:rFonts w:ascii="Calibri" w:hAnsi="Calibri" w:cs="Calibri"/>
           <w:sz w:val="24"/>
           <w:szCs w:val="24"/>
         </w:rPr>
       </w:pPr>
-      <w:bookmarkStart w:id="33" w:name="_Toc232168914"/>
-      <w:bookmarkStart w:id="34" w:name="_Toc232200584"/>
-      <w:r>
-        <w:rPr>
-          <w:rStyle w:val="HTMLCode"/>
+      <w:bookmarkStart w:id="43" w:name="_Toc232168914"/>
+      <w:bookmarkStart w:id="44" w:name="_Toc232200584"/>
+      <w:r>
+        <w:rPr>
+          <w:rStyle w:val="CdigoHTML"/>
           <w:rFonts w:ascii="Calibri" w:hAnsi="Calibri" w:cs="Calibri"/>
           <w:sz w:val="24"/>
           <w:szCs w:val="24"/>
         </w:rPr>
-        <w:t xml:space="preserve">Single-Argument </w:t>
-      </w:r>
-      <w:proofErr w:type="gramStart"/>
-      <w:r>
-        <w:rPr>
-          <w:rStyle w:val="HTMLCode"/>
-          <w:rFonts w:ascii="Calibri" w:hAnsi="Calibri" w:cs="Calibri"/>
-          <w:sz w:val="24"/>
-          <w:szCs w:val="24"/>
-        </w:rPr>
-        <w:t>Tools (@</w:t>
-      </w:r>
-      <w:proofErr w:type="gramEnd"/>
-      <w:r>
-        <w:rPr>
-          <w:rStyle w:val="HTMLCode"/>
-          <w:rFonts w:ascii="Calibri" w:hAnsi="Calibri" w:cs="Calibri"/>
-          <w:sz w:val="24"/>
-          <w:szCs w:val="24"/>
-        </w:rPr>
-        <w:t>tool)</w:t>
-      </w:r>
-      <w:bookmarkEnd w:id="33"/>
-      <w:bookmarkEnd w:id="34"/>
+        <w:t>Single-Argument Tools (@tool)</w:t>
+      </w:r>
+      <w:bookmarkEnd w:id="43"/>
+      <w:bookmarkEnd w:id="44"/>
     </w:p>
     <w:p>
       <w:r>
         <w:t xml:space="preserve">Tools that take a single string argument were decorated with </w:t>
       </w:r>
-      <w:proofErr w:type="gramStart"/>
-      <w:r>
-        <w:rPr>
-          <w:i/>
-          <w:iCs/>
-        </w:rPr>
-        <w:t>LangChain’s @</w:t>
-      </w:r>
-      <w:proofErr w:type="gramEnd"/>
-      <w:r>
-        <w:rPr>
-          <w:i/>
-          <w:iCs/>
-        </w:rPr>
-        <w:t>tool</w:t>
+      <w:r>
+        <w:rPr>
+          <w:i/>
+          <w:iCs/>
+        </w:rPr>
+        <w:t>LangChain’s @tool</w:t>
       </w:r>
       <w:r>
         <w:t xml:space="preserve"> decorator directly, as it handles single-argument functions</w:t>
@@ -4633,7 +4330,7 @@
     </w:p>
     <w:p>
       <w:pPr>
-        <w:pStyle w:val="ListParagraph"/>
+        <w:pStyle w:val="PargrafodaLista"/>
         <w:numPr>
           <w:ilvl w:val="0"/>
           <w:numId w:val="17"/>
@@ -4651,7 +4348,7 @@
       </w:r>
       <w:r>
         <w:rPr>
-          <w:rStyle w:val="HTMLCode"/>
+          <w:rStyle w:val="CdigoHTML"/>
           <w:rFonts w:ascii="Calibri" w:eastAsia="Calibri" w:hAnsi="Calibri" w:cs="Calibri"/>
           <w:i/>
           <w:iCs/>
@@ -4666,7 +4363,7 @@
     </w:p>
     <w:p>
       <w:pPr>
-        <w:pStyle w:val="ListParagraph"/>
+        <w:pStyle w:val="PargrafodaLista"/>
         <w:numPr>
           <w:ilvl w:val="0"/>
           <w:numId w:val="17"/>
@@ -4685,22 +4382,21 @@
     </w:p>
     <w:p>
       <w:pPr>
-        <w:pStyle w:val="Heading3"/>
+        <w:pStyle w:val="Ttulo3"/>
         <w:rPr>
           <w:rFonts w:ascii="Calibri" w:hAnsi="Calibri" w:cs="Calibri"/>
         </w:rPr>
       </w:pPr>
-      <w:bookmarkStart w:id="35" w:name="_Toc232168915"/>
-      <w:bookmarkStart w:id="36" w:name="_Toc232200585"/>
+      <w:bookmarkStart w:id="45" w:name="_Toc232168915"/>
+      <w:bookmarkStart w:id="46" w:name="_Toc232200585"/>
       <w:r>
         <w:rPr>
           <w:rFonts w:ascii="Calibri" w:hAnsi="Calibri" w:cs="Calibri"/>
         </w:rPr>
-        <w:lastRenderedPageBreak/>
         <w:t>Multi-Argument Tools (StructuredTool)</w:t>
       </w:r>
-      <w:bookmarkEnd w:id="35"/>
-      <w:bookmarkEnd w:id="36"/>
+      <w:bookmarkEnd w:id="45"/>
+      <w:bookmarkEnd w:id="46"/>
     </w:p>
     <w:p>
       <w:r>
@@ -4731,7 +4427,7 @@
       </w:r>
       <w:r>
         <w:rPr>
-          <w:rStyle w:val="HTMLCode"/>
+          <w:rStyle w:val="CdigoHTML"/>
           <w:rFonts w:ascii="Calibri" w:eastAsia="Calibri" w:hAnsi="Calibri" w:cs="Calibri"/>
           <w:i/>
           <w:iCs/>
@@ -4755,7 +4451,7 @@
       </w:r>
       <w:r>
         <w:rPr>
-          <w:rStyle w:val="HTMLCode"/>
+          <w:rStyle w:val="CdigoHTML"/>
           <w:rFonts w:ascii="Calibri" w:eastAsia="Calibri" w:hAnsi="Calibri" w:cs="Calibri"/>
           <w:i/>
           <w:iCs/>
@@ -4770,7 +4466,7 @@
     </w:p>
     <w:p>
       <w:pPr>
-        <w:pStyle w:val="ListParagraph"/>
+        <w:pStyle w:val="PargrafodaLista"/>
         <w:numPr>
           <w:ilvl w:val="0"/>
           <w:numId w:val="18"/>
@@ -4791,7 +4487,7 @@
       </w:r>
       <w:r>
         <w:rPr>
-          <w:rStyle w:val="HTMLCode"/>
+          <w:rStyle w:val="CdigoHTML"/>
           <w:rFonts w:ascii="Calibri" w:eastAsia="Calibri" w:hAnsi="Calibri" w:cs="Calibri"/>
           <w:i/>
           <w:iCs/>
@@ -4805,7 +4501,7 @@
       </w:r>
       <w:r>
         <w:rPr>
-          <w:rStyle w:val="HTMLCode"/>
+          <w:rStyle w:val="CdigoHTML"/>
           <w:rFonts w:ascii="Calibri" w:eastAsia="Calibri" w:hAnsi="Calibri" w:cs="Calibri"/>
           <w:i/>
           <w:iCs/>
@@ -4819,7 +4515,7 @@
       </w:r>
       <w:r>
         <w:rPr>
-          <w:rStyle w:val="HTMLCode"/>
+          <w:rStyle w:val="CdigoHTML"/>
           <w:rFonts w:ascii="Calibri" w:eastAsia="Calibri" w:hAnsi="Calibri" w:cs="Calibri"/>
           <w:i/>
           <w:iCs/>
@@ -4833,7 +4529,7 @@
       </w:r>
       <w:r>
         <w:rPr>
-          <w:rStyle w:val="HTMLCode"/>
+          <w:rStyle w:val="CdigoHTML"/>
           <w:rFonts w:ascii="Calibri" w:eastAsia="Calibri" w:hAnsi="Calibri" w:cs="Calibri"/>
           <w:i/>
           <w:iCs/>
@@ -4848,7 +4544,7 @@
     </w:p>
     <w:p>
       <w:pPr>
-        <w:pStyle w:val="ListParagraph"/>
+        <w:pStyle w:val="PargrafodaLista"/>
         <w:numPr>
           <w:ilvl w:val="0"/>
           <w:numId w:val="18"/>
@@ -4866,7 +4562,7 @@
       </w:r>
       <w:r>
         <w:rPr>
-          <w:rStyle w:val="HTMLCode"/>
+          <w:rStyle w:val="CdigoHTML"/>
           <w:rFonts w:ascii="Calibri" w:eastAsia="Calibri" w:hAnsi="Calibri" w:cs="Calibri"/>
           <w:i/>
           <w:iCs/>
@@ -4880,7 +4576,7 @@
       </w:r>
       <w:r>
         <w:rPr>
-          <w:rStyle w:val="HTMLCode"/>
+          <w:rStyle w:val="CdigoHTML"/>
           <w:rFonts w:ascii="Calibri" w:eastAsia="Calibri" w:hAnsi="Calibri" w:cs="Calibri"/>
           <w:i/>
           <w:iCs/>
@@ -4894,7 +4590,7 @@
       </w:r>
       <w:r>
         <w:rPr>
-          <w:rStyle w:val="HTMLCode"/>
+          <w:rStyle w:val="CdigoHTML"/>
           <w:rFonts w:ascii="Calibri" w:eastAsia="Calibri" w:hAnsi="Calibri" w:cs="Calibri"/>
           <w:i/>
           <w:iCs/>
@@ -4909,35 +4605,35 @@
     </w:p>
     <w:p>
       <w:pPr>
-        <w:pStyle w:val="Heading2"/>
-      </w:pPr>
-      <w:bookmarkStart w:id="37" w:name="_Toc232200586"/>
+        <w:pStyle w:val="Ttulo2"/>
+      </w:pPr>
+      <w:bookmarkStart w:id="47" w:name="_Toc232200586"/>
       <w:r>
         <w:t>Agent and Memory</w:t>
       </w:r>
-      <w:bookmarkEnd w:id="37"/>
-    </w:p>
-    <w:p>
-      <w:pPr>
-        <w:pStyle w:val="Heading3"/>
-        <w:rPr>
-          <w:rStyle w:val="HTMLCode"/>
+      <w:bookmarkEnd w:id="47"/>
+    </w:p>
+    <w:p>
+      <w:pPr>
+        <w:pStyle w:val="Ttulo3"/>
+        <w:rPr>
+          <w:rStyle w:val="CdigoHTML"/>
           <w:rFonts w:ascii="Calibri" w:hAnsi="Calibri" w:cs="Calibri"/>
           <w:sz w:val="24"/>
           <w:szCs w:val="24"/>
         </w:rPr>
       </w:pPr>
-      <w:bookmarkStart w:id="38" w:name="_Toc232200587"/>
-      <w:r>
-        <w:rPr>
-          <w:rStyle w:val="HTMLCode"/>
+      <w:bookmarkStart w:id="48" w:name="_Toc232200587"/>
+      <w:r>
+        <w:rPr>
+          <w:rStyle w:val="CdigoHTML"/>
           <w:rFonts w:ascii="Calibri" w:hAnsi="Calibri" w:cs="Calibri"/>
           <w:sz w:val="24"/>
           <w:szCs w:val="24"/>
         </w:rPr>
         <w:t>SentimentAgent Initialization</w:t>
       </w:r>
-      <w:bookmarkEnd w:id="38"/>
+      <w:bookmarkEnd w:id="48"/>
     </w:p>
     <w:p>
       <w:r>
@@ -4956,30 +4652,31 @@
     </w:p>
     <w:p>
       <w:r>
+        <w:lastRenderedPageBreak/>
         <w:t>During initialization, the class receives the collection of trained model bundles and creates both the LLM instance and the set of tools available to the agent. The LLM is instantiated through Azure OpenAI's GPT-4 deployment with a temperature of 0.0, ensuring deterministic behavior and consistent tool-selection decisions. The available tools include model discovery, tweet classification, intelligent model routing, and model evaluation functions.</w:t>
       </w:r>
     </w:p>
     <w:p>
       <w:pPr>
-        <w:pStyle w:val="Heading3"/>
-        <w:rPr>
-          <w:rStyle w:val="HTMLCode"/>
+        <w:pStyle w:val="Ttulo3"/>
+        <w:rPr>
+          <w:rStyle w:val="CdigoHTML"/>
           <w:rFonts w:ascii="Calibri" w:hAnsi="Calibri" w:cs="Calibri"/>
           <w:sz w:val="24"/>
           <w:szCs w:val="24"/>
         </w:rPr>
       </w:pPr>
-      <w:bookmarkStart w:id="39" w:name="_Toc232200588"/>
-      <w:r>
-        <w:rPr>
-          <w:rStyle w:val="HTMLCode"/>
+      <w:bookmarkStart w:id="49" w:name="_Toc232200588"/>
+      <w:r>
+        <w:rPr>
+          <w:rStyle w:val="CdigoHTML"/>
           <w:rFonts w:ascii="Calibri" w:hAnsi="Calibri" w:cs="Calibri"/>
           <w:sz w:val="24"/>
           <w:szCs w:val="24"/>
         </w:rPr>
         <w:t>Agent Creation and System Prompt Design</w:t>
       </w:r>
-      <w:bookmarkEnd w:id="39"/>
+      <w:bookmarkEnd w:id="49"/>
     </w:p>
     <w:p>
       <w:pPr>
@@ -5043,7 +4740,7 @@
     </w:p>
     <w:p>
       <w:pPr>
-        <w:pStyle w:val="ListParagraph"/>
+        <w:pStyle w:val="PargrafodaLista"/>
         <w:numPr>
           <w:ilvl w:val="0"/>
           <w:numId w:val="19"/>
@@ -5061,7 +4758,7 @@
     </w:p>
     <w:p>
       <w:pPr>
-        <w:pStyle w:val="ListParagraph"/>
+        <w:pStyle w:val="PargrafodaLista"/>
         <w:numPr>
           <w:ilvl w:val="0"/>
           <w:numId w:val="19"/>
@@ -5079,7 +4776,7 @@
     </w:p>
     <w:p>
       <w:pPr>
-        <w:pStyle w:val="ListParagraph"/>
+        <w:pStyle w:val="PargrafodaLista"/>
         <w:numPr>
           <w:ilvl w:val="0"/>
           <w:numId w:val="19"/>
@@ -5097,7 +4794,7 @@
     </w:p>
     <w:p>
       <w:pPr>
-        <w:pStyle w:val="ListParagraph"/>
+        <w:pStyle w:val="PargrafodaLista"/>
         <w:numPr>
           <w:ilvl w:val="0"/>
           <w:numId w:val="19"/>
@@ -5115,25 +4812,25 @@
     </w:p>
     <w:p>
       <w:pPr>
-        <w:pStyle w:val="Heading3"/>
-        <w:rPr>
-          <w:rStyle w:val="HTMLCode"/>
+        <w:pStyle w:val="Ttulo3"/>
+        <w:rPr>
+          <w:rStyle w:val="CdigoHTML"/>
           <w:rFonts w:ascii="Calibri" w:hAnsi="Calibri" w:cs="Calibri"/>
           <w:sz w:val="24"/>
           <w:szCs w:val="24"/>
         </w:rPr>
       </w:pPr>
-      <w:bookmarkStart w:id="40" w:name="_Toc232200589"/>
-      <w:r>
-        <w:rPr>
-          <w:rStyle w:val="HTMLCode"/>
+      <w:bookmarkStart w:id="50" w:name="_Toc232200589"/>
+      <w:r>
+        <w:rPr>
+          <w:rStyle w:val="CdigoHTML"/>
           <w:rFonts w:ascii="Calibri" w:hAnsi="Calibri" w:cs="Calibri"/>
           <w:sz w:val="24"/>
           <w:szCs w:val="24"/>
         </w:rPr>
         <w:t>Conversational Memory and Context Handling</w:t>
       </w:r>
-      <w:bookmarkEnd w:id="40"/>
+      <w:bookmarkEnd w:id="50"/>
     </w:p>
     <w:p>
       <w:pPr>
@@ -5207,26 +4904,25 @@
     </w:p>
     <w:p>
       <w:pPr>
-        <w:pStyle w:val="Heading3"/>
-        <w:rPr>
-          <w:rStyle w:val="HTMLCode"/>
+        <w:pStyle w:val="Ttulo3"/>
+        <w:rPr>
+          <w:rStyle w:val="CdigoHTML"/>
           <w:rFonts w:ascii="Calibri" w:hAnsi="Calibri" w:cs="Calibri"/>
           <w:sz w:val="24"/>
           <w:szCs w:val="24"/>
         </w:rPr>
       </w:pPr>
-      <w:bookmarkStart w:id="41" w:name="_Toc232200590"/>
-      <w:r>
-        <w:rPr>
-          <w:rStyle w:val="HTMLCode"/>
+      <w:bookmarkStart w:id="51" w:name="_Toc232200590"/>
+      <w:r>
+        <w:rPr>
+          <w:rStyle w:val="CdigoHTML"/>
           <w:rFonts w:ascii="Calibri" w:hAnsi="Calibri" w:cs="Calibri"/>
           <w:sz w:val="24"/>
           <w:szCs w:val="24"/>
         </w:rPr>
-        <w:lastRenderedPageBreak/>
         <w:t>Execution Loop and Runtime Configuration</w:t>
       </w:r>
-      <w:bookmarkEnd w:id="41"/>
+      <w:bookmarkEnd w:id="51"/>
     </w:p>
     <w:p>
       <w:r>
@@ -5257,66 +4953,25 @@
       <w:r>
         <w:t xml:space="preserve">Finally, the SentimentAgent class exposes a simple </w:t>
       </w:r>
-      <w:proofErr w:type="gramStart"/>
-      <w:r>
-        <w:rPr>
-          <w:i/>
-          <w:iCs/>
-        </w:rPr>
-        <w:t>chat(</w:t>
-      </w:r>
-      <w:proofErr w:type="gramEnd"/>
-      <w:r>
-        <w:rPr>
-          <w:i/>
-          <w:iCs/>
-        </w:rPr>
-        <w:t>)</w:t>
+      <w:r>
+        <w:rPr>
+          <w:i/>
+          <w:iCs/>
+        </w:rPr>
+        <w:t>chat()</w:t>
       </w:r>
       <w:r>
         <w:t xml:space="preserve"> method that serves as the primary interface between the user and the system. Incoming messages are passed to the agent together with the corresponding session history, after which the agent autonomously determines whether a tool should be invoked or whether a direct response can be generated. A complementary </w:t>
       </w:r>
-      <w:proofErr w:type="gramStart"/>
-      <w:r>
-        <w:rPr>
-          <w:i/>
-          <w:iCs/>
-        </w:rPr>
-        <w:t>reset(</w:t>
-      </w:r>
-      <w:proofErr w:type="gramEnd"/>
-      <w:r>
-        <w:rPr>
-          <w:i/>
-          <w:iCs/>
-        </w:rPr>
-        <w:t>)</w:t>
+      <w:r>
+        <w:rPr>
+          <w:i/>
+          <w:iCs/>
+        </w:rPr>
+        <w:t>reset()</w:t>
       </w:r>
       <w:r>
         <w:t xml:space="preserve"> method is also provided to clear the stored conversation history and start a new session when required.</w:t>
-      </w:r>
-    </w:p>
-    <w:p>
-      <w:pPr>
-        <w:pStyle w:val="Heading1"/>
-      </w:pPr>
-      <w:bookmarkStart w:id="42" w:name="_Toc410990277"/>
-      <w:bookmarkStart w:id="43" w:name="_Toc410990289"/>
-      <w:bookmarkStart w:id="44" w:name="_Toc412186402"/>
-      <w:bookmarkStart w:id="45" w:name="_Toc412186507"/>
-      <w:bookmarkStart w:id="46" w:name="_Toc412186532"/>
-      <w:bookmarkStart w:id="47" w:name="_Toc412186603"/>
-      <w:bookmarkStart w:id="48" w:name="_Toc412186633"/>
-      <w:bookmarkStart w:id="49" w:name="_Toc115296810"/>
-      <w:bookmarkStart w:id="50" w:name="_Toc141959339"/>
-      <w:bookmarkStart w:id="51" w:name="_Toc232200591"/>
-      <w:proofErr w:type="gramStart"/>
-      <w:r>
-        <w:t>Evaluation</w:t>
-      </w:r>
-      <w:proofErr w:type="gramEnd"/>
-      <w:r>
-        <w:t xml:space="preserve"> And Results</w:t>
       </w:r>
       <w:bookmarkStart w:id="52" w:name="_Toc410990278"/>
       <w:bookmarkStart w:id="53" w:name="_Toc410990290"/>
@@ -5327,38 +4982,13 @@
       <w:bookmarkStart w:id="58" w:name="_Toc412186634"/>
       <w:bookmarkStart w:id="59" w:name="_Toc115296811"/>
       <w:bookmarkStart w:id="60" w:name="_Toc141959340"/>
-      <w:bookmarkEnd w:id="42"/>
-      <w:bookmarkEnd w:id="43"/>
-      <w:bookmarkEnd w:id="44"/>
-      <w:bookmarkEnd w:id="45"/>
-      <w:bookmarkEnd w:id="46"/>
-      <w:bookmarkEnd w:id="47"/>
-      <w:bookmarkEnd w:id="48"/>
-      <w:bookmarkEnd w:id="49"/>
-      <w:bookmarkEnd w:id="50"/>
-      <w:bookmarkEnd w:id="51"/>
-    </w:p>
-    <w:p>
-      <w:pPr>
-        <w:rPr>
-          <w:rFonts w:eastAsia="Times New Roman"/>
-          <w:color w:val="DF0D7D"/>
-          <w:sz w:val="32"/>
-          <w:szCs w:val="32"/>
-        </w:rPr>
-      </w:pPr>
-      <w:proofErr w:type="spellStart"/>
-      <w:r>
-        <w:t>Aaaa</w:t>
-      </w:r>
-      <w:proofErr w:type="spellEnd"/>
       <w:r>
         <w:br w:type="page"/>
       </w:r>
     </w:p>
     <w:p>
       <w:pPr>
-        <w:pStyle w:val="Heading1"/>
+        <w:pStyle w:val="Ttulo1"/>
       </w:pPr>
       <w:bookmarkStart w:id="61" w:name="_Toc232200592"/>
       <w:r>
@@ -5676,7 +5306,7 @@
         </w:rPr>
         <w:lastRenderedPageBreak/>
         <w:drawing>
-          <wp:anchor distT="0" distB="0" distL="114300" distR="114300" simplePos="0" relativeHeight="251660288" behindDoc="1" locked="0" layoutInCell="1" allowOverlap="1" wp14:anchorId="6BE2B909" wp14:editId="4B1B50B8">
+          <wp:anchor distT="0" distB="0" distL="114300" distR="114300" simplePos="0" relativeHeight="251660288" behindDoc="1" locked="0" layoutInCell="1" allowOverlap="1" wp14:anchorId="6BE2B909" wp14:editId="64865802">
             <wp:simplePos x="0" y="0"/>
             <wp:positionH relativeFrom="page">
               <wp:posOffset>720090</wp:posOffset>
@@ -5831,15 +5461,7 @@
         <w:t xml:space="preserve"> </w:t>
       </w:r>
       <w:r>
-        <w:t xml:space="preserve">Top 15 most used hashtags and </w:t>
-      </w:r>
-      <w:proofErr w:type="spellStart"/>
-      <w:r>
-        <w:t>cashtags</w:t>
-      </w:r>
-      <w:proofErr w:type="spellEnd"/>
-      <w:r>
-        <w:t xml:space="preserve"> per class</w:t>
+        <w:t>Top 15 most used hashtags and cashtags per class</w:t>
       </w:r>
     </w:p>
     <w:p>
@@ -6086,13 +5708,8 @@
         <w:t>avg</w:t>
       </w:r>
       <w:r>
-        <w:t xml:space="preserve"> number of characters, words and presence of URL and </w:t>
-      </w:r>
-      <w:proofErr w:type="spellStart"/>
-      <w:r>
-        <w:t>cashtag</w:t>
-      </w:r>
-      <w:proofErr w:type="spellEnd"/>
+        <w:t xml:space="preserve"> number of characters, words and presence of URL and cashtag</w:t>
+      </w:r>
     </w:p>
     <w:bookmarkEnd w:id="62"/>
     <w:bookmarkEnd w:id="63"/>
@@ -6144,7 +5761,7 @@
 <w:ftr xmlns:wpc="http://schemas.microsoft.com/office/word/2010/wordprocessingCanvas" xmlns:cx="http://schemas.microsoft.com/office/drawing/2014/chartex" xmlns:cx1="http://schemas.microsoft.com/office/drawing/2015/9/8/chartex" xmlns:cx2="http://schemas.microsoft.com/office/drawing/2015/10/21/chartex" xmlns:cx3="http://schemas.microsoft.com/office/drawing/2016/5/9/chartex" xmlns:cx4="http://schemas.microsoft.com/office/drawing/2016/5/10/chartex" xmlns:cx5="http://schemas.microsoft.com/office/drawing/2016/5/11/chartex" xmlns:cx6="http://schemas.microsoft.com/office/drawing/2016/5/12/chartex" xmlns:cx7="http://schemas.microsoft.com/office/drawing/2016/5/13/chartex" xmlns:cx8="http://schemas.microsoft.com/office/drawing/2016/5/14/chartex" xmlns:mc="http://schemas.openxmlformats.org/markup-compatibility/2006" xmlns:aink="http://schemas.microsoft.com/office/drawing/2016/ink" xmlns:am3d="http://schemas.microsoft.com/office/drawing/2017/model3d" xmlns:o="urn:schemas-microsoft-com:office:office" xmlns:oel="http://schemas.microsoft.com/office/2019/extlst" xmlns:r="http://schemas.openxmlformats.org/officeDocument/2006/relationships" xmlns:m="http://schemas.openxmlformats.org/officeDocument/2006/math" xmlns:v="urn:schemas-microsoft-com:vml" xmlns:wp14="http://schemas.microsoft.com/office/word/2010/wordprocessingDrawing" xmlns:wp="http://schemas.openxmlformats.org/drawingml/2006/wordprocessingDrawing" xmlns:w10="urn:schemas-microsoft-com:office:word" xmlns:w="http://schemas.openxmlformats.org/wordprocessingml/2006/main" xmlns:w14="http://schemas.microsoft.com/office/word/2010/wordml" xmlns:w15="http://schemas.microsoft.com/office/word/2012/wordml" xmlns:w16cex="http://schemas.microsoft.com/office/word/2018/wordml/cex" xmlns:w16cid="http://schemas.microsoft.com/office/word/2016/wordml/cid" xmlns:w16="http://schemas.microsoft.com/office/word/2018/wordml" xmlns:w16du="http://schemas.microsoft.com/office/word/2023/wordml/word16du" xmlns:w16sdtdh="http://schemas.microsoft.com/office/word/2020/wordml/sdtdatahash" xmlns:w16sdtfl="http://schemas.microsoft.com/office/word/2024/wordml/sdtformatlock" xmlns:w16se="http://schemas.microsoft.com/office/word/2015/wordml/symex" xmlns:wpg="http://schemas.microsoft.com/office/word/2010/wordprocessingGroup" xmlns:wpi="http://schemas.microsoft.com/office/word/2010/wordprocessingInk" xmlns:wne="http://schemas.microsoft.com/office/word/2006/wordml" xmlns:wps="http://schemas.microsoft.com/office/word/2010/wordprocessingShape" mc:Ignorable="w14 w15 w16se w16cid w16 w16cex w16sdtdh w16sdtfl w16du wp14">
   <w:p>
     <w:pPr>
-      <w:pStyle w:val="Footer"/>
+      <w:pStyle w:val="Rodap"/>
     </w:pPr>
   </w:p>
 </w:ftr>
@@ -6168,7 +5785,7 @@
     <w:sdtContent>
       <w:p>
         <w:pPr>
-          <w:pStyle w:val="Footer"/>
+          <w:pStyle w:val="Rodap"/>
           <w:jc w:val="right"/>
         </w:pPr>
         <w:r>
@@ -6197,7 +5814,7 @@
   </w:sdt>
   <w:p>
     <w:pPr>
-      <w:pStyle w:val="Footer"/>
+      <w:pStyle w:val="Rodap"/>
     </w:pPr>
   </w:p>
 </w:ftr>
@@ -6207,7 +5824,7 @@
 <w:ftr xmlns:wpc="http://schemas.microsoft.com/office/word/2010/wordprocessingCanvas" xmlns:cx="http://schemas.microsoft.com/office/drawing/2014/chartex" xmlns:cx1="http://schemas.microsoft.com/office/drawing/2015/9/8/chartex" xmlns:cx2="http://schemas.microsoft.com/office/drawing/2015/10/21/chartex" xmlns:cx3="http://schemas.microsoft.com/office/drawing/2016/5/9/chartex" xmlns:cx4="http://schemas.microsoft.com/office/drawing/2016/5/10/chartex" xmlns:cx5="http://schemas.microsoft.com/office/drawing/2016/5/11/chartex" xmlns:cx6="http://schemas.microsoft.com/office/drawing/2016/5/12/chartex" xmlns:cx7="http://schemas.microsoft.com/office/drawing/2016/5/13/chartex" xmlns:cx8="http://schemas.microsoft.com/office/drawing/2016/5/14/chartex" xmlns:mc="http://schemas.openxmlformats.org/markup-compatibility/2006" xmlns:aink="http://schemas.microsoft.com/office/drawing/2016/ink" xmlns:am3d="http://schemas.microsoft.com/office/drawing/2017/model3d" xmlns:o="urn:schemas-microsoft-com:office:office" xmlns:oel="http://schemas.microsoft.com/office/2019/extlst" xmlns:r="http://schemas.openxmlformats.org/officeDocument/2006/relationships" xmlns:m="http://schemas.openxmlformats.org/officeDocument/2006/math" xmlns:v="urn:schemas-microsoft-com:vml" xmlns:wp14="http://schemas.microsoft.com/office/word/2010/wordprocessingDrawing" xmlns:wp="http://schemas.openxmlformats.org/drawingml/2006/wordprocessingDrawing" xmlns:w10="urn:schemas-microsoft-com:office:word" xmlns:w="http://schemas.openxmlformats.org/wordprocessingml/2006/main" xmlns:w14="http://schemas.microsoft.com/office/word/2010/wordml" xmlns:w15="http://schemas.microsoft.com/office/word/2012/wordml" xmlns:w16cex="http://schemas.microsoft.com/office/word/2018/wordml/cex" xmlns:w16cid="http://schemas.microsoft.com/office/word/2016/wordml/cid" xmlns:w16="http://schemas.microsoft.com/office/word/2018/wordml" xmlns:w16du="http://schemas.microsoft.com/office/word/2023/wordml/word16du" xmlns:w16sdtdh="http://schemas.microsoft.com/office/word/2020/wordml/sdtdatahash" xmlns:w16sdtfl="http://schemas.microsoft.com/office/word/2024/wordml/sdtformatlock" xmlns:w16se="http://schemas.microsoft.com/office/word/2015/wordml/symex" xmlns:wpg="http://schemas.microsoft.com/office/word/2010/wordprocessingGroup" xmlns:wpi="http://schemas.microsoft.com/office/word/2010/wordprocessingInk" xmlns:wne="http://schemas.microsoft.com/office/word/2006/wordml" xmlns:wps="http://schemas.microsoft.com/office/word/2010/wordprocessingShape" mc:Ignorable="w14 w15 w16se w16cid w16 w16cex w16sdtdh w16sdtfl w16du wp14">
   <w:p>
     <w:pPr>
-      <w:pStyle w:val="Footer"/>
+      <w:pStyle w:val="Rodap"/>
     </w:pPr>
   </w:p>
 </w:ftr>
@@ -6236,7 +5853,7 @@
 <w:hdr xmlns:wpc="http://schemas.microsoft.com/office/word/2010/wordprocessingCanvas" xmlns:cx="http://schemas.microsoft.com/office/drawing/2014/chartex" xmlns:cx1="http://schemas.microsoft.com/office/drawing/2015/9/8/chartex" xmlns:cx2="http://schemas.microsoft.com/office/drawing/2015/10/21/chartex" xmlns:cx3="http://schemas.microsoft.com/office/drawing/2016/5/9/chartex" xmlns:cx4="http://schemas.microsoft.com/office/drawing/2016/5/10/chartex" xmlns:cx5="http://schemas.microsoft.com/office/drawing/2016/5/11/chartex" xmlns:cx6="http://schemas.microsoft.com/office/drawing/2016/5/12/chartex" xmlns:cx7="http://schemas.microsoft.com/office/drawing/2016/5/13/chartex" xmlns:cx8="http://schemas.microsoft.com/office/drawing/2016/5/14/chartex" xmlns:mc="http://schemas.openxmlformats.org/markup-compatibility/2006" xmlns:aink="http://schemas.microsoft.com/office/drawing/2016/ink" xmlns:am3d="http://schemas.microsoft.com/office/drawing/2017/model3d" xmlns:o="urn:schemas-microsoft-com:office:office" xmlns:oel="http://schemas.microsoft.com/office/2019/extlst" xmlns:r="http://schemas.openxmlformats.org/officeDocument/2006/relationships" xmlns:m="http://schemas.openxmlformats.org/officeDocument/2006/math" xmlns:v="urn:schemas-microsoft-com:vml" xmlns:wp14="http://schemas.microsoft.com/office/word/2010/wordprocessingDrawing" xmlns:wp="http://schemas.openxmlformats.org/drawingml/2006/wordprocessingDrawing" xmlns:w10="urn:schemas-microsoft-com:office:word" xmlns:w="http://schemas.openxmlformats.org/wordprocessingml/2006/main" xmlns:w14="http://schemas.microsoft.com/office/word/2010/wordml" xmlns:w15="http://schemas.microsoft.com/office/word/2012/wordml" xmlns:w16cex="http://schemas.microsoft.com/office/word/2018/wordml/cex" xmlns:w16cid="http://schemas.microsoft.com/office/word/2016/wordml/cid" xmlns:w16="http://schemas.microsoft.com/office/word/2018/wordml" xmlns:w16du="http://schemas.microsoft.com/office/word/2023/wordml/word16du" xmlns:w16sdtdh="http://schemas.microsoft.com/office/word/2020/wordml/sdtdatahash" xmlns:w16sdtfl="http://schemas.microsoft.com/office/word/2024/wordml/sdtformatlock" xmlns:w16se="http://schemas.microsoft.com/office/word/2015/wordml/symex" xmlns:wpg="http://schemas.microsoft.com/office/word/2010/wordprocessingGroup" xmlns:wpi="http://schemas.microsoft.com/office/word/2010/wordprocessingInk" xmlns:wne="http://schemas.microsoft.com/office/word/2006/wordml" xmlns:wps="http://schemas.microsoft.com/office/word/2010/wordprocessingShape" mc:Ignorable="w14 w15 w16se w16cid w16 w16cex w16sdtdh w16sdtfl w16du wp14">
   <w:p>
     <w:pPr>
-      <w:pStyle w:val="Header"/>
+      <w:pStyle w:val="Cabealho"/>
     </w:pPr>
   </w:p>
 </w:hdr>
@@ -6265,7 +5882,7 @@
         </w:tcPr>
         <w:p>
           <w:pPr>
-            <w:pStyle w:val="Header"/>
+            <w:pStyle w:val="Cabealho"/>
           </w:pPr>
           <w:r>
             <w:rPr>
@@ -6321,7 +5938,7 @@
         </w:tcPr>
         <w:p>
           <w:pPr>
-            <w:pStyle w:val="Header"/>
+            <w:pStyle w:val="Cabealho"/>
           </w:pPr>
         </w:p>
       </w:tc>
@@ -6331,7 +5948,7 @@
         </w:tcPr>
         <w:p>
           <w:pPr>
-            <w:pStyle w:val="Header"/>
+            <w:pStyle w:val="Cabealho"/>
           </w:pPr>
         </w:p>
       </w:tc>
@@ -6339,7 +5956,7 @@
   </w:tbl>
   <w:p>
     <w:pPr>
-      <w:pStyle w:val="Header"/>
+      <w:pStyle w:val="Cabealho"/>
     </w:pPr>
   </w:p>
 </w:hdr>
@@ -6349,7 +5966,7 @@
 <w:hdr xmlns:wpc="http://schemas.microsoft.com/office/word/2010/wordprocessingCanvas" xmlns:cx="http://schemas.microsoft.com/office/drawing/2014/chartex" xmlns:cx1="http://schemas.microsoft.com/office/drawing/2015/9/8/chartex" xmlns:cx2="http://schemas.microsoft.com/office/drawing/2015/10/21/chartex" xmlns:cx3="http://schemas.microsoft.com/office/drawing/2016/5/9/chartex" xmlns:cx4="http://schemas.microsoft.com/office/drawing/2016/5/10/chartex" xmlns:cx5="http://schemas.microsoft.com/office/drawing/2016/5/11/chartex" xmlns:cx6="http://schemas.microsoft.com/office/drawing/2016/5/12/chartex" xmlns:cx7="http://schemas.microsoft.com/office/drawing/2016/5/13/chartex" xmlns:cx8="http://schemas.microsoft.com/office/drawing/2016/5/14/chartex" xmlns:mc="http://schemas.openxmlformats.org/markup-compatibility/2006" xmlns:aink="http://schemas.microsoft.com/office/drawing/2016/ink" xmlns:am3d="http://schemas.microsoft.com/office/drawing/2017/model3d" xmlns:o="urn:schemas-microsoft-com:office:office" xmlns:oel="http://schemas.microsoft.com/office/2019/extlst" xmlns:r="http://schemas.openxmlformats.org/officeDocument/2006/relationships" xmlns:m="http://schemas.openxmlformats.org/officeDocument/2006/math" xmlns:v="urn:schemas-microsoft-com:vml" xmlns:wp14="http://schemas.microsoft.com/office/word/2010/wordprocessingDrawing" xmlns:wp="http://schemas.openxmlformats.org/drawingml/2006/wordprocessingDrawing" xmlns:w10="urn:schemas-microsoft-com:office:word" xmlns:w="http://schemas.openxmlformats.org/wordprocessingml/2006/main" xmlns:w14="http://schemas.microsoft.com/office/word/2010/wordml" xmlns:w15="http://schemas.microsoft.com/office/word/2012/wordml" xmlns:w16cex="http://schemas.microsoft.com/office/word/2018/wordml/cex" xmlns:w16cid="http://schemas.microsoft.com/office/word/2016/wordml/cid" xmlns:w16="http://schemas.microsoft.com/office/word/2018/wordml" xmlns:w16du="http://schemas.microsoft.com/office/word/2023/wordml/word16du" xmlns:w16sdtdh="http://schemas.microsoft.com/office/word/2020/wordml/sdtdatahash" xmlns:w16sdtfl="http://schemas.microsoft.com/office/word/2024/wordml/sdtformatlock" xmlns:w16se="http://schemas.microsoft.com/office/word/2015/wordml/symex" xmlns:wpg="http://schemas.microsoft.com/office/word/2010/wordprocessingGroup" xmlns:wpi="http://schemas.microsoft.com/office/word/2010/wordprocessingInk" xmlns:wne="http://schemas.microsoft.com/office/word/2006/wordml" xmlns:wps="http://schemas.microsoft.com/office/word/2010/wordprocessingShape" mc:Ignorable="w14 w15 w16se w16cid w16 w16cex w16sdtdh w16sdtfl w16du wp14">
   <w:p>
     <w:pPr>
-      <w:pStyle w:val="Header"/>
+      <w:pStyle w:val="Cabealho"/>
     </w:pPr>
   </w:p>
 </w:hdr>
@@ -6378,7 +5995,7 @@
         </w:tcPr>
         <w:p>
           <w:pPr>
-            <w:pStyle w:val="Header"/>
+            <w:pStyle w:val="Cabealho"/>
           </w:pPr>
         </w:p>
       </w:tc>
@@ -6388,7 +6005,7 @@
         </w:tcPr>
         <w:p>
           <w:pPr>
-            <w:pStyle w:val="Header"/>
+            <w:pStyle w:val="Cabealho"/>
           </w:pPr>
         </w:p>
       </w:tc>
@@ -6398,7 +6015,7 @@
         </w:tcPr>
         <w:p>
           <w:pPr>
-            <w:pStyle w:val="Header"/>
+            <w:pStyle w:val="Cabealho"/>
           </w:pPr>
         </w:p>
       </w:tc>
@@ -6406,7 +6023,7 @@
   </w:tbl>
   <w:p>
     <w:pPr>
-      <w:pStyle w:val="Header"/>
+      <w:pStyle w:val="Cabealho"/>
     </w:pPr>
   </w:p>
 </w:hdr>
@@ -7526,7 +7143,7 @@
     <w:lvl w:ilvl="3">
       <w:start w:val="1"/>
       <w:numFmt w:val="decimal"/>
-      <w:pStyle w:val="Heading4"/>
+      <w:pStyle w:val="Ttulo4"/>
       <w:lvlText w:val="%1.%2.%3.%4."/>
       <w:lvlJc w:val="left"/>
       <w:pPr>
@@ -8507,11 +8124,11 @@
       <w:lang w:val="en-US"/>
     </w:rPr>
   </w:style>
-  <w:style w:type="paragraph" w:styleId="Heading1">
+  <w:style w:type="paragraph" w:styleId="Ttulo1">
     <w:name w:val="heading 1"/>
     <w:basedOn w:val="Normal"/>
     <w:next w:val="Normal"/>
-    <w:link w:val="Heading1Char"/>
+    <w:link w:val="Ttulo1Carter"/>
     <w:uiPriority w:val="9"/>
     <w:qFormat/>
     <w:rsid w:val="00586A8E"/>
@@ -8532,11 +8149,11 @@
       <w:szCs w:val="32"/>
     </w:rPr>
   </w:style>
-  <w:style w:type="paragraph" w:styleId="Heading2">
+  <w:style w:type="paragraph" w:styleId="Ttulo2">
     <w:name w:val="heading 2"/>
     <w:basedOn w:val="Normal"/>
     <w:next w:val="Normal"/>
-    <w:link w:val="Heading2Char"/>
+    <w:link w:val="Ttulo2Carter"/>
     <w:uiPriority w:val="9"/>
     <w:unhideWhenUsed/>
     <w:qFormat/>
@@ -8555,11 +8172,11 @@
       <w:szCs w:val="28"/>
     </w:rPr>
   </w:style>
-  <w:style w:type="paragraph" w:styleId="Heading3">
+  <w:style w:type="paragraph" w:styleId="Ttulo3">
     <w:name w:val="heading 3"/>
     <w:basedOn w:val="Normal"/>
     <w:next w:val="Normal"/>
-    <w:link w:val="Heading3Char"/>
+    <w:link w:val="Ttulo3Carter"/>
     <w:uiPriority w:val="9"/>
     <w:unhideWhenUsed/>
     <w:qFormat/>
@@ -8580,11 +8197,11 @@
       <w:szCs w:val="24"/>
     </w:rPr>
   </w:style>
-  <w:style w:type="paragraph" w:styleId="Heading4">
+  <w:style w:type="paragraph" w:styleId="Ttulo4">
     <w:name w:val="heading 4"/>
     <w:basedOn w:val="Normal"/>
     <w:next w:val="Normal"/>
-    <w:link w:val="Heading4Char"/>
+    <w:link w:val="Ttulo4Carter"/>
     <w:uiPriority w:val="9"/>
     <w:unhideWhenUsed/>
     <w:qFormat/>
@@ -8611,11 +8228,11 @@
       <w:szCs w:val="26"/>
     </w:rPr>
   </w:style>
-  <w:style w:type="paragraph" w:styleId="Heading5">
+  <w:style w:type="paragraph" w:styleId="Ttulo5">
     <w:name w:val="heading 5"/>
     <w:basedOn w:val="Normal"/>
     <w:next w:val="Normal"/>
-    <w:link w:val="Heading5Char"/>
+    <w:link w:val="Ttulo5Carter"/>
     <w:uiPriority w:val="9"/>
     <w:unhideWhenUsed/>
     <w:qFormat/>
@@ -8636,13 +8253,12 @@
       <w:szCs w:val="32"/>
     </w:rPr>
   </w:style>
-  <w:style w:type="character" w:default="1" w:styleId="DefaultParagraphFont">
+  <w:style w:type="character" w:default="1" w:styleId="Tipodeletrapredefinidodopargrafo">
     <w:name w:val="Default Paragraph Font"/>
     <w:uiPriority w:val="1"/>
-    <w:semiHidden/>
     <w:unhideWhenUsed/>
   </w:style>
-  <w:style w:type="table" w:default="1" w:styleId="TableNormal">
+  <w:style w:type="table" w:default="1" w:styleId="Tabelanormal">
     <w:name w:val="Normal Table"/>
     <w:uiPriority w:val="99"/>
     <w:semiHidden/>
@@ -8657,15 +8273,15 @@
       </w:tblCellMar>
     </w:tblPr>
   </w:style>
-  <w:style w:type="numbering" w:default="1" w:styleId="NoList">
+  <w:style w:type="numbering" w:default="1" w:styleId="Semlista">
     <w:name w:val="No List"/>
     <w:uiPriority w:val="99"/>
     <w:semiHidden/>
     <w:unhideWhenUsed/>
   </w:style>
-  <w:style w:type="character" w:customStyle="1" w:styleId="Heading1Char">
-    <w:name w:val="Heading 1 Char"/>
-    <w:link w:val="Heading1"/>
+  <w:style w:type="character" w:customStyle="1" w:styleId="Ttulo1Carter">
+    <w:name w:val="Título 1 Caráter"/>
+    <w:link w:val="Ttulo1"/>
     <w:uiPriority w:val="9"/>
     <w:rsid w:val="00586A8E"/>
     <w:rPr>
@@ -8679,9 +8295,9 @@
       <w:lang w:val="en-US"/>
     </w:rPr>
   </w:style>
-  <w:style w:type="character" w:customStyle="1" w:styleId="Heading2Char">
-    <w:name w:val="Heading 2 Char"/>
-    <w:link w:val="Heading2"/>
+  <w:style w:type="character" w:customStyle="1" w:styleId="Ttulo2Carter">
+    <w:name w:val="Título 2 Caráter"/>
+    <w:link w:val="Ttulo2"/>
     <w:uiPriority w:val="9"/>
     <w:rsid w:val="004672CD"/>
     <w:rPr>
@@ -8693,9 +8309,9 @@
       <w:lang w:val="en-US"/>
     </w:rPr>
   </w:style>
-  <w:style w:type="character" w:customStyle="1" w:styleId="Heading3Char">
-    <w:name w:val="Heading 3 Char"/>
-    <w:link w:val="Heading3"/>
+  <w:style w:type="character" w:customStyle="1" w:styleId="Ttulo3Carter">
+    <w:name w:val="Título 3 Caráter"/>
+    <w:link w:val="Ttulo3"/>
     <w:uiPriority w:val="9"/>
     <w:rsid w:val="004672CD"/>
     <w:rPr>
@@ -8709,9 +8325,9 @@
       <w:lang w:val="en-US"/>
     </w:rPr>
   </w:style>
-  <w:style w:type="character" w:customStyle="1" w:styleId="Heading4Char">
-    <w:name w:val="Heading 4 Char"/>
-    <w:link w:val="Heading4"/>
+  <w:style w:type="character" w:customStyle="1" w:styleId="Ttulo4Carter">
+    <w:name w:val="Título 4 Caráter"/>
+    <w:link w:val="Ttulo4"/>
     <w:uiPriority w:val="9"/>
     <w:rsid w:val="00090D29"/>
     <w:rPr>
@@ -8756,10 +8372,10 @@
       <w:rFonts w:eastAsia="Times New Roman"/>
     </w:rPr>
   </w:style>
-  <w:style w:type="paragraph" w:styleId="Header">
+  <w:style w:type="paragraph" w:styleId="Cabealho">
     <w:name w:val="header"/>
     <w:basedOn w:val="Normal"/>
-    <w:link w:val="HeaderChar"/>
+    <w:link w:val="CabealhoCarter"/>
     <w:uiPriority w:val="99"/>
     <w:unhideWhenUsed/>
     <w:rsid w:val="7979C0CF"/>
@@ -8770,10 +8386,10 @@
       </w:tabs>
     </w:pPr>
   </w:style>
-  <w:style w:type="character" w:customStyle="1" w:styleId="HeaderChar">
-    <w:name w:val="Header Char"/>
-    <w:basedOn w:val="DefaultParagraphFont"/>
-    <w:link w:val="Header"/>
+  <w:style w:type="character" w:customStyle="1" w:styleId="CabealhoCarter">
+    <w:name w:val="Cabeçalho Caráter"/>
+    <w:basedOn w:val="Tipodeletrapredefinidodopargrafo"/>
+    <w:link w:val="Cabealho"/>
     <w:uiPriority w:val="99"/>
     <w:rsid w:val="00940100"/>
     <w:rPr>
@@ -8782,10 +8398,10 @@
       <w:lang w:val="en-US" w:eastAsia="en-US"/>
     </w:rPr>
   </w:style>
-  <w:style w:type="paragraph" w:styleId="Footer">
+  <w:style w:type="paragraph" w:styleId="Rodap">
     <w:name w:val="footer"/>
     <w:basedOn w:val="Normal"/>
-    <w:link w:val="FooterChar"/>
+    <w:link w:val="RodapCarter"/>
     <w:uiPriority w:val="99"/>
     <w:unhideWhenUsed/>
     <w:rsid w:val="7979C0CF"/>
@@ -8796,10 +8412,10 @@
       </w:tabs>
     </w:pPr>
   </w:style>
-  <w:style w:type="character" w:customStyle="1" w:styleId="FooterChar">
-    <w:name w:val="Footer Char"/>
-    <w:basedOn w:val="DefaultParagraphFont"/>
-    <w:link w:val="Footer"/>
+  <w:style w:type="character" w:customStyle="1" w:styleId="RodapCarter">
+    <w:name w:val="Rodapé Caráter"/>
+    <w:basedOn w:val="Tipodeletrapredefinidodopargrafo"/>
+    <w:link w:val="Rodap"/>
     <w:uiPriority w:val="99"/>
     <w:rsid w:val="00940100"/>
     <w:rPr>
@@ -8818,7 +8434,7 @@
       <w:rFonts w:eastAsia="Times New Roman"/>
     </w:rPr>
   </w:style>
-  <w:style w:type="paragraph" w:styleId="TOC1">
+  <w:style w:type="paragraph" w:styleId="ndice1">
     <w:name w:val="toc 1"/>
     <w:basedOn w:val="Normal"/>
     <w:next w:val="Normal"/>
@@ -8837,7 +8453,7 @@
       <w:noProof/>
     </w:rPr>
   </w:style>
-  <w:style w:type="paragraph" w:styleId="TOC2">
+  <w:style w:type="paragraph" w:styleId="ndice2">
     <w:name w:val="toc 2"/>
     <w:basedOn w:val="Normal"/>
     <w:next w:val="Normal"/>
@@ -8857,7 +8473,7 @@
       <w:noProof/>
     </w:rPr>
   </w:style>
-  <w:style w:type="paragraph" w:styleId="TOC3">
+  <w:style w:type="paragraph" w:styleId="ndice3">
     <w:name w:val="toc 3"/>
     <w:basedOn w:val="Normal"/>
     <w:next w:val="Normal"/>
@@ -8877,7 +8493,7 @@
       <w:noProof/>
     </w:rPr>
   </w:style>
-  <w:style w:type="paragraph" w:styleId="TableofFigures">
+  <w:style w:type="paragraph" w:styleId="ndicedeilustraes">
     <w:name w:val="table of figures"/>
     <w:basedOn w:val="Normal"/>
     <w:next w:val="Normal"/>
@@ -8891,10 +8507,10 @@
       <w:rFonts w:eastAsia="Times New Roman"/>
     </w:rPr>
   </w:style>
-  <w:style w:type="paragraph" w:styleId="FootnoteText">
+  <w:style w:type="paragraph" w:styleId="Textodenotaderodap">
     <w:name w:val="footnote text"/>
     <w:basedOn w:val="Normal"/>
-    <w:link w:val="FootnoteTextChar"/>
+    <w:link w:val="TextodenotaderodapCarter"/>
     <w:uiPriority w:val="99"/>
     <w:unhideWhenUsed/>
     <w:rsid w:val="7979C0CF"/>
@@ -8907,9 +8523,9 @@
       <w:szCs w:val="20"/>
     </w:rPr>
   </w:style>
-  <w:style w:type="character" w:customStyle="1" w:styleId="FootnoteTextChar">
-    <w:name w:val="Footnote Text Char"/>
-    <w:link w:val="FootnoteText"/>
+  <w:style w:type="character" w:customStyle="1" w:styleId="TextodenotaderodapCarter">
+    <w:name w:val="Texto de nota de rodapé Caráter"/>
+    <w:link w:val="Textodenotaderodap"/>
     <w:uiPriority w:val="99"/>
     <w:qFormat/>
     <w:rsid w:val="00940100"/>
@@ -8918,7 +8534,7 @@
       <w:lang w:val="en-US"/>
     </w:rPr>
   </w:style>
-  <w:style w:type="character" w:styleId="FootnoteReference">
+  <w:style w:type="character" w:styleId="Refdenotaderodap">
     <w:name w:val="footnote reference"/>
     <w:uiPriority w:val="99"/>
     <w:unhideWhenUsed/>
@@ -8927,7 +8543,7 @@
       <w:vertAlign w:val="superscript"/>
     </w:rPr>
   </w:style>
-  <w:style w:type="paragraph" w:styleId="Caption">
+  <w:style w:type="paragraph" w:styleId="Legenda">
     <w:name w:val="caption"/>
     <w:basedOn w:val="Normal"/>
     <w:next w:val="Normal"/>
@@ -8944,9 +8560,9 @@
       <w:color w:val="000000" w:themeColor="text1"/>
     </w:rPr>
   </w:style>
-  <w:style w:type="table" w:styleId="TableGrid">
+  <w:style w:type="table" w:styleId="TabelacomGrelha">
     <w:name w:val="Table Grid"/>
-    <w:basedOn w:val="TableNormal"/>
+    <w:basedOn w:val="Tabelanormal"/>
     <w:uiPriority w:val="59"/>
     <w:rsid w:val="00940100"/>
     <w:rPr>
@@ -8970,7 +8586,7 @@
   </w:style>
   <w:style w:type="paragraph" w:customStyle="1" w:styleId="Lista1">
     <w:name w:val="Lista1"/>
-    <w:basedOn w:val="ListParagraph"/>
+    <w:basedOn w:val="PargrafodaLista"/>
     <w:qFormat/>
     <w:rsid w:val="000D6611"/>
     <w:pPr>
@@ -8983,7 +8599,7 @@
   </w:style>
   <w:style w:type="paragraph" w:customStyle="1" w:styleId="Listanumerada1">
     <w:name w:val="Lista numerada1"/>
-    <w:basedOn w:val="ListParagraph"/>
+    <w:basedOn w:val="PargrafodaLista"/>
     <w:qFormat/>
     <w:rsid w:val="000D6611"/>
     <w:pPr>
@@ -8996,7 +8612,7 @@
       <w:rFonts w:eastAsia="Times New Roman"/>
     </w:rPr>
   </w:style>
-  <w:style w:type="paragraph" w:styleId="ListParagraph">
+  <w:style w:type="paragraph" w:styleId="PargrafodaLista">
     <w:name w:val="List Paragraph"/>
     <w:basedOn w:val="Normal"/>
     <w:uiPriority w:val="34"/>
@@ -9007,7 +8623,7 @@
       <w:contextualSpacing/>
     </w:pPr>
   </w:style>
-  <w:style w:type="paragraph" w:styleId="TOCHeading">
+  <w:style w:type="paragraph" w:styleId="Cabealhodondice">
     <w:name w:val="TOC Heading"/>
     <w:next w:val="Normal"/>
     <w:uiPriority w:val="39"/>
@@ -9028,7 +8644,7 @@
       <w:lang w:val="en-US" w:eastAsia="en-US"/>
     </w:rPr>
   </w:style>
-  <w:style w:type="character" w:styleId="Hyperlink">
+  <w:style w:type="character" w:styleId="Hiperligao">
     <w:name w:val="Hyperlink"/>
     <w:uiPriority w:val="99"/>
     <w:unhideWhenUsed/>
@@ -9040,7 +8656,7 @@
   </w:style>
   <w:style w:type="character" w:customStyle="1" w:styleId="fontstyle01">
     <w:name w:val="fontstyle01"/>
-    <w:basedOn w:val="DefaultParagraphFont"/>
+    <w:basedOn w:val="Tipodeletrapredefinidodopargrafo"/>
     <w:rsid w:val="00F1488F"/>
     <w:rPr>
       <w:rFonts w:ascii="NewsGotT-Bol" w:hAnsi="NewsGotT-Bol" w:hint="default"/>
@@ -9055,7 +8671,7 @@
   </w:style>
   <w:style w:type="character" w:customStyle="1" w:styleId="fontstyle21">
     <w:name w:val="fontstyle21"/>
-    <w:basedOn w:val="DefaultParagraphFont"/>
+    <w:basedOn w:val="Tipodeletrapredefinidodopargrafo"/>
     <w:rsid w:val="00F1488F"/>
     <w:rPr>
       <w:rFonts w:ascii="NewsGotT-Reg" w:hAnsi="NewsGotT-Reg" w:hint="default"/>
@@ -9068,9 +8684,9 @@
       <w:szCs w:val="22"/>
     </w:rPr>
   </w:style>
-  <w:style w:type="character" w:styleId="UnresolvedMention">
+  <w:style w:type="character" w:styleId="MenoNoResolvida">
     <w:name w:val="Unresolved Mention"/>
-    <w:basedOn w:val="DefaultParagraphFont"/>
+    <w:basedOn w:val="Tipodeletrapredefinidodopargrafo"/>
     <w:uiPriority w:val="99"/>
     <w:semiHidden/>
     <w:unhideWhenUsed/>
@@ -9080,9 +8696,9 @@
       <w:shd w:val="clear" w:color="auto" w:fill="E1DFDD"/>
     </w:rPr>
   </w:style>
-  <w:style w:type="character" w:styleId="FollowedHyperlink">
+  <w:style w:type="character" w:styleId="Hiperligaovisitada">
     <w:name w:val="FollowedHyperlink"/>
-    <w:basedOn w:val="DefaultParagraphFont"/>
+    <w:basedOn w:val="Tipodeletrapredefinidodopargrafo"/>
     <w:uiPriority w:val="99"/>
     <w:semiHidden/>
     <w:unhideWhenUsed/>
@@ -9092,10 +8708,10 @@
       <w:u w:val="single"/>
     </w:rPr>
   </w:style>
-  <w:style w:type="character" w:customStyle="1" w:styleId="Heading5Char">
-    <w:name w:val="Heading 5 Char"/>
-    <w:basedOn w:val="DefaultParagraphFont"/>
-    <w:link w:val="Heading5"/>
+  <w:style w:type="character" w:customStyle="1" w:styleId="Ttulo5Carter">
+    <w:name w:val="Título 5 Caráter"/>
+    <w:basedOn w:val="Tipodeletrapredefinidodopargrafo"/>
+    <w:link w:val="Ttulo5"/>
     <w:uiPriority w:val="9"/>
     <w:rsid w:val="00D4604C"/>
     <w:rPr>
@@ -9108,7 +8724,7 @@
       <w:lang w:val="en-US" w:eastAsia="en-US"/>
     </w:rPr>
   </w:style>
-  <w:style w:type="paragraph" w:styleId="TOC4">
+  <w:style w:type="paragraph" w:styleId="ndice4">
     <w:name w:val="toc 4"/>
     <w:basedOn w:val="Normal"/>
     <w:next w:val="Normal"/>
@@ -9151,11 +8767,11 @@
       <w:vertAlign w:val="superscript"/>
     </w:rPr>
   </w:style>
-  <w:style w:type="paragraph" w:styleId="Title">
+  <w:style w:type="paragraph" w:styleId="Ttulo">
     <w:name w:val="Title"/>
     <w:basedOn w:val="Normal"/>
     <w:next w:val="Normal"/>
-    <w:link w:val="TitleChar"/>
+    <w:link w:val="TtuloCarter"/>
     <w:uiPriority w:val="10"/>
     <w:qFormat/>
     <w:rsid w:val="7979C0CF"/>
@@ -9168,10 +8784,10 @@
       <w:szCs w:val="56"/>
     </w:rPr>
   </w:style>
-  <w:style w:type="character" w:customStyle="1" w:styleId="TitleChar">
-    <w:name w:val="Title Char"/>
-    <w:basedOn w:val="DefaultParagraphFont"/>
-    <w:link w:val="Title"/>
+  <w:style w:type="character" w:customStyle="1" w:styleId="TtuloCarter">
+    <w:name w:val="Título Caráter"/>
+    <w:basedOn w:val="Tipodeletrapredefinidodopargrafo"/>
+    <w:link w:val="Ttulo"/>
     <w:uiPriority w:val="10"/>
     <w:rsid w:val="007944CF"/>
     <w:rPr>
@@ -9199,9 +8815,9 @@
       <w:lang w:val="en-GB" w:eastAsia="en-GB"/>
     </w:rPr>
   </w:style>
-  <w:style w:type="character" w:styleId="Strong">
+  <w:style w:type="character" w:styleId="Forte">
     <w:name w:val="Strong"/>
-    <w:basedOn w:val="DefaultParagraphFont"/>
+    <w:basedOn w:val="Tipodeletrapredefinidodopargrafo"/>
     <w:uiPriority w:val="22"/>
     <w:qFormat/>
     <w:rsid w:val="001E6428"/>
@@ -9210,9 +8826,9 @@
       <w:bCs/>
     </w:rPr>
   </w:style>
-  <w:style w:type="character" w:styleId="HTMLCode">
+  <w:style w:type="character" w:styleId="CdigoHTML">
     <w:name w:val="HTML Code"/>
-    <w:basedOn w:val="DefaultParagraphFont"/>
+    <w:basedOn w:val="Tipodeletrapredefinidodopargrafo"/>
     <w:uiPriority w:val="99"/>
     <w:semiHidden/>
     <w:unhideWhenUsed/>
@@ -9223,9 +8839,9 @@
       <w:szCs w:val="20"/>
     </w:rPr>
   </w:style>
-  <w:style w:type="character" w:styleId="CommentReference">
+  <w:style w:type="character" w:styleId="Refdecomentrio">
     <w:name w:val="annotation reference"/>
-    <w:basedOn w:val="DefaultParagraphFont"/>
+    <w:basedOn w:val="Tipodeletrapredefinidodopargrafo"/>
     <w:uiPriority w:val="99"/>
     <w:semiHidden/>
     <w:unhideWhenUsed/>
@@ -9235,10 +8851,10 @@
       <w:szCs w:val="16"/>
     </w:rPr>
   </w:style>
-  <w:style w:type="paragraph" w:styleId="CommentText">
+  <w:style w:type="paragraph" w:styleId="Textodecomentrio">
     <w:name w:val="annotation text"/>
     <w:basedOn w:val="Normal"/>
-    <w:link w:val="CommentTextChar"/>
+    <w:link w:val="TextodecomentrioCarter"/>
     <w:uiPriority w:val="99"/>
     <w:unhideWhenUsed/>
     <w:rsid w:val="7979C0CF"/>
@@ -9247,21 +8863,21 @@
       <w:szCs w:val="20"/>
     </w:rPr>
   </w:style>
-  <w:style w:type="character" w:customStyle="1" w:styleId="CommentTextChar">
-    <w:name w:val="Comment Text Char"/>
-    <w:basedOn w:val="DefaultParagraphFont"/>
-    <w:link w:val="CommentText"/>
+  <w:style w:type="character" w:customStyle="1" w:styleId="TextodecomentrioCarter">
+    <w:name w:val="Texto de comentário Caráter"/>
+    <w:basedOn w:val="Tipodeletrapredefinidodopargrafo"/>
+    <w:link w:val="Textodecomentrio"/>
     <w:uiPriority w:val="99"/>
     <w:rsid w:val="002E4587"/>
     <w:rPr>
       <w:lang w:val="en-US" w:eastAsia="en-US"/>
     </w:rPr>
   </w:style>
-  <w:style w:type="paragraph" w:styleId="CommentSubject">
+  <w:style w:type="paragraph" w:styleId="Assuntodecomentrio">
     <w:name w:val="annotation subject"/>
-    <w:basedOn w:val="CommentText"/>
-    <w:next w:val="CommentText"/>
-    <w:link w:val="CommentSubjectChar"/>
+    <w:basedOn w:val="Textodecomentrio"/>
+    <w:next w:val="Textodecomentrio"/>
+    <w:link w:val="AssuntodecomentrioCarter"/>
     <w:uiPriority w:val="99"/>
     <w:semiHidden/>
     <w:unhideWhenUsed/>
@@ -9271,10 +8887,10 @@
       <w:bCs/>
     </w:rPr>
   </w:style>
-  <w:style w:type="character" w:customStyle="1" w:styleId="CommentSubjectChar">
-    <w:name w:val="Comment Subject Char"/>
-    <w:basedOn w:val="CommentTextChar"/>
-    <w:link w:val="CommentSubject"/>
+  <w:style w:type="character" w:customStyle="1" w:styleId="AssuntodecomentrioCarter">
+    <w:name w:val="Assunto de comentário Caráter"/>
+    <w:basedOn w:val="TextodecomentrioCarter"/>
+    <w:link w:val="Assuntodecomentrio"/>
     <w:uiPriority w:val="99"/>
     <w:semiHidden/>
     <w:rsid w:val="002E4587"/>
@@ -9284,9 +8900,9 @@
       <w:lang w:val="en-US" w:eastAsia="en-US"/>
     </w:rPr>
   </w:style>
-  <w:style w:type="character" w:styleId="PlaceholderText">
+  <w:style w:type="character" w:styleId="TextodoMarcadordePosio">
     <w:name w:val="Placeholder Text"/>
-    <w:basedOn w:val="DefaultParagraphFont"/>
+    <w:basedOn w:val="Tipodeletrapredefinidodopargrafo"/>
     <w:uiPriority w:val="99"/>
     <w:semiHidden/>
     <w:rsid w:val="006D5055"/>

</xml_diff>